<commit_message>
add soures list, introductiond and conclusion
</commit_message>
<xml_diff>
--- a/Курсовой проект.docx
+++ b/Курсовой проект.docx
@@ -1,6 +1,6 @@
 
 <file path=word/document.xml><?xml version="1.0" encoding="utf-8"?>
-<w:document xmlns:wpc="http://schemas.microsoft.com/office/word/2010/wordprocessingCanvas" xmlns:cx="http://schemas.microsoft.com/office/drawing/2014/chartex" xmlns:mc="http://schemas.openxmlformats.org/markup-compatibility/2006" xmlns:o="urn:schemas-microsoft-com:office:office" xmlns:r="http://schemas.openxmlformats.org/officeDocument/2006/relationships" xmlns:m="http://schemas.openxmlformats.org/officeDocument/2006/math" xmlns:v="urn:schemas-microsoft-com:vml" xmlns:wp14="http://schemas.microsoft.com/office/word/2010/wordprocessingDrawing" xmlns:wp="http://schemas.openxmlformats.org/drawingml/2006/wordprocessingDrawing" xmlns:w10="urn:schemas-microsoft-com:office:word" xmlns:w="http://schemas.openxmlformats.org/wordprocessingml/2006/main" xmlns:w14="http://schemas.microsoft.com/office/word/2010/wordml" xmlns:w15="http://schemas.microsoft.com/office/word/2012/wordml" xmlns:w16se="http://schemas.microsoft.com/office/word/2015/wordml/symex" xmlns:wpg="http://schemas.microsoft.com/office/word/2010/wordprocessingGroup" xmlns:wpi="http://schemas.microsoft.com/office/word/2010/wordprocessingInk" xmlns:wne="http://schemas.microsoft.com/office/word/2006/wordml" xmlns:wps="http://schemas.microsoft.com/office/word/2010/wordprocessingShape" mc:Ignorable="w14 w15 w16se wp14">
+<w:document xmlns:wpc="http://schemas.microsoft.com/office/word/2010/wordprocessingCanvas" xmlns:cx="http://schemas.microsoft.com/office/drawing/2014/chartex" xmlns:cx1="http://schemas.microsoft.com/office/drawing/2015/9/8/chartex" xmlns:cx2="http://schemas.microsoft.com/office/drawing/2015/10/21/chartex" xmlns:cx3="http://schemas.microsoft.com/office/drawing/2016/5/9/chartex" xmlns:cx4="http://schemas.microsoft.com/office/drawing/2016/5/10/chartex" xmlns:cx5="http://schemas.microsoft.com/office/drawing/2016/5/11/chartex" xmlns:cx6="http://schemas.microsoft.com/office/drawing/2016/5/12/chartex" xmlns:cx7="http://schemas.microsoft.com/office/drawing/2016/5/13/chartex" xmlns:cx8="http://schemas.microsoft.com/office/drawing/2016/5/14/chartex" xmlns:mc="http://schemas.openxmlformats.org/markup-compatibility/2006" xmlns:aink="http://schemas.microsoft.com/office/drawing/2016/ink" xmlns:am3d="http://schemas.microsoft.com/office/drawing/2017/model3d" xmlns:o="urn:schemas-microsoft-com:office:office" xmlns:oel="http://schemas.microsoft.com/office/2019/extlst" xmlns:r="http://schemas.openxmlformats.org/officeDocument/2006/relationships" xmlns:m="http://schemas.openxmlformats.org/officeDocument/2006/math" xmlns:v="urn:schemas-microsoft-com:vml" xmlns:wp14="http://schemas.microsoft.com/office/word/2010/wordprocessingDrawing" xmlns:wp="http://schemas.openxmlformats.org/drawingml/2006/wordprocessingDrawing" xmlns:w10="urn:schemas-microsoft-com:office:word" xmlns:w="http://schemas.openxmlformats.org/wordprocessingml/2006/main" xmlns:w14="http://schemas.microsoft.com/office/word/2010/wordml" xmlns:w15="http://schemas.microsoft.com/office/word/2012/wordml" xmlns:w16cex="http://schemas.microsoft.com/office/word/2018/wordml/cex" xmlns:w16cid="http://schemas.microsoft.com/office/word/2016/wordml/cid" xmlns:w16="http://schemas.microsoft.com/office/word/2018/wordml" xmlns:w16sdtdh="http://schemas.microsoft.com/office/word/2020/wordml/sdtdatahash" xmlns:w16se="http://schemas.microsoft.com/office/word/2015/wordml/symex" xmlns:wpg="http://schemas.microsoft.com/office/word/2010/wordprocessingGroup" xmlns:wpi="http://schemas.microsoft.com/office/word/2010/wordprocessingInk" xmlns:wne="http://schemas.microsoft.com/office/word/2006/wordml" xmlns:wps="http://schemas.microsoft.com/office/word/2010/wordprocessingShape" mc:Ignorable="w14 w15 w16se w16cid w16 w16cex w16sdtdh wp14">
   <w:body>
     <w:p>
       <w:pPr>
@@ -1366,10 +1366,9 @@
         <w:rPr>
           <w:rFonts w:asciiTheme="minorHAnsi" w:eastAsiaTheme="minorEastAsia" w:hAnsiTheme="minorHAnsi"/>
           <w:noProof/>
-          <w:kern w:val="0"/>
-          <w:sz w:val="22"/>
+          <w:sz w:val="24"/>
+          <w:szCs w:val="24"/>
           <w:lang w:eastAsia="ru-RU"/>
-          <w14:ligatures w14:val="none"/>
         </w:rPr>
       </w:pPr>
       <w:r>
@@ -1381,7 +1380,7 @@
       <w:r>
         <w:fldChar w:fldCharType="separate"/>
       </w:r>
-      <w:hyperlink w:anchor="_Toc243296750" w:history="1">
+      <w:hyperlink w:anchor="_Toc243347045" w:history="1">
         <w:r>
           <w:rPr>
             <w:rStyle w:val="af7"/>
@@ -1408,7 +1407,7 @@
             <w:noProof/>
             <w:webHidden/>
           </w:rPr>
-          <w:instrText xml:space="preserve"> PAGEREF _Toc243296750 \h </w:instrText>
+          <w:instrText xml:space="preserve"> PAGEREF _Toc243347045 \h </w:instrText>
         </w:r>
         <w:r>
           <w:rPr>
@@ -1448,13 +1447,12 @@
         <w:rPr>
           <w:rFonts w:asciiTheme="minorHAnsi" w:eastAsiaTheme="minorEastAsia" w:hAnsiTheme="minorHAnsi"/>
           <w:noProof/>
-          <w:kern w:val="0"/>
-          <w:sz w:val="22"/>
+          <w:sz w:val="24"/>
+          <w:szCs w:val="24"/>
           <w:lang w:eastAsia="ru-RU"/>
-          <w14:ligatures w14:val="none"/>
-        </w:rPr>
-      </w:pPr>
-      <w:hyperlink w:anchor="_Toc243296751" w:history="1">
+        </w:rPr>
+      </w:pPr>
+      <w:hyperlink w:anchor="_Toc243347046" w:history="1">
         <w:r>
           <w:rPr>
             <w:rStyle w:val="af7"/>
@@ -1481,7 +1479,7 @@
             <w:noProof/>
             <w:webHidden/>
           </w:rPr>
-          <w:instrText xml:space="preserve"> PAGEREF _Toc243296751 \h </w:instrText>
+          <w:instrText xml:space="preserve"> PAGEREF _Toc243347046 \h </w:instrText>
         </w:r>
         <w:r>
           <w:rPr>
@@ -1521,13 +1519,12 @@
         <w:rPr>
           <w:rFonts w:asciiTheme="minorHAnsi" w:eastAsiaTheme="minorEastAsia" w:hAnsiTheme="minorHAnsi"/>
           <w:noProof/>
-          <w:kern w:val="0"/>
-          <w:sz w:val="22"/>
+          <w:sz w:val="24"/>
+          <w:szCs w:val="24"/>
           <w:lang w:eastAsia="ru-RU"/>
-          <w14:ligatures w14:val="none"/>
-        </w:rPr>
-      </w:pPr>
-      <w:hyperlink w:anchor="_Toc243296752" w:history="1">
+        </w:rPr>
+      </w:pPr>
+      <w:hyperlink w:anchor="_Toc243347047" w:history="1">
         <w:r>
           <w:rPr>
             <w:rStyle w:val="af7"/>
@@ -1554,7 +1551,7 @@
             <w:noProof/>
             <w:webHidden/>
           </w:rPr>
-          <w:instrText xml:space="preserve"> PAGEREF _Toc243296752 \h </w:instrText>
+          <w:instrText xml:space="preserve"> PAGEREF _Toc243347047 \h </w:instrText>
         </w:r>
         <w:r>
           <w:rPr>
@@ -1574,7 +1571,7 @@
             <w:noProof/>
             <w:webHidden/>
           </w:rPr>
-          <w:t>5</w:t>
+          <w:t>6</w:t>
         </w:r>
         <w:r>
           <w:rPr>
@@ -1591,19 +1588,18 @@
         <w:rPr>
           <w:rFonts w:asciiTheme="minorHAnsi" w:eastAsiaTheme="minorEastAsia" w:hAnsiTheme="minorHAnsi"/>
           <w:noProof/>
-          <w:kern w:val="0"/>
-          <w:sz w:val="22"/>
+          <w:sz w:val="24"/>
+          <w:szCs w:val="24"/>
           <w:lang w:eastAsia="ru-RU"/>
-          <w14:ligatures w14:val="none"/>
-        </w:rPr>
-      </w:pPr>
-      <w:hyperlink w:anchor="_Toc243296753" w:history="1">
+        </w:rPr>
+      </w:pPr>
+      <w:hyperlink w:anchor="_Toc243347048" w:history="1">
         <w:r>
           <w:rPr>
             <w:rStyle w:val="af7"/>
             <w:noProof/>
           </w:rPr>
-          <w:t>Назначение и область применения</w:t>
+          <w:t>1.1 Назначение и область применения</w:t>
         </w:r>
         <w:r>
           <w:rPr>
@@ -1624,7 +1620,7 @@
             <w:noProof/>
             <w:webHidden/>
           </w:rPr>
-          <w:instrText xml:space="preserve"> PAGEREF _Toc243296753 \h </w:instrText>
+          <w:instrText xml:space="preserve"> PAGEREF _Toc243347048 \h </w:instrText>
         </w:r>
         <w:r>
           <w:rPr>
@@ -1644,7 +1640,7 @@
             <w:noProof/>
             <w:webHidden/>
           </w:rPr>
-          <w:t>5</w:t>
+          <w:t>6</w:t>
         </w:r>
         <w:r>
           <w:rPr>
@@ -1661,19 +1657,18 @@
         <w:rPr>
           <w:rFonts w:asciiTheme="minorHAnsi" w:eastAsiaTheme="minorEastAsia" w:hAnsiTheme="minorHAnsi"/>
           <w:noProof/>
-          <w:kern w:val="0"/>
-          <w:sz w:val="22"/>
+          <w:sz w:val="24"/>
+          <w:szCs w:val="24"/>
           <w:lang w:eastAsia="ru-RU"/>
-          <w14:ligatures w14:val="none"/>
-        </w:rPr>
-      </w:pPr>
-      <w:hyperlink w:anchor="_Toc243296754" w:history="1">
+        </w:rPr>
+      </w:pPr>
+      <w:hyperlink w:anchor="_Toc243347049" w:history="1">
         <w:r>
           <w:rPr>
             <w:rStyle w:val="af7"/>
             <w:noProof/>
           </w:rPr>
-          <w:t>Постановка задачи</w:t>
+          <w:t>1.2 Постановка задачи</w:t>
         </w:r>
         <w:r>
           <w:rPr>
@@ -1694,7 +1689,7 @@
             <w:noProof/>
             <w:webHidden/>
           </w:rPr>
-          <w:instrText xml:space="preserve"> PAGEREF _Toc243296754 \h </w:instrText>
+          <w:instrText xml:space="preserve"> PAGEREF _Toc243347049 \h </w:instrText>
         </w:r>
         <w:r>
           <w:rPr>
@@ -1714,7 +1709,7 @@
             <w:noProof/>
             <w:webHidden/>
           </w:rPr>
-          <w:t>6</w:t>
+          <w:t>7</w:t>
         </w:r>
         <w:r>
           <w:rPr>
@@ -1731,19 +1726,18 @@
         <w:rPr>
           <w:rFonts w:asciiTheme="minorHAnsi" w:eastAsiaTheme="minorEastAsia" w:hAnsiTheme="minorHAnsi"/>
           <w:noProof/>
-          <w:kern w:val="0"/>
-          <w:sz w:val="22"/>
+          <w:sz w:val="24"/>
+          <w:szCs w:val="24"/>
           <w:lang w:eastAsia="ru-RU"/>
-          <w14:ligatures w14:val="none"/>
-        </w:rPr>
-      </w:pPr>
-      <w:hyperlink w:anchor="_Toc243296755" w:history="1">
+        </w:rPr>
+      </w:pPr>
+      <w:hyperlink w:anchor="_Toc243347050" w:history="1">
         <w:r>
           <w:rPr>
             <w:rStyle w:val="af7"/>
             <w:noProof/>
           </w:rPr>
-          <w:t>Выбор состава программных и технических средств</w:t>
+          <w:t>1.3 Выбор состава программных и технических средств</w:t>
         </w:r>
         <w:r>
           <w:rPr>
@@ -1764,7 +1758,7 @@
             <w:noProof/>
             <w:webHidden/>
           </w:rPr>
-          <w:instrText xml:space="preserve"> PAGEREF _Toc243296755 \h </w:instrText>
+          <w:instrText xml:space="preserve"> PAGEREF _Toc243347050 \h </w:instrText>
         </w:r>
         <w:r>
           <w:rPr>
@@ -1784,7 +1778,7 @@
             <w:noProof/>
             <w:webHidden/>
           </w:rPr>
-          <w:t>6</w:t>
+          <w:t>7</w:t>
         </w:r>
         <w:r>
           <w:rPr>
@@ -1804,13 +1798,12 @@
         <w:rPr>
           <w:rFonts w:asciiTheme="minorHAnsi" w:eastAsiaTheme="minorEastAsia" w:hAnsiTheme="minorHAnsi"/>
           <w:noProof/>
-          <w:kern w:val="0"/>
-          <w:sz w:val="22"/>
+          <w:sz w:val="24"/>
+          <w:szCs w:val="24"/>
           <w:lang w:eastAsia="ru-RU"/>
-          <w14:ligatures w14:val="none"/>
-        </w:rPr>
-      </w:pPr>
-      <w:hyperlink w:anchor="_Toc243296756" w:history="1">
+        </w:rPr>
+      </w:pPr>
+      <w:hyperlink w:anchor="_Toc243347051" w:history="1">
         <w:r>
           <w:rPr>
             <w:rStyle w:val="af7"/>
@@ -1837,7 +1830,7 @@
             <w:noProof/>
             <w:webHidden/>
           </w:rPr>
-          <w:instrText xml:space="preserve"> PAGEREF _Toc243296756 \h </w:instrText>
+          <w:instrText xml:space="preserve"> PAGEREF _Toc243347051 \h </w:instrText>
         </w:r>
         <w:r>
           <w:rPr>
@@ -1857,7 +1850,7 @@
             <w:noProof/>
             <w:webHidden/>
           </w:rPr>
-          <w:t>7</w:t>
+          <w:t>8</w:t>
         </w:r>
         <w:r>
           <w:rPr>
@@ -1874,19 +1867,18 @@
         <w:rPr>
           <w:rFonts w:asciiTheme="minorHAnsi" w:eastAsiaTheme="minorEastAsia" w:hAnsiTheme="minorHAnsi"/>
           <w:noProof/>
-          <w:kern w:val="0"/>
-          <w:sz w:val="22"/>
+          <w:sz w:val="24"/>
+          <w:szCs w:val="24"/>
           <w:lang w:eastAsia="ru-RU"/>
-          <w14:ligatures w14:val="none"/>
-        </w:rPr>
-      </w:pPr>
-      <w:hyperlink w:anchor="_Toc243296757" w:history="1">
+        </w:rPr>
+      </w:pPr>
+      <w:hyperlink w:anchor="_Toc243347052" w:history="1">
         <w:r>
           <w:rPr>
             <w:rStyle w:val="af7"/>
             <w:noProof/>
           </w:rPr>
-          <w:t>Проектирование интерфейса пользователя</w:t>
+          <w:t>2.1 Проектирование интерфейса пользователя</w:t>
         </w:r>
         <w:r>
           <w:rPr>
@@ -1907,7 +1899,7 @@
             <w:noProof/>
             <w:webHidden/>
           </w:rPr>
-          <w:instrText xml:space="preserve"> PAGEREF _Toc243296757 \h </w:instrText>
+          <w:instrText xml:space="preserve"> PAGEREF _Toc243347052 \h </w:instrText>
         </w:r>
         <w:r>
           <w:rPr>
@@ -1927,7 +1919,7 @@
             <w:noProof/>
             <w:webHidden/>
           </w:rPr>
-          <w:t>7</w:t>
+          <w:t>8</w:t>
         </w:r>
         <w:r>
           <w:rPr>
@@ -1944,19 +1936,18 @@
         <w:rPr>
           <w:rFonts w:asciiTheme="minorHAnsi" w:eastAsiaTheme="minorEastAsia" w:hAnsiTheme="minorHAnsi"/>
           <w:noProof/>
-          <w:kern w:val="0"/>
-          <w:sz w:val="22"/>
+          <w:sz w:val="24"/>
+          <w:szCs w:val="24"/>
           <w:lang w:eastAsia="ru-RU"/>
-          <w14:ligatures w14:val="none"/>
-        </w:rPr>
-      </w:pPr>
-      <w:hyperlink w:anchor="_Toc243296758" w:history="1">
+        </w:rPr>
+      </w:pPr>
+      <w:hyperlink w:anchor="_Toc243347053" w:history="1">
         <w:r>
           <w:rPr>
             <w:rStyle w:val="af7"/>
             <w:noProof/>
           </w:rPr>
-          <w:t>Разработка архитектуры программного обеспечения</w:t>
+          <w:t>2.2 Разработка архитектуры программного обеспечения</w:t>
         </w:r>
         <w:r>
           <w:rPr>
@@ -1977,7 +1968,7 @@
             <w:noProof/>
             <w:webHidden/>
           </w:rPr>
-          <w:instrText xml:space="preserve"> PAGEREF _Toc243296758 \h </w:instrText>
+          <w:instrText xml:space="preserve"> PAGEREF _Toc243347053 \h </w:instrText>
         </w:r>
         <w:r>
           <w:rPr>
@@ -1997,7 +1988,7 @@
             <w:noProof/>
             <w:webHidden/>
           </w:rPr>
-          <w:t>7</w:t>
+          <w:t>8</w:t>
         </w:r>
         <w:r>
           <w:rPr>
@@ -2014,19 +2005,18 @@
         <w:rPr>
           <w:rFonts w:asciiTheme="minorHAnsi" w:eastAsiaTheme="minorEastAsia" w:hAnsiTheme="minorHAnsi"/>
           <w:noProof/>
-          <w:kern w:val="0"/>
-          <w:sz w:val="22"/>
+          <w:sz w:val="24"/>
+          <w:szCs w:val="24"/>
           <w:lang w:eastAsia="ru-RU"/>
-          <w14:ligatures w14:val="none"/>
-        </w:rPr>
-      </w:pPr>
-      <w:hyperlink w:anchor="_Toc243296759" w:history="1">
+        </w:rPr>
+      </w:pPr>
+      <w:hyperlink w:anchor="_Toc243347054" w:history="1">
         <w:r>
           <w:rPr>
             <w:rStyle w:val="af7"/>
             <w:noProof/>
           </w:rPr>
-          <w:t>Проектирование базы данных</w:t>
+          <w:t>2.3 Проектирование базы данных</w:t>
         </w:r>
         <w:r>
           <w:rPr>
@@ -2047,7 +2037,7 @@
             <w:noProof/>
             <w:webHidden/>
           </w:rPr>
-          <w:instrText xml:space="preserve"> PAGEREF _Toc243296759 \h </w:instrText>
+          <w:instrText xml:space="preserve"> PAGEREF _Toc243347054 \h </w:instrText>
         </w:r>
         <w:r>
           <w:rPr>
@@ -2067,7 +2057,7 @@
             <w:noProof/>
             <w:webHidden/>
           </w:rPr>
-          <w:t>7</w:t>
+          <w:t>8</w:t>
         </w:r>
         <w:r>
           <w:rPr>
@@ -2087,13 +2077,12 @@
         <w:rPr>
           <w:rFonts w:asciiTheme="minorHAnsi" w:eastAsiaTheme="minorEastAsia" w:hAnsiTheme="minorHAnsi"/>
           <w:noProof/>
-          <w:kern w:val="0"/>
-          <w:sz w:val="22"/>
+          <w:sz w:val="24"/>
+          <w:szCs w:val="24"/>
           <w:lang w:eastAsia="ru-RU"/>
-          <w14:ligatures w14:val="none"/>
-        </w:rPr>
-      </w:pPr>
-      <w:hyperlink w:anchor="_Toc243296760" w:history="1">
+        </w:rPr>
+      </w:pPr>
+      <w:hyperlink w:anchor="_Toc243347055" w:history="1">
         <w:r>
           <w:rPr>
             <w:rStyle w:val="af7"/>
@@ -2120,7 +2109,7 @@
             <w:noProof/>
             <w:webHidden/>
           </w:rPr>
-          <w:instrText xml:space="preserve"> PAGEREF _Toc243296760 \h </w:instrText>
+          <w:instrText xml:space="preserve"> PAGEREF _Toc243347055 \h </w:instrText>
         </w:r>
         <w:r>
           <w:rPr>
@@ -2140,7 +2129,7 @@
             <w:noProof/>
             <w:webHidden/>
           </w:rPr>
-          <w:t>8</w:t>
+          <w:t>9</w:t>
         </w:r>
         <w:r>
           <w:rPr>
@@ -2157,19 +2146,18 @@
         <w:rPr>
           <w:rFonts w:asciiTheme="minorHAnsi" w:eastAsiaTheme="minorEastAsia" w:hAnsiTheme="minorHAnsi"/>
           <w:noProof/>
-          <w:kern w:val="0"/>
-          <w:sz w:val="22"/>
+          <w:sz w:val="24"/>
+          <w:szCs w:val="24"/>
           <w:lang w:eastAsia="ru-RU"/>
-          <w14:ligatures w14:val="none"/>
-        </w:rPr>
-      </w:pPr>
-      <w:hyperlink w:anchor="_Toc243296761" w:history="1">
+        </w:rPr>
+      </w:pPr>
+      <w:hyperlink w:anchor="_Toc243347056" w:history="1">
         <w:r>
           <w:rPr>
             <w:rStyle w:val="af7"/>
             <w:noProof/>
           </w:rPr>
-          <w:t>Разработка программных модулей</w:t>
+          <w:t>3.1 Разработка программных модулей</w:t>
         </w:r>
         <w:r>
           <w:rPr>
@@ -2190,7 +2178,7 @@
             <w:noProof/>
             <w:webHidden/>
           </w:rPr>
-          <w:instrText xml:space="preserve"> PAGEREF _Toc243296761 \h </w:instrText>
+          <w:instrText xml:space="preserve"> PAGEREF _Toc243347056 \h </w:instrText>
         </w:r>
         <w:r>
           <w:rPr>
@@ -2210,7 +2198,7 @@
             <w:noProof/>
             <w:webHidden/>
           </w:rPr>
-          <w:t>8</w:t>
+          <w:t>9</w:t>
         </w:r>
         <w:r>
           <w:rPr>
@@ -2227,19 +2215,18 @@
         <w:rPr>
           <w:rFonts w:asciiTheme="minorHAnsi" w:eastAsiaTheme="minorEastAsia" w:hAnsiTheme="minorHAnsi"/>
           <w:noProof/>
-          <w:kern w:val="0"/>
-          <w:sz w:val="22"/>
+          <w:sz w:val="24"/>
+          <w:szCs w:val="24"/>
           <w:lang w:eastAsia="ru-RU"/>
-          <w14:ligatures w14:val="none"/>
-        </w:rPr>
-      </w:pPr>
-      <w:hyperlink w:anchor="_Toc243296762" w:history="1">
+        </w:rPr>
+      </w:pPr>
+      <w:hyperlink w:anchor="_Toc243347057" w:history="1">
         <w:r>
           <w:rPr>
             <w:rStyle w:val="af7"/>
             <w:noProof/>
           </w:rPr>
-          <w:t>Реализация интерфейса пользователя</w:t>
+          <w:t>3.2 Реализация интерфейса пользователя</w:t>
         </w:r>
         <w:r>
           <w:rPr>
@@ -2260,7 +2247,7 @@
             <w:noProof/>
             <w:webHidden/>
           </w:rPr>
-          <w:instrText xml:space="preserve"> PAGEREF _Toc243296762 \h </w:instrText>
+          <w:instrText xml:space="preserve"> PAGEREF _Toc243347057 \h </w:instrText>
         </w:r>
         <w:r>
           <w:rPr>
@@ -2280,7 +2267,7 @@
             <w:noProof/>
             <w:webHidden/>
           </w:rPr>
-          <w:t>8</w:t>
+          <w:t>9</w:t>
         </w:r>
         <w:r>
           <w:rPr>
@@ -2297,19 +2284,18 @@
         <w:rPr>
           <w:rFonts w:asciiTheme="minorHAnsi" w:eastAsiaTheme="minorEastAsia" w:hAnsiTheme="minorHAnsi"/>
           <w:noProof/>
-          <w:kern w:val="0"/>
-          <w:sz w:val="22"/>
+          <w:sz w:val="24"/>
+          <w:szCs w:val="24"/>
           <w:lang w:eastAsia="ru-RU"/>
-          <w14:ligatures w14:val="none"/>
-        </w:rPr>
-      </w:pPr>
-      <w:hyperlink w:anchor="_Toc243296763" w:history="1">
+        </w:rPr>
+      </w:pPr>
+      <w:hyperlink w:anchor="_Toc243347058" w:history="1">
         <w:r>
           <w:rPr>
             <w:rStyle w:val="af7"/>
             <w:noProof/>
           </w:rPr>
-          <w:t>Разграничение прав доступа пользователей</w:t>
+          <w:t>3.3 Разграничение прав доступа пользователей</w:t>
         </w:r>
         <w:r>
           <w:rPr>
@@ -2330,7 +2316,7 @@
             <w:noProof/>
             <w:webHidden/>
           </w:rPr>
-          <w:instrText xml:space="preserve"> PAGEREF _Toc243296763 \h </w:instrText>
+          <w:instrText xml:space="preserve"> PAGEREF _Toc243347058 \h </w:instrText>
         </w:r>
         <w:r>
           <w:rPr>
@@ -2350,7 +2336,7 @@
             <w:noProof/>
             <w:webHidden/>
           </w:rPr>
-          <w:t>8</w:t>
+          <w:t>9</w:t>
         </w:r>
         <w:r>
           <w:rPr>
@@ -2367,19 +2353,18 @@
         <w:rPr>
           <w:rFonts w:asciiTheme="minorHAnsi" w:eastAsiaTheme="minorEastAsia" w:hAnsiTheme="minorHAnsi"/>
           <w:noProof/>
-          <w:kern w:val="0"/>
-          <w:sz w:val="22"/>
+          <w:sz w:val="24"/>
+          <w:szCs w:val="24"/>
           <w:lang w:eastAsia="ru-RU"/>
-          <w14:ligatures w14:val="none"/>
-        </w:rPr>
-      </w:pPr>
-      <w:hyperlink w:anchor="_Toc243296764" w:history="1">
+        </w:rPr>
+      </w:pPr>
+      <w:hyperlink w:anchor="_Toc243347059" w:history="1">
         <w:r>
           <w:rPr>
             <w:rStyle w:val="af7"/>
             <w:noProof/>
           </w:rPr>
-          <w:t>Экспорт и импорт данных</w:t>
+          <w:t>3.4 Экспорт и импорт данных</w:t>
         </w:r>
         <w:r>
           <w:rPr>
@@ -2400,7 +2385,7 @@
             <w:noProof/>
             <w:webHidden/>
           </w:rPr>
-          <w:instrText xml:space="preserve"> PAGEREF _Toc243296764 \h </w:instrText>
+          <w:instrText xml:space="preserve"> PAGEREF _Toc243347059 \h </w:instrText>
         </w:r>
         <w:r>
           <w:rPr>
@@ -2420,7 +2405,7 @@
             <w:noProof/>
             <w:webHidden/>
           </w:rPr>
-          <w:t>8</w:t>
+          <w:t>9</w:t>
         </w:r>
         <w:r>
           <w:rPr>
@@ -2440,13 +2425,12 @@
         <w:rPr>
           <w:rFonts w:asciiTheme="minorHAnsi" w:eastAsiaTheme="minorEastAsia" w:hAnsiTheme="minorHAnsi"/>
           <w:noProof/>
-          <w:kern w:val="0"/>
-          <w:sz w:val="22"/>
+          <w:sz w:val="24"/>
+          <w:szCs w:val="24"/>
           <w:lang w:eastAsia="ru-RU"/>
-          <w14:ligatures w14:val="none"/>
-        </w:rPr>
-      </w:pPr>
-      <w:hyperlink w:anchor="_Toc243296765" w:history="1">
+        </w:rPr>
+      </w:pPr>
+      <w:hyperlink w:anchor="_Toc243347060" w:history="1">
         <w:r>
           <w:rPr>
             <w:rStyle w:val="af7"/>
@@ -2473,7 +2457,7 @@
             <w:noProof/>
             <w:webHidden/>
           </w:rPr>
-          <w:instrText xml:space="preserve"> PAGEREF _Toc243296765 \h </w:instrText>
+          <w:instrText xml:space="preserve"> PAGEREF _Toc243347060 \h </w:instrText>
         </w:r>
         <w:r>
           <w:rPr>
@@ -2493,7 +2477,7 @@
             <w:noProof/>
             <w:webHidden/>
           </w:rPr>
-          <w:t>9</w:t>
+          <w:t>10</w:t>
         </w:r>
         <w:r>
           <w:rPr>
@@ -2510,19 +2494,18 @@
         <w:rPr>
           <w:rFonts w:asciiTheme="minorHAnsi" w:eastAsiaTheme="minorEastAsia" w:hAnsiTheme="minorHAnsi"/>
           <w:noProof/>
-          <w:kern w:val="0"/>
-          <w:sz w:val="22"/>
+          <w:sz w:val="24"/>
+          <w:szCs w:val="24"/>
           <w:lang w:eastAsia="ru-RU"/>
-          <w14:ligatures w14:val="none"/>
-        </w:rPr>
-      </w:pPr>
-      <w:hyperlink w:anchor="_Toc243296766" w:history="1">
+        </w:rPr>
+      </w:pPr>
+      <w:hyperlink w:anchor="_Toc243347061" w:history="1">
         <w:r>
           <w:rPr>
             <w:rStyle w:val="af7"/>
             <w:noProof/>
           </w:rPr>
-          <w:t>Структурное тестирование</w:t>
+          <w:t>4.1 Структурное тестирование</w:t>
         </w:r>
         <w:r>
           <w:rPr>
@@ -2543,7 +2526,7 @@
             <w:noProof/>
             <w:webHidden/>
           </w:rPr>
-          <w:instrText xml:space="preserve"> PAGEREF _Toc243296766 \h </w:instrText>
+          <w:instrText xml:space="preserve"> PAGEREF _Toc243347061 \h </w:instrText>
         </w:r>
         <w:r>
           <w:rPr>
@@ -2563,7 +2546,7 @@
             <w:noProof/>
             <w:webHidden/>
           </w:rPr>
-          <w:t>9</w:t>
+          <w:t>10</w:t>
         </w:r>
         <w:r>
           <w:rPr>
@@ -2580,19 +2563,18 @@
         <w:rPr>
           <w:rFonts w:asciiTheme="minorHAnsi" w:eastAsiaTheme="minorEastAsia" w:hAnsiTheme="minorHAnsi"/>
           <w:noProof/>
-          <w:kern w:val="0"/>
-          <w:sz w:val="22"/>
+          <w:sz w:val="24"/>
+          <w:szCs w:val="24"/>
           <w:lang w:eastAsia="ru-RU"/>
-          <w14:ligatures w14:val="none"/>
-        </w:rPr>
-      </w:pPr>
-      <w:hyperlink w:anchor="_Toc243296767" w:history="1">
+        </w:rPr>
+      </w:pPr>
+      <w:hyperlink w:anchor="_Toc243347062" w:history="1">
         <w:r>
           <w:rPr>
             <w:rStyle w:val="af7"/>
             <w:noProof/>
           </w:rPr>
-          <w:t>Функциональное тестирование</w:t>
+          <w:t>4.2 Функциональное тестирование</w:t>
         </w:r>
         <w:r>
           <w:rPr>
@@ -2613,7 +2595,7 @@
             <w:noProof/>
             <w:webHidden/>
           </w:rPr>
-          <w:instrText xml:space="preserve"> PAGEREF _Toc243296767 \h </w:instrText>
+          <w:instrText xml:space="preserve"> PAGEREF _Toc243347062 \h </w:instrText>
         </w:r>
         <w:r>
           <w:rPr>
@@ -2633,7 +2615,7 @@
             <w:noProof/>
             <w:webHidden/>
           </w:rPr>
-          <w:t>9</w:t>
+          <w:t>10</w:t>
         </w:r>
         <w:r>
           <w:rPr>
@@ -2653,13 +2635,12 @@
         <w:rPr>
           <w:rFonts w:asciiTheme="minorHAnsi" w:eastAsiaTheme="minorEastAsia" w:hAnsiTheme="minorHAnsi"/>
           <w:noProof/>
-          <w:kern w:val="0"/>
-          <w:sz w:val="22"/>
+          <w:sz w:val="24"/>
+          <w:szCs w:val="24"/>
           <w:lang w:eastAsia="ru-RU"/>
-          <w14:ligatures w14:val="none"/>
-        </w:rPr>
-      </w:pPr>
-      <w:hyperlink w:anchor="_Toc243296768" w:history="1">
+        </w:rPr>
+      </w:pPr>
+      <w:hyperlink w:anchor="_Toc243347063" w:history="1">
         <w:r>
           <w:rPr>
             <w:rStyle w:val="af7"/>
@@ -2686,7 +2667,7 @@
             <w:noProof/>
             <w:webHidden/>
           </w:rPr>
-          <w:instrText xml:space="preserve"> PAGEREF _Toc243296768 \h </w:instrText>
+          <w:instrText xml:space="preserve"> PAGEREF _Toc243347063 \h </w:instrText>
         </w:r>
         <w:r>
           <w:rPr>
@@ -2706,7 +2687,7 @@
             <w:noProof/>
             <w:webHidden/>
           </w:rPr>
-          <w:t>10</w:t>
+          <w:t>11</w:t>
         </w:r>
         <w:r>
           <w:rPr>
@@ -2723,19 +2704,18 @@
         <w:rPr>
           <w:rFonts w:asciiTheme="minorHAnsi" w:eastAsiaTheme="minorEastAsia" w:hAnsiTheme="minorHAnsi"/>
           <w:noProof/>
-          <w:kern w:val="0"/>
-          <w:sz w:val="22"/>
+          <w:sz w:val="24"/>
+          <w:szCs w:val="24"/>
           <w:lang w:eastAsia="ru-RU"/>
-          <w14:ligatures w14:val="none"/>
-        </w:rPr>
-      </w:pPr>
-      <w:hyperlink w:anchor="_Toc243296769" w:history="1">
+        </w:rPr>
+      </w:pPr>
+      <w:hyperlink w:anchor="_Toc243347064" w:history="1">
         <w:r>
           <w:rPr>
             <w:rStyle w:val="af7"/>
             <w:noProof/>
           </w:rPr>
-          <w:t>Установка программного обеспечения</w:t>
+          <w:t>5.1 Установка программного обеспечения</w:t>
         </w:r>
         <w:r>
           <w:rPr>
@@ -2756,7 +2736,7 @@
             <w:noProof/>
             <w:webHidden/>
           </w:rPr>
-          <w:instrText xml:space="preserve"> PAGEREF _Toc243296769 \h </w:instrText>
+          <w:instrText xml:space="preserve"> PAGEREF _Toc243347064 \h </w:instrText>
         </w:r>
         <w:r>
           <w:rPr>
@@ -2776,7 +2756,7 @@
             <w:noProof/>
             <w:webHidden/>
           </w:rPr>
-          <w:t>10</w:t>
+          <w:t>11</w:t>
         </w:r>
         <w:r>
           <w:rPr>
@@ -2793,19 +2773,18 @@
         <w:rPr>
           <w:rFonts w:asciiTheme="minorHAnsi" w:eastAsiaTheme="minorEastAsia" w:hAnsiTheme="minorHAnsi"/>
           <w:noProof/>
-          <w:kern w:val="0"/>
-          <w:sz w:val="22"/>
+          <w:sz w:val="24"/>
+          <w:szCs w:val="24"/>
           <w:lang w:eastAsia="ru-RU"/>
-          <w14:ligatures w14:val="none"/>
-        </w:rPr>
-      </w:pPr>
-      <w:hyperlink w:anchor="_Toc243296770" w:history="1">
+        </w:rPr>
+      </w:pPr>
+      <w:hyperlink w:anchor="_Toc243347065" w:history="1">
         <w:r>
           <w:rPr>
             <w:rStyle w:val="af7"/>
             <w:noProof/>
           </w:rPr>
-          <w:t>Инструкция по работе</w:t>
+          <w:t>5.2 Инструкция по работе</w:t>
         </w:r>
         <w:r>
           <w:rPr>
@@ -2826,7 +2805,7 @@
             <w:noProof/>
             <w:webHidden/>
           </w:rPr>
-          <w:instrText xml:space="preserve"> PAGEREF _Toc243296770 \h </w:instrText>
+          <w:instrText xml:space="preserve"> PAGEREF _Toc243347065 \h </w:instrText>
         </w:r>
         <w:r>
           <w:rPr>
@@ -2846,7 +2825,7 @@
             <w:noProof/>
             <w:webHidden/>
           </w:rPr>
-          <w:t>10</w:t>
+          <w:t>11</w:t>
         </w:r>
         <w:r>
           <w:rPr>
@@ -2866,13 +2845,12 @@
         <w:rPr>
           <w:rFonts w:asciiTheme="minorHAnsi" w:eastAsiaTheme="minorEastAsia" w:hAnsiTheme="minorHAnsi"/>
           <w:noProof/>
-          <w:kern w:val="0"/>
-          <w:sz w:val="22"/>
+          <w:sz w:val="24"/>
+          <w:szCs w:val="24"/>
           <w:lang w:eastAsia="ru-RU"/>
-          <w14:ligatures w14:val="none"/>
-        </w:rPr>
-      </w:pPr>
-      <w:hyperlink w:anchor="_Toc243296771" w:history="1">
+        </w:rPr>
+      </w:pPr>
+      <w:hyperlink w:anchor="_Toc243347066" w:history="1">
         <w:r>
           <w:rPr>
             <w:rStyle w:val="af7"/>
@@ -2899,7 +2877,7 @@
             <w:noProof/>
             <w:webHidden/>
           </w:rPr>
-          <w:instrText xml:space="preserve"> PAGEREF _Toc243296771 \h </w:instrText>
+          <w:instrText xml:space="preserve"> PAGEREF _Toc243347066 \h </w:instrText>
         </w:r>
         <w:r>
           <w:rPr>
@@ -2919,7 +2897,7 @@
             <w:noProof/>
             <w:webHidden/>
           </w:rPr>
-          <w:t>11</w:t>
+          <w:t>12</w:t>
         </w:r>
         <w:r>
           <w:rPr>
@@ -2939,13 +2917,12 @@
         <w:rPr>
           <w:rFonts w:asciiTheme="minorHAnsi" w:eastAsiaTheme="minorEastAsia" w:hAnsiTheme="minorHAnsi"/>
           <w:noProof/>
-          <w:kern w:val="0"/>
-          <w:sz w:val="22"/>
+          <w:sz w:val="24"/>
+          <w:szCs w:val="24"/>
           <w:lang w:eastAsia="ru-RU"/>
-          <w14:ligatures w14:val="none"/>
-        </w:rPr>
-      </w:pPr>
-      <w:hyperlink w:anchor="_Toc243296772" w:history="1">
+        </w:rPr>
+      </w:pPr>
+      <w:hyperlink w:anchor="_Toc243347067" w:history="1">
         <w:r>
           <w:rPr>
             <w:rStyle w:val="af7"/>
@@ -2972,7 +2949,7 @@
             <w:noProof/>
             <w:webHidden/>
           </w:rPr>
-          <w:instrText xml:space="preserve"> PAGEREF _Toc243296772 \h </w:instrText>
+          <w:instrText xml:space="preserve"> PAGEREF _Toc243347067 \h </w:instrText>
         </w:r>
         <w:r>
           <w:rPr>
@@ -2992,7 +2969,7 @@
             <w:noProof/>
             <w:webHidden/>
           </w:rPr>
-          <w:t>12</w:t>
+          <w:t>14</w:t>
         </w:r>
         <w:r>
           <w:rPr>
@@ -3010,9 +2987,9 @@
     </w:p>
     <w:p>
       <w:pPr>
-        <w:pStyle w:val="a6"/>
-      </w:pPr>
-      <w:bookmarkStart w:id="0" w:name="_Toc243296750"/>
+        <w:pStyle w:val="a5"/>
+      </w:pPr>
+      <w:bookmarkStart w:id="0" w:name="_Toc243347045"/>
       <w:r>
         <w:lastRenderedPageBreak/>
         <w:t>Перечень сокращений и обозначений</w:t>
@@ -3021,7 +2998,7 @@
     </w:p>
     <w:p>
       <w:pPr>
-        <w:pStyle w:val="a7"/>
+        <w:pStyle w:val="a6"/>
       </w:pPr>
       <w:r>
         <w:t xml:space="preserve">В настоящем </w:t>
@@ -3041,7 +3018,7 @@
     </w:p>
     <w:p>
       <w:pPr>
-        <w:pStyle w:val="a7"/>
+        <w:pStyle w:val="a6"/>
       </w:pPr>
       <w:r>
         <w:t>БД – база данных</w:t>
@@ -3049,48 +3026,50 @@
     </w:p>
     <w:p>
       <w:pPr>
-        <w:pStyle w:val="a7"/>
-      </w:pPr>
-    </w:p>
-    <w:p>
-      <w:pPr>
-        <w:pStyle w:val="a7"/>
+        <w:pStyle w:val="a6"/>
+      </w:pPr>
+      <w:r>
+        <w:t>ПО</w:t>
+      </w:r>
+      <w:r>
+        <w:t xml:space="preserve"> – программное обеспечение</w:t>
+      </w:r>
+    </w:p>
+    <w:p>
+      <w:pPr>
+        <w:pStyle w:val="a6"/>
+      </w:pPr>
+    </w:p>
+    <w:p>
+      <w:pPr>
+        <w:pStyle w:val="a6"/>
       </w:pPr>
       <w:r>
         <w:rPr>
           <w:lang w:val="en-US"/>
         </w:rPr>
-        <w:t>UML</w:t>
-      </w:r>
-      <w:r>
-        <w:t xml:space="preserve"> – </w:t>
-      </w:r>
-      <w:r>
-        <w:t>унифицированный</w:t>
+        <w:t>API</w:t>
+      </w:r>
+      <w:r>
+        <w:t xml:space="preserve"> –</w:t>
       </w:r>
       <w:r>
         <w:t xml:space="preserve"> </w:t>
       </w:r>
       <w:r>
-        <w:t>язык</w:t>
-      </w:r>
-      <w:r>
-        <w:t xml:space="preserve"> </w:t>
-      </w:r>
-      <w:r>
-        <w:t>моделирования</w:t>
-      </w:r>
-    </w:p>
-    <w:p>
-      <w:pPr>
-        <w:pStyle w:val="a7"/>
-      </w:pPr>
+        <w:t>программный интерфейс приложения</w:t>
+      </w:r>
     </w:p>
     <w:p>
       <w:pPr>
         <w:pStyle w:val="a6"/>
       </w:pPr>
-      <w:bookmarkStart w:id="1" w:name="_Toc243296751"/>
+    </w:p>
+    <w:p>
+      <w:pPr>
+        <w:pStyle w:val="a5"/>
+      </w:pPr>
+      <w:bookmarkStart w:id="1" w:name="_Toc243347046"/>
       <w:r>
         <w:lastRenderedPageBreak/>
         <w:t>Введение</w:t>
@@ -3099,20 +3078,370 @@
     </w:p>
     <w:p>
       <w:pPr>
-        <w:pStyle w:val="a7"/>
-      </w:pPr>
-      <w:r>
-        <w:t xml:space="preserve">Краткое описание </w:t>
-      </w:r>
-      <w:r>
-        <w:t>курсового проекта, базы разработки и что вообще делаем.</w:t>
+        <w:pStyle w:val="a6"/>
+      </w:pPr>
+      <w:r>
+        <w:t xml:space="preserve">В ходе курсового проектирования требуется разработать </w:t>
+      </w:r>
+      <w:r>
+        <w:t>серверную и клиентскую части многопользовательского приложения, которое позволяет систематизировать хранение, просмотр и редактирование записей пользователя с возможностью работы в оффлайн-режиме и синхронизации записей между устройствами пользователя.</w:t>
+      </w:r>
+    </w:p>
+    <w:p>
+      <w:pPr>
+        <w:pStyle w:val="a6"/>
+      </w:pPr>
+      <w:r>
+        <w:t>Для достижения поставленной цели требуется выполнить следующие задачи:</w:t>
+      </w:r>
+    </w:p>
+    <w:p>
+      <w:pPr>
+        <w:pStyle w:val="af5"/>
+        <w:numPr>
+          <w:ilvl w:val="0"/>
+          <w:numId w:val="3"/>
+        </w:numPr>
+        <w:tabs>
+          <w:tab w:val="clear" w:pos="1134"/>
+          <w:tab w:val="num" w:pos="992"/>
+        </w:tabs>
+        <w:ind w:left="0"/>
+      </w:pPr>
+      <w:r>
+        <w:t xml:space="preserve">изучить особенности </w:t>
+      </w:r>
+      <w:r>
+        <w:t>программ, позволяющих вести заметки, потребности пользователей, выделить сущности</w:t>
+      </w:r>
+      <w:r>
+        <w:t>;</w:t>
+      </w:r>
+    </w:p>
+    <w:p>
+      <w:pPr>
+        <w:pStyle w:val="af5"/>
+        <w:numPr>
+          <w:ilvl w:val="0"/>
+          <w:numId w:val="3"/>
+        </w:numPr>
+        <w:tabs>
+          <w:tab w:val="clear" w:pos="1134"/>
+          <w:tab w:val="num" w:pos="992"/>
+        </w:tabs>
+        <w:ind w:left="0"/>
+      </w:pPr>
+      <w:r>
+        <w:t xml:space="preserve">спроектировать диаграмму </w:t>
+      </w:r>
+      <w:r>
+        <w:t>классов</w:t>
+      </w:r>
+      <w:r>
+        <w:t>;</w:t>
+      </w:r>
+    </w:p>
+    <w:p>
+      <w:pPr>
+        <w:pStyle w:val="af5"/>
+        <w:numPr>
+          <w:ilvl w:val="0"/>
+          <w:numId w:val="3"/>
+        </w:numPr>
+        <w:tabs>
+          <w:tab w:val="clear" w:pos="1134"/>
+          <w:tab w:val="num" w:pos="992"/>
+        </w:tabs>
+        <w:ind w:left="0"/>
+      </w:pPr>
+      <w:r>
+        <w:t>спроектировать диаграмму пакетов;</w:t>
+      </w:r>
+    </w:p>
+    <w:p>
+      <w:pPr>
+        <w:pStyle w:val="af5"/>
+        <w:numPr>
+          <w:ilvl w:val="0"/>
+          <w:numId w:val="3"/>
+        </w:numPr>
+        <w:tabs>
+          <w:tab w:val="clear" w:pos="1134"/>
+          <w:tab w:val="num" w:pos="992"/>
+        </w:tabs>
+        <w:ind w:left="0"/>
+      </w:pPr>
+      <w:r>
+        <w:t>спроектировать диаграмма развертывания;</w:t>
+      </w:r>
+    </w:p>
+    <w:p>
+      <w:pPr>
+        <w:pStyle w:val="af5"/>
+        <w:numPr>
+          <w:ilvl w:val="0"/>
+          <w:numId w:val="3"/>
+        </w:numPr>
+        <w:tabs>
+          <w:tab w:val="clear" w:pos="1134"/>
+          <w:tab w:val="num" w:pos="992"/>
+        </w:tabs>
+        <w:ind w:left="0"/>
+      </w:pPr>
+      <w:r>
+        <w:t xml:space="preserve">спроектировать модель </w:t>
+      </w:r>
+      <w:r>
+        <w:t>пользовательского интерфейса;</w:t>
+      </w:r>
+    </w:p>
+    <w:p>
+      <w:pPr>
+        <w:pStyle w:val="af5"/>
+        <w:numPr>
+          <w:ilvl w:val="0"/>
+          <w:numId w:val="3"/>
+        </w:numPr>
+        <w:tabs>
+          <w:tab w:val="clear" w:pos="1134"/>
+          <w:tab w:val="num" w:pos="992"/>
+        </w:tabs>
+        <w:ind w:left="0"/>
+      </w:pPr>
+      <w:r>
+        <w:t>спроектировать физическую модель БД;</w:t>
+      </w:r>
+    </w:p>
+    <w:p>
+      <w:pPr>
+        <w:pStyle w:val="af5"/>
+        <w:numPr>
+          <w:ilvl w:val="0"/>
+          <w:numId w:val="3"/>
+        </w:numPr>
+        <w:tabs>
+          <w:tab w:val="clear" w:pos="1134"/>
+          <w:tab w:val="num" w:pos="992"/>
+        </w:tabs>
+        <w:ind w:left="0"/>
+      </w:pPr>
+      <w:r>
+        <w:t>разработать локальную и удалённую БД для хранения данных;</w:t>
+      </w:r>
+    </w:p>
+    <w:p>
+      <w:pPr>
+        <w:pStyle w:val="af5"/>
+        <w:numPr>
+          <w:ilvl w:val="0"/>
+          <w:numId w:val="3"/>
+        </w:numPr>
+        <w:tabs>
+          <w:tab w:val="clear" w:pos="1134"/>
+          <w:tab w:val="num" w:pos="992"/>
+        </w:tabs>
+        <w:ind w:left="0"/>
+      </w:pPr>
+      <w:r>
+        <w:t>разработать веб-API;</w:t>
+      </w:r>
+    </w:p>
+    <w:p>
+      <w:pPr>
+        <w:pStyle w:val="af5"/>
+        <w:numPr>
+          <w:ilvl w:val="0"/>
+          <w:numId w:val="3"/>
+        </w:numPr>
+        <w:tabs>
+          <w:tab w:val="clear" w:pos="1134"/>
+          <w:tab w:val="num" w:pos="992"/>
+        </w:tabs>
+        <w:ind w:left="0"/>
+      </w:pPr>
+      <w:r>
+        <w:t>разработать программный модуль мобильного приложения;</w:t>
+      </w:r>
+    </w:p>
+    <w:p>
+      <w:pPr>
+        <w:pStyle w:val="af5"/>
+        <w:numPr>
+          <w:ilvl w:val="0"/>
+          <w:numId w:val="3"/>
+        </w:numPr>
+        <w:tabs>
+          <w:tab w:val="clear" w:pos="1134"/>
+          <w:tab w:val="num" w:pos="992"/>
+        </w:tabs>
+        <w:ind w:left="0"/>
+      </w:pPr>
+      <w:r>
+        <w:t>реализовать разграничение прав доступа пользователей;</w:t>
+      </w:r>
+    </w:p>
+    <w:p>
+      <w:pPr>
+        <w:pStyle w:val="af5"/>
+        <w:numPr>
+          <w:ilvl w:val="0"/>
+          <w:numId w:val="3"/>
+        </w:numPr>
+        <w:tabs>
+          <w:tab w:val="clear" w:pos="1134"/>
+          <w:tab w:val="num" w:pos="992"/>
+        </w:tabs>
+        <w:ind w:left="0"/>
+      </w:pPr>
+      <w:r>
+        <w:t>реализовать фильтрацию, поиск и сортировку записей пользователя;</w:t>
+      </w:r>
+    </w:p>
+    <w:p>
+      <w:pPr>
+        <w:pStyle w:val="af5"/>
+        <w:numPr>
+          <w:ilvl w:val="0"/>
+          <w:numId w:val="3"/>
+        </w:numPr>
+        <w:tabs>
+          <w:tab w:val="clear" w:pos="1134"/>
+          <w:tab w:val="num" w:pos="992"/>
+        </w:tabs>
+        <w:ind w:left="0"/>
+      </w:pPr>
+      <w:r>
+        <w:t>реализовать защиту данных;</w:t>
+      </w:r>
+    </w:p>
+    <w:p>
+      <w:pPr>
+        <w:pStyle w:val="af5"/>
+        <w:numPr>
+          <w:ilvl w:val="0"/>
+          <w:numId w:val="3"/>
+        </w:numPr>
+        <w:tabs>
+          <w:tab w:val="clear" w:pos="1134"/>
+          <w:tab w:val="num" w:pos="992"/>
+        </w:tabs>
+        <w:ind w:left="0"/>
+      </w:pPr>
+      <w:r>
+        <w:t>выполнить тестирование и отладку ПО и проанализировать результаты тестирования;</w:t>
+      </w:r>
+    </w:p>
+    <w:p>
+      <w:pPr>
+        <w:pStyle w:val="af5"/>
+        <w:numPr>
+          <w:ilvl w:val="0"/>
+          <w:numId w:val="3"/>
+        </w:numPr>
+        <w:tabs>
+          <w:tab w:val="clear" w:pos="1134"/>
+          <w:tab w:val="num" w:pos="992"/>
+        </w:tabs>
+        <w:ind w:left="0"/>
+      </w:pPr>
+      <w:r>
+        <w:t>разработать программную и эксплуатационную документацию;</w:t>
+      </w:r>
+    </w:p>
+    <w:p>
+      <w:pPr>
+        <w:pStyle w:val="af5"/>
+        <w:numPr>
+          <w:ilvl w:val="0"/>
+          <w:numId w:val="3"/>
+        </w:numPr>
+        <w:tabs>
+          <w:tab w:val="clear" w:pos="1134"/>
+          <w:tab w:val="num" w:pos="992"/>
+        </w:tabs>
+        <w:ind w:left="0"/>
+      </w:pPr>
+      <w:r>
+        <w:t>систематизировать и закрепить полученные теоретические знания в соответствии с заданной темой;</w:t>
+      </w:r>
+    </w:p>
+    <w:p>
+      <w:pPr>
+        <w:pStyle w:val="af5"/>
+        <w:numPr>
+          <w:ilvl w:val="0"/>
+          <w:numId w:val="3"/>
+        </w:numPr>
+        <w:tabs>
+          <w:tab w:val="clear" w:pos="1134"/>
+          <w:tab w:val="num" w:pos="992"/>
+        </w:tabs>
+        <w:ind w:left="0"/>
+      </w:pPr>
+      <w:r>
+        <w:t xml:space="preserve">систематизировать и закрепить полученные теоретические знания и практические умения по общепрофессиональным и специальным </w:t>
+      </w:r>
+      <w:r>
+        <w:lastRenderedPageBreak/>
+        <w:t>дисциплинам специальности «09.02.07 – Информационные системы и программирование»;</w:t>
+      </w:r>
+    </w:p>
+    <w:p>
+      <w:pPr>
+        <w:pStyle w:val="af5"/>
+        <w:numPr>
+          <w:ilvl w:val="0"/>
+          <w:numId w:val="3"/>
+        </w:numPr>
+        <w:tabs>
+          <w:tab w:val="clear" w:pos="1134"/>
+          <w:tab w:val="num" w:pos="992"/>
+        </w:tabs>
+        <w:ind w:left="0"/>
+      </w:pPr>
+      <w:r>
+        <w:t>углубить теоретические знания в соответствии в заданной темой;</w:t>
+      </w:r>
+    </w:p>
+    <w:p>
+      <w:pPr>
+        <w:pStyle w:val="af5"/>
+        <w:numPr>
+          <w:ilvl w:val="0"/>
+          <w:numId w:val="3"/>
+        </w:numPr>
+        <w:tabs>
+          <w:tab w:val="clear" w:pos="1134"/>
+          <w:tab w:val="num" w:pos="992"/>
+        </w:tabs>
+        <w:ind w:left="0"/>
+      </w:pPr>
+      <w:r>
+        <w:t>сформировать умения применять теоретические знания при решении поставленных вопросов;</w:t>
+      </w:r>
+    </w:p>
+    <w:p>
+      <w:pPr>
+        <w:pStyle w:val="af5"/>
+        <w:numPr>
+          <w:ilvl w:val="0"/>
+          <w:numId w:val="3"/>
+        </w:numPr>
+        <w:tabs>
+          <w:tab w:val="clear" w:pos="1134"/>
+          <w:tab w:val="num" w:pos="992"/>
+        </w:tabs>
+        <w:ind w:left="0"/>
+      </w:pPr>
+      <w:r>
+        <w:t>сформировать умения использовать справочную и нормативную документацию.</w:t>
       </w:r>
     </w:p>
     <w:p>
       <w:pPr>
         <w:pStyle w:val="1"/>
       </w:pPr>
-      <w:bookmarkStart w:id="2" w:name="_Toc243296752"/>
+      <w:bookmarkStart w:id="2" w:name="_Toc243347047"/>
       <w:r>
         <w:lastRenderedPageBreak/>
         <w:t>Анализ и разработка требований</w:t>
@@ -3123,294 +3452,236 @@
       <w:pPr>
         <w:pStyle w:val="2"/>
       </w:pPr>
-      <w:bookmarkStart w:id="3" w:name="_Toc243296753"/>
-      <w:r>
-        <w:t>Назначение и область применения</w:t>
+      <w:bookmarkStart w:id="3" w:name="_Toc243347048"/>
+      <w:r>
+        <w:t>Назначение</w:t>
+      </w:r>
+      <w:r>
+        <w:t xml:space="preserve"> и область применения</w:t>
       </w:r>
       <w:bookmarkEnd w:id="3"/>
     </w:p>
     <w:p>
       <w:pPr>
-        <w:pStyle w:val="a7"/>
+        <w:pStyle w:val="a6"/>
+      </w:pPr>
+      <w:r>
+        <w:t>ПО предназначено для личного использования любой категории людей.</w:t>
+      </w:r>
+    </w:p>
+    <w:p>
+      <w:pPr>
+        <w:pStyle w:val="a6"/>
+      </w:pPr>
+    </w:p>
+    <w:p>
+      <w:pPr>
+        <w:pStyle w:val="a6"/>
+      </w:pPr>
+      <w:r>
+        <w:t>1. Владелец базы;</w:t>
+      </w:r>
+    </w:p>
+    <w:p>
+      <w:pPr>
+        <w:pStyle w:val="a6"/>
+      </w:pPr>
+      <w:r>
+        <w:t>2. Администратор базы;</w:t>
+      </w:r>
+    </w:p>
+    <w:p>
+      <w:pPr>
+        <w:pStyle w:val="a6"/>
+      </w:pPr>
+      <w:r>
+        <w:t>3. Зритель;</w:t>
+      </w:r>
+    </w:p>
+    <w:p>
+      <w:pPr>
+        <w:pStyle w:val="a6"/>
+      </w:pPr>
+      <w:r>
+        <w:t>4. Неавторизованный пользователь.</w:t>
+      </w:r>
+    </w:p>
+    <w:p>
+      <w:pPr>
+        <w:pStyle w:val="a6"/>
+      </w:pPr>
+    </w:p>
+    <w:p>
+      <w:pPr>
+        <w:pStyle w:val="a6"/>
+      </w:pPr>
+      <w:r>
+        <w:t>- Ведение записей;</w:t>
+      </w:r>
+    </w:p>
+    <w:p>
+      <w:pPr>
+        <w:pStyle w:val="a6"/>
+      </w:pPr>
+      <w:r>
+        <w:t>- Разделение записей по категориям;</w:t>
+      </w:r>
+    </w:p>
+    <w:p>
+      <w:pPr>
+        <w:pStyle w:val="a6"/>
+      </w:pPr>
+      <w:r>
+        <w:t>- Фильтрация записей по категориям;</w:t>
+      </w:r>
+    </w:p>
+    <w:p>
+      <w:pPr>
+        <w:pStyle w:val="a6"/>
+      </w:pPr>
+      <w:r>
+        <w:t>- Поиск записи по названию;</w:t>
+      </w:r>
+    </w:p>
+    <w:p>
+      <w:pPr>
+        <w:pStyle w:val="a6"/>
+      </w:pPr>
+      <w:r>
+        <w:t>- Архивация записей;</w:t>
+      </w:r>
+    </w:p>
+    <w:p>
+      <w:pPr>
+        <w:pStyle w:val="a6"/>
+      </w:pPr>
+      <w:r>
+        <w:t>- Синхронизация записей между устройствами;</w:t>
+      </w:r>
+    </w:p>
+    <w:p>
+      <w:pPr>
+        <w:pStyle w:val="a6"/>
         <w:rPr>
           <w:lang w:val="en-US"/>
         </w:rPr>
       </w:pPr>
       <w:r>
-        <w:rPr>
-          <w:lang w:val="en-US"/>
-        </w:rPr>
+        <w:t>- Возможность предоставлять доступ к записи другим пользователям для разных целей (только просмотр или редактирование, полное владение).</w:t>
+      </w:r>
+    </w:p>
+    <w:p>
+      <w:pPr>
+        <w:pStyle w:val="2"/>
+      </w:pPr>
+      <w:bookmarkStart w:id="4" w:name="_Toc243347049"/>
+      <w:r>
+        <w:t>Постановка задачи</w:t>
+      </w:r>
+      <w:bookmarkEnd w:id="4"/>
+    </w:p>
+    <w:p>
+      <w:pPr>
+        <w:pStyle w:val="a6"/>
+      </w:pPr>
+      <w:r>
         <w:t>Систематизация и хранение идей или подробных записей, заметки синхронизируются между всеми устройствами, что позволит упростить перенос идей между устройствами. Сократит время поиска нужной информации за счёт группировок, фильтрации и поиска, а также снизит риск потери данных среди разрозненных файлов.</w:t>
       </w:r>
     </w:p>
     <w:p>
       <w:pPr>
-        <w:pStyle w:val="a7"/>
-        <w:rPr>
-          <w:lang w:val="en-US"/>
-        </w:rPr>
-      </w:pPr>
-    </w:p>
-    <w:p>
-      <w:pPr>
-        <w:pStyle w:val="a7"/>
-        <w:rPr>
-          <w:lang w:val="en-US"/>
-        </w:rPr>
-      </w:pPr>
-      <w:r>
-        <w:rPr>
-          <w:lang w:val="en-US"/>
-        </w:rPr>
-        <w:t>ПО предназначено для личного использования любой категории людей.</w:t>
-      </w:r>
-    </w:p>
-    <w:p>
-      <w:pPr>
-        <w:pStyle w:val="a7"/>
-        <w:rPr>
-          <w:lang w:val="en-US"/>
-        </w:rPr>
-      </w:pPr>
-    </w:p>
-    <w:p>
-      <w:pPr>
-        <w:pStyle w:val="a7"/>
-        <w:rPr>
-          <w:lang w:val="en-US"/>
-        </w:rPr>
-      </w:pPr>
-      <w:r>
-        <w:rPr>
-          <w:lang w:val="en-US"/>
-        </w:rPr>
-        <w:t>1. Владелец базы;</w:t>
-      </w:r>
-    </w:p>
-    <w:p>
-      <w:pPr>
-        <w:pStyle w:val="a7"/>
-        <w:rPr>
-          <w:lang w:val="en-US"/>
-        </w:rPr>
-      </w:pPr>
-      <w:r>
-        <w:rPr>
-          <w:lang w:val="en-US"/>
-        </w:rPr>
-        <w:t>2. Администратор базы;</w:t>
-      </w:r>
-    </w:p>
-    <w:p>
-      <w:pPr>
-        <w:pStyle w:val="a7"/>
-        <w:rPr>
-          <w:lang w:val="en-US"/>
-        </w:rPr>
-      </w:pPr>
-      <w:r>
-        <w:rPr>
-          <w:lang w:val="en-US"/>
-        </w:rPr>
-        <w:t>3. Зритель;</w:t>
-      </w:r>
-    </w:p>
-    <w:p>
-      <w:pPr>
-        <w:pStyle w:val="a7"/>
-        <w:rPr>
-          <w:lang w:val="en-US"/>
-        </w:rPr>
-      </w:pPr>
-      <w:r>
-        <w:rPr>
-          <w:lang w:val="en-US"/>
-        </w:rPr>
-        <w:t>4. Неавторизованный пользователь.</w:t>
-      </w:r>
-    </w:p>
-    <w:p>
-      <w:pPr>
-        <w:pStyle w:val="a7"/>
-        <w:rPr>
-          <w:lang w:val="en-US"/>
-        </w:rPr>
-      </w:pPr>
-    </w:p>
-    <w:p>
-      <w:pPr>
-        <w:pStyle w:val="a7"/>
-        <w:rPr>
-          <w:lang w:val="en-US"/>
-        </w:rPr>
-      </w:pPr>
-      <w:r>
-        <w:rPr>
-          <w:lang w:val="en-US"/>
-        </w:rPr>
-        <w:t>- Ведение записей;</w:t>
-      </w:r>
-    </w:p>
-    <w:p>
-      <w:pPr>
-        <w:pStyle w:val="a7"/>
-        <w:rPr>
-          <w:lang w:val="en-US"/>
-        </w:rPr>
-      </w:pPr>
-      <w:r>
-        <w:rPr>
-          <w:lang w:val="en-US"/>
-        </w:rPr>
-        <w:t>- Разделение записей по категориям;</w:t>
-      </w:r>
-    </w:p>
-    <w:p>
-      <w:pPr>
-        <w:pStyle w:val="a7"/>
-        <w:rPr>
-          <w:lang w:val="en-US"/>
-        </w:rPr>
-      </w:pPr>
-      <w:r>
-        <w:rPr>
-          <w:lang w:val="en-US"/>
-        </w:rPr>
-        <w:t>- Фильтрация записей по категориям;</w:t>
-      </w:r>
-    </w:p>
-    <w:p>
-      <w:pPr>
-        <w:pStyle w:val="a7"/>
-        <w:rPr>
-          <w:lang w:val="en-US"/>
-        </w:rPr>
-      </w:pPr>
-      <w:r>
-        <w:rPr>
-          <w:lang w:val="en-US"/>
-        </w:rPr>
-        <w:t>- Поиск записи по названию;</w:t>
-      </w:r>
-    </w:p>
-    <w:p>
-      <w:pPr>
-        <w:pStyle w:val="a7"/>
-        <w:rPr>
-          <w:lang w:val="en-US"/>
-        </w:rPr>
-      </w:pPr>
-      <w:r>
-        <w:rPr>
-          <w:lang w:val="en-US"/>
-        </w:rPr>
-        <w:t>- Архивация записей;</w:t>
-      </w:r>
-    </w:p>
-    <w:p>
-      <w:pPr>
-        <w:pStyle w:val="a7"/>
-        <w:rPr>
-          <w:lang w:val="en-US"/>
-        </w:rPr>
-      </w:pPr>
-      <w:r>
-        <w:rPr>
-          <w:lang w:val="en-US"/>
-        </w:rPr>
-        <w:t>- Синхронизация записей между устройствами;</w:t>
-      </w:r>
-    </w:p>
-    <w:p>
-      <w:pPr>
-        <w:pStyle w:val="a7"/>
-        <w:rPr>
-          <w:lang w:val="en-US"/>
-        </w:rPr>
-      </w:pPr>
-      <w:r>
-        <w:rPr>
-          <w:lang w:val="en-US"/>
-        </w:rPr>
-        <w:t>- Возможность предоставлять доступ к записи другим пользователям для разных целей (только просмотр или редактирование, полное владение).</w:t>
-      </w:r>
-    </w:p>
-    <w:p>
-      <w:pPr>
-        <w:pStyle w:val="a7"/>
-        <w:rPr>
-          <w:lang w:val="en-US"/>
-        </w:rPr>
-      </w:pPr>
-    </w:p>
-    <w:p>
-      <w:pPr>
-        <w:pStyle w:val="a7"/>
-        <w:rPr>
-          <w:lang w:val="en-US"/>
-        </w:rPr>
-      </w:pPr>
-      <w:r>
-        <w:rPr>
-          <w:lang w:val="en-US"/>
-        </w:rPr>
+        <w:pStyle w:val="a6"/>
+      </w:pPr>
+      <w:r>
         <w:t>1. Неавторизованный пользователь может локально развернуть базу на своём устройстве, без возможности синхронизации</w:t>
       </w:r>
     </w:p>
     <w:p>
       <w:pPr>
-        <w:pStyle w:val="a7"/>
-        <w:rPr>
-          <w:lang w:val="en-US"/>
-        </w:rPr>
-      </w:pPr>
-      <w:r>
-        <w:rPr>
-          <w:lang w:val="en-US"/>
-        </w:rPr>
+        <w:pStyle w:val="a6"/>
+      </w:pPr>
+      <w:r>
         <w:lastRenderedPageBreak/>
         <w:t>2. Обычный пользователь может редактировать собственные записи или доступные ему, создавать новые, настраивать доступ к свои записям или записям, где он является администратором.</w:t>
       </w:r>
     </w:p>
     <w:p>
       <w:pPr>
-        <w:pStyle w:val="a7"/>
+        <w:pStyle w:val="a6"/>
+      </w:pPr>
+      <w:r>
+        <w:t>3. Зритель может просматривать записи, для которых настроены соответствующие права доступа.</w:t>
+      </w:r>
+    </w:p>
+    <w:p>
+      <w:pPr>
+        <w:pStyle w:val="a6"/>
+      </w:pPr>
+      <w:r>
+        <w:t>4. Администратор может редактировать доступные записи, изменять права доступа</w:t>
+      </w:r>
+    </w:p>
+    <w:p>
+      <w:pPr>
+        <w:pStyle w:val="a6"/>
+      </w:pPr>
+    </w:p>
+    <w:p>
+      <w:pPr>
+        <w:pStyle w:val="a6"/>
+      </w:pPr>
+      <w:r>
+        <w:t xml:space="preserve">Мобильное - </w:t>
+      </w:r>
+      <w:r>
         <w:rPr>
           <w:lang w:val="en-US"/>
         </w:rPr>
-      </w:pPr>
+        <w:t>Android</w:t>
+      </w:r>
+      <w:r>
+        <w:t xml:space="preserve"> </w:t>
+      </w:r>
       <w:r>
         <w:rPr>
           <w:lang w:val="en-US"/>
         </w:rPr>
-        <w:t>3. Зритель может просматривать записи, для которых настроены соответствующие права доступа.</w:t>
-      </w:r>
-    </w:p>
-    <w:p>
-      <w:pPr>
-        <w:pStyle w:val="a7"/>
+        <w:t>Studio</w:t>
+      </w:r>
+      <w:r>
+        <w:t xml:space="preserve"> (язык: </w:t>
+      </w:r>
+      <w:r>
         <w:rPr>
           <w:lang w:val="en-US"/>
         </w:rPr>
-      </w:pPr>
+        <w:t>Kotlin</w:t>
+      </w:r>
+      <w:r>
+        <w:t xml:space="preserve">,  фреймворки: </w:t>
+      </w:r>
       <w:r>
         <w:rPr>
           <w:lang w:val="en-US"/>
         </w:rPr>
-        <w:t>4. Администратор может редактировать доступные записи, изменять права доступа</w:t>
-      </w:r>
-    </w:p>
-    <w:p>
-      <w:pPr>
-        <w:pStyle w:val="a7"/>
+        <w:t>Jetpack</w:t>
+      </w:r>
+      <w:r>
+        <w:t xml:space="preserve"> </w:t>
+      </w:r>
+      <w:r>
         <w:rPr>
           <w:lang w:val="en-US"/>
         </w:rPr>
-      </w:pPr>
-    </w:p>
-    <w:p>
-      <w:pPr>
-        <w:pStyle w:val="a7"/>
+        <w:t>Compose</w:t>
+      </w:r>
+      <w:r>
+        <w:t>)</w:t>
+      </w:r>
+    </w:p>
+    <w:p>
+      <w:pPr>
+        <w:pStyle w:val="a6"/>
         <w:rPr>
           <w:lang w:val="en-US"/>
         </w:rPr>
@@ -3419,205 +3690,72 @@
         <w:rPr>
           <w:lang w:val="en-US"/>
         </w:rPr>
-        <w:t xml:space="preserve">Мобильное - </w:t>
-      </w:r>
-      <w:proofErr w:type="spellStart"/>
+        <w:t>Оконное</w:t>
+      </w:r>
       <w:r>
         <w:rPr>
           <w:lang w:val="en-US"/>
         </w:rPr>
-        <w:t>Android</w:t>
-      </w:r>
-      <w:proofErr w:type="spellEnd"/>
+        <w:t xml:space="preserve"> - Visual Studio (</w:t>
+      </w:r>
       <w:r>
         <w:rPr>
           <w:lang w:val="en-US"/>
         </w:rPr>
-        <w:t xml:space="preserve"> Studio (язык: </w:t>
-      </w:r>
-      <w:proofErr w:type="spellStart"/>
-      <w:proofErr w:type="gramStart"/>
+        <w:t>язык</w:t>
+      </w:r>
       <w:r>
         <w:rPr>
           <w:lang w:val="en-US"/>
         </w:rPr>
-        <w:t>Kotlin</w:t>
-      </w:r>
-      <w:proofErr w:type="spellEnd"/>
+        <w:t xml:space="preserve">: C#, </w:t>
+      </w:r>
       <w:r>
         <w:rPr>
           <w:lang w:val="en-US"/>
         </w:rPr>
-        <w:t xml:space="preserve">,  </w:t>
-      </w:r>
-      <w:proofErr w:type="spellStart"/>
+        <w:t>фреймворки</w:t>
+      </w:r>
       <w:r>
         <w:rPr>
           <w:lang w:val="en-US"/>
         </w:rPr>
-        <w:t>фреймворки</w:t>
-      </w:r>
-      <w:proofErr w:type="spellEnd"/>
-      <w:proofErr w:type="gramEnd"/>
-      <w:r>
+        <w:t>: Avalonia)</w:t>
+      </w:r>
+    </w:p>
+    <w:p>
+      <w:pPr>
+        <w:pStyle w:val="a6"/>
         <w:rPr>
           <w:lang w:val="en-US"/>
         </w:rPr>
-        <w:t xml:space="preserve">: </w:t>
-      </w:r>
-      <w:proofErr w:type="spellStart"/>
+      </w:pPr>
       <w:r>
         <w:rPr>
           <w:lang w:val="en-US"/>
         </w:rPr>
-        <w:t>Jetpack</w:t>
-      </w:r>
-      <w:proofErr w:type="spellEnd"/>
-      <w:r>
+        <w:t>База данных - MySql, SQLite.</w:t>
+      </w:r>
+    </w:p>
+    <w:p>
+      <w:pPr>
+        <w:pStyle w:val="a6"/>
         <w:rPr>
           <w:lang w:val="en-US"/>
         </w:rPr>
-        <w:t xml:space="preserve"> </w:t>
-      </w:r>
-      <w:proofErr w:type="spellStart"/>
+      </w:pPr>
       <w:r>
         <w:rPr>
           <w:lang w:val="en-US"/>
         </w:rPr>
-        <w:t>Compose</w:t>
-      </w:r>
-      <w:proofErr w:type="spellEnd"/>
-      <w:r>
-        <w:rPr>
-          <w:lang w:val="en-US"/>
-        </w:rPr>
-        <w:t>)</w:t>
-      </w:r>
-    </w:p>
-    <w:p>
-      <w:pPr>
-        <w:pStyle w:val="a7"/>
-        <w:rPr>
-          <w:lang w:val="en-US"/>
-        </w:rPr>
-      </w:pPr>
-      <w:r>
-        <w:rPr>
-          <w:lang w:val="en-US"/>
-        </w:rPr>
-        <w:t>Оконное</w:t>
-      </w:r>
-      <w:r>
-        <w:rPr>
-          <w:lang w:val="en-US"/>
-        </w:rPr>
-        <w:t xml:space="preserve"> - Visual Studio (</w:t>
-      </w:r>
-      <w:r>
-        <w:rPr>
-          <w:lang w:val="en-US"/>
-        </w:rPr>
-        <w:t>язык</w:t>
-      </w:r>
-      <w:r>
-        <w:rPr>
-          <w:lang w:val="en-US"/>
-        </w:rPr>
-        <w:t xml:space="preserve">: C#, </w:t>
-      </w:r>
-      <w:proofErr w:type="spellStart"/>
-      <w:r>
-        <w:rPr>
-          <w:lang w:val="en-US"/>
-        </w:rPr>
-        <w:t>фреймворки</w:t>
-      </w:r>
-      <w:proofErr w:type="spellEnd"/>
-      <w:r>
-        <w:rPr>
-          <w:lang w:val="en-US"/>
-        </w:rPr>
-        <w:t>: Avalonia)</w:t>
-      </w:r>
-    </w:p>
-    <w:p>
-      <w:pPr>
-        <w:pStyle w:val="a7"/>
-        <w:rPr>
-          <w:lang w:val="en-US"/>
-        </w:rPr>
-      </w:pPr>
-      <w:proofErr w:type="spellStart"/>
-      <w:r>
-        <w:rPr>
-          <w:lang w:val="en-US"/>
-        </w:rPr>
-        <w:t>База</w:t>
-      </w:r>
-      <w:proofErr w:type="spellEnd"/>
-      <w:r>
-        <w:rPr>
-          <w:lang w:val="en-US"/>
-        </w:rPr>
-        <w:t xml:space="preserve"> </w:t>
-      </w:r>
-      <w:proofErr w:type="spellStart"/>
-      <w:r>
-        <w:rPr>
-          <w:lang w:val="en-US"/>
-        </w:rPr>
-        <w:t>данных</w:t>
-      </w:r>
-      <w:proofErr w:type="spellEnd"/>
-      <w:r>
-        <w:rPr>
-          <w:lang w:val="en-US"/>
-        </w:rPr>
-        <w:t xml:space="preserve"> - MySql, SQLite.</w:t>
-      </w:r>
-    </w:p>
-    <w:p>
-      <w:pPr>
-        <w:pStyle w:val="a7"/>
-        <w:rPr>
-          <w:lang w:val="en-US"/>
-        </w:rPr>
-      </w:pPr>
-      <w:r>
-        <w:rPr>
-          <w:lang w:val="en-US"/>
-        </w:rPr>
         <w:t>API - ASP .NET API (С#).</w:t>
       </w:r>
     </w:p>
     <w:p>
       <w:pPr>
-        <w:pStyle w:val="a7"/>
-        <w:rPr>
-          <w:lang w:val="en-US"/>
-        </w:rPr>
-      </w:pPr>
-    </w:p>
-    <w:p>
-      <w:pPr>
         <w:pStyle w:val="2"/>
       </w:pPr>
-      <w:bookmarkStart w:id="4" w:name="_Toc243296754"/>
-      <w:r>
-        <w:t>Постановка задачи</w:t>
-      </w:r>
-      <w:bookmarkEnd w:id="4"/>
-    </w:p>
-    <w:p>
-      <w:pPr>
-        <w:pStyle w:val="a7"/>
-      </w:pPr>
-    </w:p>
-    <w:p>
-      <w:pPr>
-        <w:pStyle w:val="2"/>
-      </w:pPr>
-      <w:bookmarkStart w:id="5" w:name="_Toc243296755"/>
+      <w:bookmarkStart w:id="5" w:name="_Toc243347050"/>
       <w:r>
         <w:t>Выбор состава программных и технических</w:t>
       </w:r>
@@ -3631,14 +3769,36 @@
     </w:p>
     <w:p>
       <w:pPr>
-        <w:pStyle w:val="a7"/>
-      </w:pPr>
+        <w:pStyle w:val="a6"/>
+      </w:pPr>
+      <w:r>
+        <w:t>Средства разработки выбраны потому, что …</w:t>
+      </w:r>
+    </w:p>
+    <w:p>
+      <w:pPr>
+        <w:pStyle w:val="a6"/>
+      </w:pPr>
+      <w:r>
+        <w:t>Аппаратные требования к клиенту для запуска разработанного ПО:</w:t>
+      </w:r>
+    </w:p>
+    <w:p>
+      <w:pPr>
+        <w:pStyle w:val="a6"/>
+      </w:pPr>
+      <w:r>
+        <w:t>Аппаратные требования к серверу для корректной работы приложения</w:t>
+      </w:r>
+      <w:r>
+        <w:t>:</w:t>
+      </w:r>
     </w:p>
     <w:p>
       <w:pPr>
         <w:pStyle w:val="1"/>
       </w:pPr>
-      <w:bookmarkStart w:id="6" w:name="_Toc243296756"/>
+      <w:bookmarkStart w:id="6" w:name="_Toc243347051"/>
       <w:r>
         <w:lastRenderedPageBreak/>
         <w:t>Проектирование программного обеспечения</w:t>
@@ -3649,22 +3809,28 @@
       <w:pPr>
         <w:pStyle w:val="2"/>
       </w:pPr>
-      <w:bookmarkStart w:id="7" w:name="_Toc243296757"/>
-      <w:r>
-        <w:t>Проектирование интерфейса пользователя</w:t>
+      <w:bookmarkStart w:id="7" w:name="_Toc243347052"/>
+      <w:r>
+        <w:t xml:space="preserve">Проектирование </w:t>
+      </w:r>
+      <w:r>
+        <w:t>интерфейса</w:t>
+      </w:r>
+      <w:r>
+        <w:t xml:space="preserve"> пользователя</w:t>
       </w:r>
       <w:bookmarkEnd w:id="7"/>
     </w:p>
     <w:p>
       <w:pPr>
-        <w:pStyle w:val="a7"/>
+        <w:pStyle w:val="a6"/>
       </w:pPr>
     </w:p>
     <w:p>
       <w:pPr>
         <w:pStyle w:val="2"/>
       </w:pPr>
-      <w:bookmarkStart w:id="8" w:name="_Toc243296758"/>
+      <w:bookmarkStart w:id="8" w:name="_Toc243347053"/>
       <w:r>
         <w:t>Разработка архитектуры программного обеспечения</w:t>
       </w:r>
@@ -3672,14 +3838,14 @@
     </w:p>
     <w:p>
       <w:pPr>
-        <w:pStyle w:val="a7"/>
+        <w:pStyle w:val="a6"/>
       </w:pPr>
     </w:p>
     <w:p>
       <w:pPr>
         <w:pStyle w:val="2"/>
       </w:pPr>
-      <w:bookmarkStart w:id="9" w:name="_Toc243296759"/>
+      <w:bookmarkStart w:id="9" w:name="_Toc243347054"/>
       <w:r>
         <w:t xml:space="preserve">Проектирование </w:t>
       </w:r>
@@ -3690,14 +3856,14 @@
     </w:p>
     <w:p>
       <w:pPr>
-        <w:pStyle w:val="a7"/>
+        <w:pStyle w:val="a6"/>
       </w:pPr>
     </w:p>
     <w:p>
       <w:pPr>
         <w:pStyle w:val="1"/>
       </w:pPr>
-      <w:bookmarkStart w:id="10" w:name="_Toc243296760"/>
+      <w:bookmarkStart w:id="10" w:name="_Toc243347055"/>
       <w:r>
         <w:lastRenderedPageBreak/>
         <w:t>Разработка модулей программного обеспечения</w:t>
@@ -3708,7 +3874,7 @@
       <w:pPr>
         <w:pStyle w:val="2"/>
       </w:pPr>
-      <w:bookmarkStart w:id="11" w:name="_Toc243296761"/>
+      <w:bookmarkStart w:id="11" w:name="_Toc243347056"/>
       <w:r>
         <w:t xml:space="preserve">Разработка </w:t>
       </w:r>
@@ -3722,14 +3888,14 @@
     </w:p>
     <w:p>
       <w:pPr>
-        <w:pStyle w:val="a7"/>
+        <w:pStyle w:val="a6"/>
       </w:pPr>
     </w:p>
     <w:p>
       <w:pPr>
         <w:pStyle w:val="2"/>
       </w:pPr>
-      <w:bookmarkStart w:id="12" w:name="_Toc243296762"/>
+      <w:bookmarkStart w:id="12" w:name="_Toc243347057"/>
       <w:r>
         <w:t>Реализация интерфейса пользователя</w:t>
       </w:r>
@@ -3737,14 +3903,14 @@
     </w:p>
     <w:p>
       <w:pPr>
-        <w:pStyle w:val="a7"/>
+        <w:pStyle w:val="a6"/>
       </w:pPr>
     </w:p>
     <w:p>
       <w:pPr>
         <w:pStyle w:val="2"/>
       </w:pPr>
-      <w:bookmarkStart w:id="13" w:name="_Toc243296763"/>
+      <w:bookmarkStart w:id="13" w:name="_Toc243347058"/>
       <w:r>
         <w:t>Разграничение прав доступа пользователей</w:t>
       </w:r>
@@ -3752,14 +3918,14 @@
     </w:p>
     <w:p>
       <w:pPr>
-        <w:pStyle w:val="a7"/>
+        <w:pStyle w:val="a6"/>
       </w:pPr>
     </w:p>
     <w:p>
       <w:pPr>
         <w:pStyle w:val="2"/>
       </w:pPr>
-      <w:bookmarkStart w:id="14" w:name="_Toc243296764"/>
+      <w:bookmarkStart w:id="14" w:name="_Toc243347059"/>
       <w:r>
         <w:t>Экспорт и импорт данных</w:t>
       </w:r>
@@ -3767,14 +3933,14 @@
     </w:p>
     <w:p>
       <w:pPr>
-        <w:pStyle w:val="a7"/>
+        <w:pStyle w:val="a6"/>
       </w:pPr>
     </w:p>
     <w:p>
       <w:pPr>
         <w:pStyle w:val="1"/>
       </w:pPr>
-      <w:bookmarkStart w:id="15" w:name="_Toc243296765"/>
+      <w:bookmarkStart w:id="15" w:name="_Toc243347060"/>
       <w:r>
         <w:lastRenderedPageBreak/>
         <w:t>Тестирование и отладка программного обеспечения</w:t>
@@ -3785,7 +3951,7 @@
       <w:pPr>
         <w:pStyle w:val="2"/>
       </w:pPr>
-      <w:bookmarkStart w:id="16" w:name="_Toc243296766"/>
+      <w:bookmarkStart w:id="16" w:name="_Toc243347061"/>
       <w:r>
         <w:t>Структурное тестирование</w:t>
       </w:r>
@@ -3793,14 +3959,14 @@
     </w:p>
     <w:p>
       <w:pPr>
-        <w:pStyle w:val="a7"/>
+        <w:pStyle w:val="a6"/>
       </w:pPr>
     </w:p>
     <w:p>
       <w:pPr>
         <w:pStyle w:val="2"/>
       </w:pPr>
-      <w:bookmarkStart w:id="17" w:name="_Toc243296767"/>
+      <w:bookmarkStart w:id="17" w:name="_Toc243347062"/>
       <w:r>
         <w:t>Функциональное тестирование</w:t>
       </w:r>
@@ -3808,14 +3974,14 @@
     </w:p>
     <w:p>
       <w:pPr>
-        <w:pStyle w:val="a7"/>
+        <w:pStyle w:val="a6"/>
       </w:pPr>
     </w:p>
     <w:p>
       <w:pPr>
         <w:pStyle w:val="1"/>
       </w:pPr>
-      <w:bookmarkStart w:id="18" w:name="_Toc243296768"/>
+      <w:bookmarkStart w:id="18" w:name="_Toc243347063"/>
       <w:r>
         <w:lastRenderedPageBreak/>
         <w:t>Инструкция по эксплуатации программного обеспечения</w:t>
@@ -3826,7 +3992,7 @@
       <w:pPr>
         <w:pStyle w:val="2"/>
       </w:pPr>
-      <w:bookmarkStart w:id="19" w:name="_Toc243296769"/>
+      <w:bookmarkStart w:id="19" w:name="_Toc243347064"/>
       <w:r>
         <w:t xml:space="preserve">Установка </w:t>
       </w:r>
@@ -3837,14 +4003,14 @@
     </w:p>
     <w:p>
       <w:pPr>
-        <w:pStyle w:val="a7"/>
+        <w:pStyle w:val="a6"/>
       </w:pPr>
     </w:p>
     <w:p>
       <w:pPr>
         <w:pStyle w:val="2"/>
       </w:pPr>
-      <w:bookmarkStart w:id="20" w:name="_Toc243296770"/>
+      <w:bookmarkStart w:id="20" w:name="_Toc243347065"/>
       <w:r>
         <w:t>Инструкция по работе</w:t>
       </w:r>
@@ -3852,14 +4018,14 @@
     </w:p>
     <w:p>
       <w:pPr>
-        <w:pStyle w:val="a7"/>
-      </w:pPr>
-    </w:p>
-    <w:p>
-      <w:pPr>
         <w:pStyle w:val="a6"/>
       </w:pPr>
-      <w:bookmarkStart w:id="21" w:name="_Toc243296771"/>
+    </w:p>
+    <w:p>
+      <w:pPr>
+        <w:pStyle w:val="a5"/>
+      </w:pPr>
+      <w:bookmarkStart w:id="21" w:name="_Toc243347066"/>
       <w:r>
         <w:lastRenderedPageBreak/>
         <w:t>Заключение</w:t>
@@ -3868,14 +4034,580 @@
     </w:p>
     <w:p>
       <w:pPr>
-        <w:pStyle w:val="a7"/>
-      </w:pPr>
-    </w:p>
-    <w:p>
-      <w:pPr>
         <w:pStyle w:val="a6"/>
       </w:pPr>
-      <w:bookmarkStart w:id="22" w:name="_Toc243296772"/>
+      <w:r>
+        <w:t xml:space="preserve">В ходе курсового проектирования </w:t>
+      </w:r>
+      <w:r>
+        <w:t>разработаны</w:t>
+      </w:r>
+      <w:r>
+        <w:t xml:space="preserve"> </w:t>
+      </w:r>
+      <w:r>
+        <w:t>серверн</w:t>
+      </w:r>
+      <w:r>
+        <w:t>ая</w:t>
+      </w:r>
+      <w:r>
+        <w:t xml:space="preserve"> и клиентск</w:t>
+      </w:r>
+      <w:r>
+        <w:t>ая</w:t>
+      </w:r>
+      <w:r>
+        <w:t xml:space="preserve"> части многопользовательского приложения, </w:t>
+      </w:r>
+      <w:r>
+        <w:t xml:space="preserve">позволяющего </w:t>
+      </w:r>
+      <w:r>
+        <w:t>систематизировать хранение, просмотр и редактирование записей пользователя с возможностью работы в оффлайн-режиме и синхронизации записей между устройствами пользователя.</w:t>
+      </w:r>
+    </w:p>
+    <w:p>
+      <w:pPr>
+        <w:pStyle w:val="a6"/>
+      </w:pPr>
+      <w:r>
+        <w:t xml:space="preserve">В процессе достижения цели </w:t>
+      </w:r>
+      <w:r>
+        <w:t>выполнены</w:t>
+      </w:r>
+      <w:r>
+        <w:t xml:space="preserve"> следующие задачи</w:t>
+      </w:r>
+      <w:r>
+        <w:t>:</w:t>
+      </w:r>
+    </w:p>
+    <w:p>
+      <w:pPr>
+        <w:pStyle w:val="af5"/>
+        <w:numPr>
+          <w:ilvl w:val="0"/>
+          <w:numId w:val="3"/>
+        </w:numPr>
+        <w:tabs>
+          <w:tab w:val="clear" w:pos="1134"/>
+          <w:tab w:val="num" w:pos="992"/>
+        </w:tabs>
+        <w:ind w:left="0"/>
+      </w:pPr>
+      <w:r>
+        <w:t>изучены</w:t>
+      </w:r>
+      <w:r>
+        <w:t xml:space="preserve"> особенности </w:t>
+      </w:r>
+      <w:r>
+        <w:t>программ, позволяющих вести заметки, потребности пользователей, выделить сущности</w:t>
+      </w:r>
+      <w:r>
+        <w:t>;</w:t>
+      </w:r>
+    </w:p>
+    <w:p>
+      <w:pPr>
+        <w:pStyle w:val="af5"/>
+        <w:numPr>
+          <w:ilvl w:val="0"/>
+          <w:numId w:val="3"/>
+        </w:numPr>
+        <w:tabs>
+          <w:tab w:val="clear" w:pos="1134"/>
+          <w:tab w:val="num" w:pos="992"/>
+        </w:tabs>
+        <w:ind w:left="0"/>
+      </w:pPr>
+      <w:r>
+        <w:t>спроектирована</w:t>
+      </w:r>
+      <w:r>
+        <w:t xml:space="preserve"> диаграмм</w:t>
+      </w:r>
+      <w:r>
+        <w:t>а</w:t>
+      </w:r>
+      <w:r>
+        <w:t xml:space="preserve"> </w:t>
+      </w:r>
+      <w:r>
+        <w:t>классов</w:t>
+      </w:r>
+      <w:r>
+        <w:t>;</w:t>
+      </w:r>
+    </w:p>
+    <w:p>
+      <w:pPr>
+        <w:pStyle w:val="af5"/>
+        <w:numPr>
+          <w:ilvl w:val="0"/>
+          <w:numId w:val="3"/>
+        </w:numPr>
+        <w:tabs>
+          <w:tab w:val="clear" w:pos="1134"/>
+          <w:tab w:val="num" w:pos="992"/>
+        </w:tabs>
+        <w:ind w:left="0"/>
+      </w:pPr>
+      <w:r>
+        <w:t>спроектирована</w:t>
+      </w:r>
+      <w:r>
+        <w:t xml:space="preserve"> </w:t>
+      </w:r>
+      <w:r>
+        <w:t>диаграмм</w:t>
+      </w:r>
+      <w:r>
+        <w:t>а</w:t>
+      </w:r>
+      <w:r>
+        <w:t xml:space="preserve"> пакетов;</w:t>
+      </w:r>
+    </w:p>
+    <w:p>
+      <w:pPr>
+        <w:pStyle w:val="af5"/>
+        <w:numPr>
+          <w:ilvl w:val="0"/>
+          <w:numId w:val="3"/>
+        </w:numPr>
+        <w:tabs>
+          <w:tab w:val="clear" w:pos="1134"/>
+          <w:tab w:val="num" w:pos="992"/>
+        </w:tabs>
+        <w:ind w:left="0"/>
+      </w:pPr>
+      <w:r>
+        <w:t>спроектирована</w:t>
+      </w:r>
+      <w:r>
+        <w:t xml:space="preserve"> </w:t>
+      </w:r>
+      <w:r>
+        <w:t>диаграмма развертывания;</w:t>
+      </w:r>
+    </w:p>
+    <w:p>
+      <w:pPr>
+        <w:pStyle w:val="af5"/>
+        <w:numPr>
+          <w:ilvl w:val="0"/>
+          <w:numId w:val="3"/>
+        </w:numPr>
+        <w:tabs>
+          <w:tab w:val="clear" w:pos="1134"/>
+          <w:tab w:val="num" w:pos="992"/>
+        </w:tabs>
+        <w:ind w:left="0"/>
+      </w:pPr>
+      <w:r>
+        <w:t>спроектирована</w:t>
+      </w:r>
+      <w:r>
+        <w:t xml:space="preserve"> </w:t>
+      </w:r>
+      <w:r>
+        <w:t xml:space="preserve">модель </w:t>
+      </w:r>
+      <w:r>
+        <w:t>пользовательского интерфейса;</w:t>
+      </w:r>
+    </w:p>
+    <w:p>
+      <w:pPr>
+        <w:pStyle w:val="af5"/>
+        <w:numPr>
+          <w:ilvl w:val="0"/>
+          <w:numId w:val="3"/>
+        </w:numPr>
+        <w:tabs>
+          <w:tab w:val="clear" w:pos="1134"/>
+          <w:tab w:val="num" w:pos="992"/>
+        </w:tabs>
+        <w:ind w:left="0"/>
+      </w:pPr>
+      <w:r>
+        <w:t>спроектирована</w:t>
+      </w:r>
+      <w:r>
+        <w:t xml:space="preserve"> </w:t>
+      </w:r>
+      <w:r>
+        <w:t>физическ</w:t>
+      </w:r>
+      <w:r>
+        <w:t>ая</w:t>
+      </w:r>
+      <w:r>
+        <w:t xml:space="preserve"> модель БД;</w:t>
+      </w:r>
+    </w:p>
+    <w:p>
+      <w:pPr>
+        <w:pStyle w:val="af5"/>
+        <w:numPr>
+          <w:ilvl w:val="0"/>
+          <w:numId w:val="3"/>
+        </w:numPr>
+        <w:tabs>
+          <w:tab w:val="clear" w:pos="1134"/>
+          <w:tab w:val="num" w:pos="992"/>
+        </w:tabs>
+        <w:ind w:left="0"/>
+      </w:pPr>
+      <w:r>
+        <w:t>разработаны</w:t>
+      </w:r>
+      <w:r>
+        <w:t xml:space="preserve"> локальн</w:t>
+      </w:r>
+      <w:r>
+        <w:t>ая</w:t>
+      </w:r>
+      <w:r>
+        <w:t xml:space="preserve"> и удалённ</w:t>
+      </w:r>
+      <w:r>
+        <w:t>ая</w:t>
+      </w:r>
+      <w:r>
+        <w:t xml:space="preserve"> БД для хранения данных;</w:t>
+      </w:r>
+    </w:p>
+    <w:p>
+      <w:pPr>
+        <w:pStyle w:val="af5"/>
+        <w:numPr>
+          <w:ilvl w:val="0"/>
+          <w:numId w:val="3"/>
+        </w:numPr>
+        <w:tabs>
+          <w:tab w:val="clear" w:pos="1134"/>
+          <w:tab w:val="num" w:pos="992"/>
+        </w:tabs>
+        <w:ind w:left="0"/>
+      </w:pPr>
+      <w:r>
+        <w:t>разработан</w:t>
+      </w:r>
+      <w:r>
+        <w:t xml:space="preserve"> веб-API;</w:t>
+      </w:r>
+    </w:p>
+    <w:p>
+      <w:pPr>
+        <w:pStyle w:val="af5"/>
+        <w:numPr>
+          <w:ilvl w:val="0"/>
+          <w:numId w:val="3"/>
+        </w:numPr>
+        <w:tabs>
+          <w:tab w:val="clear" w:pos="1134"/>
+          <w:tab w:val="num" w:pos="992"/>
+        </w:tabs>
+        <w:ind w:left="0"/>
+      </w:pPr>
+      <w:r>
+        <w:t>разработан</w:t>
+      </w:r>
+      <w:r>
+        <w:t xml:space="preserve"> </w:t>
+      </w:r>
+      <w:r>
+        <w:t>программный модуль мобильного приложения;</w:t>
+      </w:r>
+    </w:p>
+    <w:p>
+      <w:pPr>
+        <w:pStyle w:val="af5"/>
+        <w:numPr>
+          <w:ilvl w:val="0"/>
+          <w:numId w:val="3"/>
+        </w:numPr>
+        <w:tabs>
+          <w:tab w:val="clear" w:pos="1134"/>
+          <w:tab w:val="num" w:pos="992"/>
+        </w:tabs>
+        <w:ind w:left="0"/>
+      </w:pPr>
+      <w:r>
+        <w:t>реализованы</w:t>
+      </w:r>
+      <w:r>
+        <w:t xml:space="preserve"> разграничени</w:t>
+      </w:r>
+      <w:r>
+        <w:t>я</w:t>
+      </w:r>
+      <w:r>
+        <w:t xml:space="preserve"> прав доступа пользователей;</w:t>
+      </w:r>
+    </w:p>
+    <w:p>
+      <w:pPr>
+        <w:pStyle w:val="af5"/>
+        <w:numPr>
+          <w:ilvl w:val="0"/>
+          <w:numId w:val="3"/>
+        </w:numPr>
+        <w:tabs>
+          <w:tab w:val="clear" w:pos="1134"/>
+          <w:tab w:val="num" w:pos="992"/>
+        </w:tabs>
+        <w:ind w:left="0"/>
+      </w:pPr>
+      <w:r>
+        <w:t>реализованы</w:t>
+      </w:r>
+      <w:r>
+        <w:t xml:space="preserve"> фильтраци</w:t>
+      </w:r>
+      <w:r>
+        <w:t>я</w:t>
+      </w:r>
+      <w:r>
+        <w:t>, поиск и сортировк</w:t>
+      </w:r>
+      <w:r>
+        <w:t>а</w:t>
+      </w:r>
+      <w:r>
+        <w:t xml:space="preserve"> записей пользователя;</w:t>
+      </w:r>
+    </w:p>
+    <w:p>
+      <w:pPr>
+        <w:pStyle w:val="af5"/>
+        <w:numPr>
+          <w:ilvl w:val="0"/>
+          <w:numId w:val="3"/>
+        </w:numPr>
+        <w:tabs>
+          <w:tab w:val="clear" w:pos="1134"/>
+          <w:tab w:val="num" w:pos="992"/>
+        </w:tabs>
+        <w:ind w:left="0"/>
+      </w:pPr>
+      <w:r>
+        <w:t>реализован</w:t>
+      </w:r>
+      <w:r>
+        <w:t>а</w:t>
+      </w:r>
+      <w:r>
+        <w:t xml:space="preserve"> защит</w:t>
+      </w:r>
+      <w:r>
+        <w:t>а</w:t>
+      </w:r>
+      <w:r>
+        <w:t xml:space="preserve"> данных;</w:t>
+      </w:r>
+    </w:p>
+    <w:p>
+      <w:pPr>
+        <w:pStyle w:val="af5"/>
+        <w:numPr>
+          <w:ilvl w:val="0"/>
+          <w:numId w:val="3"/>
+        </w:numPr>
+        <w:tabs>
+          <w:tab w:val="clear" w:pos="1134"/>
+          <w:tab w:val="num" w:pos="992"/>
+        </w:tabs>
+        <w:ind w:left="0"/>
+      </w:pPr>
+      <w:r>
+        <w:t>выполнено</w:t>
+      </w:r>
+      <w:r>
+        <w:t xml:space="preserve"> </w:t>
+      </w:r>
+      <w:r>
+        <w:t>тестирование,</w:t>
+      </w:r>
+      <w:r>
+        <w:t xml:space="preserve"> и отладк</w:t>
+      </w:r>
+      <w:r>
+        <w:t>а</w:t>
+      </w:r>
+      <w:r>
+        <w:t xml:space="preserve"> ПО и </w:t>
+      </w:r>
+      <w:r>
+        <w:t>проанализированы</w:t>
+      </w:r>
+      <w:r>
+        <w:t xml:space="preserve"> результаты тестирования;</w:t>
+      </w:r>
+    </w:p>
+    <w:p>
+      <w:pPr>
+        <w:pStyle w:val="af5"/>
+        <w:numPr>
+          <w:ilvl w:val="0"/>
+          <w:numId w:val="3"/>
+        </w:numPr>
+        <w:tabs>
+          <w:tab w:val="clear" w:pos="1134"/>
+          <w:tab w:val="num" w:pos="992"/>
+        </w:tabs>
+        <w:ind w:left="0"/>
+      </w:pPr>
+      <w:r>
+        <w:t>разработаны</w:t>
+      </w:r>
+      <w:r>
+        <w:t xml:space="preserve"> программн</w:t>
+      </w:r>
+      <w:r>
+        <w:t>ая</w:t>
+      </w:r>
+      <w:r>
+        <w:t xml:space="preserve"> и эксплуатационн</w:t>
+      </w:r>
+      <w:r>
+        <w:t>ая</w:t>
+      </w:r>
+      <w:r>
+        <w:t xml:space="preserve"> документаци</w:t>
+      </w:r>
+      <w:r>
+        <w:t>я</w:t>
+      </w:r>
+      <w:r>
+        <w:t>;</w:t>
+      </w:r>
+    </w:p>
+    <w:p>
+      <w:pPr>
+        <w:pStyle w:val="af5"/>
+        <w:numPr>
+          <w:ilvl w:val="0"/>
+          <w:numId w:val="3"/>
+        </w:numPr>
+        <w:tabs>
+          <w:tab w:val="clear" w:pos="1134"/>
+          <w:tab w:val="num" w:pos="992"/>
+        </w:tabs>
+        <w:ind w:left="0"/>
+      </w:pPr>
+      <w:r>
+        <w:t>систематизированы</w:t>
+      </w:r>
+      <w:r>
+        <w:t xml:space="preserve"> и закреп</w:t>
+      </w:r>
+      <w:r>
+        <w:t>лены</w:t>
+      </w:r>
+      <w:r>
+        <w:t xml:space="preserve"> полученные теоретические знания в соответствии с заданной темой;</w:t>
+      </w:r>
+    </w:p>
+    <w:p>
+      <w:pPr>
+        <w:pStyle w:val="af5"/>
+        <w:numPr>
+          <w:ilvl w:val="0"/>
+          <w:numId w:val="3"/>
+        </w:numPr>
+        <w:tabs>
+          <w:tab w:val="clear" w:pos="1134"/>
+          <w:tab w:val="num" w:pos="992"/>
+        </w:tabs>
+        <w:ind w:left="0"/>
+      </w:pPr>
+      <w:r>
+        <w:t>систематизированы</w:t>
+      </w:r>
+      <w:r>
+        <w:t xml:space="preserve"> и закреп</w:t>
+      </w:r>
+      <w:r>
+        <w:t>лены</w:t>
+      </w:r>
+      <w:r>
+        <w:t xml:space="preserve"> </w:t>
+      </w:r>
+      <w:r>
+        <w:t>полученные теоретические знания и практические умения по общепрофессиональным и специальным дисциплинам специальности «09.02.07 – Информационные системы и программирование»;</w:t>
+      </w:r>
+    </w:p>
+    <w:p>
+      <w:pPr>
+        <w:pStyle w:val="af5"/>
+        <w:numPr>
+          <w:ilvl w:val="0"/>
+          <w:numId w:val="3"/>
+        </w:numPr>
+        <w:tabs>
+          <w:tab w:val="clear" w:pos="1134"/>
+          <w:tab w:val="num" w:pos="992"/>
+        </w:tabs>
+        <w:ind w:left="0"/>
+      </w:pPr>
+      <w:r>
+        <w:lastRenderedPageBreak/>
+        <w:t>углублены</w:t>
+      </w:r>
+      <w:r>
+        <w:t xml:space="preserve"> теоретические знания в соответствии в заданной темой;</w:t>
+      </w:r>
+    </w:p>
+    <w:p>
+      <w:pPr>
+        <w:pStyle w:val="af5"/>
+        <w:numPr>
+          <w:ilvl w:val="0"/>
+          <w:numId w:val="3"/>
+        </w:numPr>
+        <w:tabs>
+          <w:tab w:val="clear" w:pos="1134"/>
+          <w:tab w:val="num" w:pos="992"/>
+        </w:tabs>
+        <w:ind w:left="0"/>
+      </w:pPr>
+      <w:r>
+        <w:t>сформированы</w:t>
+      </w:r>
+      <w:r>
+        <w:t xml:space="preserve"> умения применять теоретические знания при решении поставленных вопросов;</w:t>
+      </w:r>
+    </w:p>
+    <w:p>
+      <w:pPr>
+        <w:pStyle w:val="af5"/>
+        <w:numPr>
+          <w:ilvl w:val="0"/>
+          <w:numId w:val="3"/>
+        </w:numPr>
+        <w:tabs>
+          <w:tab w:val="clear" w:pos="1134"/>
+          <w:tab w:val="num" w:pos="992"/>
+        </w:tabs>
+        <w:ind w:left="0"/>
+      </w:pPr>
+      <w:r>
+        <w:t>сформированы</w:t>
+      </w:r>
+      <w:r>
+        <w:t xml:space="preserve"> умения использовать справочную и нормативную документацию.</w:t>
+      </w:r>
+    </w:p>
+    <w:p>
+      <w:pPr>
+        <w:pStyle w:val="a5"/>
+      </w:pPr>
+      <w:bookmarkStart w:id="22" w:name="_Toc243347067"/>
       <w:r>
         <w:lastRenderedPageBreak/>
         <w:t>Список использованных источников</w:t>
@@ -3884,13 +4616,46 @@
     </w:p>
     <w:p>
       <w:pPr>
-        <w:pStyle w:val="a7"/>
-      </w:pPr>
-      <w:bookmarkStart w:id="23" w:name="_GoBack"/>
-      <w:bookmarkEnd w:id="23"/>
+        <w:pStyle w:val="a6"/>
+      </w:pPr>
+      <w:r>
+        <w:t xml:space="preserve">1. Аспин А. MySQL. Практические рецепты: Пер. с англ. / А. Аспин – Санкт-Петербург : БХВ-Петербург, 2024. – 592 с. – URL: https://ibooks.ru/bookshelf/396439/reading (дата обращения: 05.05.2026). – Режим доступа: для зарегистрир. пользователей. – Текст: электронный. </w:t>
+      </w:r>
+    </w:p>
+    <w:p>
+      <w:pPr>
+        <w:pStyle w:val="a6"/>
+      </w:pPr>
+      <w:r>
+        <w:t xml:space="preserve">2. Нацвин А. В., Юрьева Т. А. Разработка программного обеспечения с графическим интерфейсом на базе фреймворка Avalonia: учебно-методическое пособие / А.В. Нацвин, Т.А. Юрьева. – Благовещенск : АмГУ, 2023. – 102 с. – URL: https://reader.lanbook.com/book/454511 (дата обращения: 16.05.2026). – Режим доступа: для зарегистрир. пользователей. – Текст: электронный. </w:t>
+      </w:r>
+    </w:p>
+    <w:p>
+      <w:pPr>
+        <w:pStyle w:val="a6"/>
+      </w:pPr>
+      <w:r>
+        <w:t xml:space="preserve">3. Проскуряков А. В. Качество и тестирование программного обеспечения. Метрология программного обеспечения. – Таганрог : Издательство Южного федерального университета, 2022. – 197 с. – URL: https://znanium.ru/read?id=429841 (дата обращения: 10.06.2026). – Режим доступа: для зарегистрир. пользователей. – Текст: электронный. </w:t>
+      </w:r>
+    </w:p>
+    <w:p>
+      <w:pPr>
+        <w:pStyle w:val="a6"/>
+      </w:pPr>
+      <w:r>
+        <w:t xml:space="preserve">4. Фленов М. Е. Библия C#. – 6-е изд., перераб. и доп. / М.Е. Фленов. – Санкт-Петербург : БХВ-Петербург, 2024. – 512 с. – URL: https://ibooks.ru/bookshelf/396461/reading (дата обращения: 28.05.2026). – Режим доступа: для зарегистрир. пользователей. – Текст: электронный. </w:t>
+      </w:r>
+    </w:p>
+    <w:p>
+      <w:pPr>
+        <w:pStyle w:val="a6"/>
+      </w:pPr>
+      <w:r>
+        <w:t>5. Шалин П. Программирование на Kotlin для Android: Пер. с англ. / П. Шалин. – Санкт-Петербург : БХВ-Петербург, 2023. – 336 с. – URL: https://ibooks.ru/bookshelf/396448/reading (дата обращения: 03.06.2026). – Режим доступа: для зарегистрир. пользователей. – Текст: электронный.</w:t>
+      </w:r>
     </w:p>
     <w:sectPr>
-      <w:footerReference w:type="default" r:id="rId7"/>
+      <w:footerReference w:type="default" r:id="rId8"/>
       <w:pgSz w:w="11906" w:h="16838"/>
       <w:pgMar w:top="1134" w:right="850" w:bottom="1134" w:left="1701" w:header="708" w:footer="708" w:gutter="0"/>
       <w:cols w:space="708"/>
@@ -3902,7 +4667,7 @@
 </file>
 
 <file path=word/endnotes.xml><?xml version="1.0" encoding="utf-8"?>
-<w:endnotes xmlns:wpc="http://schemas.microsoft.com/office/word/2010/wordprocessingCanvas" xmlns:cx="http://schemas.microsoft.com/office/drawing/2014/chartex" xmlns:mc="http://schemas.openxmlformats.org/markup-compatibility/2006" xmlns:o="urn:schemas-microsoft-com:office:office" xmlns:r="http://schemas.openxmlformats.org/officeDocument/2006/relationships" xmlns:m="http://schemas.openxmlformats.org/officeDocument/2006/math" xmlns:v="urn:schemas-microsoft-com:vml" xmlns:wp14="http://schemas.microsoft.com/office/word/2010/wordprocessingDrawing" xmlns:wp="http://schemas.openxmlformats.org/drawingml/2006/wordprocessingDrawing" xmlns:w10="urn:schemas-microsoft-com:office:word" xmlns:w="http://schemas.openxmlformats.org/wordprocessingml/2006/main" xmlns:w14="http://schemas.microsoft.com/office/word/2010/wordml" xmlns:w15="http://schemas.microsoft.com/office/word/2012/wordml" xmlns:w16se="http://schemas.microsoft.com/office/word/2015/wordml/symex" xmlns:wpg="http://schemas.microsoft.com/office/word/2010/wordprocessingGroup" xmlns:wpi="http://schemas.microsoft.com/office/word/2010/wordprocessingInk" xmlns:wne="http://schemas.microsoft.com/office/word/2006/wordml" xmlns:wps="http://schemas.microsoft.com/office/word/2010/wordprocessingShape" mc:Ignorable="w14 w15 w16se wp14">
+<w:endnotes xmlns:wpc="http://schemas.microsoft.com/office/word/2010/wordprocessingCanvas" xmlns:cx="http://schemas.microsoft.com/office/drawing/2014/chartex" xmlns:cx1="http://schemas.microsoft.com/office/drawing/2015/9/8/chartex" xmlns:cx2="http://schemas.microsoft.com/office/drawing/2015/10/21/chartex" xmlns:cx3="http://schemas.microsoft.com/office/drawing/2016/5/9/chartex" xmlns:cx4="http://schemas.microsoft.com/office/drawing/2016/5/10/chartex" xmlns:cx5="http://schemas.microsoft.com/office/drawing/2016/5/11/chartex" xmlns:cx6="http://schemas.microsoft.com/office/drawing/2016/5/12/chartex" xmlns:cx7="http://schemas.microsoft.com/office/drawing/2016/5/13/chartex" xmlns:cx8="http://schemas.microsoft.com/office/drawing/2016/5/14/chartex" xmlns:mc="http://schemas.openxmlformats.org/markup-compatibility/2006" xmlns:aink="http://schemas.microsoft.com/office/drawing/2016/ink" xmlns:am3d="http://schemas.microsoft.com/office/drawing/2017/model3d" xmlns:o="urn:schemas-microsoft-com:office:office" xmlns:oel="http://schemas.microsoft.com/office/2019/extlst" xmlns:r="http://schemas.openxmlformats.org/officeDocument/2006/relationships" xmlns:m="http://schemas.openxmlformats.org/officeDocument/2006/math" xmlns:v="urn:schemas-microsoft-com:vml" xmlns:wp14="http://schemas.microsoft.com/office/word/2010/wordprocessingDrawing" xmlns:wp="http://schemas.openxmlformats.org/drawingml/2006/wordprocessingDrawing" xmlns:w10="urn:schemas-microsoft-com:office:word" xmlns:w="http://schemas.openxmlformats.org/wordprocessingml/2006/main" xmlns:w14="http://schemas.microsoft.com/office/word/2010/wordml" xmlns:w15="http://schemas.microsoft.com/office/word/2012/wordml" xmlns:w16cex="http://schemas.microsoft.com/office/word/2018/wordml/cex" xmlns:w16cid="http://schemas.microsoft.com/office/word/2016/wordml/cid" xmlns:w16="http://schemas.microsoft.com/office/word/2018/wordml" xmlns:w16sdtdh="http://schemas.microsoft.com/office/word/2020/wordml/sdtdatahash" xmlns:w16se="http://schemas.microsoft.com/office/word/2015/wordml/symex" xmlns:wpg="http://schemas.microsoft.com/office/word/2010/wordprocessingGroup" xmlns:wpi="http://schemas.microsoft.com/office/word/2010/wordprocessingInk" xmlns:wne="http://schemas.microsoft.com/office/word/2006/wordml" xmlns:wps="http://schemas.microsoft.com/office/word/2010/wordprocessingShape" mc:Ignorable="w14 w15 w16se w16cid w16 w16cex w16sdtdh wp14">
   <w:endnote w:type="separator" w:id="-1">
     <w:p>
       <w:r>
@@ -3921,7 +4686,7 @@
 </file>
 
 <file path=word/footer1.xml><?xml version="1.0" encoding="utf-8"?>
-<w:ftr xmlns:wpc="http://schemas.microsoft.com/office/word/2010/wordprocessingCanvas" xmlns:cx="http://schemas.microsoft.com/office/drawing/2014/chartex" xmlns:mc="http://schemas.openxmlformats.org/markup-compatibility/2006" xmlns:o="urn:schemas-microsoft-com:office:office" xmlns:r="http://schemas.openxmlformats.org/officeDocument/2006/relationships" xmlns:m="http://schemas.openxmlformats.org/officeDocument/2006/math" xmlns:v="urn:schemas-microsoft-com:vml" xmlns:wp14="http://schemas.microsoft.com/office/word/2010/wordprocessingDrawing" xmlns:wp="http://schemas.openxmlformats.org/drawingml/2006/wordprocessingDrawing" xmlns:w10="urn:schemas-microsoft-com:office:word" xmlns:w="http://schemas.openxmlformats.org/wordprocessingml/2006/main" xmlns:w14="http://schemas.microsoft.com/office/word/2010/wordml" xmlns:w15="http://schemas.microsoft.com/office/word/2012/wordml" xmlns:w16se="http://schemas.microsoft.com/office/word/2015/wordml/symex" xmlns:wpg="http://schemas.microsoft.com/office/word/2010/wordprocessingGroup" xmlns:wpi="http://schemas.microsoft.com/office/word/2010/wordprocessingInk" xmlns:wne="http://schemas.microsoft.com/office/word/2006/wordml" xmlns:wps="http://schemas.microsoft.com/office/word/2010/wordprocessingShape" mc:Ignorable="w14 w15 w16se wp14">
+<w:ftr xmlns:wpc="http://schemas.microsoft.com/office/word/2010/wordprocessingCanvas" xmlns:cx="http://schemas.microsoft.com/office/drawing/2014/chartex" xmlns:cx1="http://schemas.microsoft.com/office/drawing/2015/9/8/chartex" xmlns:cx2="http://schemas.microsoft.com/office/drawing/2015/10/21/chartex" xmlns:cx3="http://schemas.microsoft.com/office/drawing/2016/5/9/chartex" xmlns:cx4="http://schemas.microsoft.com/office/drawing/2016/5/10/chartex" xmlns:cx5="http://schemas.microsoft.com/office/drawing/2016/5/11/chartex" xmlns:cx6="http://schemas.microsoft.com/office/drawing/2016/5/12/chartex" xmlns:cx7="http://schemas.microsoft.com/office/drawing/2016/5/13/chartex" xmlns:cx8="http://schemas.microsoft.com/office/drawing/2016/5/14/chartex" xmlns:mc="http://schemas.openxmlformats.org/markup-compatibility/2006" xmlns:aink="http://schemas.microsoft.com/office/drawing/2016/ink" xmlns:am3d="http://schemas.microsoft.com/office/drawing/2017/model3d" xmlns:o="urn:schemas-microsoft-com:office:office" xmlns:oel="http://schemas.microsoft.com/office/2019/extlst" xmlns:r="http://schemas.openxmlformats.org/officeDocument/2006/relationships" xmlns:m="http://schemas.openxmlformats.org/officeDocument/2006/math" xmlns:v="urn:schemas-microsoft-com:vml" xmlns:wp14="http://schemas.microsoft.com/office/word/2010/wordprocessingDrawing" xmlns:wp="http://schemas.openxmlformats.org/drawingml/2006/wordprocessingDrawing" xmlns:w10="urn:schemas-microsoft-com:office:word" xmlns:w="http://schemas.openxmlformats.org/wordprocessingml/2006/main" xmlns:w14="http://schemas.microsoft.com/office/word/2010/wordml" xmlns:w15="http://schemas.microsoft.com/office/word/2012/wordml" xmlns:w16cex="http://schemas.microsoft.com/office/word/2018/wordml/cex" xmlns:w16cid="http://schemas.microsoft.com/office/word/2016/wordml/cid" xmlns:w16="http://schemas.microsoft.com/office/word/2018/wordml" xmlns:w16sdtdh="http://schemas.microsoft.com/office/word/2020/wordml/sdtdatahash" xmlns:w16se="http://schemas.microsoft.com/office/word/2015/wordml/symex" xmlns:wpg="http://schemas.microsoft.com/office/word/2010/wordprocessingGroup" xmlns:wpi="http://schemas.microsoft.com/office/word/2010/wordprocessingInk" xmlns:wne="http://schemas.microsoft.com/office/word/2006/wordml" xmlns:wps="http://schemas.microsoft.com/office/word/2010/wordprocessingShape" mc:Ignorable="w14 w15 w16se w16cid w16 w16cex w16sdtdh wp14">
   <w:sdt>
     <w:sdtPr>
       <w:id w:val="-651911265"/>
@@ -3938,7 +4703,7 @@
     <w:sdtContent>
       <w:p>
         <w:pPr>
-          <w:pStyle w:val="af4"/>
+          <w:pStyle w:val="af3"/>
           <w:jc w:val="center"/>
           <w:rPr>
             <w:noProof/>
@@ -3981,7 +4746,7 @@
 </file>
 
 <file path=word/footnotes.xml><?xml version="1.0" encoding="utf-8"?>
-<w:footnotes xmlns:wpc="http://schemas.microsoft.com/office/word/2010/wordprocessingCanvas" xmlns:cx="http://schemas.microsoft.com/office/drawing/2014/chartex" xmlns:mc="http://schemas.openxmlformats.org/markup-compatibility/2006" xmlns:o="urn:schemas-microsoft-com:office:office" xmlns:r="http://schemas.openxmlformats.org/officeDocument/2006/relationships" xmlns:m="http://schemas.openxmlformats.org/officeDocument/2006/math" xmlns:v="urn:schemas-microsoft-com:vml" xmlns:wp14="http://schemas.microsoft.com/office/word/2010/wordprocessingDrawing" xmlns:wp="http://schemas.openxmlformats.org/drawingml/2006/wordprocessingDrawing" xmlns:w10="urn:schemas-microsoft-com:office:word" xmlns:w="http://schemas.openxmlformats.org/wordprocessingml/2006/main" xmlns:w14="http://schemas.microsoft.com/office/word/2010/wordml" xmlns:w15="http://schemas.microsoft.com/office/word/2012/wordml" xmlns:w16se="http://schemas.microsoft.com/office/word/2015/wordml/symex" xmlns:wpg="http://schemas.microsoft.com/office/word/2010/wordprocessingGroup" xmlns:wpi="http://schemas.microsoft.com/office/word/2010/wordprocessingInk" xmlns:wne="http://schemas.microsoft.com/office/word/2006/wordml" xmlns:wps="http://schemas.microsoft.com/office/word/2010/wordprocessingShape" mc:Ignorable="w14 w15 w16se wp14">
+<w:footnotes xmlns:wpc="http://schemas.microsoft.com/office/word/2010/wordprocessingCanvas" xmlns:cx="http://schemas.microsoft.com/office/drawing/2014/chartex" xmlns:cx1="http://schemas.microsoft.com/office/drawing/2015/9/8/chartex" xmlns:cx2="http://schemas.microsoft.com/office/drawing/2015/10/21/chartex" xmlns:cx3="http://schemas.microsoft.com/office/drawing/2016/5/9/chartex" xmlns:cx4="http://schemas.microsoft.com/office/drawing/2016/5/10/chartex" xmlns:cx5="http://schemas.microsoft.com/office/drawing/2016/5/11/chartex" xmlns:cx6="http://schemas.microsoft.com/office/drawing/2016/5/12/chartex" xmlns:cx7="http://schemas.microsoft.com/office/drawing/2016/5/13/chartex" xmlns:cx8="http://schemas.microsoft.com/office/drawing/2016/5/14/chartex" xmlns:mc="http://schemas.openxmlformats.org/markup-compatibility/2006" xmlns:aink="http://schemas.microsoft.com/office/drawing/2016/ink" xmlns:am3d="http://schemas.microsoft.com/office/drawing/2017/model3d" xmlns:o="urn:schemas-microsoft-com:office:office" xmlns:oel="http://schemas.microsoft.com/office/2019/extlst" xmlns:r="http://schemas.openxmlformats.org/officeDocument/2006/relationships" xmlns:m="http://schemas.openxmlformats.org/officeDocument/2006/math" xmlns:v="urn:schemas-microsoft-com:vml" xmlns:wp14="http://schemas.microsoft.com/office/word/2010/wordprocessingDrawing" xmlns:wp="http://schemas.openxmlformats.org/drawingml/2006/wordprocessingDrawing" xmlns:w10="urn:schemas-microsoft-com:office:word" xmlns:w="http://schemas.openxmlformats.org/wordprocessingml/2006/main" xmlns:w14="http://schemas.microsoft.com/office/word/2010/wordml" xmlns:w15="http://schemas.microsoft.com/office/word/2012/wordml" xmlns:w16cex="http://schemas.microsoft.com/office/word/2018/wordml/cex" xmlns:w16cid="http://schemas.microsoft.com/office/word/2016/wordml/cid" xmlns:w16="http://schemas.microsoft.com/office/word/2018/wordml" xmlns:w16sdtdh="http://schemas.microsoft.com/office/word/2020/wordml/sdtdatahash" xmlns:w16se="http://schemas.microsoft.com/office/word/2015/wordml/symex" xmlns:wpg="http://schemas.microsoft.com/office/word/2010/wordprocessingGroup" xmlns:wpi="http://schemas.microsoft.com/office/word/2010/wordprocessingInk" xmlns:wne="http://schemas.microsoft.com/office/word/2006/wordml" xmlns:wps="http://schemas.microsoft.com/office/word/2010/wordprocessingShape" mc:Ignorable="w14 w15 w16se w16cid w16 w16cex w16sdtdh wp14">
   <w:footnote w:type="separator" w:id="-1">
     <w:p>
       <w:r>
@@ -4000,7 +4765,7 @@
 </file>
 
 <file path=word/numbering.xml><?xml version="1.0" encoding="utf-8"?>
-<w:numbering xmlns:wpc="http://schemas.microsoft.com/office/word/2010/wordprocessingCanvas" xmlns:cx="http://schemas.microsoft.com/office/drawing/2014/chartex" xmlns:mc="http://schemas.openxmlformats.org/markup-compatibility/2006" xmlns:o="urn:schemas-microsoft-com:office:office" xmlns:r="http://schemas.openxmlformats.org/officeDocument/2006/relationships" xmlns:m="http://schemas.openxmlformats.org/officeDocument/2006/math" xmlns:v="urn:schemas-microsoft-com:vml" xmlns:wp14="http://schemas.microsoft.com/office/word/2010/wordprocessingDrawing" xmlns:wp="http://schemas.openxmlformats.org/drawingml/2006/wordprocessingDrawing" xmlns:w10="urn:schemas-microsoft-com:office:word" xmlns:w="http://schemas.openxmlformats.org/wordprocessingml/2006/main" xmlns:w14="http://schemas.microsoft.com/office/word/2010/wordml" xmlns:w15="http://schemas.microsoft.com/office/word/2012/wordml" xmlns:w16se="http://schemas.microsoft.com/office/word/2015/wordml/symex" xmlns:wpg="http://schemas.microsoft.com/office/word/2010/wordprocessingGroup" xmlns:wpi="http://schemas.microsoft.com/office/word/2010/wordprocessingInk" xmlns:wne="http://schemas.microsoft.com/office/word/2006/wordml" xmlns:wps="http://schemas.microsoft.com/office/word/2010/wordprocessingShape" mc:Ignorable="w14 w15 w16se wp14">
+<w:numbering xmlns:wpc="http://schemas.microsoft.com/office/word/2010/wordprocessingCanvas" xmlns:cx="http://schemas.microsoft.com/office/drawing/2014/chartex" xmlns:cx1="http://schemas.microsoft.com/office/drawing/2015/9/8/chartex" xmlns:cx2="http://schemas.microsoft.com/office/drawing/2015/10/21/chartex" xmlns:cx3="http://schemas.microsoft.com/office/drawing/2016/5/9/chartex" xmlns:cx4="http://schemas.microsoft.com/office/drawing/2016/5/10/chartex" xmlns:cx5="http://schemas.microsoft.com/office/drawing/2016/5/11/chartex" xmlns:cx6="http://schemas.microsoft.com/office/drawing/2016/5/12/chartex" xmlns:cx7="http://schemas.microsoft.com/office/drawing/2016/5/13/chartex" xmlns:cx8="http://schemas.microsoft.com/office/drawing/2016/5/14/chartex" xmlns:mc="http://schemas.openxmlformats.org/markup-compatibility/2006" xmlns:aink="http://schemas.microsoft.com/office/drawing/2016/ink" xmlns:am3d="http://schemas.microsoft.com/office/drawing/2017/model3d" xmlns:o="urn:schemas-microsoft-com:office:office" xmlns:oel="http://schemas.microsoft.com/office/2019/extlst" xmlns:r="http://schemas.openxmlformats.org/officeDocument/2006/relationships" xmlns:m="http://schemas.openxmlformats.org/officeDocument/2006/math" xmlns:v="urn:schemas-microsoft-com:vml" xmlns:wp14="http://schemas.microsoft.com/office/word/2010/wordprocessingDrawing" xmlns:wp="http://schemas.openxmlformats.org/drawingml/2006/wordprocessingDrawing" xmlns:w10="urn:schemas-microsoft-com:office:word" xmlns:w="http://schemas.openxmlformats.org/wordprocessingml/2006/main" xmlns:w14="http://schemas.microsoft.com/office/word/2010/wordml" xmlns:w15="http://schemas.microsoft.com/office/word/2012/wordml" xmlns:w16cex="http://schemas.microsoft.com/office/word/2018/wordml/cex" xmlns:w16cid="http://schemas.microsoft.com/office/word/2016/wordml/cid" xmlns:w16="http://schemas.microsoft.com/office/word/2018/wordml" xmlns:w16sdtdh="http://schemas.microsoft.com/office/word/2020/wordml/sdtdatahash" xmlns:w16se="http://schemas.microsoft.com/office/word/2015/wordml/symex" xmlns:wpg="http://schemas.microsoft.com/office/word/2010/wordprocessingGroup" xmlns:wpi="http://schemas.microsoft.com/office/word/2010/wordprocessingInk" xmlns:wne="http://schemas.microsoft.com/office/word/2006/wordml" xmlns:wps="http://schemas.microsoft.com/office/word/2010/wordprocessingShape" mc:Ignorable="w14 w15 w16se w16cid w16 w16cex w16sdtdh wp14">
   <w:abstractNum w:abstractNumId="0" w15:restartNumberingAfterBreak="0">
     <w:nsid w:val="0428275C"/>
     <w:multiLevelType w:val="hybridMultilevel"/>
@@ -4196,7 +4961,6 @@
     <w:lvl w:ilvl="0" w:tplc="678AABE4">
       <w:start w:val="1"/>
       <w:numFmt w:val="bullet"/>
-      <w:pStyle w:val="a1"/>
       <w:lvlText w:val="-"/>
       <w:lvlJc w:val="left"/>
       <w:pPr>
@@ -4771,7 +5535,7 @@
   <w:abstractNum w:abstractNumId="7" w15:restartNumberingAfterBreak="0">
     <w:nsid w:val="61FA6CCF"/>
     <w:multiLevelType w:val="multilevel"/>
-    <w:tmpl w:val="53F43B58"/>
+    <w:tmpl w:val="8F229814"/>
     <w:lvl w:ilvl="0">
       <w:start w:val="1"/>
       <w:numFmt w:val="decimal"/>
@@ -4792,6 +5556,7 @@
     <w:lvl w:ilvl="1">
       <w:start w:val="1"/>
       <w:numFmt w:val="decimal"/>
+      <w:pStyle w:val="2"/>
       <w:suff w:val="space"/>
       <w:lvlText w:val="%1.%2"/>
       <w:lvlJc w:val="left"/>
@@ -5030,56 +5795,56 @@
       </w:pPr>
     </w:lvl>
   </w:abstractNum>
-  <w:num w:numId="1">
+  <w:num w:numId="1" w16cid:durableId="1747534572">
     <w:abstractNumId w:val="7"/>
   </w:num>
-  <w:num w:numId="2">
+  <w:num w:numId="2" w16cid:durableId="1091389628">
     <w:abstractNumId w:val="3"/>
   </w:num>
-  <w:num w:numId="3">
+  <w:num w:numId="3" w16cid:durableId="653534449">
     <w:abstractNumId w:val="2"/>
   </w:num>
-  <w:num w:numId="4">
+  <w:num w:numId="4" w16cid:durableId="4139565">
     <w:abstractNumId w:val="2"/>
     <w:lvlOverride w:ilvl="0">
       <w:startOverride w:val="1"/>
     </w:lvlOverride>
   </w:num>
-  <w:num w:numId="5">
+  <w:num w:numId="5" w16cid:durableId="2077899190">
     <w:abstractNumId w:val="2"/>
     <w:lvlOverride w:ilvl="0">
       <w:startOverride w:val="1"/>
     </w:lvlOverride>
   </w:num>
-  <w:num w:numId="6">
+  <w:num w:numId="6" w16cid:durableId="1589534012">
     <w:abstractNumId w:val="4"/>
   </w:num>
-  <w:num w:numId="7">
+  <w:num w:numId="7" w16cid:durableId="1585916609">
     <w:abstractNumId w:val="5"/>
   </w:num>
-  <w:num w:numId="8">
+  <w:num w:numId="8" w16cid:durableId="1822885287">
     <w:abstractNumId w:val="1"/>
   </w:num>
-  <w:num w:numId="9">
+  <w:num w:numId="9" w16cid:durableId="1245918759">
     <w:abstractNumId w:val="0"/>
   </w:num>
-  <w:num w:numId="10">
+  <w:num w:numId="10" w16cid:durableId="1242839026">
     <w:abstractNumId w:val="8"/>
   </w:num>
-  <w:num w:numId="11">
+  <w:num w:numId="11" w16cid:durableId="572817272">
     <w:abstractNumId w:val="6"/>
   </w:num>
-  <w:num w:numId="12">
+  <w:num w:numId="12" w16cid:durableId="769591239">
     <w:abstractNumId w:val="7"/>
   </w:num>
-  <w:num w:numId="13">
+  <w:num w:numId="13" w16cid:durableId="1356812037">
     <w:abstractNumId w:val="7"/>
   </w:num>
 </w:numbering>
 </file>
 
 <file path=word/styles.xml><?xml version="1.0" encoding="utf-8"?>
-<w:styles xmlns:mc="http://schemas.openxmlformats.org/markup-compatibility/2006" xmlns:r="http://schemas.openxmlformats.org/officeDocument/2006/relationships" xmlns:w="http://schemas.openxmlformats.org/wordprocessingml/2006/main" xmlns:w14="http://schemas.microsoft.com/office/word/2010/wordml" xmlns:w15="http://schemas.microsoft.com/office/word/2012/wordml" xmlns:w16se="http://schemas.microsoft.com/office/word/2015/wordml/symex" mc:Ignorable="w14 w15 w16se">
+<w:styles xmlns:mc="http://schemas.openxmlformats.org/markup-compatibility/2006" xmlns:r="http://schemas.openxmlformats.org/officeDocument/2006/relationships" xmlns:w="http://schemas.openxmlformats.org/wordprocessingml/2006/main" xmlns:w14="http://schemas.microsoft.com/office/word/2010/wordml" xmlns:w15="http://schemas.microsoft.com/office/word/2012/wordml" xmlns:w16cex="http://schemas.microsoft.com/office/word/2018/wordml/cex" xmlns:w16cid="http://schemas.microsoft.com/office/word/2016/wordml/cid" xmlns:w16="http://schemas.microsoft.com/office/word/2018/wordml" xmlns:w16sdtdh="http://schemas.microsoft.com/office/word/2020/wordml/sdtdatahash" xmlns:w16se="http://schemas.microsoft.com/office/word/2015/wordml/symex" mc:Ignorable="w14 w15 w16se w16cid w16 w16cex w16sdtdh">
   <w:docDefaults>
     <w:rPrDefault>
       <w:rPr>
@@ -5095,7 +5860,7 @@
       </w:pPr>
     </w:pPrDefault>
   </w:docDefaults>
-  <w:latentStyles w:defLockedState="0" w:defUIPriority="99" w:defSemiHidden="0" w:defUnhideWhenUsed="0" w:defQFormat="0" w:count="371">
+  <w:latentStyles w:defLockedState="0" w:defUIPriority="99" w:defSemiHidden="0" w:defUnhideWhenUsed="0" w:defQFormat="0" w:count="376">
     <w:lsdException w:name="Normal" w:uiPriority="0" w:qFormat="1"/>
     <w:lsdException w:name="heading 1" w:uiPriority="9" w:qFormat="1"/>
     <w:lsdException w:name="heading 2" w:semiHidden="1" w:uiPriority="9" w:unhideWhenUsed="1" w:qFormat="1"/>
@@ -5467,8 +6232,13 @@
     <w:lsdException w:name="List Table 5 Dark Accent 6" w:uiPriority="50"/>
     <w:lsdException w:name="List Table 6 Colorful Accent 6" w:uiPriority="51"/>
     <w:lsdException w:name="List Table 7 Colorful Accent 6" w:uiPriority="52"/>
+    <w:lsdException w:name="Mention" w:semiHidden="1" w:unhideWhenUsed="1"/>
+    <w:lsdException w:name="Smart Hyperlink" w:semiHidden="1" w:unhideWhenUsed="1"/>
+    <w:lsdException w:name="Hashtag" w:semiHidden="1" w:unhideWhenUsed="1"/>
+    <w:lsdException w:name="Unresolved Mention" w:semiHidden="1" w:unhideWhenUsed="1"/>
+    <w:lsdException w:name="Smart Link" w:semiHidden="1" w:unhideWhenUsed="1"/>
   </w:latentStyles>
-  <w:style w:type="paragraph" w:default="1" w:styleId="a2">
+  <w:style w:type="paragraph" w:default="1" w:styleId="a1">
     <w:name w:val="Normal"/>
     <w:qFormat/>
     <w:rsid w:val="00E17AA0"/>
@@ -5484,8 +6254,8 @@
   </w:style>
   <w:style w:type="paragraph" w:styleId="1">
     <w:name w:val="heading 1"/>
-    <w:basedOn w:val="a2"/>
-    <w:next w:val="a2"/>
+    <w:basedOn w:val="a1"/>
+    <w:next w:val="a1"/>
     <w:link w:val="10"/>
     <w:uiPriority w:val="9"/>
     <w:qFormat/>
@@ -5512,17 +6282,20 @@
   </w:style>
   <w:style w:type="paragraph" w:styleId="2">
     <w:name w:val="heading 2"/>
-    <w:basedOn w:val="a2"/>
-    <w:next w:val="a2"/>
+    <w:basedOn w:val="a1"/>
+    <w:next w:val="a1"/>
     <w:link w:val="20"/>
     <w:uiPriority w:val="9"/>
     <w:qFormat/>
-    <w:rsid w:val="0061435B"/>
+    <w:rsid w:val="00C86C0A"/>
     <w:pPr>
       <w:keepNext/>
       <w:keepLines/>
+      <w:numPr>
+        <w:ilvl w:val="1"/>
+        <w:numId w:val="1"/>
+      </w:numPr>
       <w:spacing w:before="482" w:after="482" w:line="360" w:lineRule="auto"/>
-      <w:ind w:firstLine="709"/>
       <w:outlineLvl w:val="1"/>
     </w:pPr>
     <w:rPr>
@@ -5537,8 +6310,8 @@
   </w:style>
   <w:style w:type="paragraph" w:styleId="3">
     <w:name w:val="heading 3"/>
-    <w:basedOn w:val="a2"/>
-    <w:next w:val="a2"/>
+    <w:basedOn w:val="a1"/>
+    <w:next w:val="a1"/>
     <w:link w:val="30"/>
     <w:uiPriority w:val="9"/>
     <w:qFormat/>
@@ -5558,8 +6331,8 @@
   </w:style>
   <w:style w:type="paragraph" w:styleId="4">
     <w:name w:val="heading 4"/>
-    <w:basedOn w:val="a2"/>
-    <w:next w:val="a2"/>
+    <w:basedOn w:val="a1"/>
+    <w:next w:val="a1"/>
     <w:link w:val="40"/>
     <w:uiPriority w:val="9"/>
     <w:qFormat/>
@@ -5578,8 +6351,8 @@
   </w:style>
   <w:style w:type="paragraph" w:styleId="5">
     <w:name w:val="heading 5"/>
-    <w:basedOn w:val="a2"/>
-    <w:next w:val="a2"/>
+    <w:basedOn w:val="a1"/>
+    <w:next w:val="a1"/>
     <w:link w:val="50"/>
     <w:uiPriority w:val="9"/>
     <w:semiHidden/>
@@ -5606,8 +6379,8 @@
   </w:style>
   <w:style w:type="paragraph" w:styleId="6">
     <w:name w:val="heading 6"/>
-    <w:basedOn w:val="a2"/>
-    <w:next w:val="a2"/>
+    <w:basedOn w:val="a1"/>
+    <w:next w:val="a1"/>
     <w:link w:val="60"/>
     <w:uiPriority w:val="9"/>
     <w:qFormat/>
@@ -5625,8 +6398,8 @@
   </w:style>
   <w:style w:type="paragraph" w:styleId="7">
     <w:name w:val="heading 7"/>
-    <w:basedOn w:val="a2"/>
-    <w:next w:val="a2"/>
+    <w:basedOn w:val="a1"/>
+    <w:next w:val="a1"/>
     <w:link w:val="70"/>
     <w:uiPriority w:val="9"/>
     <w:qFormat/>
@@ -5638,8 +6411,8 @@
   </w:style>
   <w:style w:type="paragraph" w:styleId="8">
     <w:name w:val="heading 8"/>
-    <w:basedOn w:val="a2"/>
-    <w:next w:val="a2"/>
+    <w:basedOn w:val="a1"/>
+    <w:next w:val="a1"/>
     <w:link w:val="80"/>
     <w:uiPriority w:val="9"/>
     <w:semiHidden/>
@@ -5667,8 +6440,8 @@
   </w:style>
   <w:style w:type="paragraph" w:styleId="9">
     <w:name w:val="heading 9"/>
-    <w:basedOn w:val="a2"/>
-    <w:next w:val="a2"/>
+    <w:basedOn w:val="a1"/>
+    <w:next w:val="a1"/>
     <w:link w:val="90"/>
     <w:uiPriority w:val="9"/>
     <w:semiHidden/>
@@ -5692,13 +6465,12 @@
       <w14:ligatures w14:val="standardContextual"/>
     </w:rPr>
   </w:style>
-  <w:style w:type="character" w:default="1" w:styleId="a3">
+  <w:style w:type="character" w:default="1" w:styleId="a2">
     <w:name w:val="Default Paragraph Font"/>
     <w:uiPriority w:val="1"/>
-    <w:semiHidden/>
     <w:unhideWhenUsed/>
   </w:style>
-  <w:style w:type="table" w:default="1" w:styleId="a4">
+  <w:style w:type="table" w:default="1" w:styleId="a3">
     <w:name w:val="Normal Table"/>
     <w:uiPriority w:val="99"/>
     <w:semiHidden/>
@@ -5713,7 +6485,7 @@
       </w:tblCellMar>
     </w:tblPr>
   </w:style>
-  <w:style w:type="numbering" w:default="1" w:styleId="a5">
+  <w:style w:type="numbering" w:default="1" w:styleId="a4">
     <w:name w:val="No List"/>
     <w:uiPriority w:val="99"/>
     <w:semiHidden/>
@@ -5721,10 +6493,10 @@
   </w:style>
   <w:style w:type="character" w:customStyle="1" w:styleId="20">
     <w:name w:val="Заголовок 2 Знак"/>
-    <w:basedOn w:val="a3"/>
+    <w:basedOn w:val="a2"/>
     <w:link w:val="2"/>
     <w:uiPriority w:val="9"/>
-    <w:rsid w:val="0061435B"/>
+    <w:rsid w:val="00C86C0A"/>
     <w:rPr>
       <w:rFonts w:ascii="Times New Roman" w:eastAsiaTheme="majorEastAsia" w:hAnsi="Times New Roman" w:cstheme="majorBidi"/>
       <w:b/>
@@ -5736,7 +6508,7 @@
   </w:style>
   <w:style w:type="character" w:customStyle="1" w:styleId="30">
     <w:name w:val="Заголовок 3 Знак"/>
-    <w:basedOn w:val="a3"/>
+    <w:basedOn w:val="a2"/>
     <w:link w:val="3"/>
     <w:uiPriority w:val="9"/>
     <w:rsid w:val="00654A48"/>
@@ -5751,7 +6523,7 @@
   </w:style>
   <w:style w:type="character" w:customStyle="1" w:styleId="40">
     <w:name w:val="Заголовок 4 Знак"/>
-    <w:basedOn w:val="a3"/>
+    <w:basedOn w:val="a2"/>
     <w:link w:val="4"/>
     <w:uiPriority w:val="9"/>
     <w:rsid w:val="00654A48"/>
@@ -5766,7 +6538,7 @@
   </w:style>
   <w:style w:type="character" w:customStyle="1" w:styleId="60">
     <w:name w:val="Заголовок 6 Знак"/>
-    <w:basedOn w:val="a3"/>
+    <w:basedOn w:val="a2"/>
     <w:link w:val="6"/>
     <w:uiPriority w:val="9"/>
     <w:rsid w:val="00654A48"/>
@@ -5779,7 +6551,7 @@
   </w:style>
   <w:style w:type="character" w:customStyle="1" w:styleId="70">
     <w:name w:val="Заголовок 7 Знак"/>
-    <w:basedOn w:val="a3"/>
+    <w:basedOn w:val="a2"/>
     <w:link w:val="7"/>
     <w:uiPriority w:val="9"/>
     <w:rsid w:val="00654A48"/>
@@ -5792,7 +6564,7 @@
   </w:style>
   <w:style w:type="character" w:customStyle="1" w:styleId="10">
     <w:name w:val="Заголовок 1 Знак"/>
-    <w:basedOn w:val="a3"/>
+    <w:basedOn w:val="a2"/>
     <w:link w:val="1"/>
     <w:uiPriority w:val="9"/>
     <w:rsid w:val="0061435B"/>
@@ -5807,7 +6579,7 @@
   </w:style>
   <w:style w:type="character" w:customStyle="1" w:styleId="50">
     <w:name w:val="Заголовок 5 Знак"/>
-    <w:basedOn w:val="a3"/>
+    <w:basedOn w:val="a2"/>
     <w:link w:val="5"/>
     <w:uiPriority w:val="9"/>
     <w:semiHidden/>
@@ -5822,7 +6594,7 @@
   </w:style>
   <w:style w:type="character" w:customStyle="1" w:styleId="80">
     <w:name w:val="Заголовок 8 Знак"/>
-    <w:basedOn w:val="a3"/>
+    <w:basedOn w:val="a2"/>
     <w:link w:val="8"/>
     <w:uiPriority w:val="9"/>
     <w:semiHidden/>
@@ -5839,7 +6611,7 @@
   </w:style>
   <w:style w:type="character" w:customStyle="1" w:styleId="90">
     <w:name w:val="Заголовок 9 Знак"/>
-    <w:basedOn w:val="a3"/>
+    <w:basedOn w:val="a2"/>
     <w:link w:val="9"/>
     <w:uiPriority w:val="9"/>
     <w:semiHidden/>
@@ -5852,11 +6624,11 @@
       <w14:ligatures w14:val="standardContextual"/>
     </w:rPr>
   </w:style>
-  <w:style w:type="paragraph" w:styleId="a6">
+  <w:style w:type="paragraph" w:styleId="a5">
     <w:name w:val="Title"/>
-    <w:basedOn w:val="a2"/>
-    <w:next w:val="a7"/>
-    <w:link w:val="a8"/>
+    <w:basedOn w:val="a1"/>
+    <w:next w:val="a6"/>
+    <w:link w:val="a7"/>
     <w:uiPriority w:val="10"/>
     <w:qFormat/>
     <w:rsid w:val="0061435B"/>
@@ -5878,10 +6650,10 @@
       <w14:ligatures w14:val="standardContextual"/>
     </w:rPr>
   </w:style>
-  <w:style w:type="character" w:customStyle="1" w:styleId="a8">
+  <w:style w:type="character" w:customStyle="1" w:styleId="a7">
     <w:name w:val="Заголовок Знак"/>
-    <w:basedOn w:val="a3"/>
-    <w:link w:val="a6"/>
+    <w:basedOn w:val="a2"/>
+    <w:link w:val="a5"/>
     <w:uiPriority w:val="10"/>
     <w:rsid w:val="0061435B"/>
     <w:rPr>
@@ -5895,11 +6667,11 @@
       <w14:ligatures w14:val="standardContextual"/>
     </w:rPr>
   </w:style>
-  <w:style w:type="paragraph" w:styleId="a9">
+  <w:style w:type="paragraph" w:styleId="a8">
     <w:name w:val="Subtitle"/>
-    <w:basedOn w:val="a2"/>
-    <w:next w:val="a2"/>
-    <w:link w:val="aa"/>
+    <w:basedOn w:val="a1"/>
+    <w:next w:val="a1"/>
+    <w:link w:val="a9"/>
     <w:uiPriority w:val="11"/>
     <w:qFormat/>
     <w:rsid w:val="0061435B"/>
@@ -5920,10 +6692,10 @@
       <w14:ligatures w14:val="standardContextual"/>
     </w:rPr>
   </w:style>
-  <w:style w:type="character" w:customStyle="1" w:styleId="aa">
+  <w:style w:type="character" w:customStyle="1" w:styleId="a9">
     <w:name w:val="Подзаголовок Знак"/>
-    <w:basedOn w:val="a3"/>
-    <w:link w:val="a9"/>
+    <w:basedOn w:val="a2"/>
+    <w:link w:val="a8"/>
     <w:uiPriority w:val="11"/>
     <w:rsid w:val="0061435B"/>
     <w:rPr>
@@ -5938,8 +6710,8 @@
   </w:style>
   <w:style w:type="paragraph" w:styleId="21">
     <w:name w:val="Quote"/>
-    <w:basedOn w:val="a2"/>
-    <w:next w:val="a2"/>
+    <w:basedOn w:val="a1"/>
+    <w:next w:val="a1"/>
     <w:link w:val="22"/>
     <w:uiPriority w:val="29"/>
     <w:qFormat/>
@@ -5962,7 +6734,7 @@
   </w:style>
   <w:style w:type="character" w:customStyle="1" w:styleId="22">
     <w:name w:val="Цитата 2 Знак"/>
-    <w:basedOn w:val="a3"/>
+    <w:basedOn w:val="a2"/>
     <w:link w:val="21"/>
     <w:uiPriority w:val="29"/>
     <w:rsid w:val="0061435B"/>
@@ -5976,9 +6748,9 @@
       <w14:ligatures w14:val="standardContextual"/>
     </w:rPr>
   </w:style>
-  <w:style w:type="paragraph" w:styleId="ab">
+  <w:style w:type="paragraph" w:styleId="aa">
     <w:name w:val="List Paragraph"/>
-    <w:basedOn w:val="a2"/>
+    <w:basedOn w:val="a1"/>
     <w:uiPriority w:val="34"/>
     <w:qFormat/>
     <w:rsid w:val="0061435B"/>
@@ -5996,9 +6768,9 @@
       <w14:ligatures w14:val="standardContextual"/>
     </w:rPr>
   </w:style>
-  <w:style w:type="character" w:styleId="ac">
+  <w:style w:type="character" w:styleId="ab">
     <w:name w:val="Intense Emphasis"/>
-    <w:basedOn w:val="a3"/>
+    <w:basedOn w:val="a2"/>
     <w:uiPriority w:val="21"/>
     <w:qFormat/>
     <w:rsid w:val="0061435B"/>
@@ -6008,11 +6780,11 @@
       <w:color w:val="365F91" w:themeColor="accent1" w:themeShade="BF"/>
     </w:rPr>
   </w:style>
-  <w:style w:type="paragraph" w:styleId="ad">
+  <w:style w:type="paragraph" w:styleId="ac">
     <w:name w:val="Intense Quote"/>
-    <w:basedOn w:val="a2"/>
-    <w:next w:val="a2"/>
-    <w:link w:val="ae"/>
+    <w:basedOn w:val="a1"/>
+    <w:next w:val="a1"/>
+    <w:link w:val="ad"/>
     <w:uiPriority w:val="30"/>
     <w:qFormat/>
     <w:rsid w:val="0061435B"/>
@@ -6037,10 +6809,10 @@
       <w14:ligatures w14:val="standardContextual"/>
     </w:rPr>
   </w:style>
-  <w:style w:type="character" w:customStyle="1" w:styleId="ae">
+  <w:style w:type="character" w:customStyle="1" w:styleId="ad">
     <w:name w:val="Выделенная цитата Знак"/>
-    <w:basedOn w:val="a3"/>
-    <w:link w:val="ad"/>
+    <w:basedOn w:val="a2"/>
+    <w:link w:val="ac"/>
     <w:uiPriority w:val="30"/>
     <w:rsid w:val="0061435B"/>
     <w:rPr>
@@ -6053,9 +6825,9 @@
       <w14:ligatures w14:val="standardContextual"/>
     </w:rPr>
   </w:style>
-  <w:style w:type="character" w:styleId="af">
+  <w:style w:type="character" w:styleId="ae">
     <w:name w:val="Intense Reference"/>
-    <w:basedOn w:val="a3"/>
+    <w:basedOn w:val="a2"/>
     <w:uiPriority w:val="32"/>
     <w:qFormat/>
     <w:rsid w:val="0061435B"/>
@@ -6067,10 +6839,10 @@
       <w:spacing w:val="5"/>
     </w:rPr>
   </w:style>
-  <w:style w:type="paragraph" w:customStyle="1" w:styleId="a7">
+  <w:style w:type="paragraph" w:customStyle="1" w:styleId="a6">
     <w:name w:val="Основной"/>
-    <w:basedOn w:val="a2"/>
-    <w:link w:val="af0"/>
+    <w:basedOn w:val="a1"/>
+    <w:link w:val="af"/>
     <w:uiPriority w:val="1"/>
     <w:qFormat/>
     <w:rsid w:val="0061435B"/>
@@ -6088,10 +6860,10 @@
       <w14:ligatures w14:val="standardContextual"/>
     </w:rPr>
   </w:style>
-  <w:style w:type="character" w:customStyle="1" w:styleId="af0">
+  <w:style w:type="character" w:customStyle="1" w:styleId="af">
     <w:name w:val="Основной Знак"/>
-    <w:basedOn w:val="a3"/>
-    <w:link w:val="a7"/>
+    <w:basedOn w:val="a2"/>
+    <w:link w:val="a6"/>
     <w:uiPriority w:val="1"/>
     <w:rsid w:val="0061435B"/>
     <w:rPr>
@@ -6101,9 +6873,9 @@
       <w14:ligatures w14:val="standardContextual"/>
     </w:rPr>
   </w:style>
-  <w:style w:type="table" w:styleId="af1">
+  <w:style w:type="table" w:styleId="af0">
     <w:name w:val="Table Grid"/>
-    <w:basedOn w:val="a4"/>
+    <w:basedOn w:val="a3"/>
     <w:uiPriority w:val="59"/>
     <w:rsid w:val="0061435B"/>
     <w:pPr>
@@ -6124,10 +6896,10 @@
       </w:tblBorders>
     </w:tblPr>
   </w:style>
-  <w:style w:type="paragraph" w:styleId="af2">
+  <w:style w:type="paragraph" w:styleId="af1">
     <w:name w:val="header"/>
-    <w:basedOn w:val="a2"/>
-    <w:link w:val="af3"/>
+    <w:basedOn w:val="a1"/>
+    <w:link w:val="af2"/>
     <w:uiPriority w:val="99"/>
     <w:unhideWhenUsed/>
     <w:rsid w:val="0061435B"/>
@@ -6147,10 +6919,10 @@
       <w14:ligatures w14:val="standardContextual"/>
     </w:rPr>
   </w:style>
-  <w:style w:type="character" w:customStyle="1" w:styleId="af3">
+  <w:style w:type="character" w:customStyle="1" w:styleId="af2">
     <w:name w:val="Верхний колонтитул Знак"/>
-    <w:basedOn w:val="a3"/>
-    <w:link w:val="af2"/>
+    <w:basedOn w:val="a2"/>
+    <w:link w:val="af1"/>
     <w:uiPriority w:val="99"/>
     <w:rsid w:val="0061435B"/>
     <w:rPr>
@@ -6160,10 +6932,10 @@
       <w14:ligatures w14:val="standardContextual"/>
     </w:rPr>
   </w:style>
-  <w:style w:type="paragraph" w:styleId="af4">
+  <w:style w:type="paragraph" w:styleId="af3">
     <w:name w:val="footer"/>
-    <w:basedOn w:val="a2"/>
-    <w:link w:val="af5"/>
+    <w:basedOn w:val="a1"/>
+    <w:link w:val="af4"/>
     <w:uiPriority w:val="99"/>
     <w:unhideWhenUsed/>
     <w:rsid w:val="0061435B"/>
@@ -6183,10 +6955,10 @@
       <w14:ligatures w14:val="standardContextual"/>
     </w:rPr>
   </w:style>
-  <w:style w:type="character" w:customStyle="1" w:styleId="af5">
+  <w:style w:type="character" w:customStyle="1" w:styleId="af4">
     <w:name w:val="Нижний колонтитул Знак"/>
-    <w:basedOn w:val="a3"/>
-    <w:link w:val="af4"/>
+    <w:basedOn w:val="a2"/>
+    <w:link w:val="af3"/>
     <w:uiPriority w:val="99"/>
     <w:rsid w:val="0061435B"/>
     <w:rPr>
@@ -6196,27 +6968,20 @@
       <w14:ligatures w14:val="standardContextual"/>
     </w:rPr>
   </w:style>
-  <w:style w:type="paragraph" w:customStyle="1" w:styleId="a1">
+  <w:style w:type="paragraph" w:customStyle="1" w:styleId="af5">
     <w:name w:val="Список маркированный"/>
-    <w:basedOn w:val="a7"/>
+    <w:basedOn w:val="a6"/>
     <w:link w:val="af6"/>
     <w:qFormat/>
     <w:rsid w:val="0061435B"/>
     <w:pPr>
-      <w:numPr>
-        <w:numId w:val="3"/>
-      </w:numPr>
-      <w:tabs>
-        <w:tab w:val="clear" w:pos="1134"/>
-        <w:tab w:val="num" w:pos="992"/>
-      </w:tabs>
-      <w:ind w:left="0"/>
+      <w:ind w:firstLine="0"/>
     </w:pPr>
   </w:style>
   <w:style w:type="character" w:customStyle="1" w:styleId="af6">
     <w:name w:val="Список маркированный Знак"/>
-    <w:basedOn w:val="af0"/>
-    <w:link w:val="a1"/>
+    <w:basedOn w:val="af"/>
+    <w:link w:val="af5"/>
     <w:rsid w:val="0061435B"/>
     <w:rPr>
       <w:rFonts w:ascii="Times New Roman" w:hAnsi="Times New Roman"/>
@@ -6227,8 +6992,8 @@
   </w:style>
   <w:style w:type="paragraph" w:styleId="41">
     <w:name w:val="toc 4"/>
-    <w:basedOn w:val="a2"/>
-    <w:next w:val="a2"/>
+    <w:basedOn w:val="a1"/>
+    <w:next w:val="a1"/>
     <w:autoRedefine/>
     <w:uiPriority w:val="39"/>
     <w:semiHidden/>
@@ -6250,8 +7015,8 @@
   </w:style>
   <w:style w:type="paragraph" w:styleId="11">
     <w:name w:val="toc 1"/>
-    <w:basedOn w:val="a2"/>
-    <w:next w:val="a2"/>
+    <w:basedOn w:val="a1"/>
+    <w:next w:val="a1"/>
     <w:autoRedefine/>
     <w:uiPriority w:val="39"/>
     <w:unhideWhenUsed/>
@@ -6273,7 +7038,7 @@
   <w:style w:type="paragraph" w:styleId="23">
     <w:name w:val="toc 2"/>
     <w:basedOn w:val="11"/>
-    <w:next w:val="a2"/>
+    <w:next w:val="a1"/>
     <w:autoRedefine/>
     <w:uiPriority w:val="39"/>
     <w:unhideWhenUsed/>
@@ -6288,7 +7053,7 @@
   <w:style w:type="paragraph" w:styleId="31">
     <w:name w:val="toc 3"/>
     <w:basedOn w:val="23"/>
-    <w:next w:val="a2"/>
+    <w:next w:val="a1"/>
     <w:autoRedefine/>
     <w:uiPriority w:val="39"/>
     <w:unhideWhenUsed/>
@@ -6299,7 +7064,7 @@
   </w:style>
   <w:style w:type="character" w:styleId="af7">
     <w:name w:val="Hyperlink"/>
-    <w:basedOn w:val="a3"/>
+    <w:basedOn w:val="a2"/>
     <w:uiPriority w:val="99"/>
     <w:unhideWhenUsed/>
     <w:rsid w:val="0061435B"/>
@@ -6310,14 +7075,14 @@
   </w:style>
   <w:style w:type="paragraph" w:customStyle="1" w:styleId="af8">
     <w:name w:val="Заголовок Содержание"/>
-    <w:basedOn w:val="a6"/>
+    <w:basedOn w:val="a5"/>
     <w:link w:val="af9"/>
     <w:qFormat/>
     <w:rsid w:val="0061435B"/>
   </w:style>
   <w:style w:type="character" w:customStyle="1" w:styleId="af9">
     <w:name w:val="Заголовок Содержание Знак"/>
-    <w:basedOn w:val="a8"/>
+    <w:basedOn w:val="a7"/>
     <w:link w:val="af8"/>
     <w:rsid w:val="0061435B"/>
     <w:rPr>
@@ -6333,7 +7098,7 @@
   </w:style>
   <w:style w:type="paragraph" w:styleId="afa">
     <w:name w:val="Normal (Web)"/>
-    <w:basedOn w:val="a2"/>
+    <w:basedOn w:val="a1"/>
     <w:uiPriority w:val="99"/>
     <w:semiHidden/>
     <w:unhideWhenUsed/>
@@ -6344,7 +7109,7 @@
   </w:style>
   <w:style w:type="paragraph" w:customStyle="1" w:styleId="a0">
     <w:name w:val="Список буквенный"/>
-    <w:basedOn w:val="a7"/>
+    <w:basedOn w:val="a6"/>
     <w:link w:val="afb"/>
     <w:qFormat/>
     <w:rsid w:val="0061435B"/>
@@ -6356,7 +7121,7 @@
   </w:style>
   <w:style w:type="character" w:customStyle="1" w:styleId="afb">
     <w:name w:val="Список буквенный Знак"/>
-    <w:basedOn w:val="af0"/>
+    <w:basedOn w:val="af"/>
     <w:link w:val="a0"/>
     <w:rsid w:val="0061435B"/>
     <w:rPr>
@@ -6368,7 +7133,7 @@
   </w:style>
   <w:style w:type="paragraph" w:customStyle="1" w:styleId="a">
     <w:name w:val="Список нумерованный"/>
-    <w:basedOn w:val="a7"/>
+    <w:basedOn w:val="a6"/>
     <w:link w:val="afc"/>
     <w:qFormat/>
     <w:rsid w:val="0061435B"/>
@@ -6380,7 +7145,7 @@
   </w:style>
   <w:style w:type="character" w:customStyle="1" w:styleId="afc">
     <w:name w:val="Список нумерованный Знак"/>
-    <w:basedOn w:val="af0"/>
+    <w:basedOn w:val="af"/>
     <w:link w:val="a"/>
     <w:rsid w:val="0061435B"/>
     <w:rPr>
@@ -6392,8 +7157,8 @@
   </w:style>
   <w:style w:type="paragraph" w:customStyle="1" w:styleId="afd">
     <w:name w:val="Рисунок"/>
-    <w:basedOn w:val="a2"/>
-    <w:next w:val="a2"/>
+    <w:basedOn w:val="a1"/>
+    <w:next w:val="a1"/>
     <w:qFormat/>
     <w:rsid w:val="0061435B"/>
     <w:pPr>
@@ -6414,8 +7179,8 @@
   </w:style>
   <w:style w:type="paragraph" w:customStyle="1" w:styleId="afe">
     <w:name w:val="Подпись рисунка"/>
-    <w:basedOn w:val="a2"/>
-    <w:next w:val="a7"/>
+    <w:basedOn w:val="a1"/>
+    <w:next w:val="a6"/>
     <w:link w:val="aff"/>
     <w:qFormat/>
     <w:rsid w:val="0061435B"/>
@@ -6434,7 +7199,7 @@
   </w:style>
   <w:style w:type="character" w:customStyle="1" w:styleId="aff">
     <w:name w:val="Подпись рисунка Знак"/>
-    <w:basedOn w:val="a3"/>
+    <w:basedOn w:val="a2"/>
     <w:link w:val="afe"/>
     <w:rsid w:val="0061435B"/>
     <w:rPr>
@@ -6446,7 +7211,7 @@
   </w:style>
   <w:style w:type="paragraph" w:customStyle="1" w:styleId="aff0">
     <w:name w:val="Листинг"/>
-    <w:basedOn w:val="a2"/>
+    <w:basedOn w:val="a1"/>
     <w:link w:val="aff1"/>
     <w:qFormat/>
     <w:rsid w:val="0061435B"/>
@@ -6464,7 +7229,7 @@
   </w:style>
   <w:style w:type="character" w:customStyle="1" w:styleId="aff1">
     <w:name w:val="Листинг Знак"/>
-    <w:basedOn w:val="a3"/>
+    <w:basedOn w:val="a2"/>
     <w:link w:val="aff0"/>
     <w:rsid w:val="0061435B"/>
     <w:rPr>
@@ -6477,7 +7242,7 @@
   </w:style>
   <w:style w:type="paragraph" w:customStyle="1" w:styleId="aff2">
     <w:name w:val="Подпись элемента"/>
-    <w:basedOn w:val="a2"/>
+    <w:basedOn w:val="a1"/>
     <w:qFormat/>
     <w:rsid w:val="0061435B"/>
     <w:pPr>
@@ -6497,12 +7262,12 @@
   <w:style w:type="character" w:customStyle="1" w:styleId="docdata">
     <w:name w:val="docdata"/>
     <w:aliases w:val="docy,v5,1907,bqiaagaaeyqcaaagiaiaaapabgaabeggaaaaaaaaaaaaaaaaaaaaaaaaaaaaaaaaaaaaaaaaaaaaaaaaaaaaaaaaaaaaaaaaaaaaaaaaaaaaaaaaaaaaaaaaaaaaaaaaaaaaaaaaaaaaaaaaaaaaaaaaaaaaaaaaaaaaaaaaaaaaaaaaaaaaaaaaaaaaaaaaaaaaaaaaaaaaaaaaaaaaaaaaaaaaaaaaaaaaaaaa"/>
-    <w:basedOn w:val="a3"/>
+    <w:basedOn w:val="a2"/>
     <w:rsid w:val="0061435B"/>
   </w:style>
   <w:style w:type="character" w:styleId="aff3">
     <w:name w:val="FollowedHyperlink"/>
-    <w:basedOn w:val="a3"/>
+    <w:basedOn w:val="a2"/>
     <w:uiPriority w:val="99"/>
     <w:semiHidden/>
     <w:unhideWhenUsed/>
@@ -6514,7 +7279,7 @@
   </w:style>
   <w:style w:type="character" w:styleId="aff4">
     <w:name w:val="annotation reference"/>
-    <w:basedOn w:val="a3"/>
+    <w:basedOn w:val="a2"/>
     <w:uiPriority w:val="99"/>
     <w:semiHidden/>
     <w:unhideWhenUsed/>
@@ -6526,7 +7291,7 @@
   </w:style>
   <w:style w:type="paragraph" w:styleId="aff5">
     <w:name w:val="annotation text"/>
-    <w:basedOn w:val="a2"/>
+    <w:basedOn w:val="a1"/>
     <w:link w:val="aff6"/>
     <w:uiPriority w:val="99"/>
     <w:unhideWhenUsed/>
@@ -6545,7 +7310,7 @@
   </w:style>
   <w:style w:type="character" w:customStyle="1" w:styleId="aff6">
     <w:name w:val="Текст примечания Знак"/>
-    <w:basedOn w:val="a3"/>
+    <w:basedOn w:val="a2"/>
     <w:link w:val="aff5"/>
     <w:uiPriority w:val="99"/>
     <w:rsid w:val="0061435B"/>
@@ -6874,4 +7639,16 @@
   <a:objectDefaults/>
   <a:extraClrSchemeLst/>
 </a:theme>
+</file>
+
+<file path=customXml/item1.xml><?xml version="1.0" encoding="utf-8"?>
+<b:Sources xmlns:b="http://schemas.openxmlformats.org/officeDocument/2006/bibliography" xmlns="http://schemas.openxmlformats.org/officeDocument/2006/bibliography" SelectedStyle="\APASixthEditionOfficeOnline.xsl" StyleName="APA" Version="6"/>
+</file>
+
+<file path=customXml/itemProps1.xml><?xml version="1.0" encoding="utf-8"?>
+<ds:datastoreItem xmlns:ds="http://schemas.openxmlformats.org/officeDocument/2006/customXml" ds:itemID="{070AD996-7DCA-41C4-A891-833F582793AC}">
+  <ds:schemaRefs>
+    <ds:schemaRef ds:uri="http://schemas.openxmlformats.org/officeDocument/2006/bibliography"/>
+  </ds:schemaRefs>
+</ds:datastoreItem>
 </file>
</xml_diff>

<commit_message>
make first punk full
</commit_message>
<xml_diff>
--- a/Курсовой проект.docx
+++ b/Курсовой проект.docx
@@ -1124,6 +1124,7 @@
               </w:rPr>
               <w:t xml:space="preserve">. </w:t>
             </w:r>
+            <w:proofErr w:type="spellStart"/>
             <w:r>
               <w:rPr>
                 <w:b w:val="0"/>
@@ -1133,6 +1134,7 @@
               </w:rPr>
               <w:t>Маломан</w:t>
             </w:r>
+            <w:proofErr w:type="spellEnd"/>
           </w:p>
         </w:tc>
       </w:tr>
@@ -1380,7 +1382,7 @@
       <w:r>
         <w:fldChar w:fldCharType="separate"/>
       </w:r>
-      <w:hyperlink w:anchor="_Toc243412063" w:history="1">
+      <w:hyperlink w:anchor="_Toc243518856" w:history="1">
         <w:r>
           <w:rPr>
             <w:rStyle w:val="af7"/>
@@ -1407,7 +1409,7 @@
             <w:noProof/>
             <w:webHidden/>
           </w:rPr>
-          <w:instrText xml:space="preserve"> PAGEREF _Toc243412063 \h </w:instrText>
+          <w:instrText xml:space="preserve"> PAGEREF _Toc243518856 \h </w:instrText>
         </w:r>
         <w:r>
           <w:rPr>
@@ -1452,7 +1454,7 @@
           <w:lang w:eastAsia="ru-RU"/>
         </w:rPr>
       </w:pPr>
-      <w:hyperlink w:anchor="_Toc243412064" w:history="1">
+      <w:hyperlink w:anchor="_Toc243518857" w:history="1">
         <w:r>
           <w:rPr>
             <w:rStyle w:val="af7"/>
@@ -1479,7 +1481,7 @@
             <w:noProof/>
             <w:webHidden/>
           </w:rPr>
-          <w:instrText xml:space="preserve"> PAGEREF _Toc243412064 \h </w:instrText>
+          <w:instrText xml:space="preserve"> PAGEREF _Toc243518857 \h </w:instrText>
         </w:r>
         <w:r>
           <w:rPr>
@@ -1524,7 +1526,7 @@
           <w:lang w:eastAsia="ru-RU"/>
         </w:rPr>
       </w:pPr>
-      <w:hyperlink w:anchor="_Toc243412065" w:history="1">
+      <w:hyperlink w:anchor="_Toc243518858" w:history="1">
         <w:r>
           <w:rPr>
             <w:rStyle w:val="af7"/>
@@ -1551,7 +1553,7 @@
             <w:noProof/>
             <w:webHidden/>
           </w:rPr>
-          <w:instrText xml:space="preserve"> PAGEREF _Toc243412065 \h </w:instrText>
+          <w:instrText xml:space="preserve"> PAGEREF _Toc243518858 \h </w:instrText>
         </w:r>
         <w:r>
           <w:rPr>
@@ -1593,7 +1595,7 @@
           <w:lang w:eastAsia="ru-RU"/>
         </w:rPr>
       </w:pPr>
-      <w:hyperlink w:anchor="_Toc243412066" w:history="1">
+      <w:hyperlink w:anchor="_Toc243518859" w:history="1">
         <w:r>
           <w:rPr>
             <w:rStyle w:val="af7"/>
@@ -1620,7 +1622,7 @@
             <w:noProof/>
             <w:webHidden/>
           </w:rPr>
-          <w:instrText xml:space="preserve"> PAGEREF _Toc243412066 \h </w:instrText>
+          <w:instrText xml:space="preserve"> PAGEREF _Toc243518859 \h </w:instrText>
         </w:r>
         <w:r>
           <w:rPr>
@@ -1662,7 +1664,7 @@
           <w:lang w:eastAsia="ru-RU"/>
         </w:rPr>
       </w:pPr>
-      <w:hyperlink w:anchor="_Toc243412067" w:history="1">
+      <w:hyperlink w:anchor="_Toc243518860" w:history="1">
         <w:r>
           <w:rPr>
             <w:rStyle w:val="af7"/>
@@ -1689,7 +1691,7 @@
             <w:noProof/>
             <w:webHidden/>
           </w:rPr>
-          <w:instrText xml:space="preserve"> PAGEREF _Toc243412067 \h </w:instrText>
+          <w:instrText xml:space="preserve"> PAGEREF _Toc243518860 \h </w:instrText>
         </w:r>
         <w:r>
           <w:rPr>
@@ -1731,7 +1733,7 @@
           <w:lang w:eastAsia="ru-RU"/>
         </w:rPr>
       </w:pPr>
-      <w:hyperlink w:anchor="_Toc243412068" w:history="1">
+      <w:hyperlink w:anchor="_Toc243518861" w:history="1">
         <w:r>
           <w:rPr>
             <w:rStyle w:val="af7"/>
@@ -1758,7 +1760,7 @@
             <w:noProof/>
             <w:webHidden/>
           </w:rPr>
-          <w:instrText xml:space="preserve"> PAGEREF _Toc243412068 \h </w:instrText>
+          <w:instrText xml:space="preserve"> PAGEREF _Toc243518861 \h </w:instrText>
         </w:r>
         <w:r>
           <w:rPr>
@@ -1778,7 +1780,7 @@
             <w:noProof/>
             <w:webHidden/>
           </w:rPr>
-          <w:t>8</w:t>
+          <w:t>7</w:t>
         </w:r>
         <w:r>
           <w:rPr>
@@ -1803,7 +1805,7 @@
           <w:lang w:eastAsia="ru-RU"/>
         </w:rPr>
       </w:pPr>
-      <w:hyperlink w:anchor="_Toc243412069" w:history="1">
+      <w:hyperlink w:anchor="_Toc243518862" w:history="1">
         <w:r>
           <w:rPr>
             <w:rStyle w:val="af7"/>
@@ -1830,7 +1832,7 @@
             <w:noProof/>
             <w:webHidden/>
           </w:rPr>
-          <w:instrText xml:space="preserve"> PAGEREF _Toc243412069 \h </w:instrText>
+          <w:instrText xml:space="preserve"> PAGEREF _Toc243518862 \h </w:instrText>
         </w:r>
         <w:r>
           <w:rPr>
@@ -1872,7 +1874,7 @@
           <w:lang w:eastAsia="ru-RU"/>
         </w:rPr>
       </w:pPr>
-      <w:hyperlink w:anchor="_Toc243412070" w:history="1">
+      <w:hyperlink w:anchor="_Toc243518863" w:history="1">
         <w:r>
           <w:rPr>
             <w:rStyle w:val="af7"/>
@@ -1899,7 +1901,7 @@
             <w:noProof/>
             <w:webHidden/>
           </w:rPr>
-          <w:instrText xml:space="preserve"> PAGEREF _Toc243412070 \h </w:instrText>
+          <w:instrText xml:space="preserve"> PAGEREF _Toc243518863 \h </w:instrText>
         </w:r>
         <w:r>
           <w:rPr>
@@ -1941,7 +1943,7 @@
           <w:lang w:eastAsia="ru-RU"/>
         </w:rPr>
       </w:pPr>
-      <w:hyperlink w:anchor="_Toc243412071" w:history="1">
+      <w:hyperlink w:anchor="_Toc243518864" w:history="1">
         <w:r>
           <w:rPr>
             <w:rStyle w:val="af7"/>
@@ -1968,7 +1970,7 @@
             <w:noProof/>
             <w:webHidden/>
           </w:rPr>
-          <w:instrText xml:space="preserve"> PAGEREF _Toc243412071 \h </w:instrText>
+          <w:instrText xml:space="preserve"> PAGEREF _Toc243518864 \h </w:instrText>
         </w:r>
         <w:r>
           <w:rPr>
@@ -2010,7 +2012,7 @@
           <w:lang w:eastAsia="ru-RU"/>
         </w:rPr>
       </w:pPr>
-      <w:hyperlink w:anchor="_Toc243412072" w:history="1">
+      <w:hyperlink w:anchor="_Toc243518865" w:history="1">
         <w:r>
           <w:rPr>
             <w:rStyle w:val="af7"/>
@@ -2037,7 +2039,7 @@
             <w:noProof/>
             <w:webHidden/>
           </w:rPr>
-          <w:instrText xml:space="preserve"> PAGEREF _Toc243412072 \h </w:instrText>
+          <w:instrText xml:space="preserve"> PAGEREF _Toc243518865 \h </w:instrText>
         </w:r>
         <w:r>
           <w:rPr>
@@ -2082,7 +2084,7 @@
           <w:lang w:eastAsia="ru-RU"/>
         </w:rPr>
       </w:pPr>
-      <w:hyperlink w:anchor="_Toc243412073" w:history="1">
+      <w:hyperlink w:anchor="_Toc243518866" w:history="1">
         <w:r>
           <w:rPr>
             <w:rStyle w:val="af7"/>
@@ -2109,7 +2111,7 @@
             <w:noProof/>
             <w:webHidden/>
           </w:rPr>
-          <w:instrText xml:space="preserve"> PAGEREF _Toc243412073 \h </w:instrText>
+          <w:instrText xml:space="preserve"> PAGEREF _Toc243518866 \h </w:instrText>
         </w:r>
         <w:r>
           <w:rPr>
@@ -2151,7 +2153,7 @@
           <w:lang w:eastAsia="ru-RU"/>
         </w:rPr>
       </w:pPr>
-      <w:hyperlink w:anchor="_Toc243412074" w:history="1">
+      <w:hyperlink w:anchor="_Toc243518867" w:history="1">
         <w:r>
           <w:rPr>
             <w:rStyle w:val="af7"/>
@@ -2178,7 +2180,7 @@
             <w:noProof/>
             <w:webHidden/>
           </w:rPr>
-          <w:instrText xml:space="preserve"> PAGEREF _Toc243412074 \h </w:instrText>
+          <w:instrText xml:space="preserve"> PAGEREF _Toc243518867 \h </w:instrText>
         </w:r>
         <w:r>
           <w:rPr>
@@ -2220,7 +2222,7 @@
           <w:lang w:eastAsia="ru-RU"/>
         </w:rPr>
       </w:pPr>
-      <w:hyperlink w:anchor="_Toc243412075" w:history="1">
+      <w:hyperlink w:anchor="_Toc243518868" w:history="1">
         <w:r>
           <w:rPr>
             <w:rStyle w:val="af7"/>
@@ -2247,7 +2249,7 @@
             <w:noProof/>
             <w:webHidden/>
           </w:rPr>
-          <w:instrText xml:space="preserve"> PAGEREF _Toc243412075 \h </w:instrText>
+          <w:instrText xml:space="preserve"> PAGEREF _Toc243518868 \h </w:instrText>
         </w:r>
         <w:r>
           <w:rPr>
@@ -2289,7 +2291,7 @@
           <w:lang w:eastAsia="ru-RU"/>
         </w:rPr>
       </w:pPr>
-      <w:hyperlink w:anchor="_Toc243412076" w:history="1">
+      <w:hyperlink w:anchor="_Toc243518869" w:history="1">
         <w:r>
           <w:rPr>
             <w:rStyle w:val="af7"/>
@@ -2316,7 +2318,7 @@
             <w:noProof/>
             <w:webHidden/>
           </w:rPr>
-          <w:instrText xml:space="preserve"> PAGEREF _Toc243412076 \h </w:instrText>
+          <w:instrText xml:space="preserve"> PAGEREF _Toc243518869 \h </w:instrText>
         </w:r>
         <w:r>
           <w:rPr>
@@ -2358,7 +2360,7 @@
           <w:lang w:eastAsia="ru-RU"/>
         </w:rPr>
       </w:pPr>
-      <w:hyperlink w:anchor="_Toc243412077" w:history="1">
+      <w:hyperlink w:anchor="_Toc243518870" w:history="1">
         <w:r>
           <w:rPr>
             <w:rStyle w:val="af7"/>
@@ -2385,7 +2387,7 @@
             <w:noProof/>
             <w:webHidden/>
           </w:rPr>
-          <w:instrText xml:space="preserve"> PAGEREF _Toc243412077 \h </w:instrText>
+          <w:instrText xml:space="preserve"> PAGEREF _Toc243518870 \h </w:instrText>
         </w:r>
         <w:r>
           <w:rPr>
@@ -2430,7 +2432,7 @@
           <w:lang w:eastAsia="ru-RU"/>
         </w:rPr>
       </w:pPr>
-      <w:hyperlink w:anchor="_Toc243412078" w:history="1">
+      <w:hyperlink w:anchor="_Toc243518871" w:history="1">
         <w:r>
           <w:rPr>
             <w:rStyle w:val="af7"/>
@@ -2457,7 +2459,7 @@
             <w:noProof/>
             <w:webHidden/>
           </w:rPr>
-          <w:instrText xml:space="preserve"> PAGEREF _Toc243412078 \h </w:instrText>
+          <w:instrText xml:space="preserve"> PAGEREF _Toc243518871 \h </w:instrText>
         </w:r>
         <w:r>
           <w:rPr>
@@ -2499,7 +2501,7 @@
           <w:lang w:eastAsia="ru-RU"/>
         </w:rPr>
       </w:pPr>
-      <w:hyperlink w:anchor="_Toc243412079" w:history="1">
+      <w:hyperlink w:anchor="_Toc243518872" w:history="1">
         <w:r>
           <w:rPr>
             <w:rStyle w:val="af7"/>
@@ -2526,7 +2528,7 @@
             <w:noProof/>
             <w:webHidden/>
           </w:rPr>
-          <w:instrText xml:space="preserve"> PAGEREF _Toc243412079 \h </w:instrText>
+          <w:instrText xml:space="preserve"> PAGEREF _Toc243518872 \h </w:instrText>
         </w:r>
         <w:r>
           <w:rPr>
@@ -2568,7 +2570,7 @@
           <w:lang w:eastAsia="ru-RU"/>
         </w:rPr>
       </w:pPr>
-      <w:hyperlink w:anchor="_Toc243412080" w:history="1">
+      <w:hyperlink w:anchor="_Toc243518873" w:history="1">
         <w:r>
           <w:rPr>
             <w:rStyle w:val="af7"/>
@@ -2595,7 +2597,7 @@
             <w:noProof/>
             <w:webHidden/>
           </w:rPr>
-          <w:instrText xml:space="preserve"> PAGEREF _Toc243412080 \h </w:instrText>
+          <w:instrText xml:space="preserve"> PAGEREF _Toc243518873 \h </w:instrText>
         </w:r>
         <w:r>
           <w:rPr>
@@ -2640,7 +2642,7 @@
           <w:lang w:eastAsia="ru-RU"/>
         </w:rPr>
       </w:pPr>
-      <w:hyperlink w:anchor="_Toc243412081" w:history="1">
+      <w:hyperlink w:anchor="_Toc243518874" w:history="1">
         <w:r>
           <w:rPr>
             <w:rStyle w:val="af7"/>
@@ -2667,7 +2669,7 @@
             <w:noProof/>
             <w:webHidden/>
           </w:rPr>
-          <w:instrText xml:space="preserve"> PAGEREF _Toc243412081 \h </w:instrText>
+          <w:instrText xml:space="preserve"> PAGEREF _Toc243518874 \h </w:instrText>
         </w:r>
         <w:r>
           <w:rPr>
@@ -2709,7 +2711,7 @@
           <w:lang w:eastAsia="ru-RU"/>
         </w:rPr>
       </w:pPr>
-      <w:hyperlink w:anchor="_Toc243412082" w:history="1">
+      <w:hyperlink w:anchor="_Toc243518875" w:history="1">
         <w:r>
           <w:rPr>
             <w:rStyle w:val="af7"/>
@@ -2736,7 +2738,7 @@
             <w:noProof/>
             <w:webHidden/>
           </w:rPr>
-          <w:instrText xml:space="preserve"> PAGEREF _Toc243412082 \h </w:instrText>
+          <w:instrText xml:space="preserve"> PAGEREF _Toc243518875 \h </w:instrText>
         </w:r>
         <w:r>
           <w:rPr>
@@ -2778,7 +2780,7 @@
           <w:lang w:eastAsia="ru-RU"/>
         </w:rPr>
       </w:pPr>
-      <w:hyperlink w:anchor="_Toc243412083" w:history="1">
+      <w:hyperlink w:anchor="_Toc243518876" w:history="1">
         <w:r>
           <w:rPr>
             <w:rStyle w:val="af7"/>
@@ -2805,7 +2807,7 @@
             <w:noProof/>
             <w:webHidden/>
           </w:rPr>
-          <w:instrText xml:space="preserve"> PAGEREF _Toc243412083 \h </w:instrText>
+          <w:instrText xml:space="preserve"> PAGEREF _Toc243518876 \h </w:instrText>
         </w:r>
         <w:r>
           <w:rPr>
@@ -2850,7 +2852,7 @@
           <w:lang w:eastAsia="ru-RU"/>
         </w:rPr>
       </w:pPr>
-      <w:hyperlink w:anchor="_Toc243412084" w:history="1">
+      <w:hyperlink w:anchor="_Toc243518877" w:history="1">
         <w:r>
           <w:rPr>
             <w:rStyle w:val="af7"/>
@@ -2877,7 +2879,7 @@
             <w:noProof/>
             <w:webHidden/>
           </w:rPr>
-          <w:instrText xml:space="preserve"> PAGEREF _Toc243412084 \h </w:instrText>
+          <w:instrText xml:space="preserve"> PAGEREF _Toc243518877 \h </w:instrText>
         </w:r>
         <w:r>
           <w:rPr>
@@ -2922,7 +2924,7 @@
           <w:lang w:eastAsia="ru-RU"/>
         </w:rPr>
       </w:pPr>
-      <w:hyperlink w:anchor="_Toc243412085" w:history="1">
+      <w:hyperlink w:anchor="_Toc243518878" w:history="1">
         <w:r>
           <w:rPr>
             <w:rStyle w:val="af7"/>
@@ -2949,7 +2951,7 @@
             <w:noProof/>
             <w:webHidden/>
           </w:rPr>
-          <w:instrText xml:space="preserve"> PAGEREF _Toc243412085 \h </w:instrText>
+          <w:instrText xml:space="preserve"> PAGEREF _Toc243518878 \h </w:instrText>
         </w:r>
         <w:r>
           <w:rPr>
@@ -2989,7 +2991,7 @@
       <w:pPr>
         <w:pStyle w:val="a5"/>
       </w:pPr>
-      <w:bookmarkStart w:id="0" w:name="_Toc243412063"/>
+      <w:bookmarkStart w:id="0" w:name="_Toc243518856"/>
       <w:r>
         <w:lastRenderedPageBreak/>
         <w:t>Перечень сокращений и обозначений</w:t>
@@ -3041,6 +3043,36 @@
       </w:pPr>
       <w:r>
         <w:t>ОС – операционная система</w:t>
+      </w:r>
+    </w:p>
+    <w:p>
+      <w:pPr>
+        <w:pStyle w:val="a6"/>
+      </w:pPr>
+      <w:r>
+        <w:t>ГГц</w:t>
+      </w:r>
+      <w:r>
+        <w:t xml:space="preserve"> – </w:t>
+      </w:r>
+      <w:r>
+        <w:t>гигагерц</w:t>
+      </w:r>
+    </w:p>
+    <w:p>
+      <w:pPr>
+        <w:pStyle w:val="a6"/>
+      </w:pPr>
+      <w:r>
+        <w:t>ГБ – гигабайт</w:t>
+      </w:r>
+    </w:p>
+    <w:p>
+      <w:pPr>
+        <w:pStyle w:val="a6"/>
+      </w:pPr>
+      <w:r>
+        <w:t>МБ – мегабайт</w:t>
       </w:r>
     </w:p>
     <w:p>
@@ -3071,13 +3103,45 @@
     <w:p>
       <w:pPr>
         <w:pStyle w:val="a6"/>
-      </w:pPr>
+        <w:tabs>
+          <w:tab w:val="left" w:pos="1959"/>
+        </w:tabs>
+      </w:pPr>
+      <w:r>
+        <w:rPr>
+          <w:lang w:val="en-US"/>
+        </w:rPr>
+        <w:t>SQL</w:t>
+      </w:r>
+      <w:r>
+        <w:t xml:space="preserve"> –</w:t>
+      </w:r>
+      <w:r>
+        <w:t xml:space="preserve"> язык структурированных запросов</w:t>
+      </w:r>
+    </w:p>
+    <w:p>
+      <w:pPr>
+        <w:pStyle w:val="a6"/>
+      </w:pPr>
+      <w:r>
+        <w:rPr>
+          <w:lang w:val="en-US"/>
+        </w:rPr>
+        <w:t>ASP</w:t>
+      </w:r>
+      <w:r>
+        <w:t xml:space="preserve"> – </w:t>
+      </w:r>
+      <w:r>
+        <w:t>активные серверные страницы</w:t>
+      </w:r>
     </w:p>
     <w:p>
       <w:pPr>
         <w:pStyle w:val="a5"/>
       </w:pPr>
-      <w:bookmarkStart w:id="1" w:name="_Toc243412064"/>
+      <w:bookmarkStart w:id="1" w:name="_Toc243518857"/>
       <w:r>
         <w:lastRenderedPageBreak/>
         <w:t>Введение</w:t>
@@ -3449,7 +3513,7 @@
       <w:pPr>
         <w:pStyle w:val="1"/>
       </w:pPr>
-      <w:bookmarkStart w:id="2" w:name="_Toc243412065"/>
+      <w:bookmarkStart w:id="2" w:name="_Toc243518858"/>
       <w:r>
         <w:lastRenderedPageBreak/>
         <w:t>Анализ и разработка требований</w:t>
@@ -3460,7 +3524,7 @@
       <w:pPr>
         <w:pStyle w:val="2"/>
       </w:pPr>
-      <w:bookmarkStart w:id="3" w:name="_Toc243412066"/>
+      <w:bookmarkStart w:id="3" w:name="_Toc243518859"/>
       <w:r>
         <w:t>Назначение</w:t>
       </w:r>
@@ -3601,7 +3665,7 @@
       <w:pPr>
         <w:pStyle w:val="2"/>
       </w:pPr>
-      <w:bookmarkStart w:id="4" w:name="_Toc243412067"/>
+      <w:bookmarkStart w:id="4" w:name="_Toc243518860"/>
       <w:r>
         <w:t>Постановка задачи</w:t>
       </w:r>
@@ -3923,7 +3987,7 @@
       <w:pPr>
         <w:pStyle w:val="2"/>
       </w:pPr>
-      <w:bookmarkStart w:id="5" w:name="_Toc243412068"/>
+      <w:bookmarkStart w:id="5" w:name="_Toc243518861"/>
       <w:r>
         <w:t>Выбор состава программных и технических</w:t>
       </w:r>
@@ -3946,7 +4010,7 @@
         <w:rPr>
           <w:lang w:val="en-US"/>
         </w:rPr>
-        <w:t>MySql</w:t>
+        <w:t>MySQL</w:t>
       </w:r>
       <w:r>
         <w:t xml:space="preserve"> </w:t>
@@ -4017,31 +4081,7 @@
         <w:pStyle w:val="a6"/>
       </w:pPr>
       <w:r>
-        <w:t>Аппаратные требования к клиенту для запуска разработанного ПО:</w:t>
-      </w:r>
-    </w:p>
-    <w:p>
-      <w:pPr>
-        <w:pStyle w:val="a6"/>
-      </w:pPr>
-      <w:r>
-        <w:t>Аппаратные требования к серверу для корректной работы приложения</w:t>
-      </w:r>
-      <w:r>
-        <w:t>:</w:t>
-      </w:r>
-    </w:p>
-    <w:p>
-      <w:pPr>
-        <w:pStyle w:val="a6"/>
-      </w:pPr>
-    </w:p>
-    <w:p>
-      <w:pPr>
-        <w:pStyle w:val="a6"/>
-      </w:pPr>
-      <w:r>
-        <w:t xml:space="preserve">Мобильное - </w:t>
+        <w:t xml:space="preserve">Для разработки мобильного приложения выбрана среда разработки </w:t>
       </w:r>
       <w:r>
         <w:rPr>
@@ -4059,7 +4099,7 @@
         <w:t>Studio</w:t>
       </w:r>
       <w:r>
-        <w:t xml:space="preserve"> (язык: </w:t>
+        <w:t xml:space="preserve">, язык программирования </w:t>
       </w:r>
       <w:r>
         <w:rPr>
@@ -4068,13 +4108,22 @@
         <w:t>Kotlin</w:t>
       </w:r>
       <w:r>
-        <w:t xml:space="preserve">,  фреймворки: </w:t>
+        <w:t xml:space="preserve">, </w:t>
+      </w:r>
+      <w:r>
+        <w:t xml:space="preserve">с использованием фреймворка </w:t>
       </w:r>
       <w:r>
         <w:rPr>
           <w:lang w:val="en-US"/>
         </w:rPr>
-        <w:t>Jetpack</w:t>
+        <w:t>Jetpac</w:t>
+      </w:r>
+      <w:r>
+        <w:rPr>
+          <w:lang w:val="en-US"/>
+        </w:rPr>
+        <w:t>k</w:t>
       </w:r>
       <w:r>
         <w:t xml:space="preserve"> </w:t>
@@ -4086,87 +4135,342 @@
         <w:t>Compose</w:t>
       </w:r>
       <w:r>
-        <w:t>)</w:t>
+        <w:t>.</w:t>
       </w:r>
     </w:p>
     <w:p>
       <w:pPr>
         <w:pStyle w:val="a6"/>
+      </w:pPr>
+      <w:r>
+        <w:t xml:space="preserve">Для разработки оконного приложения выбрана среда разработки </w:t>
+      </w:r>
+      <w:r>
         <w:rPr>
           <w:lang w:val="en-US"/>
         </w:rPr>
-      </w:pPr>
+        <w:t>Visual</w:t>
+      </w:r>
+      <w:r>
+        <w:t xml:space="preserve"> </w:t>
+      </w:r>
       <w:r>
         <w:rPr>
           <w:lang w:val="en-US"/>
         </w:rPr>
-        <w:t>Оконное</w:t>
+        <w:t>Studio</w:t>
+      </w:r>
+      <w:r>
+        <w:t xml:space="preserve">, язык программирования </w:t>
       </w:r>
       <w:r>
         <w:rPr>
           <w:lang w:val="en-US"/>
         </w:rPr>
-        <w:t xml:space="preserve"> - Visual Studio (</w:t>
+        <w:t>C</w:t>
+      </w:r>
+      <w:r>
+        <w:t>#</w:t>
+      </w:r>
+      <w:r>
+        <w:t xml:space="preserve">, с использованием фреймворка </w:t>
       </w:r>
       <w:r>
         <w:rPr>
           <w:lang w:val="en-US"/>
         </w:rPr>
-        <w:t>язык</w:t>
-      </w:r>
-      <w:r>
+        <w:t>Avalonia</w:t>
+      </w:r>
+      <w:r>
+        <w:t>.</w:t>
+      </w:r>
+    </w:p>
+    <w:p>
+      <w:pPr>
+        <w:pStyle w:val="a6"/>
+      </w:pPr>
+      <w:r>
+        <w:t>Аппаратные требования к клиенту для запуска разработанного ПО:</w:t>
+      </w:r>
+    </w:p>
+    <w:p>
+      <w:pPr>
+        <w:pStyle w:val="af5"/>
+        <w:numPr>
+          <w:ilvl w:val="0"/>
+          <w:numId w:val="3"/>
+        </w:numPr>
+        <w:tabs>
+          <w:tab w:val="clear" w:pos="1134"/>
+          <w:tab w:val="num" w:pos="992"/>
+        </w:tabs>
+        <w:ind w:left="0"/>
+      </w:pPr>
+      <w:r>
+        <w:t xml:space="preserve">операционная система: </w:t>
+      </w:r>
+      <w:r>
+        <w:t xml:space="preserve">Windows 10 </w:t>
+      </w:r>
+      <w:r>
+        <w:t xml:space="preserve">и выше, </w:t>
+      </w:r>
+      <w:r>
+        <w:t xml:space="preserve">Android </w:t>
+      </w:r>
+      <w:r>
+        <w:t>15 и выше;</w:t>
+      </w:r>
+    </w:p>
+    <w:p>
+      <w:pPr>
+        <w:pStyle w:val="af5"/>
+        <w:numPr>
+          <w:ilvl w:val="0"/>
+          <w:numId w:val="3"/>
+        </w:numPr>
+        <w:tabs>
+          <w:tab w:val="clear" w:pos="1134"/>
+          <w:tab w:val="num" w:pos="992"/>
+        </w:tabs>
+        <w:ind w:left="0"/>
+      </w:pPr>
+      <w:r>
+        <w:lastRenderedPageBreak/>
+        <w:t>процессор: 2-ядерный с тактовой частотой от 1 ГГц;</w:t>
+      </w:r>
+    </w:p>
+    <w:p>
+      <w:pPr>
+        <w:pStyle w:val="af5"/>
+        <w:numPr>
+          <w:ilvl w:val="0"/>
+          <w:numId w:val="3"/>
+        </w:numPr>
+        <w:tabs>
+          <w:tab w:val="clear" w:pos="1134"/>
+          <w:tab w:val="num" w:pos="992"/>
+        </w:tabs>
+        <w:ind w:left="0"/>
+      </w:pPr>
+      <w:r>
+        <w:t>оперативная память: от 2 ГБ для 32-битных систем или от 4 ГБ для 64-битных систем;</w:t>
+      </w:r>
+    </w:p>
+    <w:p>
+      <w:pPr>
+        <w:pStyle w:val="af5"/>
+        <w:numPr>
+          <w:ilvl w:val="0"/>
+          <w:numId w:val="3"/>
+        </w:numPr>
+        <w:tabs>
+          <w:tab w:val="clear" w:pos="1134"/>
+          <w:tab w:val="num" w:pos="992"/>
+        </w:tabs>
+        <w:ind w:left="0"/>
+      </w:pPr>
+      <w:r>
+        <w:t>накопитель: от 50 до 500 МБ под файлы программы;</w:t>
+      </w:r>
+    </w:p>
+    <w:p>
+      <w:pPr>
+        <w:pStyle w:val="af5"/>
+        <w:numPr>
+          <w:ilvl w:val="0"/>
+          <w:numId w:val="3"/>
+        </w:numPr>
+        <w:tabs>
+          <w:tab w:val="clear" w:pos="1134"/>
+          <w:tab w:val="num" w:pos="992"/>
+        </w:tabs>
+        <w:ind w:left="0"/>
+      </w:pPr>
+      <w:r>
+        <w:t xml:space="preserve">видеокарта: встроенная графика </w:t>
+      </w:r>
+      <w:r>
+        <w:t xml:space="preserve">– </w:t>
+      </w:r>
+      <w:r>
+        <w:t>отдельная видеокарта не требуется</w:t>
+      </w:r>
+      <w:r>
+        <w:t>.</w:t>
+      </w:r>
+    </w:p>
+    <w:p>
+      <w:pPr>
+        <w:pStyle w:val="af5"/>
+        <w:ind w:left="709"/>
         <w:rPr>
           <w:lang w:val="en-US"/>
         </w:rPr>
-        <w:t xml:space="preserve">: C#, </w:t>
-      </w:r>
-      <w:r>
-        <w:rPr>
-          <w:lang w:val="en-US"/>
-        </w:rPr>
-        <w:t>фреймворки</w:t>
-      </w:r>
-      <w:r>
-        <w:rPr>
-          <w:lang w:val="en-US"/>
-        </w:rPr>
-        <w:t>: Avalonia)</w:t>
+      </w:pPr>
+      <w:r>
+        <w:t>Особых программных требований для клиента не предусмотрено.</w:t>
       </w:r>
     </w:p>
     <w:p>
       <w:pPr>
         <w:pStyle w:val="a6"/>
-        <w:rPr>
-          <w:lang w:val="en-US"/>
-        </w:rPr>
-      </w:pPr>
-      <w:r>
-        <w:rPr>
-          <w:lang w:val="en-US"/>
-        </w:rPr>
-        <w:t>База данных - MySql, SQLite.</w:t>
-      </w:r>
-    </w:p>
-    <w:p>
-      <w:pPr>
-        <w:pStyle w:val="a6"/>
-        <w:rPr>
-          <w:lang w:val="en-US"/>
-        </w:rPr>
-      </w:pPr>
-      <w:r>
-        <w:rPr>
-          <w:lang w:val="en-US"/>
-        </w:rPr>
-        <w:lastRenderedPageBreak/>
-        <w:t>API - ASP .NET API (С#).</w:t>
-      </w:r>
+      </w:pPr>
+      <w:r>
+        <w:t>Аппаратные требования к серверу для корректной работы приложения</w:t>
+      </w:r>
+      <w:r>
+        <w:t>:</w:t>
+      </w:r>
+    </w:p>
+    <w:p>
+      <w:pPr>
+        <w:pStyle w:val="af5"/>
+        <w:numPr>
+          <w:ilvl w:val="0"/>
+          <w:numId w:val="3"/>
+        </w:numPr>
+        <w:tabs>
+          <w:tab w:val="clear" w:pos="1134"/>
+          <w:tab w:val="num" w:pos="992"/>
+        </w:tabs>
+        <w:ind w:left="0"/>
+      </w:pPr>
+      <w:r>
+        <w:t>о</w:t>
+      </w:r>
+      <w:r>
+        <w:t>перационная система</w:t>
+      </w:r>
+      <w:r>
+        <w:t xml:space="preserve">: </w:t>
+      </w:r>
+      <w:r>
+        <w:t>Ubuntu</w:t>
+      </w:r>
+      <w:r>
+        <w:t xml:space="preserve"> </w:t>
+      </w:r>
+      <w:r>
+        <w:t>Server</w:t>
+      </w:r>
+      <w:r>
+        <w:t xml:space="preserve"> 24.04 </w:t>
+      </w:r>
+      <w:r>
+        <w:t>LTS</w:t>
+      </w:r>
+      <w:r>
+        <w:t>;</w:t>
+      </w:r>
+    </w:p>
+    <w:p>
+      <w:pPr>
+        <w:pStyle w:val="af5"/>
+        <w:numPr>
+          <w:ilvl w:val="0"/>
+          <w:numId w:val="3"/>
+        </w:numPr>
+        <w:tabs>
+          <w:tab w:val="clear" w:pos="1134"/>
+          <w:tab w:val="num" w:pos="992"/>
+        </w:tabs>
+        <w:ind w:left="0"/>
+      </w:pPr>
+      <w:r>
+        <w:t>п</w:t>
+      </w:r>
+      <w:r>
+        <w:t xml:space="preserve">роцессор: </w:t>
+      </w:r>
+      <w:r>
+        <w:t>64-</w:t>
+      </w:r>
+      <w:r>
+        <w:t xml:space="preserve">битный </w:t>
+      </w:r>
+      <w:r>
+        <w:t>2-</w:t>
+      </w:r>
+      <w:r>
+        <w:t>ядерный процессор, с тактовой частой 2,5 ГГЦ;</w:t>
+      </w:r>
+    </w:p>
+    <w:p>
+      <w:pPr>
+        <w:pStyle w:val="af5"/>
+        <w:numPr>
+          <w:ilvl w:val="0"/>
+          <w:numId w:val="3"/>
+        </w:numPr>
+        <w:tabs>
+          <w:tab w:val="clear" w:pos="1134"/>
+          <w:tab w:val="num" w:pos="992"/>
+        </w:tabs>
+        <w:ind w:left="0"/>
+      </w:pPr>
+      <w:r>
+        <w:t>о</w:t>
+      </w:r>
+      <w:r>
+        <w:t>перативная память</w:t>
+      </w:r>
+      <w:r>
+        <w:t xml:space="preserve">: </w:t>
+      </w:r>
+      <w:r>
+        <w:t>4</w:t>
+      </w:r>
+      <w:r>
+        <w:t xml:space="preserve"> ГБ</w:t>
+      </w:r>
+      <w:r>
+        <w:t xml:space="preserve"> для работы серверных служб</w:t>
+      </w:r>
+      <w:r>
+        <w:t>;</w:t>
+      </w:r>
+    </w:p>
+    <w:p>
+      <w:pPr>
+        <w:pStyle w:val="af5"/>
+        <w:numPr>
+          <w:ilvl w:val="0"/>
+          <w:numId w:val="3"/>
+        </w:numPr>
+        <w:tabs>
+          <w:tab w:val="clear" w:pos="1134"/>
+          <w:tab w:val="num" w:pos="992"/>
+        </w:tabs>
+        <w:ind w:left="0"/>
+      </w:pPr>
+      <w:r>
+        <w:t>хранилище: 25 ГБ для всего устанавливаемого ПО и хранения данных</w:t>
+      </w:r>
+      <w:r>
+        <w:t>.</w:t>
+      </w:r>
+    </w:p>
+    <w:p>
+      <w:pPr>
+        <w:pStyle w:val="af5"/>
+        <w:ind w:left="709"/>
+      </w:pPr>
+      <w:r>
+        <w:t>Программные требования для сервера:</w:t>
+      </w:r>
+    </w:p>
+    <w:p>
+      <w:pPr>
+        <w:pStyle w:val="af5"/>
+        <w:ind w:left="709"/>
+      </w:pPr>
     </w:p>
     <w:p>
       <w:pPr>
         <w:pStyle w:val="1"/>
       </w:pPr>
-      <w:bookmarkStart w:id="6" w:name="_Toc243412069"/>
+      <w:bookmarkStart w:id="6" w:name="_Toc243518862"/>
       <w:r>
         <w:lastRenderedPageBreak/>
         <w:t>Проектирование программного обеспечения</w:t>
@@ -4177,7 +4481,7 @@
       <w:pPr>
         <w:pStyle w:val="2"/>
       </w:pPr>
-      <w:bookmarkStart w:id="7" w:name="_Toc243412070"/>
+      <w:bookmarkStart w:id="7" w:name="_Toc243518863"/>
       <w:r>
         <w:t xml:space="preserve">Проектирование </w:t>
       </w:r>
@@ -4198,7 +4502,7 @@
       <w:pPr>
         <w:pStyle w:val="2"/>
       </w:pPr>
-      <w:bookmarkStart w:id="8" w:name="_Toc243412071"/>
+      <w:bookmarkStart w:id="8" w:name="_Toc243518864"/>
       <w:r>
         <w:t>Разработка архитектуры программного обеспечения</w:t>
       </w:r>
@@ -4213,7 +4517,7 @@
       <w:pPr>
         <w:pStyle w:val="2"/>
       </w:pPr>
-      <w:bookmarkStart w:id="9" w:name="_Toc243412072"/>
+      <w:bookmarkStart w:id="9" w:name="_Toc243518865"/>
       <w:r>
         <w:t xml:space="preserve">Проектирование </w:t>
       </w:r>
@@ -4231,7 +4535,7 @@
       <w:pPr>
         <w:pStyle w:val="1"/>
       </w:pPr>
-      <w:bookmarkStart w:id="10" w:name="_Toc243412073"/>
+      <w:bookmarkStart w:id="10" w:name="_Toc243518866"/>
       <w:r>
         <w:lastRenderedPageBreak/>
         <w:t>Разработка модулей программного обеспечения</w:t>
@@ -4242,7 +4546,7 @@
       <w:pPr>
         <w:pStyle w:val="2"/>
       </w:pPr>
-      <w:bookmarkStart w:id="11" w:name="_Toc243412074"/>
+      <w:bookmarkStart w:id="11" w:name="_Toc243518867"/>
       <w:r>
         <w:t xml:space="preserve">Разработка </w:t>
       </w:r>
@@ -4263,7 +4567,7 @@
       <w:pPr>
         <w:pStyle w:val="2"/>
       </w:pPr>
-      <w:bookmarkStart w:id="12" w:name="_Toc243412075"/>
+      <w:bookmarkStart w:id="12" w:name="_Toc243518868"/>
       <w:r>
         <w:t>Реализация интерфейса пользователя</w:t>
       </w:r>
@@ -4278,7 +4582,7 @@
       <w:pPr>
         <w:pStyle w:val="2"/>
       </w:pPr>
-      <w:bookmarkStart w:id="13" w:name="_Toc243412076"/>
+      <w:bookmarkStart w:id="13" w:name="_Toc243518869"/>
       <w:r>
         <w:t>Разграничение прав доступа пользователей</w:t>
       </w:r>
@@ -4293,7 +4597,7 @@
       <w:pPr>
         <w:pStyle w:val="2"/>
       </w:pPr>
-      <w:bookmarkStart w:id="14" w:name="_Toc243412077"/>
+      <w:bookmarkStart w:id="14" w:name="_Toc243518870"/>
       <w:r>
         <w:t>Экспорт и импорт данных</w:t>
       </w:r>
@@ -4308,7 +4612,7 @@
       <w:pPr>
         <w:pStyle w:val="1"/>
       </w:pPr>
-      <w:bookmarkStart w:id="15" w:name="_Toc243412078"/>
+      <w:bookmarkStart w:id="15" w:name="_Toc243518871"/>
       <w:r>
         <w:lastRenderedPageBreak/>
         <w:t>Тестирование и отладка программного обеспечения</w:t>
@@ -4319,7 +4623,7 @@
       <w:pPr>
         <w:pStyle w:val="2"/>
       </w:pPr>
-      <w:bookmarkStart w:id="16" w:name="_Toc243412079"/>
+      <w:bookmarkStart w:id="16" w:name="_Toc243518872"/>
       <w:r>
         <w:t>Структурное тестирование</w:t>
       </w:r>
@@ -4334,7 +4638,7 @@
       <w:pPr>
         <w:pStyle w:val="2"/>
       </w:pPr>
-      <w:bookmarkStart w:id="17" w:name="_Toc243412080"/>
+      <w:bookmarkStart w:id="17" w:name="_Toc243518873"/>
       <w:r>
         <w:t>Функциональное тестирование</w:t>
       </w:r>
@@ -4349,7 +4653,7 @@
       <w:pPr>
         <w:pStyle w:val="1"/>
       </w:pPr>
-      <w:bookmarkStart w:id="18" w:name="_Toc243412081"/>
+      <w:bookmarkStart w:id="18" w:name="_Toc243518874"/>
       <w:r>
         <w:lastRenderedPageBreak/>
         <w:t>Инструкция по эксплуатации программного обеспечения</w:t>
@@ -4360,7 +4664,7 @@
       <w:pPr>
         <w:pStyle w:val="2"/>
       </w:pPr>
-      <w:bookmarkStart w:id="19" w:name="_Toc243412082"/>
+      <w:bookmarkStart w:id="19" w:name="_Toc243518875"/>
       <w:r>
         <w:t xml:space="preserve">Установка </w:t>
       </w:r>
@@ -4378,7 +4682,7 @@
       <w:pPr>
         <w:pStyle w:val="2"/>
       </w:pPr>
-      <w:bookmarkStart w:id="20" w:name="_Toc243412083"/>
+      <w:bookmarkStart w:id="20" w:name="_Toc243518876"/>
       <w:r>
         <w:t>Инструкция по работе</w:t>
       </w:r>
@@ -4393,7 +4697,7 @@
       <w:pPr>
         <w:pStyle w:val="a5"/>
       </w:pPr>
-      <w:bookmarkStart w:id="21" w:name="_Toc243412084"/>
+      <w:bookmarkStart w:id="21" w:name="_Toc243518877"/>
       <w:r>
         <w:lastRenderedPageBreak/>
         <w:t>Заключение</w:t>
@@ -4883,7 +5187,7 @@
       <w:pPr>
         <w:pStyle w:val="a5"/>
       </w:pPr>
-      <w:bookmarkStart w:id="22" w:name="_Toc243412085"/>
+      <w:bookmarkStart w:id="22" w:name="_Toc243518878"/>
       <w:r>
         <w:lastRenderedPageBreak/>
         <w:t>Список использованных источников</w:t>
@@ -4895,7 +5199,31 @@
         <w:pStyle w:val="a6"/>
       </w:pPr>
       <w:r>
-        <w:t xml:space="preserve">1. Аспин А. MySQL. Практические рецепты: Пер. с англ. / А. Аспин – Санкт-Петербург : БХВ-Петербург, 2024. – 592 с. – URL: https://ibooks.ru/bookshelf/396439/reading (дата обращения: 05.05.2026). – Режим доступа: для зарегистрир. пользователей. – Текст: электронный. </w:t>
+        <w:t xml:space="preserve">1. </w:t>
+      </w:r>
+      <w:proofErr w:type="spellStart"/>
+      <w:r>
+        <w:t>Аспин</w:t>
+      </w:r>
+      <w:proofErr w:type="spellEnd"/>
+      <w:r>
+        <w:t xml:space="preserve"> А. MySQL. Практические рецепты: Пер. с англ. / А. </w:t>
+      </w:r>
+      <w:proofErr w:type="spellStart"/>
+      <w:r>
+        <w:t>Аспин</w:t>
+      </w:r>
+      <w:proofErr w:type="spellEnd"/>
+      <w:r>
+        <w:t xml:space="preserve"> – Санкт-Петербург : БХВ-Петербург, 2024. – 592 с. – URL: https://ibooks.ru/bookshelf/396439/reading (дата обращения: 05.05.2026). – Режим доступа: для </w:t>
+      </w:r>
+      <w:proofErr w:type="spellStart"/>
+      <w:r>
+        <w:t>зарегистрир</w:t>
+      </w:r>
+      <w:proofErr w:type="spellEnd"/>
+      <w:r>
+        <w:t xml:space="preserve">. пользователей. – Текст: электронный. </w:t>
       </w:r>
     </w:p>
     <w:p>
@@ -4903,7 +5231,47 @@
         <w:pStyle w:val="a6"/>
       </w:pPr>
       <w:r>
-        <w:t xml:space="preserve">2. Нацвин А. В., Юрьева Т. А. Разработка программного обеспечения с графическим интерфейсом на базе фреймворка Avalonia: учебно-методическое пособие / А.В. Нацвин, Т.А. Юрьева. – Благовещенск : АмГУ, 2023. – 102 с. – URL: https://reader.lanbook.com/book/454511 (дата обращения: 16.05.2026). – Режим доступа: для зарегистрир. пользователей. – Текст: электронный. </w:t>
+        <w:t xml:space="preserve">2. </w:t>
+      </w:r>
+      <w:proofErr w:type="spellStart"/>
+      <w:r>
+        <w:t>Нацвин</w:t>
+      </w:r>
+      <w:proofErr w:type="spellEnd"/>
+      <w:r>
+        <w:t xml:space="preserve"> А. В., Юрьева Т. А. Разработка программного обеспечения с графическим интерфейсом на базе фреймворка </w:t>
+      </w:r>
+      <w:proofErr w:type="spellStart"/>
+      <w:r>
+        <w:t>Avalonia</w:t>
+      </w:r>
+      <w:proofErr w:type="spellEnd"/>
+      <w:r>
+        <w:t xml:space="preserve">: учебно-методическое пособие / А.В. </w:t>
+      </w:r>
+      <w:proofErr w:type="spellStart"/>
+      <w:r>
+        <w:t>Нацвин</w:t>
+      </w:r>
+      <w:proofErr w:type="spellEnd"/>
+      <w:r>
+        <w:t xml:space="preserve">, Т.А. Юрьева. – Благовещенск : </w:t>
+      </w:r>
+      <w:proofErr w:type="spellStart"/>
+      <w:r>
+        <w:t>АмГУ</w:t>
+      </w:r>
+      <w:proofErr w:type="spellEnd"/>
+      <w:r>
+        <w:t xml:space="preserve">, 2023. – 102 с. – URL: https://reader.lanbook.com/book/454511 (дата обращения: 16.05.2026). – Режим доступа: для </w:t>
+      </w:r>
+      <w:proofErr w:type="spellStart"/>
+      <w:r>
+        <w:t>зарегистрир</w:t>
+      </w:r>
+      <w:proofErr w:type="spellEnd"/>
+      <w:r>
+        <w:t xml:space="preserve">. пользователей. – Текст: электронный. </w:t>
       </w:r>
     </w:p>
     <w:p>
@@ -4911,7 +5279,15 @@
         <w:pStyle w:val="a6"/>
       </w:pPr>
       <w:r>
-        <w:t xml:space="preserve">3. Проскуряков А. В. Качество и тестирование программного обеспечения. Метрология программного обеспечения. – Таганрог : Издательство Южного федерального университета, 2022. – 197 с. – URL: https://znanium.ru/read?id=429841 (дата обращения: 10.06.2026). – Режим доступа: для зарегистрир. пользователей. – Текст: электронный. </w:t>
+        <w:t xml:space="preserve">3. Проскуряков А. В. Качество и тестирование программного обеспечения. Метрология программного обеспечения. – Таганрог : Издательство Южного федерального университета, 2022. – 197 с. – URL: https://znanium.ru/read?id=429841 (дата обращения: 10.06.2026). – Режим доступа: для </w:t>
+      </w:r>
+      <w:proofErr w:type="spellStart"/>
+      <w:r>
+        <w:t>зарегистрир</w:t>
+      </w:r>
+      <w:proofErr w:type="spellEnd"/>
+      <w:r>
+        <w:t xml:space="preserve">. пользователей. – Текст: электронный. </w:t>
       </w:r>
     </w:p>
     <w:p>
@@ -4919,7 +5295,39 @@
         <w:pStyle w:val="a6"/>
       </w:pPr>
       <w:r>
-        <w:t xml:space="preserve">4. Фленов М. Е. Библия C#. – 6-е изд., перераб. и доп. / М.Е. Фленов. – Санкт-Петербург : БХВ-Петербург, 2024. – 512 с. – URL: https://ibooks.ru/bookshelf/396461/reading (дата обращения: 28.05.2026). – Режим доступа: для зарегистрир. пользователей. – Текст: электронный. </w:t>
+        <w:t xml:space="preserve">4. </w:t>
+      </w:r>
+      <w:proofErr w:type="spellStart"/>
+      <w:r>
+        <w:t>Фленов</w:t>
+      </w:r>
+      <w:proofErr w:type="spellEnd"/>
+      <w:r>
+        <w:t xml:space="preserve"> М. Е. Библия C#. – 6-е изд., </w:t>
+      </w:r>
+      <w:proofErr w:type="spellStart"/>
+      <w:r>
+        <w:t>перераб</w:t>
+      </w:r>
+      <w:proofErr w:type="spellEnd"/>
+      <w:r>
+        <w:t xml:space="preserve">. и доп. / М.Е. </w:t>
+      </w:r>
+      <w:proofErr w:type="spellStart"/>
+      <w:r>
+        <w:t>Фленов</w:t>
+      </w:r>
+      <w:proofErr w:type="spellEnd"/>
+      <w:r>
+        <w:t xml:space="preserve">. – Санкт-Петербург : БХВ-Петербург, 2024. – 512 с. – URL: https://ibooks.ru/bookshelf/396461/reading (дата обращения: 28.05.2026). – Режим доступа: для </w:t>
+      </w:r>
+      <w:proofErr w:type="spellStart"/>
+      <w:r>
+        <w:t>зарегистрир</w:t>
+      </w:r>
+      <w:proofErr w:type="spellEnd"/>
+      <w:r>
+        <w:t xml:space="preserve">. пользователей. – Текст: электронный. </w:t>
       </w:r>
     </w:p>
     <w:p>
@@ -4927,7 +5335,23 @@
         <w:pStyle w:val="a6"/>
       </w:pPr>
       <w:r>
-        <w:t>5. Шалин П. Программирование на Kotlin для Android: Пер. с англ. / П. Шалин. – Санкт-Петербург : БХВ-Петербург, 2023. – 336 с. – URL: https://ibooks.ru/bookshelf/396448/reading (дата обращения: 03.06.2026). – Режим доступа: для зарегистрир. пользователей. – Текст: электронный.</w:t>
+        <w:t xml:space="preserve">5. Шалин П. Программирование на </w:t>
+      </w:r>
+      <w:proofErr w:type="spellStart"/>
+      <w:r>
+        <w:t>Kotlin</w:t>
+      </w:r>
+      <w:proofErr w:type="spellEnd"/>
+      <w:r>
+        <w:t xml:space="preserve"> для Android: Пер. с англ. / П. Шалин. – Санкт-Петербург : БХВ-Петербург, 2023. – 336 с. – URL: https://ibooks.ru/bookshelf/396448/reading (дата обращения: 03.06.2026). – Режим доступа: для </w:t>
+      </w:r>
+      <w:proofErr w:type="spellStart"/>
+      <w:r>
+        <w:t>зарегистрир</w:t>
+      </w:r>
+      <w:proofErr w:type="spellEnd"/>
+      <w:r>
+        <w:t>. пользователей. – Текст: электронный.</w:t>
       </w:r>
     </w:p>
     <w:sectPr>

</xml_diff>

<commit_message>
update REAMDE file, rewrite first paragraph
</commit_message>
<xml_diff>
--- a/Курсовой проект.docx
+++ b/Курсовой проект.docx
@@ -1,6 +1,6 @@
 
 <file path=word/document.xml><?xml version="1.0" encoding="utf-8"?>
-<w:document xmlns:wpc="http://schemas.microsoft.com/office/word/2010/wordprocessingCanvas" xmlns:cx="http://schemas.microsoft.com/office/drawing/2014/chartex" xmlns:mc="http://schemas.openxmlformats.org/markup-compatibility/2006" xmlns:o="urn:schemas-microsoft-com:office:office" xmlns:r="http://schemas.openxmlformats.org/officeDocument/2006/relationships" xmlns:m="http://schemas.openxmlformats.org/officeDocument/2006/math" xmlns:v="urn:schemas-microsoft-com:vml" xmlns:wp14="http://schemas.microsoft.com/office/word/2010/wordprocessingDrawing" xmlns:wp="http://schemas.openxmlformats.org/drawingml/2006/wordprocessingDrawing" xmlns:w10="urn:schemas-microsoft-com:office:word" xmlns:w="http://schemas.openxmlformats.org/wordprocessingml/2006/main" xmlns:w14="http://schemas.microsoft.com/office/word/2010/wordml" xmlns:w15="http://schemas.microsoft.com/office/word/2012/wordml" xmlns:w16se="http://schemas.microsoft.com/office/word/2015/wordml/symex" xmlns:wpg="http://schemas.microsoft.com/office/word/2010/wordprocessingGroup" xmlns:wpi="http://schemas.microsoft.com/office/word/2010/wordprocessingInk" xmlns:wne="http://schemas.microsoft.com/office/word/2006/wordml" xmlns:wps="http://schemas.microsoft.com/office/word/2010/wordprocessingShape" mc:Ignorable="w14 w15 w16se wp14">
+<w:document xmlns:wpc="http://schemas.microsoft.com/office/word/2010/wordprocessingCanvas" xmlns:cx="http://schemas.microsoft.com/office/drawing/2014/chartex" xmlns:cx1="http://schemas.microsoft.com/office/drawing/2015/9/8/chartex" xmlns:cx2="http://schemas.microsoft.com/office/drawing/2015/10/21/chartex" xmlns:cx3="http://schemas.microsoft.com/office/drawing/2016/5/9/chartex" xmlns:cx4="http://schemas.microsoft.com/office/drawing/2016/5/10/chartex" xmlns:cx5="http://schemas.microsoft.com/office/drawing/2016/5/11/chartex" xmlns:cx6="http://schemas.microsoft.com/office/drawing/2016/5/12/chartex" xmlns:cx7="http://schemas.microsoft.com/office/drawing/2016/5/13/chartex" xmlns:cx8="http://schemas.microsoft.com/office/drawing/2016/5/14/chartex" xmlns:mc="http://schemas.openxmlformats.org/markup-compatibility/2006" xmlns:aink="http://schemas.microsoft.com/office/drawing/2016/ink" xmlns:am3d="http://schemas.microsoft.com/office/drawing/2017/model3d" xmlns:o="urn:schemas-microsoft-com:office:office" xmlns:oel="http://schemas.microsoft.com/office/2019/extlst" xmlns:r="http://schemas.openxmlformats.org/officeDocument/2006/relationships" xmlns:m="http://schemas.openxmlformats.org/officeDocument/2006/math" xmlns:v="urn:schemas-microsoft-com:vml" xmlns:wp14="http://schemas.microsoft.com/office/word/2010/wordprocessingDrawing" xmlns:wp="http://schemas.openxmlformats.org/drawingml/2006/wordprocessingDrawing" xmlns:w10="urn:schemas-microsoft-com:office:word" xmlns:w="http://schemas.openxmlformats.org/wordprocessingml/2006/main" xmlns:w14="http://schemas.microsoft.com/office/word/2010/wordml" xmlns:w15="http://schemas.microsoft.com/office/word/2012/wordml" xmlns:w16cex="http://schemas.microsoft.com/office/word/2018/wordml/cex" xmlns:w16cid="http://schemas.microsoft.com/office/word/2016/wordml/cid" xmlns:w16="http://schemas.microsoft.com/office/word/2018/wordml" xmlns:w16sdtdh="http://schemas.microsoft.com/office/word/2020/wordml/sdtdatahash" xmlns:w16se="http://schemas.microsoft.com/office/word/2015/wordml/symex" xmlns:wpg="http://schemas.microsoft.com/office/word/2010/wordprocessingGroup" xmlns:wpi="http://schemas.microsoft.com/office/word/2010/wordprocessingInk" xmlns:wne="http://schemas.microsoft.com/office/word/2006/wordml" xmlns:wps="http://schemas.microsoft.com/office/word/2010/wordprocessingShape" mc:Ignorable="w14 w15 w16se w16cid w16 w16cex w16sdtdh wp14">
   <w:body>
     <w:p>
       <w:pPr>
@@ -1124,7 +1124,6 @@
               </w:rPr>
               <w:t xml:space="preserve">. </w:t>
             </w:r>
-            <w:proofErr w:type="spellStart"/>
             <w:r>
               <w:rPr>
                 <w:b w:val="0"/>
@@ -1134,7 +1133,6 @@
               </w:rPr>
               <w:t>Маломан</w:t>
             </w:r>
-            <w:proofErr w:type="spellEnd"/>
           </w:p>
         </w:tc>
       </w:tr>
@@ -1368,10 +1366,9 @@
         <w:rPr>
           <w:rFonts w:asciiTheme="minorHAnsi" w:eastAsiaTheme="minorEastAsia" w:hAnsiTheme="minorHAnsi"/>
           <w:noProof/>
-          <w:kern w:val="0"/>
-          <w:sz w:val="22"/>
+          <w:sz w:val="24"/>
+          <w:szCs w:val="24"/>
           <w:lang w:eastAsia="ru-RU"/>
-          <w14:ligatures w14:val="none"/>
         </w:rPr>
       </w:pPr>
       <w:r>
@@ -1383,7 +1380,7 @@
       <w:r>
         <w:fldChar w:fldCharType="separate"/>
       </w:r>
-      <w:hyperlink w:anchor="_Toc243555840" w:history="1">
+      <w:hyperlink w:anchor="_Toc243597590" w:history="1">
         <w:r>
           <w:rPr>
             <w:rStyle w:val="af7"/>
@@ -1410,7 +1407,7 @@
             <w:noProof/>
             <w:webHidden/>
           </w:rPr>
-          <w:instrText xml:space="preserve"> PAGEREF _Toc243555840 \h </w:instrText>
+          <w:instrText xml:space="preserve"> PAGEREF _Toc243597590 \h </w:instrText>
         </w:r>
         <w:r>
           <w:rPr>
@@ -1450,13 +1447,12 @@
         <w:rPr>
           <w:rFonts w:asciiTheme="minorHAnsi" w:eastAsiaTheme="minorEastAsia" w:hAnsiTheme="minorHAnsi"/>
           <w:noProof/>
-          <w:kern w:val="0"/>
-          <w:sz w:val="22"/>
+          <w:sz w:val="24"/>
+          <w:szCs w:val="24"/>
           <w:lang w:eastAsia="ru-RU"/>
-          <w14:ligatures w14:val="none"/>
-        </w:rPr>
-      </w:pPr>
-      <w:hyperlink w:anchor="_Toc243555841" w:history="1">
+        </w:rPr>
+      </w:pPr>
+      <w:hyperlink w:anchor="_Toc243597591" w:history="1">
         <w:r>
           <w:rPr>
             <w:rStyle w:val="af7"/>
@@ -1483,7 +1479,7 @@
             <w:noProof/>
             <w:webHidden/>
           </w:rPr>
-          <w:instrText xml:space="preserve"> PAGEREF _Toc243555841 \h </w:instrText>
+          <w:instrText xml:space="preserve"> PAGEREF _Toc243597591 \h </w:instrText>
         </w:r>
         <w:r>
           <w:rPr>
@@ -1523,13 +1519,12 @@
         <w:rPr>
           <w:rFonts w:asciiTheme="minorHAnsi" w:eastAsiaTheme="minorEastAsia" w:hAnsiTheme="minorHAnsi"/>
           <w:noProof/>
-          <w:kern w:val="0"/>
-          <w:sz w:val="22"/>
+          <w:sz w:val="24"/>
+          <w:szCs w:val="24"/>
           <w:lang w:eastAsia="ru-RU"/>
-          <w14:ligatures w14:val="none"/>
-        </w:rPr>
-      </w:pPr>
-      <w:hyperlink w:anchor="_Toc243555842" w:history="1">
+        </w:rPr>
+      </w:pPr>
+      <w:hyperlink w:anchor="_Toc243597592" w:history="1">
         <w:r>
           <w:rPr>
             <w:rStyle w:val="af7"/>
@@ -1556,7 +1551,7 @@
             <w:noProof/>
             <w:webHidden/>
           </w:rPr>
-          <w:instrText xml:space="preserve"> PAGEREF _Toc243555842 \h </w:instrText>
+          <w:instrText xml:space="preserve"> PAGEREF _Toc243597592 \h </w:instrText>
         </w:r>
         <w:r>
           <w:rPr>
@@ -1593,13 +1588,12 @@
         <w:rPr>
           <w:rFonts w:asciiTheme="minorHAnsi" w:eastAsiaTheme="minorEastAsia" w:hAnsiTheme="minorHAnsi"/>
           <w:noProof/>
-          <w:kern w:val="0"/>
-          <w:sz w:val="22"/>
+          <w:sz w:val="24"/>
+          <w:szCs w:val="24"/>
           <w:lang w:eastAsia="ru-RU"/>
-          <w14:ligatures w14:val="none"/>
-        </w:rPr>
-      </w:pPr>
-      <w:hyperlink w:anchor="_Toc243555843" w:history="1">
+        </w:rPr>
+      </w:pPr>
+      <w:hyperlink w:anchor="_Toc243597593" w:history="1">
         <w:r>
           <w:rPr>
             <w:rStyle w:val="af7"/>
@@ -1626,7 +1620,7 @@
             <w:noProof/>
             <w:webHidden/>
           </w:rPr>
-          <w:instrText xml:space="preserve"> PAGEREF _Toc243555843 \h </w:instrText>
+          <w:instrText xml:space="preserve"> PAGEREF _Toc243597593 \h </w:instrText>
         </w:r>
         <w:r>
           <w:rPr>
@@ -1663,13 +1657,12 @@
         <w:rPr>
           <w:rFonts w:asciiTheme="minorHAnsi" w:eastAsiaTheme="minorEastAsia" w:hAnsiTheme="minorHAnsi"/>
           <w:noProof/>
-          <w:kern w:val="0"/>
-          <w:sz w:val="22"/>
+          <w:sz w:val="24"/>
+          <w:szCs w:val="24"/>
           <w:lang w:eastAsia="ru-RU"/>
-          <w14:ligatures w14:val="none"/>
-        </w:rPr>
-      </w:pPr>
-      <w:hyperlink w:anchor="_Toc243555844" w:history="1">
+        </w:rPr>
+      </w:pPr>
+      <w:hyperlink w:anchor="_Toc243597594" w:history="1">
         <w:r>
           <w:rPr>
             <w:rStyle w:val="af7"/>
@@ -1696,7 +1689,7 @@
             <w:noProof/>
             <w:webHidden/>
           </w:rPr>
-          <w:instrText xml:space="preserve"> PAGEREF _Toc243555844 \h </w:instrText>
+          <w:instrText xml:space="preserve"> PAGEREF _Toc243597594 \h </w:instrText>
         </w:r>
         <w:r>
           <w:rPr>
@@ -1733,13 +1726,12 @@
         <w:rPr>
           <w:rFonts w:asciiTheme="minorHAnsi" w:eastAsiaTheme="minorEastAsia" w:hAnsiTheme="minorHAnsi"/>
           <w:noProof/>
-          <w:kern w:val="0"/>
-          <w:sz w:val="22"/>
+          <w:sz w:val="24"/>
+          <w:szCs w:val="24"/>
           <w:lang w:eastAsia="ru-RU"/>
-          <w14:ligatures w14:val="none"/>
-        </w:rPr>
-      </w:pPr>
-      <w:hyperlink w:anchor="_Toc243555845" w:history="1">
+        </w:rPr>
+      </w:pPr>
+      <w:hyperlink w:anchor="_Toc243597595" w:history="1">
         <w:r>
           <w:rPr>
             <w:rStyle w:val="af7"/>
@@ -1766,7 +1758,7 @@
             <w:noProof/>
             <w:webHidden/>
           </w:rPr>
-          <w:instrText xml:space="preserve"> PAGEREF _Toc243555845 \h </w:instrText>
+          <w:instrText xml:space="preserve"> PAGEREF _Toc243597595 \h </w:instrText>
         </w:r>
         <w:r>
           <w:rPr>
@@ -1806,13 +1798,12 @@
         <w:rPr>
           <w:rFonts w:asciiTheme="minorHAnsi" w:eastAsiaTheme="minorEastAsia" w:hAnsiTheme="minorHAnsi"/>
           <w:noProof/>
-          <w:kern w:val="0"/>
-          <w:sz w:val="22"/>
+          <w:sz w:val="24"/>
+          <w:szCs w:val="24"/>
           <w:lang w:eastAsia="ru-RU"/>
-          <w14:ligatures w14:val="none"/>
-        </w:rPr>
-      </w:pPr>
-      <w:hyperlink w:anchor="_Toc243555846" w:history="1">
+        </w:rPr>
+      </w:pPr>
+      <w:hyperlink w:anchor="_Toc243597596" w:history="1">
         <w:r>
           <w:rPr>
             <w:rStyle w:val="af7"/>
@@ -1839,7 +1830,7 @@
             <w:noProof/>
             <w:webHidden/>
           </w:rPr>
-          <w:instrText xml:space="preserve"> PAGEREF _Toc243555846 \h </w:instrText>
+          <w:instrText xml:space="preserve"> PAGEREF _Toc243597596 \h </w:instrText>
         </w:r>
         <w:r>
           <w:rPr>
@@ -1859,7 +1850,7 @@
             <w:noProof/>
             <w:webHidden/>
           </w:rPr>
-          <w:t>9</w:t>
+          <w:t>10</w:t>
         </w:r>
         <w:r>
           <w:rPr>
@@ -1876,13 +1867,12 @@
         <w:rPr>
           <w:rFonts w:asciiTheme="minorHAnsi" w:eastAsiaTheme="minorEastAsia" w:hAnsiTheme="minorHAnsi"/>
           <w:noProof/>
-          <w:kern w:val="0"/>
-          <w:sz w:val="22"/>
+          <w:sz w:val="24"/>
+          <w:szCs w:val="24"/>
           <w:lang w:eastAsia="ru-RU"/>
-          <w14:ligatures w14:val="none"/>
-        </w:rPr>
-      </w:pPr>
-      <w:hyperlink w:anchor="_Toc243555847" w:history="1">
+        </w:rPr>
+      </w:pPr>
+      <w:hyperlink w:anchor="_Toc243597597" w:history="1">
         <w:r>
           <w:rPr>
             <w:rStyle w:val="af7"/>
@@ -1909,7 +1899,7 @@
             <w:noProof/>
             <w:webHidden/>
           </w:rPr>
-          <w:instrText xml:space="preserve"> PAGEREF _Toc243555847 \h </w:instrText>
+          <w:instrText xml:space="preserve"> PAGEREF _Toc243597597 \h </w:instrText>
         </w:r>
         <w:r>
           <w:rPr>
@@ -1929,7 +1919,7 @@
             <w:noProof/>
             <w:webHidden/>
           </w:rPr>
-          <w:t>9</w:t>
+          <w:t>10</w:t>
         </w:r>
         <w:r>
           <w:rPr>
@@ -1946,13 +1936,12 @@
         <w:rPr>
           <w:rFonts w:asciiTheme="minorHAnsi" w:eastAsiaTheme="minorEastAsia" w:hAnsiTheme="minorHAnsi"/>
           <w:noProof/>
-          <w:kern w:val="0"/>
-          <w:sz w:val="22"/>
+          <w:sz w:val="24"/>
+          <w:szCs w:val="24"/>
           <w:lang w:eastAsia="ru-RU"/>
-          <w14:ligatures w14:val="none"/>
-        </w:rPr>
-      </w:pPr>
-      <w:hyperlink w:anchor="_Toc243555848" w:history="1">
+        </w:rPr>
+      </w:pPr>
+      <w:hyperlink w:anchor="_Toc243597598" w:history="1">
         <w:r>
           <w:rPr>
             <w:rStyle w:val="af7"/>
@@ -1979,7 +1968,7 @@
             <w:noProof/>
             <w:webHidden/>
           </w:rPr>
-          <w:instrText xml:space="preserve"> PAGEREF _Toc243555848 \h </w:instrText>
+          <w:instrText xml:space="preserve"> PAGEREF _Toc243597598 \h </w:instrText>
         </w:r>
         <w:r>
           <w:rPr>
@@ -1999,7 +1988,7 @@
             <w:noProof/>
             <w:webHidden/>
           </w:rPr>
-          <w:t>9</w:t>
+          <w:t>10</w:t>
         </w:r>
         <w:r>
           <w:rPr>
@@ -2016,13 +2005,12 @@
         <w:rPr>
           <w:rFonts w:asciiTheme="minorHAnsi" w:eastAsiaTheme="minorEastAsia" w:hAnsiTheme="minorHAnsi"/>
           <w:noProof/>
-          <w:kern w:val="0"/>
-          <w:sz w:val="22"/>
+          <w:sz w:val="24"/>
+          <w:szCs w:val="24"/>
           <w:lang w:eastAsia="ru-RU"/>
-          <w14:ligatures w14:val="none"/>
-        </w:rPr>
-      </w:pPr>
-      <w:hyperlink w:anchor="_Toc243555849" w:history="1">
+        </w:rPr>
+      </w:pPr>
+      <w:hyperlink w:anchor="_Toc243597599" w:history="1">
         <w:r>
           <w:rPr>
             <w:rStyle w:val="af7"/>
@@ -2049,7 +2037,7 @@
             <w:noProof/>
             <w:webHidden/>
           </w:rPr>
-          <w:instrText xml:space="preserve"> PAGEREF _Toc243555849 \h </w:instrText>
+          <w:instrText xml:space="preserve"> PAGEREF _Toc243597599 \h </w:instrText>
         </w:r>
         <w:r>
           <w:rPr>
@@ -2069,7 +2057,7 @@
             <w:noProof/>
             <w:webHidden/>
           </w:rPr>
-          <w:t>9</w:t>
+          <w:t>10</w:t>
         </w:r>
         <w:r>
           <w:rPr>
@@ -2089,13 +2077,12 @@
         <w:rPr>
           <w:rFonts w:asciiTheme="minorHAnsi" w:eastAsiaTheme="minorEastAsia" w:hAnsiTheme="minorHAnsi"/>
           <w:noProof/>
-          <w:kern w:val="0"/>
-          <w:sz w:val="22"/>
+          <w:sz w:val="24"/>
+          <w:szCs w:val="24"/>
           <w:lang w:eastAsia="ru-RU"/>
-          <w14:ligatures w14:val="none"/>
-        </w:rPr>
-      </w:pPr>
-      <w:hyperlink w:anchor="_Toc243555850" w:history="1">
+        </w:rPr>
+      </w:pPr>
+      <w:hyperlink w:anchor="_Toc243597600" w:history="1">
         <w:r>
           <w:rPr>
             <w:rStyle w:val="af7"/>
@@ -2122,7 +2109,7 @@
             <w:noProof/>
             <w:webHidden/>
           </w:rPr>
-          <w:instrText xml:space="preserve"> PAGEREF _Toc243555850 \h </w:instrText>
+          <w:instrText xml:space="preserve"> PAGEREF _Toc243597600 \h </w:instrText>
         </w:r>
         <w:r>
           <w:rPr>
@@ -2142,7 +2129,7 @@
             <w:noProof/>
             <w:webHidden/>
           </w:rPr>
-          <w:t>10</w:t>
+          <w:t>11</w:t>
         </w:r>
         <w:r>
           <w:rPr>
@@ -2159,13 +2146,12 @@
         <w:rPr>
           <w:rFonts w:asciiTheme="minorHAnsi" w:eastAsiaTheme="minorEastAsia" w:hAnsiTheme="minorHAnsi"/>
           <w:noProof/>
-          <w:kern w:val="0"/>
-          <w:sz w:val="22"/>
+          <w:sz w:val="24"/>
+          <w:szCs w:val="24"/>
           <w:lang w:eastAsia="ru-RU"/>
-          <w14:ligatures w14:val="none"/>
-        </w:rPr>
-      </w:pPr>
-      <w:hyperlink w:anchor="_Toc243555851" w:history="1">
+        </w:rPr>
+      </w:pPr>
+      <w:hyperlink w:anchor="_Toc243597601" w:history="1">
         <w:r>
           <w:rPr>
             <w:rStyle w:val="af7"/>
@@ -2192,7 +2178,7 @@
             <w:noProof/>
             <w:webHidden/>
           </w:rPr>
-          <w:instrText xml:space="preserve"> PAGEREF _Toc243555851 \h </w:instrText>
+          <w:instrText xml:space="preserve"> PAGEREF _Toc243597601 \h </w:instrText>
         </w:r>
         <w:r>
           <w:rPr>
@@ -2212,7 +2198,7 @@
             <w:noProof/>
             <w:webHidden/>
           </w:rPr>
-          <w:t>10</w:t>
+          <w:t>11</w:t>
         </w:r>
         <w:r>
           <w:rPr>
@@ -2229,13 +2215,12 @@
         <w:rPr>
           <w:rFonts w:asciiTheme="minorHAnsi" w:eastAsiaTheme="minorEastAsia" w:hAnsiTheme="minorHAnsi"/>
           <w:noProof/>
-          <w:kern w:val="0"/>
-          <w:sz w:val="22"/>
+          <w:sz w:val="24"/>
+          <w:szCs w:val="24"/>
           <w:lang w:eastAsia="ru-RU"/>
-          <w14:ligatures w14:val="none"/>
-        </w:rPr>
-      </w:pPr>
-      <w:hyperlink w:anchor="_Toc243555852" w:history="1">
+        </w:rPr>
+      </w:pPr>
+      <w:hyperlink w:anchor="_Toc243597602" w:history="1">
         <w:r>
           <w:rPr>
             <w:rStyle w:val="af7"/>
@@ -2262,7 +2247,7 @@
             <w:noProof/>
             <w:webHidden/>
           </w:rPr>
-          <w:instrText xml:space="preserve"> PAGEREF _Toc243555852 \h </w:instrText>
+          <w:instrText xml:space="preserve"> PAGEREF _Toc243597602 \h </w:instrText>
         </w:r>
         <w:r>
           <w:rPr>
@@ -2282,7 +2267,7 @@
             <w:noProof/>
             <w:webHidden/>
           </w:rPr>
-          <w:t>10</w:t>
+          <w:t>11</w:t>
         </w:r>
         <w:r>
           <w:rPr>
@@ -2299,13 +2284,12 @@
         <w:rPr>
           <w:rFonts w:asciiTheme="minorHAnsi" w:eastAsiaTheme="minorEastAsia" w:hAnsiTheme="minorHAnsi"/>
           <w:noProof/>
-          <w:kern w:val="0"/>
-          <w:sz w:val="22"/>
+          <w:sz w:val="24"/>
+          <w:szCs w:val="24"/>
           <w:lang w:eastAsia="ru-RU"/>
-          <w14:ligatures w14:val="none"/>
-        </w:rPr>
-      </w:pPr>
-      <w:hyperlink w:anchor="_Toc243555853" w:history="1">
+        </w:rPr>
+      </w:pPr>
+      <w:hyperlink w:anchor="_Toc243597603" w:history="1">
         <w:r>
           <w:rPr>
             <w:rStyle w:val="af7"/>
@@ -2332,7 +2316,7 @@
             <w:noProof/>
             <w:webHidden/>
           </w:rPr>
-          <w:instrText xml:space="preserve"> PAGEREF _Toc243555853 \h </w:instrText>
+          <w:instrText xml:space="preserve"> PAGEREF _Toc243597603 \h </w:instrText>
         </w:r>
         <w:r>
           <w:rPr>
@@ -2352,7 +2336,7 @@
             <w:noProof/>
             <w:webHidden/>
           </w:rPr>
-          <w:t>10</w:t>
+          <w:t>11</w:t>
         </w:r>
         <w:r>
           <w:rPr>
@@ -2369,13 +2353,12 @@
         <w:rPr>
           <w:rFonts w:asciiTheme="minorHAnsi" w:eastAsiaTheme="minorEastAsia" w:hAnsiTheme="minorHAnsi"/>
           <w:noProof/>
-          <w:kern w:val="0"/>
-          <w:sz w:val="22"/>
+          <w:sz w:val="24"/>
+          <w:szCs w:val="24"/>
           <w:lang w:eastAsia="ru-RU"/>
-          <w14:ligatures w14:val="none"/>
-        </w:rPr>
-      </w:pPr>
-      <w:hyperlink w:anchor="_Toc243555854" w:history="1">
+        </w:rPr>
+      </w:pPr>
+      <w:hyperlink w:anchor="_Toc243597604" w:history="1">
         <w:r>
           <w:rPr>
             <w:rStyle w:val="af7"/>
@@ -2402,7 +2385,7 @@
             <w:noProof/>
             <w:webHidden/>
           </w:rPr>
-          <w:instrText xml:space="preserve"> PAGEREF _Toc243555854 \h </w:instrText>
+          <w:instrText xml:space="preserve"> PAGEREF _Toc243597604 \h </w:instrText>
         </w:r>
         <w:r>
           <w:rPr>
@@ -2422,7 +2405,7 @@
             <w:noProof/>
             <w:webHidden/>
           </w:rPr>
-          <w:t>10</w:t>
+          <w:t>11</w:t>
         </w:r>
         <w:r>
           <w:rPr>
@@ -2442,13 +2425,12 @@
         <w:rPr>
           <w:rFonts w:asciiTheme="minorHAnsi" w:eastAsiaTheme="minorEastAsia" w:hAnsiTheme="minorHAnsi"/>
           <w:noProof/>
-          <w:kern w:val="0"/>
-          <w:sz w:val="22"/>
+          <w:sz w:val="24"/>
+          <w:szCs w:val="24"/>
           <w:lang w:eastAsia="ru-RU"/>
-          <w14:ligatures w14:val="none"/>
-        </w:rPr>
-      </w:pPr>
-      <w:hyperlink w:anchor="_Toc243555855" w:history="1">
+        </w:rPr>
+      </w:pPr>
+      <w:hyperlink w:anchor="_Toc243597605" w:history="1">
         <w:r>
           <w:rPr>
             <w:rStyle w:val="af7"/>
@@ -2475,7 +2457,7 @@
             <w:noProof/>
             <w:webHidden/>
           </w:rPr>
-          <w:instrText xml:space="preserve"> PAGEREF _Toc243555855 \h </w:instrText>
+          <w:instrText xml:space="preserve"> PAGEREF _Toc243597605 \h </w:instrText>
         </w:r>
         <w:r>
           <w:rPr>
@@ -2495,7 +2477,7 @@
             <w:noProof/>
             <w:webHidden/>
           </w:rPr>
-          <w:t>11</w:t>
+          <w:t>12</w:t>
         </w:r>
         <w:r>
           <w:rPr>
@@ -2512,13 +2494,12 @@
         <w:rPr>
           <w:rFonts w:asciiTheme="minorHAnsi" w:eastAsiaTheme="minorEastAsia" w:hAnsiTheme="minorHAnsi"/>
           <w:noProof/>
-          <w:kern w:val="0"/>
-          <w:sz w:val="22"/>
+          <w:sz w:val="24"/>
+          <w:szCs w:val="24"/>
           <w:lang w:eastAsia="ru-RU"/>
-          <w14:ligatures w14:val="none"/>
-        </w:rPr>
-      </w:pPr>
-      <w:hyperlink w:anchor="_Toc243555856" w:history="1">
+        </w:rPr>
+      </w:pPr>
+      <w:hyperlink w:anchor="_Toc243597606" w:history="1">
         <w:r>
           <w:rPr>
             <w:rStyle w:val="af7"/>
@@ -2545,7 +2526,7 @@
             <w:noProof/>
             <w:webHidden/>
           </w:rPr>
-          <w:instrText xml:space="preserve"> PAGEREF _Toc243555856 \h </w:instrText>
+          <w:instrText xml:space="preserve"> PAGEREF _Toc243597606 \h </w:instrText>
         </w:r>
         <w:r>
           <w:rPr>
@@ -2565,7 +2546,7 @@
             <w:noProof/>
             <w:webHidden/>
           </w:rPr>
-          <w:t>11</w:t>
+          <w:t>12</w:t>
         </w:r>
         <w:r>
           <w:rPr>
@@ -2582,13 +2563,12 @@
         <w:rPr>
           <w:rFonts w:asciiTheme="minorHAnsi" w:eastAsiaTheme="minorEastAsia" w:hAnsiTheme="minorHAnsi"/>
           <w:noProof/>
-          <w:kern w:val="0"/>
-          <w:sz w:val="22"/>
+          <w:sz w:val="24"/>
+          <w:szCs w:val="24"/>
           <w:lang w:eastAsia="ru-RU"/>
-          <w14:ligatures w14:val="none"/>
-        </w:rPr>
-      </w:pPr>
-      <w:hyperlink w:anchor="_Toc243555857" w:history="1">
+        </w:rPr>
+      </w:pPr>
+      <w:hyperlink w:anchor="_Toc243597607" w:history="1">
         <w:r>
           <w:rPr>
             <w:rStyle w:val="af7"/>
@@ -2615,7 +2595,7 @@
             <w:noProof/>
             <w:webHidden/>
           </w:rPr>
-          <w:instrText xml:space="preserve"> PAGEREF _Toc243555857 \h </w:instrText>
+          <w:instrText xml:space="preserve"> PAGEREF _Toc243597607 \h </w:instrText>
         </w:r>
         <w:r>
           <w:rPr>
@@ -2635,7 +2615,7 @@
             <w:noProof/>
             <w:webHidden/>
           </w:rPr>
-          <w:t>11</w:t>
+          <w:t>12</w:t>
         </w:r>
         <w:r>
           <w:rPr>
@@ -2655,13 +2635,12 @@
         <w:rPr>
           <w:rFonts w:asciiTheme="minorHAnsi" w:eastAsiaTheme="minorEastAsia" w:hAnsiTheme="minorHAnsi"/>
           <w:noProof/>
-          <w:kern w:val="0"/>
-          <w:sz w:val="22"/>
+          <w:sz w:val="24"/>
+          <w:szCs w:val="24"/>
           <w:lang w:eastAsia="ru-RU"/>
-          <w14:ligatures w14:val="none"/>
-        </w:rPr>
-      </w:pPr>
-      <w:hyperlink w:anchor="_Toc243555858" w:history="1">
+        </w:rPr>
+      </w:pPr>
+      <w:hyperlink w:anchor="_Toc243597608" w:history="1">
         <w:r>
           <w:rPr>
             <w:rStyle w:val="af7"/>
@@ -2688,7 +2667,7 @@
             <w:noProof/>
             <w:webHidden/>
           </w:rPr>
-          <w:instrText xml:space="preserve"> PAGEREF _Toc243555858 \h </w:instrText>
+          <w:instrText xml:space="preserve"> PAGEREF _Toc243597608 \h </w:instrText>
         </w:r>
         <w:r>
           <w:rPr>
@@ -2708,7 +2687,7 @@
             <w:noProof/>
             <w:webHidden/>
           </w:rPr>
-          <w:t>12</w:t>
+          <w:t>13</w:t>
         </w:r>
         <w:r>
           <w:rPr>
@@ -2725,13 +2704,12 @@
         <w:rPr>
           <w:rFonts w:asciiTheme="minorHAnsi" w:eastAsiaTheme="minorEastAsia" w:hAnsiTheme="minorHAnsi"/>
           <w:noProof/>
-          <w:kern w:val="0"/>
-          <w:sz w:val="22"/>
+          <w:sz w:val="24"/>
+          <w:szCs w:val="24"/>
           <w:lang w:eastAsia="ru-RU"/>
-          <w14:ligatures w14:val="none"/>
-        </w:rPr>
-      </w:pPr>
-      <w:hyperlink w:anchor="_Toc243555859" w:history="1">
+        </w:rPr>
+      </w:pPr>
+      <w:hyperlink w:anchor="_Toc243597609" w:history="1">
         <w:r>
           <w:rPr>
             <w:rStyle w:val="af7"/>
@@ -2758,7 +2736,7 @@
             <w:noProof/>
             <w:webHidden/>
           </w:rPr>
-          <w:instrText xml:space="preserve"> PAGEREF _Toc243555859 \h </w:instrText>
+          <w:instrText xml:space="preserve"> PAGEREF _Toc243597609 \h </w:instrText>
         </w:r>
         <w:r>
           <w:rPr>
@@ -2778,7 +2756,7 @@
             <w:noProof/>
             <w:webHidden/>
           </w:rPr>
-          <w:t>12</w:t>
+          <w:t>13</w:t>
         </w:r>
         <w:r>
           <w:rPr>
@@ -2795,13 +2773,12 @@
         <w:rPr>
           <w:rFonts w:asciiTheme="minorHAnsi" w:eastAsiaTheme="minorEastAsia" w:hAnsiTheme="minorHAnsi"/>
           <w:noProof/>
-          <w:kern w:val="0"/>
-          <w:sz w:val="22"/>
+          <w:sz w:val="24"/>
+          <w:szCs w:val="24"/>
           <w:lang w:eastAsia="ru-RU"/>
-          <w14:ligatures w14:val="none"/>
-        </w:rPr>
-      </w:pPr>
-      <w:hyperlink w:anchor="_Toc243555860" w:history="1">
+        </w:rPr>
+      </w:pPr>
+      <w:hyperlink w:anchor="_Toc243597610" w:history="1">
         <w:r>
           <w:rPr>
             <w:rStyle w:val="af7"/>
@@ -2828,7 +2805,7 @@
             <w:noProof/>
             <w:webHidden/>
           </w:rPr>
-          <w:instrText xml:space="preserve"> PAGEREF _Toc243555860 \h </w:instrText>
+          <w:instrText xml:space="preserve"> PAGEREF _Toc243597610 \h </w:instrText>
         </w:r>
         <w:r>
           <w:rPr>
@@ -2848,7 +2825,7 @@
             <w:noProof/>
             <w:webHidden/>
           </w:rPr>
-          <w:t>12</w:t>
+          <w:t>13</w:t>
         </w:r>
         <w:r>
           <w:rPr>
@@ -2868,13 +2845,12 @@
         <w:rPr>
           <w:rFonts w:asciiTheme="minorHAnsi" w:eastAsiaTheme="minorEastAsia" w:hAnsiTheme="minorHAnsi"/>
           <w:noProof/>
-          <w:kern w:val="0"/>
-          <w:sz w:val="22"/>
+          <w:sz w:val="24"/>
+          <w:szCs w:val="24"/>
           <w:lang w:eastAsia="ru-RU"/>
-          <w14:ligatures w14:val="none"/>
-        </w:rPr>
-      </w:pPr>
-      <w:hyperlink w:anchor="_Toc243555861" w:history="1">
+        </w:rPr>
+      </w:pPr>
+      <w:hyperlink w:anchor="_Toc243597611" w:history="1">
         <w:r>
           <w:rPr>
             <w:rStyle w:val="af7"/>
@@ -2901,7 +2877,7 @@
             <w:noProof/>
             <w:webHidden/>
           </w:rPr>
-          <w:instrText xml:space="preserve"> PAGEREF _Toc243555861 \h </w:instrText>
+          <w:instrText xml:space="preserve"> PAGEREF _Toc243597611 \h </w:instrText>
         </w:r>
         <w:r>
           <w:rPr>
@@ -2921,7 +2897,7 @@
             <w:noProof/>
             <w:webHidden/>
           </w:rPr>
-          <w:t>13</w:t>
+          <w:t>14</w:t>
         </w:r>
         <w:r>
           <w:rPr>
@@ -2941,13 +2917,12 @@
         <w:rPr>
           <w:rFonts w:asciiTheme="minorHAnsi" w:eastAsiaTheme="minorEastAsia" w:hAnsiTheme="minorHAnsi"/>
           <w:noProof/>
-          <w:kern w:val="0"/>
-          <w:sz w:val="22"/>
+          <w:sz w:val="24"/>
+          <w:szCs w:val="24"/>
           <w:lang w:eastAsia="ru-RU"/>
-          <w14:ligatures w14:val="none"/>
-        </w:rPr>
-      </w:pPr>
-      <w:hyperlink w:anchor="_Toc243555862" w:history="1">
+        </w:rPr>
+      </w:pPr>
+      <w:hyperlink w:anchor="_Toc243597612" w:history="1">
         <w:r>
           <w:rPr>
             <w:rStyle w:val="af7"/>
@@ -2974,7 +2949,7 @@
             <w:noProof/>
             <w:webHidden/>
           </w:rPr>
-          <w:instrText xml:space="preserve"> PAGEREF _Toc243555862 \h </w:instrText>
+          <w:instrText xml:space="preserve"> PAGEREF _Toc243597612 \h </w:instrText>
         </w:r>
         <w:r>
           <w:rPr>
@@ -2994,7 +2969,7 @@
             <w:noProof/>
             <w:webHidden/>
           </w:rPr>
-          <w:t>15</w:t>
+          <w:t>16</w:t>
         </w:r>
         <w:r>
           <w:rPr>
@@ -3014,7 +2989,7 @@
       <w:pPr>
         <w:pStyle w:val="a6"/>
       </w:pPr>
-      <w:bookmarkStart w:id="0" w:name="_Toc243555840"/>
+      <w:bookmarkStart w:id="0" w:name="_Toc243597590"/>
       <w:r>
         <w:lastRenderedPageBreak/>
         <w:t>Перечень сокращений и обозначений</w:t>
@@ -3096,11 +3071,19 @@
       <w:pPr>
         <w:pStyle w:val="a7"/>
       </w:pPr>
+      <w:r>
+        <w:t>СУБД – система управления базами данных</w:t>
+      </w:r>
     </w:p>
     <w:p>
       <w:pPr>
         <w:pStyle w:val="a7"/>
       </w:pPr>
+    </w:p>
+    <w:p>
+      <w:pPr>
+        <w:pStyle w:val="a7"/>
+      </w:pPr>
       <w:r>
         <w:rPr>
           <w:lang w:val="en-US"/>
@@ -3115,23 +3098,6 @@
       </w:r>
       <w:r>
         <w:t>программный интерфейс приложения</w:t>
-      </w:r>
-    </w:p>
-    <w:p>
-      <w:pPr>
-        <w:pStyle w:val="a7"/>
-      </w:pPr>
-      <w:r>
-        <w:rPr>
-          <w:lang w:val="en-US"/>
-        </w:rPr>
-        <w:t>ASP</w:t>
-      </w:r>
-      <w:r>
-        <w:t xml:space="preserve"> – </w:t>
-      </w:r>
-      <w:r>
-        <w:t>активные серверные страницы</w:t>
       </w:r>
     </w:p>
     <w:p>
@@ -3145,6 +3111,43 @@
         <w:rPr>
           <w:lang w:val="en-US"/>
         </w:rPr>
+        <w:t>ARM</w:t>
+      </w:r>
+      <w:r>
+        <w:t xml:space="preserve"> – </w:t>
+      </w:r>
+      <w:r>
+        <w:t>усовершенствованная машина с сокращённым набором команд</w:t>
+      </w:r>
+    </w:p>
+    <w:p>
+      <w:pPr>
+        <w:pStyle w:val="a7"/>
+      </w:pPr>
+      <w:r>
+        <w:rPr>
+          <w:lang w:val="en-US"/>
+        </w:rPr>
+        <w:t>ASP</w:t>
+      </w:r>
+      <w:r>
+        <w:t xml:space="preserve"> – </w:t>
+      </w:r>
+      <w:r>
+        <w:t>активные серверные страницы</w:t>
+      </w:r>
+    </w:p>
+    <w:p>
+      <w:pPr>
+        <w:pStyle w:val="a7"/>
+        <w:tabs>
+          <w:tab w:val="left" w:pos="1959"/>
+        </w:tabs>
+      </w:pPr>
+      <w:r>
+        <w:rPr>
+          <w:lang w:val="en-US"/>
+        </w:rPr>
         <w:t>SQL</w:t>
       </w:r>
       <w:r>
@@ -3155,7 +3158,7 @@
       <w:pPr>
         <w:pStyle w:val="a6"/>
       </w:pPr>
-      <w:bookmarkStart w:id="1" w:name="_Toc243555841"/>
+      <w:bookmarkStart w:id="1" w:name="_Toc243597591"/>
       <w:r>
         <w:lastRenderedPageBreak/>
         <w:t>Введение</w:t>
@@ -3381,7 +3384,7 @@
       <w:pPr>
         <w:pStyle w:val="1"/>
       </w:pPr>
-      <w:bookmarkStart w:id="2" w:name="_Toc243555842"/>
+      <w:bookmarkStart w:id="2" w:name="_Toc243597592"/>
       <w:r>
         <w:lastRenderedPageBreak/>
         <w:t>Анализ и разработка требований</w:t>
@@ -3392,7 +3395,7 @@
       <w:pPr>
         <w:pStyle w:val="2"/>
       </w:pPr>
-      <w:bookmarkStart w:id="3" w:name="_Toc243555843"/>
+      <w:bookmarkStart w:id="3" w:name="_Toc243597593"/>
       <w:r>
         <w:t>Назначение</w:t>
       </w:r>
@@ -3572,7 +3575,7 @@
       <w:pPr>
         <w:pStyle w:val="2"/>
       </w:pPr>
-      <w:bookmarkStart w:id="4" w:name="_Toc243555844"/>
+      <w:bookmarkStart w:id="4" w:name="_Toc243597594"/>
       <w:r>
         <w:t>Постановка задачи</w:t>
       </w:r>
@@ -3823,7 +3826,7 @@
       <w:pPr>
         <w:pStyle w:val="2"/>
       </w:pPr>
-      <w:bookmarkStart w:id="5" w:name="_Toc243555845"/>
+      <w:bookmarkStart w:id="5" w:name="_Toc243597595"/>
       <w:r>
         <w:t>Выбор состава программных и технических</w:t>
       </w:r>
@@ -3840,28 +3843,39 @@
         <w:pStyle w:val="a7"/>
       </w:pPr>
       <w:r>
-        <w:t xml:space="preserve">Для разработки БД выбраны </w:t>
-      </w:r>
-      <w:r>
-        <w:rPr>
-          <w:highlight w:val="yellow"/>
-        </w:rPr>
+        <w:t xml:space="preserve">Для разработки БД </w:t>
+      </w:r>
+      <w:r>
+        <w:t xml:space="preserve">выбраны </w:t>
+      </w:r>
+      <w:r>
         <w:t xml:space="preserve">СУБД </w:t>
       </w:r>
       <w:r>
         <w:rPr>
-          <w:highlight w:val="yellow"/>
           <w:lang w:val="en-US"/>
         </w:rPr>
         <w:t>MySQL</w:t>
       </w:r>
       <w:r>
-        <w:t xml:space="preserve"> за счёт высокой производительности и скорости работы</w:t>
+        <w:t xml:space="preserve"> за</w:t>
+      </w:r>
+      <w:r>
+        <w:t xml:space="preserve"> счёт высокой производительности и скорости работы</w:t>
       </w:r>
       <w:r>
         <w:t xml:space="preserve"> </w:t>
       </w:r>
       <w:r>
+        <w:t>[1</w:t>
+      </w:r>
+      <w:r>
+        <w:t>]</w:t>
+      </w:r>
+      <w:r>
+        <w:t xml:space="preserve"> </w:t>
+      </w:r>
+      <w:r>
         <w:t xml:space="preserve">и </w:t>
       </w:r>
       <w:r>
@@ -3882,10 +3896,46 @@
         <w:pStyle w:val="a7"/>
       </w:pPr>
       <w:r>
-        <w:rPr>
-          <w:highlight w:val="darkCyan"/>
-        </w:rPr>
-        <w:t>Описать где будет работа с БД</w:t>
+        <w:t xml:space="preserve">Для </w:t>
+      </w:r>
+      <w:r>
+        <w:t xml:space="preserve">проектирования, администрирования и работы с базой данных </w:t>
+      </w:r>
+      <w:r>
+        <w:rPr>
+          <w:lang w:val="en-US"/>
+        </w:rPr>
+        <w:t>MySQL</w:t>
+      </w:r>
+      <w:r>
+        <w:t xml:space="preserve"> </w:t>
+      </w:r>
+      <w:r>
+        <w:t xml:space="preserve">выбран </w:t>
+      </w:r>
+      <w:r>
+        <w:rPr>
+          <w:lang w:val="en-US"/>
+        </w:rPr>
+        <w:t>MySQL</w:t>
+      </w:r>
+      <w:r>
+        <w:t xml:space="preserve"> </w:t>
+      </w:r>
+      <w:r>
+        <w:rPr>
+          <w:lang w:val="en-US"/>
+        </w:rPr>
+        <w:t>Workbench</w:t>
+      </w:r>
+      <w:r>
+        <w:t>,</w:t>
+      </w:r>
+      <w:r>
+        <w:t xml:space="preserve"> </w:t>
+      </w:r>
+      <w:r>
+        <w:t>в виду полной совместимости с выбранной СУБД.</w:t>
       </w:r>
     </w:p>
     <w:p>
@@ -3913,11 +3963,24 @@
       <w:r>
         <w:t xml:space="preserve"> </w:t>
       </w:r>
-      <w:proofErr w:type="spellStart"/>
-      <w:r>
-        <w:t>фреймворк</w:t>
-      </w:r>
-      <w:proofErr w:type="spellEnd"/>
+      <w:r>
+        <w:t xml:space="preserve">фреймворк </w:t>
+      </w:r>
+      <w:r>
+        <w:rPr>
+          <w:lang w:val="en-US"/>
+        </w:rPr>
+        <w:t>ASP</w:t>
+      </w:r>
+      <w:r>
+        <w:t>.</w:t>
+      </w:r>
+      <w:r>
+        <w:rPr>
+          <w:lang w:val="en-US"/>
+        </w:rPr>
+        <w:t>NET</w:t>
+      </w:r>
       <w:r>
         <w:t xml:space="preserve"> </w:t>
       </w:r>
@@ -3925,24 +3988,55 @@
         <w:rPr>
           <w:lang w:val="en-US"/>
         </w:rPr>
-        <w:t>ASP</w:t>
+        <w:t>Core</w:t>
+      </w:r>
+      <w:r>
+        <w:t>, о</w:t>
+      </w:r>
+      <w:r>
+        <w:t>тличающийся высокой производительностью и масштабируемостью</w:t>
       </w:r>
       <w:r>
         <w:t>.</w:t>
       </w:r>
+    </w:p>
+    <w:p>
+      <w:pPr>
+        <w:pStyle w:val="a7"/>
+      </w:pPr>
+      <w:r>
+        <w:t xml:space="preserve">Для разработки мобильного приложения выбран язык программирования </w:t>
+      </w:r>
       <w:r>
         <w:rPr>
           <w:lang w:val="en-US"/>
         </w:rPr>
-        <w:t>N</w:t>
-      </w:r>
-      <w:bookmarkStart w:id="6" w:name="_GoBack"/>
-      <w:bookmarkEnd w:id="6"/>
+        <w:t>Kotlin</w:t>
+      </w:r>
+      <w:r>
+        <w:t xml:space="preserve">, так как он признан основным инструментом для </w:t>
+      </w:r>
+      <w:r>
+        <w:lastRenderedPageBreak/>
+        <w:t xml:space="preserve">разработки приложений на </w:t>
+      </w:r>
       <w:r>
         <w:rPr>
           <w:lang w:val="en-US"/>
         </w:rPr>
-        <w:t>ET</w:t>
+        <w:t>Android</w:t>
+      </w:r>
+      <w:r>
+        <w:t xml:space="preserve">, </w:t>
+      </w:r>
+      <w:r>
+        <w:t xml:space="preserve">и фреймворк </w:t>
+      </w:r>
+      <w:r>
+        <w:rPr>
+          <w:lang w:val="en-US"/>
+        </w:rPr>
+        <w:t>Jetpack</w:t>
       </w:r>
       <w:r>
         <w:t xml:space="preserve"> </w:t>
@@ -3951,13 +4045,13 @@
         <w:rPr>
           <w:lang w:val="en-US"/>
         </w:rPr>
-        <w:t>Core</w:t>
-      </w:r>
-      <w:r>
-        <w:t>, о</w:t>
-      </w:r>
-      <w:r>
-        <w:t>тличающийся высокой производительностью и масштабируемостью</w:t>
+        <w:t>Compose</w:t>
+      </w:r>
+      <w:r>
+        <w:t xml:space="preserve">, являющийся удобным инструментом для построения современных </w:t>
+      </w:r>
+      <w:r>
+        <w:t>пользовательских интерфейсов</w:t>
       </w:r>
       <w:r>
         <w:t>.</w:t>
@@ -3968,44 +4062,376 @@
         <w:pStyle w:val="a7"/>
       </w:pPr>
       <w:r>
-        <w:t xml:space="preserve">Для разработки мобильного приложения выбран язык программирования </w:t>
-      </w:r>
-      <w:proofErr w:type="spellStart"/>
+        <w:t xml:space="preserve">Для разработки оконного приложения выбран язык программирования </w:t>
+      </w:r>
       <w:r>
         <w:rPr>
           <w:lang w:val="en-US"/>
         </w:rPr>
-        <w:t>Kotlin</w:t>
-      </w:r>
-      <w:proofErr w:type="spellEnd"/>
-      <w:r>
-        <w:t xml:space="preserve">, так как он признан основным инструментом для разработки приложений на </w:t>
+        <w:t>C</w:t>
+      </w:r>
+      <w:r>
+        <w:t>#</w:t>
+      </w:r>
+      <w:r>
+        <w:t xml:space="preserve">, так как он отличается высокой безопасностью кода, поддерживает автоматическое управление памятью, а также является объектно-ориентированным языком. Разработка будет вестись с использованием фреймворка </w:t>
       </w:r>
       <w:r>
         <w:rPr>
           <w:lang w:val="en-US"/>
         </w:rPr>
+        <w:t>Avalonia</w:t>
+      </w:r>
+      <w:r>
+        <w:t>, так как она использует нативные технологии для отрисовки интерфейса, что обеспечивает высокую производительность</w:t>
+      </w:r>
+      <w:r>
+        <w:t xml:space="preserve"> </w:t>
+      </w:r>
+      <w:r>
+        <w:t>[2</w:t>
+      </w:r>
+      <w:r>
+        <w:rPr>
+          <w:lang w:val="en-US"/>
+        </w:rPr>
+        <w:t>]</w:t>
+      </w:r>
+      <w:r>
+        <w:t>.</w:t>
+      </w:r>
+    </w:p>
+    <w:p>
+      <w:pPr>
+        <w:pStyle w:val="a7"/>
+      </w:pPr>
+      <w:r>
+        <w:t xml:space="preserve">Для разработки мобильного приложения выбрана среда разработки </w:t>
+      </w:r>
+      <w:r>
+        <w:rPr>
+          <w:lang w:val="en-US"/>
+        </w:rPr>
         <w:t>Android</w:t>
       </w:r>
       <w:r>
+        <w:t xml:space="preserve"> </w:t>
+      </w:r>
+      <w:r>
+        <w:rPr>
+          <w:lang w:val="en-US"/>
+        </w:rPr>
+        <w:t>Studio</w:t>
+      </w:r>
+      <w:r>
+        <w:t xml:space="preserve">, которая является официальной средой разработки приложений на </w:t>
+      </w:r>
+      <w:r>
+        <w:rPr>
+          <w:lang w:val="en-US"/>
+        </w:rPr>
+        <w:t>Android</w:t>
+      </w:r>
+      <w:r>
+        <w:t xml:space="preserve">. </w:t>
+      </w:r>
+    </w:p>
+    <w:p>
+      <w:pPr>
+        <w:pStyle w:val="a7"/>
+      </w:pPr>
+      <w:r>
+        <w:t>Для разработки оконного приложения</w:t>
+      </w:r>
+      <w:r>
+        <w:t>, веб-</w:t>
+      </w:r>
+      <w:r>
+        <w:rPr>
+          <w:lang w:val="en-US"/>
+        </w:rPr>
+        <w:t>API</w:t>
+      </w:r>
+      <w:r>
+        <w:t xml:space="preserve"> выбрана среда разработки </w:t>
+      </w:r>
+      <w:r>
+        <w:rPr>
+          <w:lang w:val="en-US"/>
+        </w:rPr>
+        <w:t>Visual</w:t>
+      </w:r>
+      <w:r>
+        <w:t xml:space="preserve"> </w:t>
+      </w:r>
+      <w:r>
+        <w:rPr>
+          <w:lang w:val="en-US"/>
+        </w:rPr>
+        <w:t>Studio</w:t>
+      </w:r>
+      <w:r>
+        <w:t xml:space="preserve"> – мощный инструмент, включающий профессиональный отладчик и встроенные инструменты работы с данными</w:t>
+      </w:r>
+      <w:r>
+        <w:t xml:space="preserve">, которые будут применяться при работе с </w:t>
+      </w:r>
+      <w:r>
+        <w:rPr>
+          <w:lang w:val="en-US"/>
+        </w:rPr>
+        <w:t>SQLite</w:t>
+      </w:r>
+      <w:r>
+        <w:t>.</w:t>
+      </w:r>
+      <w:r>
+        <w:t xml:space="preserve"> </w:t>
+      </w:r>
+    </w:p>
+    <w:p>
+      <w:pPr>
+        <w:pStyle w:val="a7"/>
+      </w:pPr>
+      <w:r>
+        <w:t>К клиенту оконного приложения представлены следующие а</w:t>
+      </w:r>
+      <w:r>
+        <w:t>ппаратные</w:t>
+      </w:r>
+      <w:r>
+        <w:t xml:space="preserve"> и программные</w:t>
+      </w:r>
+      <w:r>
+        <w:t xml:space="preserve"> требования </w:t>
+      </w:r>
+      <w:r>
+        <w:t>для запуска</w:t>
+      </w:r>
+      <w:r>
+        <w:t xml:space="preserve"> разработанного </w:t>
+      </w:r>
+      <w:r>
+        <w:t>приложения</w:t>
+      </w:r>
+      <w:r>
+        <w:t>:</w:t>
+      </w:r>
+    </w:p>
+    <w:p>
+      <w:pPr>
+        <w:pStyle w:val="a1"/>
+      </w:pPr>
+      <w:r>
+        <w:t xml:space="preserve">операционная система: </w:t>
+      </w:r>
+      <w:r>
+        <w:t xml:space="preserve">Windows 10 </w:t>
+      </w:r>
+      <w:r>
+        <w:t>и выше;</w:t>
+      </w:r>
+    </w:p>
+    <w:p>
+      <w:pPr>
+        <w:pStyle w:val="a1"/>
+      </w:pPr>
+      <w:r>
+        <w:t>процессор: 2-ядерный с тактовой частотой от 1 ГГц;</w:t>
+      </w:r>
+    </w:p>
+    <w:p>
+      <w:pPr>
+        <w:pStyle w:val="a1"/>
+      </w:pPr>
+      <w:r>
+        <w:t>оперативная память: от 2 ГБ для 32-битных систем или от 4 ГБ для 64-битных систем;</w:t>
+      </w:r>
+    </w:p>
+    <w:p>
+      <w:pPr>
+        <w:pStyle w:val="a1"/>
+      </w:pPr>
+      <w:r>
+        <w:t>свободное пространство диска</w:t>
+      </w:r>
+      <w:r>
+        <w:t xml:space="preserve">: </w:t>
+      </w:r>
+      <w:r>
+        <w:t>5 ГБ</w:t>
+      </w:r>
+      <w:r>
+        <w:t>;</w:t>
+      </w:r>
+    </w:p>
+    <w:p>
+      <w:pPr>
+        <w:pStyle w:val="a1"/>
+      </w:pPr>
+      <w:r>
+        <w:t xml:space="preserve">видеокарта: встроенная графика </w:t>
+      </w:r>
+      <w:r>
+        <w:t xml:space="preserve">– </w:t>
+      </w:r>
+      <w:r>
+        <w:t>отдельная видеокарта не требуется</w:t>
+      </w:r>
+      <w:r>
+        <w:t>.</w:t>
+      </w:r>
+    </w:p>
+    <w:p>
+      <w:pPr>
+        <w:pStyle w:val="a7"/>
+      </w:pPr>
+      <w:r>
+        <w:t>К клиенту мобильного приложения представлены следующие аппаратные и программные требования</w:t>
+      </w:r>
+      <w:r>
+        <w:t xml:space="preserve"> для запуска разработанного приложения</w:t>
+      </w:r>
+      <w:r>
+        <w:t>:</w:t>
+      </w:r>
+    </w:p>
+    <w:p>
+      <w:pPr>
+        <w:pStyle w:val="a1"/>
+      </w:pPr>
+      <w:r>
+        <w:t xml:space="preserve">операционная система: </w:t>
+      </w:r>
+      <w:r>
+        <w:rPr>
+          <w:lang w:val="en-US"/>
+        </w:rPr>
+        <w:t>Android</w:t>
+      </w:r>
+      <w:r>
+        <w:t xml:space="preserve"> </w:t>
+      </w:r>
+      <w:r>
+        <w:t>11</w:t>
+      </w:r>
+      <w:r>
+        <w:t xml:space="preserve"> </w:t>
+      </w:r>
+      <w:r>
+        <w:t>и выше</w:t>
+      </w:r>
+      <w:r>
+        <w:t>;</w:t>
+      </w:r>
+    </w:p>
+    <w:p>
+      <w:pPr>
+        <w:pStyle w:val="a1"/>
+      </w:pPr>
+      <w:r>
+        <w:t xml:space="preserve">архитектура процессора: </w:t>
+      </w:r>
+      <w:r>
+        <w:t xml:space="preserve">архитектура </w:t>
+      </w:r>
+      <w:r>
+        <w:rPr>
+          <w:lang w:val="en-US"/>
+        </w:rPr>
+        <w:t>ARM</w:t>
+      </w:r>
+      <w:r>
         <w:t xml:space="preserve">, </w:t>
       </w:r>
       <w:r>
-        <w:t xml:space="preserve">и </w:t>
-      </w:r>
-      <w:proofErr w:type="spellStart"/>
-      <w:r>
-        <w:t>фреймворк</w:t>
-      </w:r>
-      <w:proofErr w:type="spellEnd"/>
+        <w:t>64-битная;</w:t>
+      </w:r>
+    </w:p>
+    <w:p>
+      <w:pPr>
+        <w:pStyle w:val="a1"/>
+      </w:pPr>
+      <w:r>
+        <w:t>оперативная память: от 2 до 4 ГБ;</w:t>
+      </w:r>
+    </w:p>
+    <w:p>
+      <w:pPr>
+        <w:pStyle w:val="a1"/>
+      </w:pPr>
+      <w:r>
+        <w:lastRenderedPageBreak/>
+        <w:t xml:space="preserve">свободное </w:t>
+      </w:r>
+      <w:r>
+        <w:t>пространство диска</w:t>
+      </w:r>
+      <w:r>
+        <w:t>: 5 ГБ;</w:t>
+      </w:r>
+    </w:p>
+    <w:p>
+      <w:pPr>
+        <w:pStyle w:val="a7"/>
+      </w:pPr>
+      <w:r>
+        <w:t>Аппаратные и программные требования, представленные</w:t>
+      </w:r>
+      <w:r>
+        <w:t xml:space="preserve"> к серверу для корректной работы приложения</w:t>
+      </w:r>
+      <w:r>
+        <w:t>:</w:t>
+      </w:r>
+    </w:p>
+    <w:p>
+      <w:pPr>
+        <w:pStyle w:val="a1"/>
+      </w:pPr>
+      <w:r>
+        <w:t>о</w:t>
+      </w:r>
+      <w:r>
+        <w:t>перационная система</w:t>
+      </w:r>
+      <w:r>
+        <w:t xml:space="preserve">: </w:t>
+      </w:r>
+      <w:r>
+        <w:t>Ubuntu</w:t>
+      </w:r>
       <w:r>
         <w:t xml:space="preserve"> </w:t>
       </w:r>
       <w:r>
+        <w:t>Server</w:t>
+      </w:r>
+      <w:r>
+        <w:t xml:space="preserve"> 24.04 </w:t>
+      </w:r>
+      <w:r>
+        <w:t>LTS</w:t>
+      </w:r>
+      <w:r>
+        <w:t>;</w:t>
+      </w:r>
+    </w:p>
+    <w:p>
+      <w:pPr>
+        <w:pStyle w:val="a1"/>
+      </w:pPr>
+      <w:r>
+        <w:t xml:space="preserve">установленный </w:t>
+      </w:r>
+      <w:r>
+        <w:t xml:space="preserve">сервер БД </w:t>
+      </w:r>
+      <w:r>
         <w:rPr>
           <w:lang w:val="en-US"/>
         </w:rPr>
-        <w:t>Jetpack</w:t>
+        <w:t>MySQL</w:t>
       </w:r>
       <w:r>
         <w:t xml:space="preserve"> </w:t>
@@ -4014,17 +4440,114 @@
         <w:rPr>
           <w:lang w:val="en-US"/>
         </w:rPr>
-        <w:t>Compose</w:t>
-      </w:r>
-      <w:r>
-        <w:t xml:space="preserve">, </w:t>
-      </w:r>
-      <w:r>
-        <w:lastRenderedPageBreak/>
-        <w:t xml:space="preserve">являющийся удобным инструментом для построения современных </w:t>
-      </w:r>
-      <w:r>
-        <w:t>пользовательских интерфейсов</w:t>
+        <w:t>Server</w:t>
+      </w:r>
+      <w:r>
+        <w:t xml:space="preserve"> 8.0</w:t>
+      </w:r>
+      <w:r>
+        <w:t>;</w:t>
+      </w:r>
+    </w:p>
+    <w:p>
+      <w:pPr>
+        <w:pStyle w:val="a1"/>
+      </w:pPr>
+      <w:r>
+        <w:t>установленная среда выполнения .</w:t>
+      </w:r>
+      <w:r>
+        <w:rPr>
+          <w:lang w:val="en-US"/>
+        </w:rPr>
+        <w:t>NET</w:t>
+      </w:r>
+      <w:r>
+        <w:t xml:space="preserve"> </w:t>
+      </w:r>
+      <w:r>
+        <w:rPr>
+          <w:lang w:val="en-US"/>
+        </w:rPr>
+        <w:t>Runtime</w:t>
+      </w:r>
+      <w:r>
+        <w:t>;</w:t>
+      </w:r>
+    </w:p>
+    <w:p>
+      <w:pPr>
+        <w:pStyle w:val="a1"/>
+      </w:pPr>
+      <w:r>
+        <w:t>п</w:t>
+      </w:r>
+      <w:r>
+        <w:t xml:space="preserve">роцессор: </w:t>
+      </w:r>
+      <w:r>
+        <w:t>64-</w:t>
+      </w:r>
+      <w:r>
+        <w:t>битный</w:t>
+      </w:r>
+      <w:r>
+        <w:t>,</w:t>
+      </w:r>
+      <w:r>
+        <w:t xml:space="preserve"> </w:t>
+      </w:r>
+      <w:r>
+        <w:t>2-</w:t>
+      </w:r>
+      <w:r>
+        <w:t>ядерный п</w:t>
+      </w:r>
+      <w:r>
+        <w:t>роцессор, с тактовой частой 2,5</w:t>
+      </w:r>
+      <w:r>
+        <w:rPr>
+          <w:lang w:val="en-US"/>
+        </w:rPr>
+        <w:t> </w:t>
+      </w:r>
+      <w:r>
+        <w:t>ГГЦ;</w:t>
+      </w:r>
+    </w:p>
+    <w:p>
+      <w:pPr>
+        <w:pStyle w:val="a1"/>
+      </w:pPr>
+      <w:r>
+        <w:t>о</w:t>
+      </w:r>
+      <w:r>
+        <w:t>перативная память</w:t>
+      </w:r>
+      <w:r>
+        <w:t xml:space="preserve">: </w:t>
+      </w:r>
+      <w:r>
+        <w:t>4</w:t>
+      </w:r>
+      <w:r>
+        <w:t xml:space="preserve"> ГБ</w:t>
+      </w:r>
+      <w:r>
+        <w:t xml:space="preserve"> для работы серверных служб</w:t>
+      </w:r>
+      <w:r>
+        <w:t>;</w:t>
+      </w:r>
+    </w:p>
+    <w:p>
+      <w:pPr>
+        <w:pStyle w:val="a1"/>
+      </w:pPr>
+      <w:r>
+        <w:t>хранилище: 25 ГБ для всего устанавливаемого ПО и хранения данных</w:t>
       </w:r>
       <w:r>
         <w:t>.</w:t>
@@ -4032,489 +4555,63 @@
     </w:p>
     <w:p>
       <w:pPr>
-        <w:pStyle w:val="a7"/>
-      </w:pPr>
-      <w:r>
-        <w:t>Для разработки оконного приложения выбран я</w:t>
-      </w:r>
-      <w:r>
-        <w:t xml:space="preserve">зык программирования </w:t>
-      </w:r>
-      <w:r>
-        <w:rPr>
-          <w:lang w:val="en-US"/>
-        </w:rPr>
-        <w:t>C</w:t>
-      </w:r>
-      <w:r>
-        <w:t>#</w:t>
-      </w:r>
-      <w:r>
-        <w:t xml:space="preserve">, так как он отличается высокой безопасностью кода, поддерживает автоматическое управление памятью, а также является объектно-ориентированным языком. Разработка будет вестись с использованием </w:t>
-      </w:r>
-      <w:proofErr w:type="spellStart"/>
-      <w:r>
-        <w:t>фреймворка</w:t>
-      </w:r>
-      <w:proofErr w:type="spellEnd"/>
-      <w:r>
-        <w:t xml:space="preserve"> </w:t>
-      </w:r>
-      <w:r>
-        <w:rPr>
-          <w:lang w:val="en-US"/>
-        </w:rPr>
-        <w:t>Avalonia</w:t>
-      </w:r>
-      <w:r>
-        <w:t xml:space="preserve">, так как она использует </w:t>
-      </w:r>
-      <w:proofErr w:type="spellStart"/>
-      <w:r>
-        <w:t>нативные</w:t>
-      </w:r>
-      <w:proofErr w:type="spellEnd"/>
-      <w:r>
-        <w:t xml:space="preserve"> технологии для </w:t>
-      </w:r>
-      <w:proofErr w:type="spellStart"/>
-      <w:r>
-        <w:t>отрисовки</w:t>
-      </w:r>
-      <w:proofErr w:type="spellEnd"/>
-      <w:r>
-        <w:t xml:space="preserve"> интерфейса, что обеспечивает высокую производительность</w:t>
-      </w:r>
-      <w:r>
-        <w:t>.</w:t>
-      </w:r>
-    </w:p>
-    <w:p>
-      <w:pPr>
-        <w:pStyle w:val="a7"/>
-      </w:pPr>
-      <w:r>
-        <w:t xml:space="preserve">Для разработки мобильного приложения выбрана среда разработки </w:t>
-      </w:r>
-      <w:r>
-        <w:rPr>
-          <w:lang w:val="en-US"/>
-        </w:rPr>
-        <w:t>Android</w:t>
-      </w:r>
-      <w:r>
-        <w:t xml:space="preserve"> </w:t>
-      </w:r>
-      <w:r>
-        <w:rPr>
-          <w:lang w:val="en-US"/>
-        </w:rPr>
-        <w:t>Studio</w:t>
-      </w:r>
-      <w:r>
-        <w:t xml:space="preserve">, которая является официальной средой разработки приложений на </w:t>
-      </w:r>
-      <w:r>
-        <w:rPr>
-          <w:lang w:val="en-US"/>
-        </w:rPr>
-        <w:t>Android</w:t>
-      </w:r>
-      <w:r>
-        <w:t xml:space="preserve">. </w:t>
-      </w:r>
-    </w:p>
-    <w:p>
-      <w:pPr>
-        <w:pStyle w:val="a7"/>
-      </w:pPr>
-      <w:r>
-        <w:t>Для разработки оконного приложения</w:t>
-      </w:r>
-      <w:r>
-        <w:t>, веб-</w:t>
-      </w:r>
-      <w:r>
-        <w:rPr>
-          <w:lang w:val="en-US"/>
-        </w:rPr>
-        <w:t>API</w:t>
-      </w:r>
-      <w:r>
-        <w:t xml:space="preserve"> выбрана среда разработки </w:t>
-      </w:r>
-      <w:r>
-        <w:rPr>
-          <w:lang w:val="en-US"/>
-        </w:rPr>
-        <w:t>Visual</w:t>
-      </w:r>
-      <w:r>
-        <w:t xml:space="preserve"> </w:t>
-      </w:r>
-      <w:r>
-        <w:rPr>
-          <w:lang w:val="en-US"/>
-        </w:rPr>
-        <w:t>Studio</w:t>
-      </w:r>
-      <w:r>
-        <w:t xml:space="preserve"> – мощный инструмент, включающий профессиональный отладчик и встроенные инструменты работы с данными</w:t>
-      </w:r>
-      <w:r>
-        <w:t xml:space="preserve">. </w:t>
-      </w:r>
-    </w:p>
-    <w:p>
-      <w:pPr>
-        <w:pStyle w:val="a7"/>
-      </w:pPr>
-      <w:r>
-        <w:t>К клиенту оконного приложения представлены следующие а</w:t>
-      </w:r>
-      <w:r>
-        <w:t>ппаратные</w:t>
-      </w:r>
-      <w:r>
-        <w:t xml:space="preserve"> и программные</w:t>
-      </w:r>
-      <w:r>
-        <w:t xml:space="preserve"> требования </w:t>
-      </w:r>
-      <w:r>
-        <w:t>для запуска,</w:t>
-      </w:r>
-      <w:r>
-        <w:t xml:space="preserve"> разработанного </w:t>
-      </w:r>
-      <w:r>
-        <w:t>приложения</w:t>
-      </w:r>
-      <w:r>
-        <w:t>:</w:t>
-      </w:r>
-    </w:p>
-    <w:p>
-      <w:pPr>
-        <w:pStyle w:val="a1"/>
-      </w:pPr>
-      <w:r>
-        <w:t xml:space="preserve">операционная система: </w:t>
-      </w:r>
-      <w:proofErr w:type="spellStart"/>
-      <w:r>
-        <w:t>Windows</w:t>
-      </w:r>
-      <w:proofErr w:type="spellEnd"/>
-      <w:r>
-        <w:t xml:space="preserve"> 10 </w:t>
-      </w:r>
-      <w:r>
-        <w:t xml:space="preserve">и выше, </w:t>
-      </w:r>
-      <w:proofErr w:type="spellStart"/>
-      <w:r>
-        <w:t>Android</w:t>
-      </w:r>
-      <w:proofErr w:type="spellEnd"/>
-      <w:r>
-        <w:t xml:space="preserve"> </w:t>
-      </w:r>
-      <w:r>
-        <w:t>15 и выше;</w:t>
-      </w:r>
-    </w:p>
-    <w:p>
-      <w:pPr>
-        <w:pStyle w:val="a1"/>
-      </w:pPr>
-      <w:r>
-        <w:t>процессор: 2-ядерный с тактовой частотой от 1 ГГц;</w:t>
-      </w:r>
-    </w:p>
-    <w:p>
-      <w:pPr>
-        <w:pStyle w:val="a1"/>
-      </w:pPr>
-      <w:r>
-        <w:t>оперативная память: от 2 ГБ для 32-битных систем или от 4 ГБ для 64-битных систем;</w:t>
-      </w:r>
-    </w:p>
-    <w:p>
-      <w:pPr>
-        <w:pStyle w:val="a1"/>
-      </w:pPr>
-      <w:r>
-        <w:t>накопитель: от 50 до 500 МБ под файлы программы;</w:t>
-      </w:r>
-    </w:p>
-    <w:p>
-      <w:pPr>
-        <w:pStyle w:val="a1"/>
-      </w:pPr>
-      <w:r>
-        <w:t xml:space="preserve">видеокарта: встроенная графика </w:t>
-      </w:r>
-      <w:r>
-        <w:t xml:space="preserve">– </w:t>
-      </w:r>
-      <w:r>
-        <w:t>отдельная видеокарта не требуется</w:t>
-      </w:r>
-      <w:r>
-        <w:t>.</w:t>
-      </w:r>
-    </w:p>
-    <w:p>
-      <w:pPr>
-        <w:pStyle w:val="a7"/>
-      </w:pPr>
-      <w:r>
-        <w:t>К клиенту мобильного приложения представлены следующие аппаратные и программные требования:</w:t>
-      </w:r>
-    </w:p>
-    <w:p>
-      <w:pPr>
-        <w:pStyle w:val="a7"/>
-      </w:pPr>
-    </w:p>
-    <w:p>
-      <w:pPr>
-        <w:pStyle w:val="a7"/>
-      </w:pPr>
-      <w:r>
-        <w:t>Аппаратные и программные требования, представленные</w:t>
-      </w:r>
-      <w:r>
-        <w:t xml:space="preserve"> к серверу для корректной работы приложения</w:t>
-      </w:r>
-      <w:r>
-        <w:t>:</w:t>
-      </w:r>
-    </w:p>
-    <w:p>
-      <w:pPr>
-        <w:pStyle w:val="a1"/>
-      </w:pPr>
-      <w:r>
-        <w:t>о</w:t>
-      </w:r>
-      <w:r>
-        <w:t>перационная система</w:t>
-      </w:r>
-      <w:r>
-        <w:t xml:space="preserve">: </w:t>
-      </w:r>
-      <w:proofErr w:type="spellStart"/>
-      <w:r>
-        <w:t>Ubuntu</w:t>
-      </w:r>
-      <w:proofErr w:type="spellEnd"/>
-      <w:r>
-        <w:t xml:space="preserve"> </w:t>
-      </w:r>
-      <w:proofErr w:type="spellStart"/>
-      <w:r>
-        <w:t>Server</w:t>
-      </w:r>
-      <w:proofErr w:type="spellEnd"/>
-      <w:r>
-        <w:t xml:space="preserve"> 24.04 </w:t>
-      </w:r>
-      <w:r>
-        <w:t>LTS</w:t>
-      </w:r>
-      <w:r>
-        <w:t>;</w:t>
-      </w:r>
-    </w:p>
-    <w:p>
-      <w:pPr>
-        <w:pStyle w:val="a1"/>
-      </w:pPr>
-      <w:r>
-        <w:t xml:space="preserve">сервер БД: </w:t>
-      </w:r>
-      <w:r>
-        <w:rPr>
-          <w:lang w:val="en-US"/>
-        </w:rPr>
-        <w:t>MySQL Server</w:t>
-      </w:r>
-      <w:r>
-        <w:t xml:space="preserve"> 8.0</w:t>
-      </w:r>
-      <w:r>
-        <w:rPr>
-          <w:lang w:val="en-US"/>
-        </w:rPr>
-        <w:t>;</w:t>
-      </w:r>
-    </w:p>
-    <w:p>
-      <w:pPr>
-        <w:pStyle w:val="a1"/>
-      </w:pPr>
-      <w:r>
-        <w:t>установленная среда выполнения .</w:t>
-      </w:r>
-      <w:r>
-        <w:rPr>
-          <w:lang w:val="en-US"/>
-        </w:rPr>
-        <w:t>NET</w:t>
-      </w:r>
-      <w:r>
-        <w:t xml:space="preserve"> </w:t>
-      </w:r>
-      <w:proofErr w:type="gramStart"/>
-      <w:r>
-        <w:rPr>
-          <w:lang w:val="en-US"/>
-        </w:rPr>
-        <w:t>Runtime</w:t>
-      </w:r>
-      <w:r>
-        <w:t>;</w:t>
-      </w:r>
-      <w:proofErr w:type="spellStart"/>
-      <w:r>
-        <w:rPr>
-          <w:lang w:val="en-US"/>
-        </w:rPr>
-        <w:t>gi</w:t>
-      </w:r>
-      <w:proofErr w:type="spellEnd"/>
-      <w:proofErr w:type="gramEnd"/>
-      <w:r>
-        <w:t xml:space="preserve"> </w:t>
-      </w:r>
-      <w:r>
-        <w:rPr>
-          <w:lang w:val="en-US"/>
-        </w:rPr>
-        <w:t>reset</w:t>
-      </w:r>
-      <w:r>
-        <w:t xml:space="preserve"> --</w:t>
-      </w:r>
-      <w:proofErr w:type="spellStart"/>
-      <w:r>
-        <w:rPr>
-          <w:lang w:val="en-US"/>
-        </w:rPr>
-        <w:t>sof</w:t>
-      </w:r>
-      <w:proofErr w:type="spellEnd"/>
-    </w:p>
-    <w:p>
-      <w:pPr>
-        <w:pStyle w:val="a1"/>
-      </w:pPr>
-      <w:r>
-        <w:lastRenderedPageBreak/>
-        <w:t>п</w:t>
-      </w:r>
-      <w:r>
-        <w:t xml:space="preserve">роцессор: </w:t>
-      </w:r>
-      <w:r>
-        <w:t>64-</w:t>
-      </w:r>
-      <w:r>
-        <w:t>битный</w:t>
-      </w:r>
-      <w:r>
-        <w:t>,</w:t>
-      </w:r>
-      <w:r>
-        <w:t xml:space="preserve"> </w:t>
-      </w:r>
-      <w:r>
-        <w:t>2-</w:t>
-      </w:r>
-      <w:r>
-        <w:t>ядерный п</w:t>
-      </w:r>
-      <w:r>
-        <w:t>роцессор, с тактовой частой 2,5</w:t>
-      </w:r>
-      <w:r>
-        <w:rPr>
-          <w:lang w:val="en-US"/>
-        </w:rPr>
-        <w:t> </w:t>
-      </w:r>
-      <w:r>
-        <w:t>ГГЦ;</w:t>
-      </w:r>
-    </w:p>
-    <w:p>
-      <w:pPr>
-        <w:pStyle w:val="a1"/>
-      </w:pPr>
-      <w:r>
-        <w:t>о</w:t>
-      </w:r>
-      <w:r>
-        <w:t>перативная память</w:t>
-      </w:r>
-      <w:r>
-        <w:t xml:space="preserve">: </w:t>
-      </w:r>
-      <w:r>
-        <w:t>4</w:t>
-      </w:r>
-      <w:r>
-        <w:t xml:space="preserve"> ГБ</w:t>
-      </w:r>
-      <w:r>
-        <w:t xml:space="preserve"> для работы серверных служб</w:t>
-      </w:r>
-      <w:r>
-        <w:t>;</w:t>
-      </w:r>
-    </w:p>
-    <w:p>
-      <w:pPr>
-        <w:pStyle w:val="a1"/>
-      </w:pPr>
-      <w:r>
-        <w:t>хранилище: 25 ГБ для всего устанавливаемого ПО и хранения данных</w:t>
-      </w:r>
-      <w:r>
-        <w:t>.</w:t>
-      </w:r>
-      <w:r>
-        <w:t xml:space="preserve"> </w:t>
-      </w:r>
-    </w:p>
-    <w:p>
-      <w:pPr>
         <w:pStyle w:val="1"/>
       </w:pPr>
-      <w:bookmarkStart w:id="7" w:name="_Toc243555846"/>
+      <w:bookmarkStart w:id="6" w:name="_Toc243597596"/>
       <w:r>
         <w:lastRenderedPageBreak/>
         <w:t>Проектирование программного обеспечения</w:t>
       </w:r>
+      <w:bookmarkEnd w:id="6"/>
+    </w:p>
+    <w:p>
+      <w:pPr>
+        <w:pStyle w:val="2"/>
+      </w:pPr>
+      <w:bookmarkStart w:id="7" w:name="_Toc243597597"/>
+      <w:r>
+        <w:t xml:space="preserve">Проектирование </w:t>
+      </w:r>
+      <w:r>
+        <w:t>интерфейса</w:t>
+      </w:r>
+      <w:r>
+        <w:t xml:space="preserve"> пользователя</w:t>
+      </w:r>
       <w:bookmarkEnd w:id="7"/>
     </w:p>
     <w:p>
       <w:pPr>
+        <w:pStyle w:val="a7"/>
+      </w:pPr>
+    </w:p>
+    <w:p>
+      <w:pPr>
         <w:pStyle w:val="2"/>
       </w:pPr>
-      <w:bookmarkStart w:id="8" w:name="_Toc243555847"/>
+      <w:bookmarkStart w:id="8" w:name="_Toc243597598"/>
+      <w:r>
+        <w:t>Разработка архитектуры программного обеспечения</w:t>
+      </w:r>
+      <w:bookmarkEnd w:id="8"/>
+    </w:p>
+    <w:p>
+      <w:pPr>
+        <w:pStyle w:val="a7"/>
+      </w:pPr>
+    </w:p>
+    <w:p>
+      <w:pPr>
+        <w:pStyle w:val="2"/>
+      </w:pPr>
+      <w:bookmarkStart w:id="9" w:name="_Toc243597599"/>
       <w:r>
         <w:t xml:space="preserve">Проектирование </w:t>
       </w:r>
       <w:r>
-        <w:t>интерфейса</w:t>
-      </w:r>
-      <w:r>
-        <w:t xml:space="preserve"> пользователя</w:t>
-      </w:r>
-      <w:bookmarkEnd w:id="8"/>
+        <w:t>базы данных</w:t>
+      </w:r>
+      <w:bookmarkEnd w:id="9"/>
     </w:p>
     <w:p>
       <w:pPr>
@@ -4523,61 +4620,43 @@
     </w:p>
     <w:p>
       <w:pPr>
-        <w:pStyle w:val="2"/>
-      </w:pPr>
-      <w:bookmarkStart w:id="9" w:name="_Toc243555848"/>
-      <w:r>
-        <w:t>Разработка архитектуры программного обеспечения</w:t>
-      </w:r>
-      <w:bookmarkEnd w:id="9"/>
-    </w:p>
-    <w:p>
-      <w:pPr>
-        <w:pStyle w:val="a7"/>
-      </w:pPr>
-    </w:p>
-    <w:p>
-      <w:pPr>
-        <w:pStyle w:val="2"/>
-      </w:pPr>
-      <w:bookmarkStart w:id="10" w:name="_Toc243555849"/>
-      <w:r>
-        <w:t xml:space="preserve">Проектирование </w:t>
-      </w:r>
-      <w:r>
-        <w:t>базы данных</w:t>
-      </w:r>
-      <w:bookmarkEnd w:id="10"/>
-    </w:p>
-    <w:p>
-      <w:pPr>
-        <w:pStyle w:val="a7"/>
-      </w:pPr>
-    </w:p>
-    <w:p>
-      <w:pPr>
         <w:pStyle w:val="1"/>
       </w:pPr>
-      <w:bookmarkStart w:id="11" w:name="_Toc243555850"/>
+      <w:bookmarkStart w:id="10" w:name="_Toc243597600"/>
       <w:r>
         <w:lastRenderedPageBreak/>
         <w:t>Разработка модулей программного обеспечения</w:t>
       </w:r>
+      <w:bookmarkEnd w:id="10"/>
+    </w:p>
+    <w:p>
+      <w:pPr>
+        <w:pStyle w:val="2"/>
+      </w:pPr>
+      <w:bookmarkStart w:id="11" w:name="_Toc243597601"/>
+      <w:r>
+        <w:t xml:space="preserve">Разработка </w:t>
+      </w:r>
+      <w:r>
+        <w:t xml:space="preserve">программных </w:t>
+      </w:r>
+      <w:r>
+        <w:t>модулей</w:t>
+      </w:r>
       <w:bookmarkEnd w:id="11"/>
     </w:p>
     <w:p>
       <w:pPr>
+        <w:pStyle w:val="a7"/>
+      </w:pPr>
+    </w:p>
+    <w:p>
+      <w:pPr>
         <w:pStyle w:val="2"/>
       </w:pPr>
-      <w:bookmarkStart w:id="12" w:name="_Toc243555851"/>
-      <w:r>
-        <w:t xml:space="preserve">Разработка </w:t>
-      </w:r>
-      <w:r>
-        <w:t xml:space="preserve">программных </w:t>
-      </w:r>
-      <w:r>
-        <w:t>модулей</w:t>
+      <w:bookmarkStart w:id="12" w:name="_Toc243597602"/>
+      <w:r>
+        <w:t>Реализация интерфейса пользователя</w:t>
       </w:r>
       <w:bookmarkEnd w:id="12"/>
     </w:p>
@@ -4590,9 +4669,9 @@
       <w:pPr>
         <w:pStyle w:val="2"/>
       </w:pPr>
-      <w:bookmarkStart w:id="13" w:name="_Toc243555852"/>
-      <w:r>
-        <w:t>Реализация интерфейса пользователя</w:t>
+      <w:bookmarkStart w:id="13" w:name="_Toc243597603"/>
+      <w:r>
+        <w:t>Разграничение прав доступа пользователей</w:t>
       </w:r>
       <w:bookmarkEnd w:id="13"/>
     </w:p>
@@ -4605,9 +4684,9 @@
       <w:pPr>
         <w:pStyle w:val="2"/>
       </w:pPr>
-      <w:bookmarkStart w:id="14" w:name="_Toc243555853"/>
-      <w:r>
-        <w:t>Разграничение прав доступа пользователей</w:t>
+      <w:bookmarkStart w:id="14" w:name="_Toc243597604"/>
+      <w:r>
+        <w:t>Экспорт и импорт данных</w:t>
       </w:r>
       <w:bookmarkEnd w:id="14"/>
     </w:p>
@@ -4618,37 +4697,37 @@
     </w:p>
     <w:p>
       <w:pPr>
-        <w:pStyle w:val="2"/>
-      </w:pPr>
-      <w:bookmarkStart w:id="15" w:name="_Toc243555854"/>
-      <w:r>
-        <w:t>Экспорт и импорт данных</w:t>
-      </w:r>
-      <w:bookmarkEnd w:id="15"/>
-    </w:p>
-    <w:p>
-      <w:pPr>
-        <w:pStyle w:val="a7"/>
-      </w:pPr>
-    </w:p>
-    <w:p>
-      <w:pPr>
         <w:pStyle w:val="1"/>
       </w:pPr>
-      <w:bookmarkStart w:id="16" w:name="_Toc243555855"/>
+      <w:bookmarkStart w:id="15" w:name="_Toc243597605"/>
       <w:r>
         <w:lastRenderedPageBreak/>
         <w:t>Тестирование и отладка программного обеспечения</w:t>
       </w:r>
+      <w:bookmarkEnd w:id="15"/>
+    </w:p>
+    <w:p>
+      <w:pPr>
+        <w:pStyle w:val="2"/>
+      </w:pPr>
+      <w:bookmarkStart w:id="16" w:name="_Toc243597606"/>
+      <w:r>
+        <w:t>Структурное тестирование</w:t>
+      </w:r>
       <w:bookmarkEnd w:id="16"/>
     </w:p>
     <w:p>
       <w:pPr>
+        <w:pStyle w:val="a7"/>
+      </w:pPr>
+    </w:p>
+    <w:p>
+      <w:pPr>
         <w:pStyle w:val="2"/>
       </w:pPr>
-      <w:bookmarkStart w:id="17" w:name="_Toc243555856"/>
-      <w:r>
-        <w:t>Структурное тестирование</w:t>
+      <w:bookmarkStart w:id="17" w:name="_Toc243597607"/>
+      <w:r>
+        <w:t>Функциональное тестирование</w:t>
       </w:r>
       <w:bookmarkEnd w:id="17"/>
     </w:p>
@@ -4659,40 +4738,40 @@
     </w:p>
     <w:p>
       <w:pPr>
-        <w:pStyle w:val="2"/>
-      </w:pPr>
-      <w:bookmarkStart w:id="18" w:name="_Toc243555857"/>
-      <w:r>
-        <w:t>Функциональное тестирование</w:t>
-      </w:r>
-      <w:bookmarkEnd w:id="18"/>
-    </w:p>
-    <w:p>
-      <w:pPr>
-        <w:pStyle w:val="a7"/>
-      </w:pPr>
-    </w:p>
-    <w:p>
-      <w:pPr>
         <w:pStyle w:val="1"/>
       </w:pPr>
-      <w:bookmarkStart w:id="19" w:name="_Toc243555858"/>
+      <w:bookmarkStart w:id="18" w:name="_Toc243597608"/>
       <w:r>
         <w:lastRenderedPageBreak/>
         <w:t>Инструкция по эксплуатации программного обеспечения</w:t>
       </w:r>
+      <w:bookmarkEnd w:id="18"/>
+    </w:p>
+    <w:p>
+      <w:pPr>
+        <w:pStyle w:val="2"/>
+      </w:pPr>
+      <w:bookmarkStart w:id="19" w:name="_Toc243597609"/>
+      <w:r>
+        <w:t xml:space="preserve">Установка </w:t>
+      </w:r>
+      <w:r>
+        <w:t>программного обеспечения</w:t>
+      </w:r>
       <w:bookmarkEnd w:id="19"/>
     </w:p>
     <w:p>
       <w:pPr>
+        <w:pStyle w:val="a7"/>
+      </w:pPr>
+    </w:p>
+    <w:p>
+      <w:pPr>
         <w:pStyle w:val="2"/>
       </w:pPr>
-      <w:bookmarkStart w:id="20" w:name="_Toc243555859"/>
-      <w:r>
-        <w:t xml:space="preserve">Установка </w:t>
-      </w:r>
-      <w:r>
-        <w:t>программного обеспечения</w:t>
+      <w:bookmarkStart w:id="20" w:name="_Toc243597610"/>
+      <w:r>
+        <w:t>Инструкция по работе</w:t>
       </w:r>
       <w:bookmarkEnd w:id="20"/>
     </w:p>
@@ -4703,29 +4782,14 @@
     </w:p>
     <w:p>
       <w:pPr>
-        <w:pStyle w:val="2"/>
-      </w:pPr>
-      <w:bookmarkStart w:id="21" w:name="_Toc243555860"/>
-      <w:r>
-        <w:t>Инструкция по работе</w:t>
-      </w:r>
-      <w:bookmarkEnd w:id="21"/>
-    </w:p>
-    <w:p>
-      <w:pPr>
-        <w:pStyle w:val="a7"/>
-      </w:pPr>
-    </w:p>
-    <w:p>
-      <w:pPr>
         <w:pStyle w:val="a6"/>
       </w:pPr>
-      <w:bookmarkStart w:id="22" w:name="_Toc243555861"/>
+      <w:bookmarkStart w:id="21" w:name="_Toc243597611"/>
       <w:r>
         <w:lastRenderedPageBreak/>
         <w:t>Заключение</w:t>
       </w:r>
-      <w:bookmarkEnd w:id="22"/>
+      <w:bookmarkEnd w:id="21"/>
     </w:p>
     <w:p>
       <w:pPr>
@@ -4782,19 +4846,245 @@
     <w:p>
       <w:pPr>
         <w:pStyle w:val="a1"/>
-        <w:numPr>
-          <w:ilvl w:val="0"/>
-          <w:numId w:val="14"/>
-        </w:numPr>
       </w:pPr>
       <w:r>
         <w:t>изучены</w:t>
       </w:r>
       <w:r>
-        <w:t xml:space="preserve"> особенности </w:t>
-      </w:r>
-      <w:r>
-        <w:t>программ, позволяющих вести заметки, потребности пользователей, выделить сущности</w:t>
+        <w:t xml:space="preserve"> особенности программ, позволяющих вести заметки, потребности пользователей, выделить сущности;</w:t>
+      </w:r>
+    </w:p>
+    <w:p>
+      <w:pPr>
+        <w:pStyle w:val="a1"/>
+      </w:pPr>
+      <w:r>
+        <w:t>спроектирована</w:t>
+      </w:r>
+      <w:r>
+        <w:t xml:space="preserve"> диаграмм</w:t>
+      </w:r>
+      <w:r>
+        <w:t>а</w:t>
+      </w:r>
+      <w:r>
+        <w:t xml:space="preserve"> классов;</w:t>
+      </w:r>
+    </w:p>
+    <w:p>
+      <w:pPr>
+        <w:pStyle w:val="a1"/>
+      </w:pPr>
+      <w:r>
+        <w:t xml:space="preserve">спроектирована </w:t>
+      </w:r>
+      <w:r>
+        <w:t>диаграмм</w:t>
+      </w:r>
+      <w:r>
+        <w:t>а</w:t>
+      </w:r>
+      <w:r>
+        <w:t xml:space="preserve"> пакетов;</w:t>
+      </w:r>
+    </w:p>
+    <w:p>
+      <w:pPr>
+        <w:pStyle w:val="a1"/>
+      </w:pPr>
+      <w:r>
+        <w:t xml:space="preserve">спроектирована </w:t>
+      </w:r>
+      <w:r>
+        <w:t>диаграмма развертывания;</w:t>
+      </w:r>
+    </w:p>
+    <w:p>
+      <w:pPr>
+        <w:pStyle w:val="a1"/>
+      </w:pPr>
+      <w:r>
+        <w:t xml:space="preserve">спроектирована </w:t>
+      </w:r>
+      <w:r>
+        <w:t>модель пользовательского интерфейса;</w:t>
+      </w:r>
+    </w:p>
+    <w:p>
+      <w:pPr>
+        <w:pStyle w:val="a1"/>
+      </w:pPr>
+      <w:r>
+        <w:t xml:space="preserve">спроектирована </w:t>
+      </w:r>
+      <w:r>
+        <w:t>физическ</w:t>
+      </w:r>
+      <w:r>
+        <w:t>ая</w:t>
+      </w:r>
+      <w:r>
+        <w:t xml:space="preserve"> модель БД;</w:t>
+      </w:r>
+    </w:p>
+    <w:p>
+      <w:pPr>
+        <w:pStyle w:val="a1"/>
+      </w:pPr>
+      <w:r>
+        <w:t>разработаны</w:t>
+      </w:r>
+      <w:r>
+        <w:t xml:space="preserve"> локальн</w:t>
+      </w:r>
+      <w:r>
+        <w:t>ая</w:t>
+      </w:r>
+      <w:r>
+        <w:t xml:space="preserve"> и удалённ</w:t>
+      </w:r>
+      <w:r>
+        <w:t>ая</w:t>
+      </w:r>
+      <w:r>
+        <w:t xml:space="preserve"> БД для хранения данных;</w:t>
+      </w:r>
+    </w:p>
+    <w:p>
+      <w:pPr>
+        <w:pStyle w:val="a1"/>
+      </w:pPr>
+      <w:r>
+        <w:t>разработан</w:t>
+      </w:r>
+      <w:r>
+        <w:t xml:space="preserve"> веб-API;</w:t>
+      </w:r>
+    </w:p>
+    <w:p>
+      <w:pPr>
+        <w:pStyle w:val="a1"/>
+      </w:pPr>
+      <w:r>
+        <w:t xml:space="preserve">разработан </w:t>
+      </w:r>
+      <w:r>
+        <w:t>программный модуль мобильного приложения;</w:t>
+      </w:r>
+    </w:p>
+    <w:p>
+      <w:pPr>
+        <w:pStyle w:val="a1"/>
+      </w:pPr>
+      <w:r>
+        <w:t>реализованы</w:t>
+      </w:r>
+      <w:r>
+        <w:t xml:space="preserve"> разграничени</w:t>
+      </w:r>
+      <w:r>
+        <w:t>я</w:t>
+      </w:r>
+      <w:r>
+        <w:t xml:space="preserve"> прав доступа пользователей;</w:t>
+      </w:r>
+    </w:p>
+    <w:p>
+      <w:pPr>
+        <w:pStyle w:val="a1"/>
+      </w:pPr>
+      <w:r>
+        <w:t>реализованы</w:t>
+      </w:r>
+      <w:r>
+        <w:t xml:space="preserve"> фильтраци</w:t>
+      </w:r>
+      <w:r>
+        <w:t>я</w:t>
+      </w:r>
+      <w:r>
+        <w:t>, поиск и сортировк</w:t>
+      </w:r>
+      <w:r>
+        <w:t>а</w:t>
+      </w:r>
+      <w:r>
+        <w:t xml:space="preserve"> записей пользователя;</w:t>
+      </w:r>
+    </w:p>
+    <w:p>
+      <w:pPr>
+        <w:pStyle w:val="a1"/>
+      </w:pPr>
+      <w:r>
+        <w:t>реализован</w:t>
+      </w:r>
+      <w:r>
+        <w:t>а</w:t>
+      </w:r>
+      <w:r>
+        <w:t xml:space="preserve"> защит</w:t>
+      </w:r>
+      <w:r>
+        <w:t>а</w:t>
+      </w:r>
+      <w:r>
+        <w:t xml:space="preserve"> данных;</w:t>
+      </w:r>
+    </w:p>
+    <w:p>
+      <w:pPr>
+        <w:pStyle w:val="a1"/>
+      </w:pPr>
+      <w:r>
+        <w:t>выполнено</w:t>
+      </w:r>
+      <w:r>
+        <w:t xml:space="preserve"> </w:t>
+      </w:r>
+      <w:r>
+        <w:t>тестирование,</w:t>
+      </w:r>
+      <w:r>
+        <w:t xml:space="preserve"> и отладк</w:t>
+      </w:r>
+      <w:r>
+        <w:t>а</w:t>
+      </w:r>
+      <w:r>
+        <w:t xml:space="preserve"> ПО и </w:t>
+      </w:r>
+      <w:r>
+        <w:t>проанализированы</w:t>
+      </w:r>
+      <w:r>
+        <w:t xml:space="preserve"> результаты тестирования;</w:t>
+      </w:r>
+    </w:p>
+    <w:p>
+      <w:pPr>
+        <w:pStyle w:val="a1"/>
+      </w:pPr>
+      <w:r>
+        <w:t>разработаны</w:t>
+      </w:r>
+      <w:r>
+        <w:t xml:space="preserve"> программн</w:t>
+      </w:r>
+      <w:r>
+        <w:t>ая</w:t>
+      </w:r>
+      <w:r>
+        <w:t xml:space="preserve"> и эксплуатационн</w:t>
+      </w:r>
+      <w:r>
+        <w:t>ая</w:t>
+      </w:r>
+      <w:r>
+        <w:t xml:space="preserve"> документаци</w:t>
+      </w:r>
+      <w:r>
+        <w:t>я</w:t>
       </w:r>
       <w:r>
         <w:t>;</w:t>
@@ -4803,406 +5093,62 @@
     <w:p>
       <w:pPr>
         <w:pStyle w:val="a1"/>
-        <w:numPr>
-          <w:ilvl w:val="0"/>
-          <w:numId w:val="14"/>
-        </w:numPr>
-      </w:pPr>
-      <w:r>
-        <w:t>спроектирована</w:t>
-      </w:r>
-      <w:r>
-        <w:t xml:space="preserve"> диаграмм</w:t>
-      </w:r>
-      <w:r>
-        <w:t>а</w:t>
-      </w:r>
-      <w:r>
-        <w:t xml:space="preserve"> </w:t>
-      </w:r>
-      <w:r>
-        <w:t>классов</w:t>
-      </w:r>
-      <w:r>
-        <w:t>;</w:t>
+      </w:pPr>
+      <w:r>
+        <w:t>систематизированы</w:t>
+      </w:r>
+      <w:r>
+        <w:t xml:space="preserve"> и закреп</w:t>
+      </w:r>
+      <w:r>
+        <w:t>лены</w:t>
+      </w:r>
+      <w:r>
+        <w:t xml:space="preserve"> полученные теоретические знания в соответствии с заданной темой;</w:t>
       </w:r>
     </w:p>
     <w:p>
       <w:pPr>
         <w:pStyle w:val="a1"/>
-        <w:numPr>
-          <w:ilvl w:val="0"/>
-          <w:numId w:val="14"/>
-        </w:numPr>
-      </w:pPr>
-      <w:r>
-        <w:t>спроектирована</w:t>
-      </w:r>
-      <w:r>
-        <w:t xml:space="preserve"> </w:t>
-      </w:r>
-      <w:r>
-        <w:t>диаграмм</w:t>
-      </w:r>
-      <w:r>
-        <w:t>а</w:t>
-      </w:r>
-      <w:r>
-        <w:t xml:space="preserve"> пакетов;</w:t>
+      </w:pPr>
+      <w:r>
+        <w:t xml:space="preserve">систематизированы и закреплены </w:t>
+      </w:r>
+      <w:r>
+        <w:t>полученные теоретические знания и практические умения по общепрофессиональным и специальным дисциплинам специальности «09.02.07 – Информационные системы и программирование»;</w:t>
       </w:r>
     </w:p>
     <w:p>
       <w:pPr>
         <w:pStyle w:val="a1"/>
-        <w:numPr>
-          <w:ilvl w:val="0"/>
-          <w:numId w:val="14"/>
-        </w:numPr>
-      </w:pPr>
-      <w:r>
-        <w:t>спроектирована</w:t>
-      </w:r>
-      <w:r>
-        <w:t xml:space="preserve"> </w:t>
-      </w:r>
-      <w:r>
-        <w:t>диаграмма развертывания;</w:t>
+      </w:pPr>
+      <w:r>
+        <w:lastRenderedPageBreak/>
+        <w:t>углублены</w:t>
+      </w:r>
+      <w:r>
+        <w:t xml:space="preserve"> теоретические знания в соответствии в заданной темой;</w:t>
       </w:r>
     </w:p>
     <w:p>
       <w:pPr>
         <w:pStyle w:val="a1"/>
-        <w:numPr>
-          <w:ilvl w:val="0"/>
-          <w:numId w:val="14"/>
-        </w:numPr>
-      </w:pPr>
-      <w:r>
-        <w:t>спроектирована</w:t>
-      </w:r>
-      <w:r>
-        <w:t xml:space="preserve"> </w:t>
-      </w:r>
-      <w:r>
-        <w:t xml:space="preserve">модель </w:t>
-      </w:r>
-      <w:r>
-        <w:t>пользовательского интерфейса;</w:t>
+      </w:pPr>
+      <w:r>
+        <w:t>сформированы</w:t>
+      </w:r>
+      <w:r>
+        <w:t xml:space="preserve"> умения применять теоретические знания при решении поставленных вопросов;</w:t>
       </w:r>
     </w:p>
     <w:p>
       <w:pPr>
         <w:pStyle w:val="a1"/>
-        <w:numPr>
-          <w:ilvl w:val="0"/>
-          <w:numId w:val="14"/>
-        </w:numPr>
-      </w:pPr>
-      <w:r>
-        <w:t>спроектирована</w:t>
-      </w:r>
-      <w:r>
-        <w:t xml:space="preserve"> </w:t>
-      </w:r>
-      <w:r>
-        <w:t>физическ</w:t>
-      </w:r>
-      <w:r>
-        <w:t>ая</w:t>
-      </w:r>
-      <w:r>
-        <w:t xml:space="preserve"> модель БД;</w:t>
-      </w:r>
-    </w:p>
-    <w:p>
-      <w:pPr>
-        <w:pStyle w:val="a1"/>
-        <w:numPr>
-          <w:ilvl w:val="0"/>
-          <w:numId w:val="14"/>
-        </w:numPr>
-      </w:pPr>
-      <w:r>
-        <w:t>разработаны</w:t>
-      </w:r>
-      <w:r>
-        <w:t xml:space="preserve"> локальн</w:t>
-      </w:r>
-      <w:r>
-        <w:t>ая</w:t>
-      </w:r>
-      <w:r>
-        <w:t xml:space="preserve"> и удалённ</w:t>
-      </w:r>
-      <w:r>
-        <w:t>ая</w:t>
-      </w:r>
-      <w:r>
-        <w:t xml:space="preserve"> БД для хранения данных;</w:t>
-      </w:r>
-    </w:p>
-    <w:p>
-      <w:pPr>
-        <w:pStyle w:val="a1"/>
-        <w:numPr>
-          <w:ilvl w:val="0"/>
-          <w:numId w:val="14"/>
-        </w:numPr>
-      </w:pPr>
-      <w:r>
-        <w:t>разработан</w:t>
-      </w:r>
-      <w:r>
-        <w:t xml:space="preserve"> веб-API;</w:t>
-      </w:r>
-    </w:p>
-    <w:p>
-      <w:pPr>
-        <w:pStyle w:val="a1"/>
-        <w:numPr>
-          <w:ilvl w:val="0"/>
-          <w:numId w:val="14"/>
-        </w:numPr>
-      </w:pPr>
-      <w:r>
-        <w:t>разработан</w:t>
-      </w:r>
-      <w:r>
-        <w:t xml:space="preserve"> </w:t>
-      </w:r>
-      <w:r>
-        <w:t>программный модуль мобильного приложения;</w:t>
-      </w:r>
-    </w:p>
-    <w:p>
-      <w:pPr>
-        <w:pStyle w:val="a1"/>
-        <w:numPr>
-          <w:ilvl w:val="0"/>
-          <w:numId w:val="14"/>
-        </w:numPr>
-      </w:pPr>
-      <w:r>
-        <w:t>реализованы</w:t>
-      </w:r>
-      <w:r>
-        <w:t xml:space="preserve"> разграничени</w:t>
-      </w:r>
-      <w:r>
-        <w:t>я</w:t>
-      </w:r>
-      <w:r>
-        <w:t xml:space="preserve"> прав доступа пользователей;</w:t>
-      </w:r>
-    </w:p>
-    <w:p>
-      <w:pPr>
-        <w:pStyle w:val="a1"/>
-        <w:numPr>
-          <w:ilvl w:val="0"/>
-          <w:numId w:val="14"/>
-        </w:numPr>
-      </w:pPr>
-      <w:r>
-        <w:t>реализованы</w:t>
-      </w:r>
-      <w:r>
-        <w:t xml:space="preserve"> фильтраци</w:t>
-      </w:r>
-      <w:r>
-        <w:t>я</w:t>
-      </w:r>
-      <w:r>
-        <w:t>, поиск и сортировк</w:t>
-      </w:r>
-      <w:r>
-        <w:t>а</w:t>
-      </w:r>
-      <w:r>
-        <w:t xml:space="preserve"> записей пользователя;</w:t>
-      </w:r>
-    </w:p>
-    <w:p>
-      <w:pPr>
-        <w:pStyle w:val="a1"/>
-        <w:numPr>
-          <w:ilvl w:val="0"/>
-          <w:numId w:val="14"/>
-        </w:numPr>
-      </w:pPr>
-      <w:r>
-        <w:t>реализован</w:t>
-      </w:r>
-      <w:r>
-        <w:t>а</w:t>
-      </w:r>
-      <w:r>
-        <w:t xml:space="preserve"> защит</w:t>
-      </w:r>
-      <w:r>
-        <w:t>а</w:t>
-      </w:r>
-      <w:r>
-        <w:t xml:space="preserve"> данных;</w:t>
-      </w:r>
-    </w:p>
-    <w:p>
-      <w:pPr>
-        <w:pStyle w:val="a1"/>
-        <w:numPr>
-          <w:ilvl w:val="0"/>
-          <w:numId w:val="14"/>
-        </w:numPr>
-      </w:pPr>
-      <w:r>
-        <w:t>выполнено</w:t>
-      </w:r>
-      <w:r>
-        <w:t xml:space="preserve"> </w:t>
-      </w:r>
-      <w:r>
-        <w:t>тестирование,</w:t>
-      </w:r>
-      <w:r>
-        <w:t xml:space="preserve"> и отладк</w:t>
-      </w:r>
-      <w:r>
-        <w:t>а</w:t>
-      </w:r>
-      <w:r>
-        <w:t xml:space="preserve"> ПО и </w:t>
-      </w:r>
-      <w:r>
-        <w:t>проанализированы</w:t>
-      </w:r>
-      <w:r>
-        <w:t xml:space="preserve"> результаты тестирования;</w:t>
-      </w:r>
-    </w:p>
-    <w:p>
-      <w:pPr>
-        <w:pStyle w:val="a1"/>
-        <w:numPr>
-          <w:ilvl w:val="0"/>
-          <w:numId w:val="14"/>
-        </w:numPr>
-      </w:pPr>
-      <w:r>
-        <w:t>разработаны</w:t>
-      </w:r>
-      <w:r>
-        <w:t xml:space="preserve"> программн</w:t>
-      </w:r>
-      <w:r>
-        <w:t>ая</w:t>
-      </w:r>
-      <w:r>
-        <w:t xml:space="preserve"> и эксплуатационн</w:t>
-      </w:r>
-      <w:r>
-        <w:t>ая</w:t>
-      </w:r>
-      <w:r>
-        <w:t xml:space="preserve"> документаци</w:t>
-      </w:r>
-      <w:r>
-        <w:t>я</w:t>
-      </w:r>
-      <w:r>
-        <w:t>;</w:t>
-      </w:r>
-    </w:p>
-    <w:p>
-      <w:pPr>
-        <w:pStyle w:val="a1"/>
-        <w:numPr>
-          <w:ilvl w:val="0"/>
-          <w:numId w:val="14"/>
-        </w:numPr>
-      </w:pPr>
-      <w:r>
-        <w:t>систематизированы</w:t>
-      </w:r>
-      <w:r>
-        <w:t xml:space="preserve"> и закреп</w:t>
-      </w:r>
-      <w:r>
-        <w:t>лены</w:t>
-      </w:r>
-      <w:r>
-        <w:t xml:space="preserve"> полученные теоретические знания в соответствии с заданной темой;</w:t>
-      </w:r>
-    </w:p>
-    <w:p>
-      <w:pPr>
-        <w:pStyle w:val="a1"/>
-        <w:numPr>
-          <w:ilvl w:val="0"/>
-          <w:numId w:val="14"/>
-        </w:numPr>
-      </w:pPr>
-      <w:r>
-        <w:t>систематизированы</w:t>
-      </w:r>
-      <w:r>
-        <w:t xml:space="preserve"> и закреп</w:t>
-      </w:r>
-      <w:r>
-        <w:t>лены</w:t>
-      </w:r>
-      <w:r>
-        <w:t xml:space="preserve"> </w:t>
-      </w:r>
-      <w:r>
-        <w:t xml:space="preserve">полученные теоретические знания и практические умения по общепрофессиональным и специальным </w:t>
-      </w:r>
-      <w:r>
-        <w:lastRenderedPageBreak/>
-        <w:t>дисциплинам специальности «09.02.07 – Информационные системы и программирование»;</w:t>
-      </w:r>
-    </w:p>
-    <w:p>
-      <w:pPr>
-        <w:pStyle w:val="a1"/>
-        <w:numPr>
-          <w:ilvl w:val="0"/>
-          <w:numId w:val="14"/>
-        </w:numPr>
-      </w:pPr>
-      <w:r>
-        <w:t>углублены</w:t>
-      </w:r>
-      <w:r>
-        <w:t xml:space="preserve"> теоретические знания в соответствии в заданной темой;</w:t>
-      </w:r>
-    </w:p>
-    <w:p>
-      <w:pPr>
-        <w:pStyle w:val="a1"/>
-        <w:numPr>
-          <w:ilvl w:val="0"/>
-          <w:numId w:val="14"/>
-        </w:numPr>
       </w:pPr>
       <w:r>
         <w:t>сформированы</w:t>
       </w:r>
       <w:r>
-        <w:t xml:space="preserve"> умения применять теоретические знания при решении поставленных вопросов;</w:t>
-      </w:r>
-    </w:p>
-    <w:p>
-      <w:pPr>
-        <w:pStyle w:val="a1"/>
-        <w:numPr>
-          <w:ilvl w:val="0"/>
-          <w:numId w:val="14"/>
-        </w:numPr>
-      </w:pPr>
-      <w:r>
-        <w:t>сформированы</w:t>
-      </w:r>
-      <w:r>
         <w:t xml:space="preserve"> умения использовать справочную и нормативную документацию.</w:t>
       </w:r>
     </w:p>
@@ -5210,51 +5156,19 @@
       <w:pPr>
         <w:pStyle w:val="a6"/>
       </w:pPr>
-      <w:bookmarkStart w:id="23" w:name="_Toc243555862"/>
+      <w:bookmarkStart w:id="22" w:name="_Toc243597612"/>
       <w:r>
         <w:lastRenderedPageBreak/>
         <w:t>Список использованных источников</w:t>
       </w:r>
-      <w:bookmarkEnd w:id="23"/>
+      <w:bookmarkEnd w:id="22"/>
     </w:p>
     <w:p>
       <w:pPr>
         <w:pStyle w:val="a7"/>
       </w:pPr>
       <w:r>
-        <w:t xml:space="preserve">1. </w:t>
-      </w:r>
-      <w:proofErr w:type="spellStart"/>
-      <w:r>
-        <w:t>Аспин</w:t>
-      </w:r>
-      <w:proofErr w:type="spellEnd"/>
-      <w:r>
-        <w:t xml:space="preserve"> А. MySQL. Практические рецепты: Пер. с англ. / А. </w:t>
-      </w:r>
-      <w:proofErr w:type="spellStart"/>
-      <w:r>
-        <w:t>Аспин</w:t>
-      </w:r>
-      <w:proofErr w:type="spellEnd"/>
-      <w:r>
-        <w:t xml:space="preserve"> – Санкт-</w:t>
-      </w:r>
-      <w:proofErr w:type="gramStart"/>
-      <w:r>
-        <w:t>Петербург :</w:t>
-      </w:r>
-      <w:proofErr w:type="gramEnd"/>
-      <w:r>
-        <w:t xml:space="preserve"> БХВ-Петербург, 2024. – 592 с. – URL: https://ibooks.ru/bookshelf/396439/reading (дата обращения: 05.05.2026). – Режим доступа: для </w:t>
-      </w:r>
-      <w:proofErr w:type="spellStart"/>
-      <w:r>
-        <w:t>зарегистрир</w:t>
-      </w:r>
-      <w:proofErr w:type="spellEnd"/>
-      <w:r>
-        <w:t xml:space="preserve">. пользователей. – Текст: электронный. </w:t>
+        <w:t xml:space="preserve">1. Аспин А. MySQL. Практические рецепты: Пер. с англ. / А. Аспин – Санкт-Петербург : БХВ-Петербург, 2024. – 592 с. – URL: https://ibooks.ru/bookshelf/396439/reading (дата обращения: 05.05.2026). – Режим доступа: для зарегистрир. пользователей. – Текст: электронный. </w:t>
       </w:r>
     </w:p>
     <w:p>
@@ -5262,63 +5176,7 @@
         <w:pStyle w:val="a7"/>
       </w:pPr>
       <w:r>
-        <w:t xml:space="preserve">2. </w:t>
-      </w:r>
-      <w:proofErr w:type="spellStart"/>
-      <w:r>
-        <w:t>Нацвин</w:t>
-      </w:r>
-      <w:proofErr w:type="spellEnd"/>
-      <w:r>
-        <w:t xml:space="preserve"> А. В., Юрьева Т. А. Разработка программного обеспечения с графическим интерфейсом на базе </w:t>
-      </w:r>
-      <w:proofErr w:type="spellStart"/>
-      <w:r>
-        <w:t>фреймворка</w:t>
-      </w:r>
-      <w:proofErr w:type="spellEnd"/>
-      <w:r>
-        <w:t xml:space="preserve"> </w:t>
-      </w:r>
-      <w:proofErr w:type="spellStart"/>
-      <w:r>
-        <w:t>Avalonia</w:t>
-      </w:r>
-      <w:proofErr w:type="spellEnd"/>
-      <w:r>
-        <w:t xml:space="preserve">: учебно-методическое пособие / А.В. </w:t>
-      </w:r>
-      <w:proofErr w:type="spellStart"/>
-      <w:r>
-        <w:t>Нацвин</w:t>
-      </w:r>
-      <w:proofErr w:type="spellEnd"/>
-      <w:r>
-        <w:t xml:space="preserve">, Т.А. Юрьева. – </w:t>
-      </w:r>
-      <w:proofErr w:type="gramStart"/>
-      <w:r>
-        <w:t>Благовещенск :</w:t>
-      </w:r>
-      <w:proofErr w:type="gramEnd"/>
-      <w:r>
-        <w:t xml:space="preserve"> </w:t>
-      </w:r>
-      <w:proofErr w:type="spellStart"/>
-      <w:r>
-        <w:t>АмГУ</w:t>
-      </w:r>
-      <w:proofErr w:type="spellEnd"/>
-      <w:r>
-        <w:t xml:space="preserve">, 2023. – 102 с. – URL: https://reader.lanbook.com/book/454511 (дата обращения: 16.05.2026). – Режим доступа: для </w:t>
-      </w:r>
-      <w:proofErr w:type="spellStart"/>
-      <w:r>
-        <w:t>зарегистрир</w:t>
-      </w:r>
-      <w:proofErr w:type="spellEnd"/>
-      <w:r>
-        <w:t xml:space="preserve">. пользователей. – Текст: электронный. </w:t>
+        <w:t xml:space="preserve">2. Нацвин А. В., Юрьева Т. А. Разработка программного обеспечения с графическим интерфейсом на базе фреймворка Avalonia: учебно-методическое пособие / А.В. Нацвин, Т.А. Юрьева. – Благовещенск : АмГУ, 2023. – 102 с. – URL: https://reader.lanbook.com/book/454511 (дата обращения: 16.05.2026). – Режим доступа: для зарегистрир. пользователей. – Текст: электронный. </w:t>
       </w:r>
     </w:p>
     <w:p>
@@ -5326,23 +5184,7 @@
         <w:pStyle w:val="a7"/>
       </w:pPr>
       <w:r>
-        <w:t xml:space="preserve">3. Проскуряков А. В. Качество и тестирование программного обеспечения. Метрология программного обеспечения. – </w:t>
-      </w:r>
-      <w:proofErr w:type="gramStart"/>
-      <w:r>
-        <w:t>Таганрог :</w:t>
-      </w:r>
-      <w:proofErr w:type="gramEnd"/>
-      <w:r>
-        <w:t xml:space="preserve"> Издательство Южного федерального университета, 2022. – 197 с. – URL: https://znanium.ru/read?id=429841 (дата обращения: 10.06.2026). – Режим доступа: для </w:t>
-      </w:r>
-      <w:proofErr w:type="spellStart"/>
-      <w:r>
-        <w:t>зарегистрир</w:t>
-      </w:r>
-      <w:proofErr w:type="spellEnd"/>
-      <w:r>
-        <w:t xml:space="preserve">. пользователей. – Текст: электронный. </w:t>
+        <w:t xml:space="preserve">3. Проскуряков А. В. Качество и тестирование программного обеспечения. Метрология программного обеспечения. – Таганрог : Издательство Южного федерального университета, 2022. – 197 с. – URL: https://znanium.ru/read?id=429841 (дата обращения: 10.06.2026). – Режим доступа: для зарегистрир. пользователей. – Текст: электронный. </w:t>
       </w:r>
     </w:p>
     <w:p>
@@ -5350,52 +5192,7 @@
         <w:pStyle w:val="a7"/>
       </w:pPr>
       <w:r>
-        <w:t xml:space="preserve">4. </w:t>
-      </w:r>
-      <w:proofErr w:type="spellStart"/>
-      <w:r>
-        <w:t>Фленов</w:t>
-      </w:r>
-      <w:proofErr w:type="spellEnd"/>
-      <w:r>
-        <w:t xml:space="preserve"> М. Е. Библия C#. – 6-е изд., </w:t>
-      </w:r>
-      <w:proofErr w:type="spellStart"/>
-      <w:r>
-        <w:t>перераб</w:t>
-      </w:r>
-      <w:proofErr w:type="spellEnd"/>
-      <w:proofErr w:type="gramStart"/>
-      <w:r>
-        <w:t>.</w:t>
-      </w:r>
-      <w:proofErr w:type="gramEnd"/>
-      <w:r>
-        <w:t xml:space="preserve"> и доп. / М.Е. </w:t>
-      </w:r>
-      <w:proofErr w:type="spellStart"/>
-      <w:r>
-        <w:t>Фленов</w:t>
-      </w:r>
-      <w:proofErr w:type="spellEnd"/>
-      <w:r>
-        <w:t>. – Санкт-</w:t>
-      </w:r>
-      <w:proofErr w:type="gramStart"/>
-      <w:r>
-        <w:t>Петербург :</w:t>
-      </w:r>
-      <w:proofErr w:type="gramEnd"/>
-      <w:r>
-        <w:t xml:space="preserve"> БХВ-Петербург, 2024. – 512 с. – URL: https://ibooks.ru/bookshelf/396461/reading (дата обращения: 28.05.2026). – Режим доступа: для </w:t>
-      </w:r>
-      <w:proofErr w:type="spellStart"/>
-      <w:r>
-        <w:t>зарегистрир</w:t>
-      </w:r>
-      <w:proofErr w:type="spellEnd"/>
-      <w:r>
-        <w:t xml:space="preserve">. пользователей. – Текст: электронный. </w:t>
+        <w:t xml:space="preserve">4. Фленов М. Е. Библия C#. – 6-е изд., перераб. и доп. / М.Е. Фленов. – Санкт-Петербург : БХВ-Петербург, 2024. – 512 с. – URL: https://ibooks.ru/bookshelf/396461/reading (дата обращения: 28.05.2026). – Режим доступа: для зарегистрир. пользователей. – Текст: электронный. </w:t>
       </w:r>
     </w:p>
     <w:p>
@@ -5403,39 +5200,7 @@
         <w:pStyle w:val="a7"/>
       </w:pPr>
       <w:r>
-        <w:t xml:space="preserve">5. Шалин П. Программирование на </w:t>
-      </w:r>
-      <w:proofErr w:type="spellStart"/>
-      <w:r>
-        <w:t>Kotlin</w:t>
-      </w:r>
-      <w:proofErr w:type="spellEnd"/>
-      <w:r>
-        <w:t xml:space="preserve"> для </w:t>
-      </w:r>
-      <w:proofErr w:type="spellStart"/>
-      <w:r>
-        <w:t>Android</w:t>
-      </w:r>
-      <w:proofErr w:type="spellEnd"/>
-      <w:r>
-        <w:t>: Пер. с англ. / П. Шалин. – Санкт-</w:t>
-      </w:r>
-      <w:proofErr w:type="gramStart"/>
-      <w:r>
-        <w:t>Петербург :</w:t>
-      </w:r>
-      <w:proofErr w:type="gramEnd"/>
-      <w:r>
-        <w:t xml:space="preserve"> БХВ-Петербург, 2023. – 336 с. – URL: https://ibooks.ru/bookshelf/396448/reading (дата обращения: 03.06.2026). – Режим доступа: для </w:t>
-      </w:r>
-      <w:proofErr w:type="spellStart"/>
-      <w:r>
-        <w:t>зарегистрир</w:t>
-      </w:r>
-      <w:proofErr w:type="spellEnd"/>
-      <w:r>
-        <w:t>. пользователей. – Текст: электронный.</w:t>
+        <w:t>5. Шалин П. Программирование на Kotlin для Android: Пер. с англ. / П. Шалин. – Санкт-Петербург : БХВ-Петербург, 2023. – 336 с. – URL: https://ibooks.ru/bookshelf/396448/reading (дата обращения: 03.06.2026). – Режим доступа: для зарегистрир. пользователей. – Текст: электронный.</w:t>
       </w:r>
     </w:p>
     <w:sectPr>
@@ -5451,7 +5216,7 @@
 </file>
 
 <file path=word/endnotes.xml><?xml version="1.0" encoding="utf-8"?>
-<w:endnotes xmlns:wpc="http://schemas.microsoft.com/office/word/2010/wordprocessingCanvas" xmlns:cx="http://schemas.microsoft.com/office/drawing/2014/chartex" xmlns:mc="http://schemas.openxmlformats.org/markup-compatibility/2006" xmlns:o="urn:schemas-microsoft-com:office:office" xmlns:r="http://schemas.openxmlformats.org/officeDocument/2006/relationships" xmlns:m="http://schemas.openxmlformats.org/officeDocument/2006/math" xmlns:v="urn:schemas-microsoft-com:vml" xmlns:wp14="http://schemas.microsoft.com/office/word/2010/wordprocessingDrawing" xmlns:wp="http://schemas.openxmlformats.org/drawingml/2006/wordprocessingDrawing" xmlns:w10="urn:schemas-microsoft-com:office:word" xmlns:w="http://schemas.openxmlformats.org/wordprocessingml/2006/main" xmlns:w14="http://schemas.microsoft.com/office/word/2010/wordml" xmlns:w15="http://schemas.microsoft.com/office/word/2012/wordml" xmlns:w16se="http://schemas.microsoft.com/office/word/2015/wordml/symex" xmlns:wpg="http://schemas.microsoft.com/office/word/2010/wordprocessingGroup" xmlns:wpi="http://schemas.microsoft.com/office/word/2010/wordprocessingInk" xmlns:wne="http://schemas.microsoft.com/office/word/2006/wordml" xmlns:wps="http://schemas.microsoft.com/office/word/2010/wordprocessingShape" mc:Ignorable="w14 w15 w16se wp14">
+<w:endnotes xmlns:wpc="http://schemas.microsoft.com/office/word/2010/wordprocessingCanvas" xmlns:cx="http://schemas.microsoft.com/office/drawing/2014/chartex" xmlns:cx1="http://schemas.microsoft.com/office/drawing/2015/9/8/chartex" xmlns:cx2="http://schemas.microsoft.com/office/drawing/2015/10/21/chartex" xmlns:cx3="http://schemas.microsoft.com/office/drawing/2016/5/9/chartex" xmlns:cx4="http://schemas.microsoft.com/office/drawing/2016/5/10/chartex" xmlns:cx5="http://schemas.microsoft.com/office/drawing/2016/5/11/chartex" xmlns:cx6="http://schemas.microsoft.com/office/drawing/2016/5/12/chartex" xmlns:cx7="http://schemas.microsoft.com/office/drawing/2016/5/13/chartex" xmlns:cx8="http://schemas.microsoft.com/office/drawing/2016/5/14/chartex" xmlns:mc="http://schemas.openxmlformats.org/markup-compatibility/2006" xmlns:aink="http://schemas.microsoft.com/office/drawing/2016/ink" xmlns:am3d="http://schemas.microsoft.com/office/drawing/2017/model3d" xmlns:o="urn:schemas-microsoft-com:office:office" xmlns:oel="http://schemas.microsoft.com/office/2019/extlst" xmlns:r="http://schemas.openxmlformats.org/officeDocument/2006/relationships" xmlns:m="http://schemas.openxmlformats.org/officeDocument/2006/math" xmlns:v="urn:schemas-microsoft-com:vml" xmlns:wp14="http://schemas.microsoft.com/office/word/2010/wordprocessingDrawing" xmlns:wp="http://schemas.openxmlformats.org/drawingml/2006/wordprocessingDrawing" xmlns:w10="urn:schemas-microsoft-com:office:word" xmlns:w="http://schemas.openxmlformats.org/wordprocessingml/2006/main" xmlns:w14="http://schemas.microsoft.com/office/word/2010/wordml" xmlns:w15="http://schemas.microsoft.com/office/word/2012/wordml" xmlns:w16cex="http://schemas.microsoft.com/office/word/2018/wordml/cex" xmlns:w16cid="http://schemas.microsoft.com/office/word/2016/wordml/cid" xmlns:w16="http://schemas.microsoft.com/office/word/2018/wordml" xmlns:w16sdtdh="http://schemas.microsoft.com/office/word/2020/wordml/sdtdatahash" xmlns:w16se="http://schemas.microsoft.com/office/word/2015/wordml/symex" xmlns:wpg="http://schemas.microsoft.com/office/word/2010/wordprocessingGroup" xmlns:wpi="http://schemas.microsoft.com/office/word/2010/wordprocessingInk" xmlns:wne="http://schemas.microsoft.com/office/word/2006/wordml" xmlns:wps="http://schemas.microsoft.com/office/word/2010/wordprocessingShape" mc:Ignorable="w14 w15 w16se w16cid w16 w16cex w16sdtdh wp14">
   <w:endnote w:type="separator" w:id="-1">
     <w:p>
       <w:r>
@@ -5470,7 +5235,7 @@
 </file>
 
 <file path=word/footer1.xml><?xml version="1.0" encoding="utf-8"?>
-<w:ftr xmlns:wpc="http://schemas.microsoft.com/office/word/2010/wordprocessingCanvas" xmlns:cx="http://schemas.microsoft.com/office/drawing/2014/chartex" xmlns:mc="http://schemas.openxmlformats.org/markup-compatibility/2006" xmlns:o="urn:schemas-microsoft-com:office:office" xmlns:r="http://schemas.openxmlformats.org/officeDocument/2006/relationships" xmlns:m="http://schemas.openxmlformats.org/officeDocument/2006/math" xmlns:v="urn:schemas-microsoft-com:vml" xmlns:wp14="http://schemas.microsoft.com/office/word/2010/wordprocessingDrawing" xmlns:wp="http://schemas.openxmlformats.org/drawingml/2006/wordprocessingDrawing" xmlns:w10="urn:schemas-microsoft-com:office:word" xmlns:w="http://schemas.openxmlformats.org/wordprocessingml/2006/main" xmlns:w14="http://schemas.microsoft.com/office/word/2010/wordml" xmlns:w15="http://schemas.microsoft.com/office/word/2012/wordml" xmlns:w16se="http://schemas.microsoft.com/office/word/2015/wordml/symex" xmlns:wpg="http://schemas.microsoft.com/office/word/2010/wordprocessingGroup" xmlns:wpi="http://schemas.microsoft.com/office/word/2010/wordprocessingInk" xmlns:wne="http://schemas.microsoft.com/office/word/2006/wordml" xmlns:wps="http://schemas.microsoft.com/office/word/2010/wordprocessingShape" mc:Ignorable="w14 w15 w16se wp14">
+<w:ftr xmlns:wpc="http://schemas.microsoft.com/office/word/2010/wordprocessingCanvas" xmlns:cx="http://schemas.microsoft.com/office/drawing/2014/chartex" xmlns:cx1="http://schemas.microsoft.com/office/drawing/2015/9/8/chartex" xmlns:cx2="http://schemas.microsoft.com/office/drawing/2015/10/21/chartex" xmlns:cx3="http://schemas.microsoft.com/office/drawing/2016/5/9/chartex" xmlns:cx4="http://schemas.microsoft.com/office/drawing/2016/5/10/chartex" xmlns:cx5="http://schemas.microsoft.com/office/drawing/2016/5/11/chartex" xmlns:cx6="http://schemas.microsoft.com/office/drawing/2016/5/12/chartex" xmlns:cx7="http://schemas.microsoft.com/office/drawing/2016/5/13/chartex" xmlns:cx8="http://schemas.microsoft.com/office/drawing/2016/5/14/chartex" xmlns:mc="http://schemas.openxmlformats.org/markup-compatibility/2006" xmlns:aink="http://schemas.microsoft.com/office/drawing/2016/ink" xmlns:am3d="http://schemas.microsoft.com/office/drawing/2017/model3d" xmlns:o="urn:schemas-microsoft-com:office:office" xmlns:oel="http://schemas.microsoft.com/office/2019/extlst" xmlns:r="http://schemas.openxmlformats.org/officeDocument/2006/relationships" xmlns:m="http://schemas.openxmlformats.org/officeDocument/2006/math" xmlns:v="urn:schemas-microsoft-com:vml" xmlns:wp14="http://schemas.microsoft.com/office/word/2010/wordprocessingDrawing" xmlns:wp="http://schemas.openxmlformats.org/drawingml/2006/wordprocessingDrawing" xmlns:w10="urn:schemas-microsoft-com:office:word" xmlns:w="http://schemas.openxmlformats.org/wordprocessingml/2006/main" xmlns:w14="http://schemas.microsoft.com/office/word/2010/wordml" xmlns:w15="http://schemas.microsoft.com/office/word/2012/wordml" xmlns:w16cex="http://schemas.microsoft.com/office/word/2018/wordml/cex" xmlns:w16cid="http://schemas.microsoft.com/office/word/2016/wordml/cid" xmlns:w16="http://schemas.microsoft.com/office/word/2018/wordml" xmlns:w16sdtdh="http://schemas.microsoft.com/office/word/2020/wordml/sdtdatahash" xmlns:w16se="http://schemas.microsoft.com/office/word/2015/wordml/symex" xmlns:wpg="http://schemas.microsoft.com/office/word/2010/wordprocessingGroup" xmlns:wpi="http://schemas.microsoft.com/office/word/2010/wordprocessingInk" xmlns:wne="http://schemas.microsoft.com/office/word/2006/wordml" xmlns:wps="http://schemas.microsoft.com/office/word/2010/wordprocessingShape" mc:Ignorable="w14 w15 w16se w16cid w16 w16cex w16sdtdh wp14">
   <w:sdt>
     <w:sdtPr>
       <w:id w:val="-651911265"/>
@@ -5530,7 +5295,7 @@
 </file>
 
 <file path=word/footnotes.xml><?xml version="1.0" encoding="utf-8"?>
-<w:footnotes xmlns:wpc="http://schemas.microsoft.com/office/word/2010/wordprocessingCanvas" xmlns:cx="http://schemas.microsoft.com/office/drawing/2014/chartex" xmlns:mc="http://schemas.openxmlformats.org/markup-compatibility/2006" xmlns:o="urn:schemas-microsoft-com:office:office" xmlns:r="http://schemas.openxmlformats.org/officeDocument/2006/relationships" xmlns:m="http://schemas.openxmlformats.org/officeDocument/2006/math" xmlns:v="urn:schemas-microsoft-com:vml" xmlns:wp14="http://schemas.microsoft.com/office/word/2010/wordprocessingDrawing" xmlns:wp="http://schemas.openxmlformats.org/drawingml/2006/wordprocessingDrawing" xmlns:w10="urn:schemas-microsoft-com:office:word" xmlns:w="http://schemas.openxmlformats.org/wordprocessingml/2006/main" xmlns:w14="http://schemas.microsoft.com/office/word/2010/wordml" xmlns:w15="http://schemas.microsoft.com/office/word/2012/wordml" xmlns:w16se="http://schemas.microsoft.com/office/word/2015/wordml/symex" xmlns:wpg="http://schemas.microsoft.com/office/word/2010/wordprocessingGroup" xmlns:wpi="http://schemas.microsoft.com/office/word/2010/wordprocessingInk" xmlns:wne="http://schemas.microsoft.com/office/word/2006/wordml" xmlns:wps="http://schemas.microsoft.com/office/word/2010/wordprocessingShape" mc:Ignorable="w14 w15 w16se wp14">
+<w:footnotes xmlns:wpc="http://schemas.microsoft.com/office/word/2010/wordprocessingCanvas" xmlns:cx="http://schemas.microsoft.com/office/drawing/2014/chartex" xmlns:cx1="http://schemas.microsoft.com/office/drawing/2015/9/8/chartex" xmlns:cx2="http://schemas.microsoft.com/office/drawing/2015/10/21/chartex" xmlns:cx3="http://schemas.microsoft.com/office/drawing/2016/5/9/chartex" xmlns:cx4="http://schemas.microsoft.com/office/drawing/2016/5/10/chartex" xmlns:cx5="http://schemas.microsoft.com/office/drawing/2016/5/11/chartex" xmlns:cx6="http://schemas.microsoft.com/office/drawing/2016/5/12/chartex" xmlns:cx7="http://schemas.microsoft.com/office/drawing/2016/5/13/chartex" xmlns:cx8="http://schemas.microsoft.com/office/drawing/2016/5/14/chartex" xmlns:mc="http://schemas.openxmlformats.org/markup-compatibility/2006" xmlns:aink="http://schemas.microsoft.com/office/drawing/2016/ink" xmlns:am3d="http://schemas.microsoft.com/office/drawing/2017/model3d" xmlns:o="urn:schemas-microsoft-com:office:office" xmlns:oel="http://schemas.microsoft.com/office/2019/extlst" xmlns:r="http://schemas.openxmlformats.org/officeDocument/2006/relationships" xmlns:m="http://schemas.openxmlformats.org/officeDocument/2006/math" xmlns:v="urn:schemas-microsoft-com:vml" xmlns:wp14="http://schemas.microsoft.com/office/word/2010/wordprocessingDrawing" xmlns:wp="http://schemas.openxmlformats.org/drawingml/2006/wordprocessingDrawing" xmlns:w10="urn:schemas-microsoft-com:office:word" xmlns:w="http://schemas.openxmlformats.org/wordprocessingml/2006/main" xmlns:w14="http://schemas.microsoft.com/office/word/2010/wordml" xmlns:w15="http://schemas.microsoft.com/office/word/2012/wordml" xmlns:w16cex="http://schemas.microsoft.com/office/word/2018/wordml/cex" xmlns:w16cid="http://schemas.microsoft.com/office/word/2016/wordml/cid" xmlns:w16="http://schemas.microsoft.com/office/word/2018/wordml" xmlns:w16sdtdh="http://schemas.microsoft.com/office/word/2020/wordml/sdtdatahash" xmlns:w16se="http://schemas.microsoft.com/office/word/2015/wordml/symex" xmlns:wpg="http://schemas.microsoft.com/office/word/2010/wordprocessingGroup" xmlns:wpi="http://schemas.microsoft.com/office/word/2010/wordprocessingInk" xmlns:wne="http://schemas.microsoft.com/office/word/2006/wordml" xmlns:wps="http://schemas.microsoft.com/office/word/2010/wordprocessingShape" mc:Ignorable="w14 w15 w16se w16cid w16 w16cex w16sdtdh wp14">
   <w:footnote w:type="separator" w:id="-1">
     <w:p>
       <w:r>
@@ -5549,7 +5314,7 @@
 </file>
 
 <file path=word/numbering.xml><?xml version="1.0" encoding="utf-8"?>
-<w:numbering xmlns:wpc="http://schemas.microsoft.com/office/word/2010/wordprocessingCanvas" xmlns:cx="http://schemas.microsoft.com/office/drawing/2014/chartex" xmlns:mc="http://schemas.openxmlformats.org/markup-compatibility/2006" xmlns:o="urn:schemas-microsoft-com:office:office" xmlns:r="http://schemas.openxmlformats.org/officeDocument/2006/relationships" xmlns:m="http://schemas.openxmlformats.org/officeDocument/2006/math" xmlns:v="urn:schemas-microsoft-com:vml" xmlns:wp14="http://schemas.microsoft.com/office/word/2010/wordprocessingDrawing" xmlns:wp="http://schemas.openxmlformats.org/drawingml/2006/wordprocessingDrawing" xmlns:w10="urn:schemas-microsoft-com:office:word" xmlns:w="http://schemas.openxmlformats.org/wordprocessingml/2006/main" xmlns:w14="http://schemas.microsoft.com/office/word/2010/wordml" xmlns:w15="http://schemas.microsoft.com/office/word/2012/wordml" xmlns:w16se="http://schemas.microsoft.com/office/word/2015/wordml/symex" xmlns:wpg="http://schemas.microsoft.com/office/word/2010/wordprocessingGroup" xmlns:wpi="http://schemas.microsoft.com/office/word/2010/wordprocessingInk" xmlns:wne="http://schemas.microsoft.com/office/word/2006/wordml" xmlns:wps="http://schemas.microsoft.com/office/word/2010/wordprocessingShape" mc:Ignorable="w14 w15 w16se wp14">
+<w:numbering xmlns:wpc="http://schemas.microsoft.com/office/word/2010/wordprocessingCanvas" xmlns:cx="http://schemas.microsoft.com/office/drawing/2014/chartex" xmlns:cx1="http://schemas.microsoft.com/office/drawing/2015/9/8/chartex" xmlns:cx2="http://schemas.microsoft.com/office/drawing/2015/10/21/chartex" xmlns:cx3="http://schemas.microsoft.com/office/drawing/2016/5/9/chartex" xmlns:cx4="http://schemas.microsoft.com/office/drawing/2016/5/10/chartex" xmlns:cx5="http://schemas.microsoft.com/office/drawing/2016/5/11/chartex" xmlns:cx6="http://schemas.microsoft.com/office/drawing/2016/5/12/chartex" xmlns:cx7="http://schemas.microsoft.com/office/drawing/2016/5/13/chartex" xmlns:cx8="http://schemas.microsoft.com/office/drawing/2016/5/14/chartex" xmlns:mc="http://schemas.openxmlformats.org/markup-compatibility/2006" xmlns:aink="http://schemas.microsoft.com/office/drawing/2016/ink" xmlns:am3d="http://schemas.microsoft.com/office/drawing/2017/model3d" xmlns:o="urn:schemas-microsoft-com:office:office" xmlns:oel="http://schemas.microsoft.com/office/2019/extlst" xmlns:r="http://schemas.openxmlformats.org/officeDocument/2006/relationships" xmlns:m="http://schemas.openxmlformats.org/officeDocument/2006/math" xmlns:v="urn:schemas-microsoft-com:vml" xmlns:wp14="http://schemas.microsoft.com/office/word/2010/wordprocessingDrawing" xmlns:wp="http://schemas.openxmlformats.org/drawingml/2006/wordprocessingDrawing" xmlns:w10="urn:schemas-microsoft-com:office:word" xmlns:w="http://schemas.openxmlformats.org/wordprocessingml/2006/main" xmlns:w14="http://schemas.microsoft.com/office/word/2010/wordml" xmlns:w15="http://schemas.microsoft.com/office/word/2012/wordml" xmlns:w16cex="http://schemas.microsoft.com/office/word/2018/wordml/cex" xmlns:w16cid="http://schemas.microsoft.com/office/word/2016/wordml/cid" xmlns:w16="http://schemas.microsoft.com/office/word/2018/wordml" xmlns:w16sdtdh="http://schemas.microsoft.com/office/word/2020/wordml/sdtdatahash" xmlns:w16se="http://schemas.microsoft.com/office/word/2015/wordml/symex" xmlns:wpg="http://schemas.microsoft.com/office/word/2010/wordprocessingGroup" xmlns:wpi="http://schemas.microsoft.com/office/word/2010/wordprocessingInk" xmlns:wne="http://schemas.microsoft.com/office/word/2006/wordml" xmlns:wps="http://schemas.microsoft.com/office/word/2010/wordprocessingShape" mc:Ignorable="w14 w15 w16se w16cid w16 w16cex w16sdtdh wp14">
   <w:abstractNum w:abstractNumId="0" w15:restartNumberingAfterBreak="0">
     <w:nsid w:val="0428275C"/>
     <w:multiLevelType w:val="hybridMultilevel"/>
@@ -6696,59 +6461,59 @@
       </w:pPr>
     </w:lvl>
   </w:abstractNum>
-  <w:num w:numId="1">
+  <w:num w:numId="1" w16cid:durableId="1286690182">
     <w:abstractNumId w:val="8"/>
   </w:num>
-  <w:num w:numId="2">
+  <w:num w:numId="2" w16cid:durableId="465247522">
     <w:abstractNumId w:val="3"/>
   </w:num>
-  <w:num w:numId="3">
+  <w:num w:numId="3" w16cid:durableId="207373438">
     <w:abstractNumId w:val="2"/>
   </w:num>
-  <w:num w:numId="4">
+  <w:num w:numId="4" w16cid:durableId="49618442">
     <w:abstractNumId w:val="2"/>
     <w:lvlOverride w:ilvl="0">
       <w:startOverride w:val="1"/>
     </w:lvlOverride>
   </w:num>
-  <w:num w:numId="5">
+  <w:num w:numId="5" w16cid:durableId="898856296">
     <w:abstractNumId w:val="2"/>
     <w:lvlOverride w:ilvl="0">
       <w:startOverride w:val="1"/>
     </w:lvlOverride>
   </w:num>
-  <w:num w:numId="6">
+  <w:num w:numId="6" w16cid:durableId="227618539">
     <w:abstractNumId w:val="5"/>
   </w:num>
-  <w:num w:numId="7">
+  <w:num w:numId="7" w16cid:durableId="197819301">
     <w:abstractNumId w:val="6"/>
   </w:num>
-  <w:num w:numId="8">
+  <w:num w:numId="8" w16cid:durableId="740175439">
     <w:abstractNumId w:val="1"/>
   </w:num>
-  <w:num w:numId="9">
+  <w:num w:numId="9" w16cid:durableId="369306606">
     <w:abstractNumId w:val="0"/>
   </w:num>
-  <w:num w:numId="10">
+  <w:num w:numId="10" w16cid:durableId="1062486720">
     <w:abstractNumId w:val="9"/>
   </w:num>
-  <w:num w:numId="11">
+  <w:num w:numId="11" w16cid:durableId="1655379042">
     <w:abstractNumId w:val="7"/>
   </w:num>
-  <w:num w:numId="12">
+  <w:num w:numId="12" w16cid:durableId="1138647914">
     <w:abstractNumId w:val="8"/>
   </w:num>
-  <w:num w:numId="13">
+  <w:num w:numId="13" w16cid:durableId="520166217">
     <w:abstractNumId w:val="8"/>
   </w:num>
-  <w:num w:numId="14">
+  <w:num w:numId="14" w16cid:durableId="2108963448">
     <w:abstractNumId w:val="4"/>
   </w:num>
 </w:numbering>
 </file>
 
 <file path=word/styles.xml><?xml version="1.0" encoding="utf-8"?>
-<w:styles xmlns:mc="http://schemas.openxmlformats.org/markup-compatibility/2006" xmlns:r="http://schemas.openxmlformats.org/officeDocument/2006/relationships" xmlns:w="http://schemas.openxmlformats.org/wordprocessingml/2006/main" xmlns:w14="http://schemas.microsoft.com/office/word/2010/wordml" xmlns:w15="http://schemas.microsoft.com/office/word/2012/wordml" xmlns:w16se="http://schemas.microsoft.com/office/word/2015/wordml/symex" mc:Ignorable="w14 w15 w16se">
+<w:styles xmlns:mc="http://schemas.openxmlformats.org/markup-compatibility/2006" xmlns:r="http://schemas.openxmlformats.org/officeDocument/2006/relationships" xmlns:w="http://schemas.openxmlformats.org/wordprocessingml/2006/main" xmlns:w14="http://schemas.microsoft.com/office/word/2010/wordml" xmlns:w15="http://schemas.microsoft.com/office/word/2012/wordml" xmlns:w16cex="http://schemas.microsoft.com/office/word/2018/wordml/cex" xmlns:w16cid="http://schemas.microsoft.com/office/word/2016/wordml/cid" xmlns:w16="http://schemas.microsoft.com/office/word/2018/wordml" xmlns:w16sdtdh="http://schemas.microsoft.com/office/word/2020/wordml/sdtdatahash" xmlns:w16se="http://schemas.microsoft.com/office/word/2015/wordml/symex" mc:Ignorable="w14 w15 w16se w16cid w16 w16cex w16sdtdh">
   <w:docDefaults>
     <w:rPrDefault>
       <w:rPr>
@@ -6764,7 +6529,7 @@
       </w:pPr>
     </w:pPrDefault>
   </w:docDefaults>
-  <w:latentStyles w:defLockedState="0" w:defUIPriority="99" w:defSemiHidden="0" w:defUnhideWhenUsed="0" w:defQFormat="0" w:count="371">
+  <w:latentStyles w:defLockedState="0" w:defUIPriority="99" w:defSemiHidden="0" w:defUnhideWhenUsed="0" w:defQFormat="0" w:count="376">
     <w:lsdException w:name="Normal" w:uiPriority="0" w:qFormat="1"/>
     <w:lsdException w:name="heading 1" w:uiPriority="9" w:qFormat="1"/>
     <w:lsdException w:name="heading 2" w:semiHidden="1" w:uiPriority="9" w:unhideWhenUsed="1" w:qFormat="1"/>
@@ -7136,6 +6901,11 @@
     <w:lsdException w:name="List Table 5 Dark Accent 6" w:uiPriority="50"/>
     <w:lsdException w:name="List Table 6 Colorful Accent 6" w:uiPriority="51"/>
     <w:lsdException w:name="List Table 7 Colorful Accent 6" w:uiPriority="52"/>
+    <w:lsdException w:name="Mention" w:semiHidden="1" w:unhideWhenUsed="1"/>
+    <w:lsdException w:name="Smart Hyperlink" w:semiHidden="1" w:unhideWhenUsed="1"/>
+    <w:lsdException w:name="Hashtag" w:semiHidden="1" w:unhideWhenUsed="1"/>
+    <w:lsdException w:name="Unresolved Mention" w:semiHidden="1" w:unhideWhenUsed="1"/>
+    <w:lsdException w:name="Smart Link" w:semiHidden="1" w:unhideWhenUsed="1"/>
   </w:latentStyles>
   <w:style w:type="paragraph" w:default="1" w:styleId="a2">
     <w:name w:val="Normal"/>

</xml_diff>

<commit_message>
make color scheme, add mockups, load some other files
</commit_message>
<xml_diff>
--- a/Курсовой проект.docx
+++ b/Курсовой проект.docx
@@ -1,6 +1,6 @@
 
 <file path=word/document.xml><?xml version="1.0" encoding="utf-8"?>
-<w:document xmlns:wpc="http://schemas.microsoft.com/office/word/2010/wordprocessingCanvas" xmlns:cx="http://schemas.microsoft.com/office/drawing/2014/chartex" xmlns:mc="http://schemas.openxmlformats.org/markup-compatibility/2006" xmlns:o="urn:schemas-microsoft-com:office:office" xmlns:r="http://schemas.openxmlformats.org/officeDocument/2006/relationships" xmlns:m="http://schemas.openxmlformats.org/officeDocument/2006/math" xmlns:v="urn:schemas-microsoft-com:vml" xmlns:wp14="http://schemas.microsoft.com/office/word/2010/wordprocessingDrawing" xmlns:wp="http://schemas.openxmlformats.org/drawingml/2006/wordprocessingDrawing" xmlns:w10="urn:schemas-microsoft-com:office:word" xmlns:w="http://schemas.openxmlformats.org/wordprocessingml/2006/main" xmlns:w14="http://schemas.microsoft.com/office/word/2010/wordml" xmlns:w15="http://schemas.microsoft.com/office/word/2012/wordml" xmlns:w16se="http://schemas.microsoft.com/office/word/2015/wordml/symex" xmlns:wpg="http://schemas.microsoft.com/office/word/2010/wordprocessingGroup" xmlns:wpi="http://schemas.microsoft.com/office/word/2010/wordprocessingInk" xmlns:wne="http://schemas.microsoft.com/office/word/2006/wordml" xmlns:wps="http://schemas.microsoft.com/office/word/2010/wordprocessingShape" mc:Ignorable="w14 w15 w16se wp14">
+<w:document xmlns:wpc="http://schemas.microsoft.com/office/word/2010/wordprocessingCanvas" xmlns:cx="http://schemas.microsoft.com/office/drawing/2014/chartex" xmlns:cx1="http://schemas.microsoft.com/office/drawing/2015/9/8/chartex" xmlns:cx2="http://schemas.microsoft.com/office/drawing/2015/10/21/chartex" xmlns:cx3="http://schemas.microsoft.com/office/drawing/2016/5/9/chartex" xmlns:cx4="http://schemas.microsoft.com/office/drawing/2016/5/10/chartex" xmlns:cx5="http://schemas.microsoft.com/office/drawing/2016/5/11/chartex" xmlns:cx6="http://schemas.microsoft.com/office/drawing/2016/5/12/chartex" xmlns:cx7="http://schemas.microsoft.com/office/drawing/2016/5/13/chartex" xmlns:cx8="http://schemas.microsoft.com/office/drawing/2016/5/14/chartex" xmlns:mc="http://schemas.openxmlformats.org/markup-compatibility/2006" xmlns:aink="http://schemas.microsoft.com/office/drawing/2016/ink" xmlns:am3d="http://schemas.microsoft.com/office/drawing/2017/model3d" xmlns:o="urn:schemas-microsoft-com:office:office" xmlns:oel="http://schemas.microsoft.com/office/2019/extlst" xmlns:r="http://schemas.openxmlformats.org/officeDocument/2006/relationships" xmlns:m="http://schemas.openxmlformats.org/officeDocument/2006/math" xmlns:v="urn:schemas-microsoft-com:vml" xmlns:wp14="http://schemas.microsoft.com/office/word/2010/wordprocessingDrawing" xmlns:wp="http://schemas.openxmlformats.org/drawingml/2006/wordprocessingDrawing" xmlns:w10="urn:schemas-microsoft-com:office:word" xmlns:w="http://schemas.openxmlformats.org/wordprocessingml/2006/main" xmlns:w14="http://schemas.microsoft.com/office/word/2010/wordml" xmlns:w15="http://schemas.microsoft.com/office/word/2012/wordml" xmlns:w16cex="http://schemas.microsoft.com/office/word/2018/wordml/cex" xmlns:w16cid="http://schemas.microsoft.com/office/word/2016/wordml/cid" xmlns:w16="http://schemas.microsoft.com/office/word/2018/wordml" xmlns:w16sdtdh="http://schemas.microsoft.com/office/word/2020/wordml/sdtdatahash" xmlns:w16se="http://schemas.microsoft.com/office/word/2015/wordml/symex" xmlns:wpg="http://schemas.microsoft.com/office/word/2010/wordprocessingGroup" xmlns:wpi="http://schemas.microsoft.com/office/word/2010/wordprocessingInk" xmlns:wne="http://schemas.microsoft.com/office/word/2006/wordml" xmlns:wps="http://schemas.microsoft.com/office/word/2010/wordprocessingShape" mc:Ignorable="w14 w15 w16se w16cid w16 w16cex w16sdtdh wp14">
   <w:body>
     <w:p>
       <w:pPr>
@@ -63,33 +63,33 @@
           <w:b/>
           <w:bCs/>
         </w:rPr>
-        <w:t>(</w:t>
-      </w:r>
-      <w:proofErr w:type="spellStart"/>
-      <w:r>
+        <w:t>(СПбГУТ)</w:t>
+      </w:r>
+    </w:p>
+    <w:p>
+      <w:pPr>
+        <w:jc w:val="center"/>
         <w:rPr>
           <w:b/>
           <w:bCs/>
         </w:rPr>
-        <w:t>СПбГУТ</w:t>
-      </w:r>
-      <w:proofErr w:type="spellEnd"/>
-      <w:r>
+      </w:pPr>
+    </w:p>
+    <w:p>
+      <w:pPr>
+        <w:jc w:val="center"/>
         <w:rPr>
           <w:b/>
           <w:bCs/>
         </w:rPr>
-        <w:t>)</w:t>
-      </w:r>
-    </w:p>
-    <w:p>
-      <w:pPr>
-        <w:jc w:val="center"/>
+      </w:pPr>
+      <w:r>
         <w:rPr>
           <w:b/>
           <w:bCs/>
         </w:rPr>
-      </w:pPr>
+        <w:t>АРХАНГЕЛЬСКИЙ КОЛЛЕДЖ ТЕЛЕКОММУНИКАЦИЙ</w:t>
+      </w:r>
     </w:p>
     <w:p>
       <w:pPr>
@@ -104,71 +104,30 @@
           <w:b/>
           <w:bCs/>
         </w:rPr>
-        <w:t>АРХАНГЕЛЬСКИЙ КОЛЛЕДЖ ТЕЛЕКОММУНИКАЦИЙ</w:t>
-      </w:r>
-    </w:p>
-    <w:p>
-      <w:pPr>
-        <w:jc w:val="center"/>
+        <w:t xml:space="preserve">ИМ. Б.Л. РОЗИНГА </w:t>
+      </w:r>
+      <w:r>
         <w:rPr>
           <w:b/>
           <w:bCs/>
         </w:rPr>
-      </w:pPr>
-      <w:r>
+        <w:t>(ФИЛИАЛ) СПбГУТ</w:t>
+      </w:r>
+    </w:p>
+    <w:p>
+      <w:pPr>
+        <w:jc w:val="center"/>
         <w:rPr>
           <w:b/>
           <w:bCs/>
         </w:rPr>
-        <w:t xml:space="preserve">ИМ. Б.Л. РОЗИНГА </w:t>
-      </w:r>
+      </w:pPr>
       <w:r>
         <w:rPr>
           <w:b/>
           <w:bCs/>
         </w:rPr>
-        <w:t xml:space="preserve">(ФИЛИАЛ) </w:t>
-      </w:r>
-      <w:proofErr w:type="spellStart"/>
-      <w:r>
-        <w:rPr>
-          <w:b/>
-          <w:bCs/>
-        </w:rPr>
-        <w:t>СПбГУТ</w:t>
-      </w:r>
-      <w:proofErr w:type="spellEnd"/>
-    </w:p>
-    <w:p>
-      <w:pPr>
-        <w:jc w:val="center"/>
-        <w:rPr>
-          <w:b/>
-          <w:bCs/>
-        </w:rPr>
-      </w:pPr>
-      <w:r>
-        <w:rPr>
-          <w:b/>
-          <w:bCs/>
-        </w:rPr>
-        <w:t xml:space="preserve">(АКТ (ф) </w:t>
-      </w:r>
-      <w:proofErr w:type="spellStart"/>
-      <w:r>
-        <w:rPr>
-          <w:b/>
-          <w:bCs/>
-        </w:rPr>
-        <w:t>СПбГУТ</w:t>
-      </w:r>
-      <w:proofErr w:type="spellEnd"/>
-      <w:r>
-        <w:rPr>
-          <w:b/>
-          <w:bCs/>
-        </w:rPr>
-        <w:t>)</w:t>
+        <w:t>(АКТ (ф) СПбГУТ)</w:t>
       </w:r>
     </w:p>
     <w:p>
@@ -3233,15 +3192,7 @@
         <w:t>ПО</w:t>
       </w:r>
       <w:r>
-        <w:t xml:space="preserve">, которое позволяет систематизировать хранение, просмотр и редактирование записей пользователя с возможностью работы в </w:t>
-      </w:r>
-      <w:proofErr w:type="spellStart"/>
-      <w:r>
-        <w:t>оффлайн</w:t>
-      </w:r>
-      <w:proofErr w:type="spellEnd"/>
-      <w:r>
-        <w:t>-режиме и синхронизации записей между устройствами пользователя.</w:t>
+        <w:t>, которое позволяет систематизировать хранение, просмотр и редактирование записей пользователя с возможностью работы в оффлайн-режиме и синхронизации записей между устройствами пользователя.</w:t>
       </w:r>
     </w:p>
     <w:p>
@@ -4143,52 +4094,632 @@
         <w:t>#</w:t>
       </w:r>
       <w:r>
-        <w:t xml:space="preserve">, так как он отличается высокой безопасностью кода, поддерживает автоматическое управление памятью, а также является объектно-ориентированным языком. Разработка будет вестись с использованием </w:t>
+        <w:t xml:space="preserve">, так как он отличается высокой безопасностью кода, поддерживает автоматическое управление памятью, а также является объектно-ориентированным языком. Разработка будет вестись с использованием фреймворка </w:t>
+      </w:r>
+      <w:r>
+        <w:rPr>
+          <w:lang w:val="en-US"/>
+        </w:rPr>
+        <w:t>Avalonia</w:t>
+      </w:r>
+      <w:r>
+        <w:t>, так как она использует нативные технологии для отрисовки интерфейса, что обеспечивает высокую производительность</w:t>
+      </w:r>
+      <w:r>
+        <w:t xml:space="preserve"> </w:t>
+      </w:r>
+      <w:r>
+        <w:t xml:space="preserve">и кроссплатформенность </w:t>
+      </w:r>
+      <w:r>
+        <w:t>[2</w:t>
+      </w:r>
+      <w:r>
+        <w:t>]</w:t>
+      </w:r>
+      <w:r>
+        <w:t>.</w:t>
+      </w:r>
+    </w:p>
+    <w:p>
+      <w:pPr>
+        <w:pStyle w:val="a7"/>
+      </w:pPr>
+      <w:r>
+        <w:t>Для разработки оконного приложения и веб-</w:t>
+      </w:r>
+      <w:r>
+        <w:rPr>
+          <w:lang w:val="en-US"/>
+        </w:rPr>
+        <w:t>API</w:t>
+      </w:r>
+      <w:r>
+        <w:t xml:space="preserve"> выбрана среда разработки </w:t>
+      </w:r>
+      <w:r>
+        <w:rPr>
+          <w:lang w:val="en-US"/>
+        </w:rPr>
+        <w:t>Visual</w:t>
+      </w:r>
+      <w:r>
+        <w:t xml:space="preserve"> </w:t>
+      </w:r>
+      <w:r>
+        <w:rPr>
+          <w:lang w:val="en-US"/>
+        </w:rPr>
+        <w:t>Studio</w:t>
+      </w:r>
+      <w:r>
+        <w:t xml:space="preserve"> – мощный инструмент, включающий профессиональный отладчик и встроенные инструменты работы с данными, которые будут применяться при работе с </w:t>
+      </w:r>
+      <w:r>
+        <w:rPr>
+          <w:lang w:val="en-US"/>
+        </w:rPr>
+        <w:t>SQLite</w:t>
+      </w:r>
+      <w:r>
+        <w:t>.</w:t>
+      </w:r>
+      <w:r>
+        <w:t xml:space="preserve"> </w:t>
+      </w:r>
+    </w:p>
+    <w:p>
+      <w:pPr>
+        <w:pStyle w:val="a7"/>
+      </w:pPr>
+      <w:r>
+        <w:t xml:space="preserve">Для разработки мобильного приложения выбран язык программирования </w:t>
+      </w:r>
+      <w:r>
+        <w:rPr>
+          <w:lang w:val="en-US"/>
+        </w:rPr>
+        <w:t>Kotlin</w:t>
+      </w:r>
+      <w:r>
+        <w:t xml:space="preserve">, так как он признан основным инструментом для разработки приложений на </w:t>
+      </w:r>
+      <w:r>
+        <w:rPr>
+          <w:lang w:val="en-US"/>
+        </w:rPr>
+        <w:t>Android</w:t>
+      </w:r>
+      <w:r>
+        <w:t xml:space="preserve">, </w:t>
+      </w:r>
+      <w:r>
+        <w:t xml:space="preserve">и фреймворк </w:t>
+      </w:r>
+      <w:r>
+        <w:rPr>
+          <w:lang w:val="en-US"/>
+        </w:rPr>
+        <w:t>Jetpack</w:t>
+      </w:r>
+      <w:r>
+        <w:t xml:space="preserve"> </w:t>
+      </w:r>
+      <w:r>
+        <w:rPr>
+          <w:lang w:val="en-US"/>
+        </w:rPr>
+        <w:t>Compose</w:t>
+      </w:r>
+      <w:r>
+        <w:t xml:space="preserve">, являющийся удобным инструментом для построения современных </w:t>
+      </w:r>
+      <w:r>
+        <w:t>пользовательских интерфейсов</w:t>
+      </w:r>
+      <w:r>
+        <w:t xml:space="preserve"> в декларативном стиле</w:t>
+      </w:r>
+      <w:r>
+        <w:t>.</w:t>
+      </w:r>
+    </w:p>
+    <w:p>
+      <w:pPr>
+        <w:pStyle w:val="a7"/>
+      </w:pPr>
+      <w:r>
+        <w:t xml:space="preserve">Для разработки мобильного приложения выбрана среда разработки </w:t>
+      </w:r>
+      <w:r>
+        <w:rPr>
+          <w:lang w:val="en-US"/>
+        </w:rPr>
+        <w:t>Android</w:t>
+      </w:r>
+      <w:r>
+        <w:t xml:space="preserve"> </w:t>
+      </w:r>
+      <w:r>
+        <w:rPr>
+          <w:lang w:val="en-US"/>
+        </w:rPr>
+        <w:t>Studio</w:t>
+      </w:r>
+      <w:r>
+        <w:t xml:space="preserve">, которая является официальной средой разработки приложений на </w:t>
+      </w:r>
+      <w:r>
+        <w:rPr>
+          <w:lang w:val="en-US"/>
+        </w:rPr>
+        <w:t>Android</w:t>
+      </w:r>
+      <w:r>
+        <w:t xml:space="preserve">. </w:t>
+      </w:r>
+    </w:p>
+    <w:p>
+      <w:pPr>
+        <w:pStyle w:val="a7"/>
+      </w:pPr>
+      <w:r>
+        <w:t>К клиенту оконного приложения представлены следующие а</w:t>
+      </w:r>
+      <w:r>
+        <w:t>ппаратные</w:t>
+      </w:r>
+      <w:r>
+        <w:t xml:space="preserve"> и программные</w:t>
+      </w:r>
+      <w:r>
+        <w:t xml:space="preserve"> требования </w:t>
+      </w:r>
+      <w:r>
+        <w:t>для запуска</w:t>
+      </w:r>
+      <w:r>
+        <w:t xml:space="preserve"> разработанного </w:t>
+      </w:r>
+      <w:r>
+        <w:t>приложения</w:t>
+      </w:r>
+      <w:r>
+        <w:t>:</w:t>
+      </w:r>
+    </w:p>
+    <w:p>
+      <w:pPr>
+        <w:pStyle w:val="a1"/>
+      </w:pPr>
+      <w:r>
+        <w:t xml:space="preserve">процессор: </w:t>
+      </w:r>
+      <w:r>
+        <w:t>2</w:t>
+      </w:r>
+      <w:r>
+        <w:t>-ядерный с тактовой частотой от 1 ГГц;</w:t>
+      </w:r>
+    </w:p>
+    <w:p>
+      <w:pPr>
+        <w:pStyle w:val="a1"/>
+      </w:pPr>
+      <w:r>
+        <w:t>оперативная память: от 2 ГБ для 32-битных систем или от 4 ГБ для 64-битных систем;</w:t>
+      </w:r>
+    </w:p>
+    <w:p>
+      <w:pPr>
+        <w:pStyle w:val="a1"/>
+      </w:pPr>
+      <w:r>
+        <w:t>свободное пространство диска</w:t>
+      </w:r>
+      <w:r>
+        <w:t xml:space="preserve">: </w:t>
+      </w:r>
+      <w:r>
+        <w:t>5 ГБ</w:t>
+      </w:r>
+      <w:r>
+        <w:t>;</w:t>
+      </w:r>
+    </w:p>
+    <w:p>
+      <w:pPr>
+        <w:pStyle w:val="a1"/>
+      </w:pPr>
+      <w:r>
+        <w:t xml:space="preserve">видеокарта: встроенная графика </w:t>
+      </w:r>
+      <w:r>
+        <w:t xml:space="preserve">– </w:t>
+      </w:r>
+      <w:r>
+        <w:t>отдельная видеокарта не требуется</w:t>
+      </w:r>
+      <w:r>
+        <w:t>;</w:t>
+      </w:r>
+    </w:p>
+    <w:p>
+      <w:pPr>
+        <w:pStyle w:val="a1"/>
+      </w:pPr>
+      <w:r>
+        <w:t xml:space="preserve">операционная система: </w:t>
+      </w:r>
+      <w:r>
+        <w:t>Windows 11</w:t>
+      </w:r>
+      <w:r>
+        <w:t>,</w:t>
+      </w:r>
+      <w:r>
+        <w:t xml:space="preserve"> </w:t>
+      </w:r>
+      <w:r>
+        <w:rPr>
+          <w:lang w:val="en-US"/>
+        </w:rPr>
+        <w:t>macOS</w:t>
+      </w:r>
+      <w:r>
+        <w:t xml:space="preserve"> 14 </w:t>
+      </w:r>
+      <w:r>
+        <w:t xml:space="preserve">и </w:t>
+      </w:r>
+      <w:r>
+        <w:t xml:space="preserve">выше, </w:t>
+      </w:r>
+      <w:r>
+        <w:t>Linux;</w:t>
+      </w:r>
+    </w:p>
+    <w:p>
+      <w:pPr>
+        <w:pStyle w:val="a1"/>
+      </w:pPr>
+      <w:r>
+        <w:t>среда выполнения: .</w:t>
+      </w:r>
+      <w:r>
+        <w:rPr>
+          <w:lang w:val="en-US"/>
+        </w:rPr>
+        <w:t>NET 10.</w:t>
+      </w:r>
+      <w:r>
+        <w:t>0</w:t>
+      </w:r>
+      <w:r>
+        <w:rPr>
+          <w:lang w:val="en-US"/>
+        </w:rPr>
+        <w:t xml:space="preserve"> Runtime</w:t>
+      </w:r>
+      <w:r>
+        <w:rPr>
+          <w:lang w:val="en-US"/>
+        </w:rPr>
+        <w:t>;</w:t>
+      </w:r>
+    </w:p>
+    <w:p>
+      <w:pPr>
+        <w:pStyle w:val="a1"/>
+      </w:pPr>
+      <w:r>
+        <w:t xml:space="preserve">архитектура процессора: </w:t>
+      </w:r>
+      <w:r>
+        <w:t>x64 или ARM64</w:t>
+      </w:r>
+      <w:r>
+        <w:t xml:space="preserve"> (</w:t>
+      </w:r>
+      <w:r>
+        <w:t>Apple Silicon</w:t>
+      </w:r>
+      <w:r>
+        <w:t>).</w:t>
+      </w:r>
+    </w:p>
+    <w:p>
+      <w:pPr>
+        <w:pStyle w:val="a7"/>
+      </w:pPr>
+      <w:r>
+        <w:lastRenderedPageBreak/>
+        <w:t>К клиенту мобильного приложения представлены следующие аппаратные и программные требования</w:t>
+      </w:r>
+      <w:r>
+        <w:t xml:space="preserve"> для запуска разработанного приложения</w:t>
+      </w:r>
+      <w:r>
+        <w:t>:</w:t>
+      </w:r>
+    </w:p>
+    <w:p>
+      <w:pPr>
+        <w:pStyle w:val="a1"/>
+      </w:pPr>
+      <w:r>
+        <w:t>операционная система</w:t>
+      </w:r>
+      <w:r>
+        <w:t xml:space="preserve">: </w:t>
+      </w:r>
+      <w:r>
+        <w:rPr>
+          <w:lang w:val="en-US"/>
+        </w:rPr>
+        <w:t>Android</w:t>
+      </w:r>
+      <w:r>
+        <w:t xml:space="preserve"> </w:t>
+      </w:r>
+      <w:r>
+        <w:t>8</w:t>
+      </w:r>
+      <w:r>
+        <w:t>.0</w:t>
+      </w:r>
+      <w:r>
+        <w:t xml:space="preserve"> и выше</w:t>
+      </w:r>
+      <w:r>
+        <w:t>;</w:t>
+      </w:r>
+    </w:p>
+    <w:p>
+      <w:pPr>
+        <w:pStyle w:val="a1"/>
+      </w:pPr>
+      <w:r>
+        <w:t xml:space="preserve">архитектура процессора: </w:t>
+      </w:r>
+      <w:r>
+        <w:t xml:space="preserve">архитектура </w:t>
+      </w:r>
+      <w:r>
+        <w:rPr>
+          <w:lang w:val="en-US"/>
+        </w:rPr>
+        <w:t>ARM</w:t>
+      </w:r>
+      <w:r>
+        <w:t xml:space="preserve">, </w:t>
+      </w:r>
+      <w:r>
+        <w:t>64-битная;</w:t>
+      </w:r>
+    </w:p>
+    <w:p>
+      <w:pPr>
+        <w:pStyle w:val="a1"/>
+      </w:pPr>
+      <w:r>
+        <w:t>оперативная память: от 2 до 4 ГБ;</w:t>
+      </w:r>
+    </w:p>
+    <w:p>
+      <w:pPr>
+        <w:pStyle w:val="a1"/>
+      </w:pPr>
+      <w:r>
+        <w:t>свободное пространство диска: 5 ГБ</w:t>
+      </w:r>
+      <w:r>
+        <w:t>.</w:t>
+      </w:r>
+    </w:p>
+    <w:p>
+      <w:pPr>
+        <w:pStyle w:val="a7"/>
+      </w:pPr>
+      <w:r>
+        <w:t>Аппаратные и программные требования, представленные</w:t>
+      </w:r>
+      <w:r>
+        <w:t xml:space="preserve"> к серверу для корректной работы приложения</w:t>
+      </w:r>
+      <w:r>
+        <w:t>:</w:t>
+      </w:r>
+    </w:p>
+    <w:p>
+      <w:pPr>
+        <w:pStyle w:val="a1"/>
+      </w:pPr>
+      <w:r>
+        <w:t>п</w:t>
+      </w:r>
+      <w:r>
+        <w:t xml:space="preserve">роцессор: </w:t>
+      </w:r>
+      <w:r>
+        <w:t>64-</w:t>
+      </w:r>
+      <w:r>
+        <w:t>битный</w:t>
+      </w:r>
+      <w:r>
+        <w:t>,</w:t>
+      </w:r>
+      <w:r>
+        <w:t xml:space="preserve"> </w:t>
+      </w:r>
+      <w:r>
+        <w:t>2-</w:t>
+      </w:r>
+      <w:r>
+        <w:t>ядерный п</w:t>
+      </w:r>
+      <w:r>
+        <w:t>роцессор, с тактовой частой 2,5</w:t>
+      </w:r>
+      <w:r>
+        <w:rPr>
+          <w:lang w:val="en-US"/>
+        </w:rPr>
+        <w:t> </w:t>
+      </w:r>
+      <w:r>
+        <w:t>ГГЦ;</w:t>
+      </w:r>
+    </w:p>
+    <w:p>
+      <w:pPr>
+        <w:pStyle w:val="a1"/>
+      </w:pPr>
+      <w:r>
+        <w:t>о</w:t>
+      </w:r>
+      <w:r>
+        <w:t>перативная память</w:t>
+      </w:r>
+      <w:r>
+        <w:t xml:space="preserve">: </w:t>
+      </w:r>
+      <w:r>
+        <w:t>4</w:t>
+      </w:r>
+      <w:r>
+        <w:t xml:space="preserve"> ГБ</w:t>
+      </w:r>
+      <w:r>
+        <w:t xml:space="preserve"> для работы серверных служб</w:t>
+      </w:r>
+      <w:r>
+        <w:t>;</w:t>
+      </w:r>
+    </w:p>
+    <w:p>
+      <w:pPr>
+        <w:pStyle w:val="a1"/>
+      </w:pPr>
+      <w:r>
+        <w:t>хранилище: 25 ГБ для всего устанавливаемого ПО и хранения данных</w:t>
+      </w:r>
+      <w:r>
+        <w:t>;</w:t>
+      </w:r>
+    </w:p>
+    <w:p>
+      <w:pPr>
+        <w:pStyle w:val="a1"/>
+      </w:pPr>
+      <w:r>
+        <w:t>сеть: скорость соединения минимум 100 Мбит/с.</w:t>
+      </w:r>
+    </w:p>
+    <w:p>
+      <w:pPr>
+        <w:pStyle w:val="a1"/>
+      </w:pPr>
+      <w:r>
+        <w:t>операционная система</w:t>
+      </w:r>
+      <w:r>
+        <w:t xml:space="preserve">: </w:t>
+      </w:r>
+      <w:r>
+        <w:t>Ubuntu</w:t>
+      </w:r>
+      <w:r>
+        <w:t xml:space="preserve"> </w:t>
+      </w:r>
+      <w:r>
+        <w:t>Server</w:t>
+      </w:r>
+      <w:r>
+        <w:t xml:space="preserve"> 24.04 </w:t>
+      </w:r>
+      <w:r>
+        <w:t>LTS</w:t>
+      </w:r>
+      <w:r>
+        <w:t>;</w:t>
+      </w:r>
+    </w:p>
+    <w:p>
+      <w:pPr>
+        <w:pStyle w:val="a1"/>
+      </w:pPr>
+      <w:r>
+        <w:t xml:space="preserve">установленный сервер БД </w:t>
+      </w:r>
+      <w:r>
+        <w:rPr>
+          <w:lang w:val="en-US"/>
+        </w:rPr>
+        <w:t>MySQL</w:t>
+      </w:r>
+      <w:r>
+        <w:t xml:space="preserve"> </w:t>
+      </w:r>
+      <w:r>
+        <w:rPr>
+          <w:lang w:val="en-US"/>
+        </w:rPr>
+        <w:t>Server</w:t>
+      </w:r>
+      <w:r>
+        <w:t xml:space="preserve"> 8.0</w:t>
+      </w:r>
+      <w:r>
+        <w:t>;</w:t>
+      </w:r>
+    </w:p>
+    <w:p>
+      <w:pPr>
+        <w:pStyle w:val="a1"/>
+        <w:tabs>
+          <w:tab w:val="clear" w:pos="992"/>
+          <w:tab w:val="num" w:pos="993"/>
+        </w:tabs>
+      </w:pPr>
+      <w:r>
+        <w:t xml:space="preserve">установленная среда </w:t>
+      </w:r>
+      <w:r>
+        <w:t>выполнения .NET</w:t>
+      </w:r>
+      <w:r>
+        <w:t xml:space="preserve"> 10.0</w:t>
+      </w:r>
+      <w:r>
+        <w:t xml:space="preserve"> </w:t>
       </w:r>
       <w:proofErr w:type="spellStart"/>
       <w:r>
-        <w:t>фреймворка</w:t>
+        <w:t>Runtime</w:t>
       </w:r>
       <w:proofErr w:type="spellEnd"/>
       <w:r>
-        <w:t xml:space="preserve"> </w:t>
+        <w:t>;</w:t>
+      </w:r>
+    </w:p>
+    <w:p>
+      <w:pPr>
+        <w:pStyle w:val="a1"/>
+        <w:tabs>
+          <w:tab w:val="clear" w:pos="992"/>
+          <w:tab w:val="num" w:pos="993"/>
+        </w:tabs>
+      </w:pPr>
+      <w:r>
+        <w:t xml:space="preserve">установленный веб-сервер </w:t>
       </w:r>
       <w:r>
         <w:rPr>
           <w:lang w:val="en-US"/>
         </w:rPr>
-        <w:t>Avalonia</w:t>
-      </w:r>
-      <w:r>
-        <w:t xml:space="preserve">, так как она использует </w:t>
-      </w:r>
-      <w:proofErr w:type="spellStart"/>
-      <w:r>
-        <w:t>нативные</w:t>
-      </w:r>
-      <w:proofErr w:type="spellEnd"/>
-      <w:r>
-        <w:t xml:space="preserve"> технологии для </w:t>
-      </w:r>
-      <w:proofErr w:type="spellStart"/>
-      <w:r>
-        <w:t>отрисовки</w:t>
-      </w:r>
-      <w:proofErr w:type="spellEnd"/>
-      <w:r>
-        <w:t xml:space="preserve"> интерфейса, что обеспечивает высокую производительность</w:t>
-      </w:r>
-      <w:r>
-        <w:t xml:space="preserve"> </w:t>
-      </w:r>
-      <w:r>
-        <w:t xml:space="preserve">и кроссплатформенность </w:t>
-      </w:r>
-      <w:r>
-        <w:t>[2</w:t>
-      </w:r>
-      <w:r>
-        <w:t>]</w:t>
+        <w:t>Nginx</w:t>
       </w:r>
       <w:r>
         <w:t>.</w:t>
@@ -4196,554 +4727,63 @@
     </w:p>
     <w:p>
       <w:pPr>
-        <w:pStyle w:val="a7"/>
-      </w:pPr>
-      <w:r>
-        <w:t>Для разработки оконного приложения и веб-</w:t>
-      </w:r>
-      <w:r>
-        <w:rPr>
-          <w:lang w:val="en-US"/>
-        </w:rPr>
-        <w:t>API</w:t>
-      </w:r>
-      <w:r>
-        <w:t xml:space="preserve"> выбрана среда разработки </w:t>
-      </w:r>
-      <w:r>
-        <w:rPr>
-          <w:lang w:val="en-US"/>
-        </w:rPr>
-        <w:t>Visual</w:t>
-      </w:r>
-      <w:r>
-        <w:t xml:space="preserve"> </w:t>
-      </w:r>
-      <w:r>
-        <w:rPr>
-          <w:lang w:val="en-US"/>
-        </w:rPr>
-        <w:t>Studio</w:t>
-      </w:r>
-      <w:r>
-        <w:t xml:space="preserve"> – мощный инструмент, включающий профессиональный отладчик и встроенные инструменты работы с данными, которые будут применяться при работе с </w:t>
-      </w:r>
-      <w:r>
-        <w:rPr>
-          <w:lang w:val="en-US"/>
-        </w:rPr>
-        <w:t>SQLite</w:t>
-      </w:r>
-      <w:r>
-        <w:t>.</w:t>
-      </w:r>
-      <w:r>
-        <w:t xml:space="preserve"> </w:t>
-      </w:r>
-    </w:p>
-    <w:p>
-      <w:pPr>
-        <w:pStyle w:val="a7"/>
-      </w:pPr>
-      <w:r>
-        <w:t xml:space="preserve">Для разработки мобильного приложения выбран язык программирования </w:t>
-      </w:r>
-      <w:proofErr w:type="spellStart"/>
-      <w:r>
-        <w:rPr>
-          <w:lang w:val="en-US"/>
-        </w:rPr>
-        <w:t>Kotlin</w:t>
-      </w:r>
-      <w:proofErr w:type="spellEnd"/>
-      <w:r>
-        <w:t xml:space="preserve">, так как он признан основным инструментом для разработки приложений на </w:t>
-      </w:r>
-      <w:r>
-        <w:rPr>
-          <w:lang w:val="en-US"/>
-        </w:rPr>
-        <w:t>Android</w:t>
-      </w:r>
-      <w:r>
-        <w:t xml:space="preserve">, </w:t>
-      </w:r>
-      <w:r>
-        <w:t xml:space="preserve">и фреймворк </w:t>
-      </w:r>
-      <w:r>
-        <w:rPr>
-          <w:lang w:val="en-US"/>
-        </w:rPr>
-        <w:t>Jetpack</w:t>
-      </w:r>
-      <w:r>
-        <w:t xml:space="preserve"> </w:t>
-      </w:r>
-      <w:r>
-        <w:rPr>
-          <w:lang w:val="en-US"/>
-        </w:rPr>
-        <w:t>Compose</w:t>
-      </w:r>
-      <w:r>
-        <w:t xml:space="preserve">, являющийся удобным инструментом для построения современных </w:t>
-      </w:r>
-      <w:r>
-        <w:t>пользовательских интерфейсов</w:t>
-      </w:r>
-      <w:r>
-        <w:t xml:space="preserve"> в декларативном стиле</w:t>
-      </w:r>
-      <w:r>
-        <w:t>.</w:t>
-      </w:r>
-    </w:p>
-    <w:p>
-      <w:pPr>
-        <w:pStyle w:val="a7"/>
-      </w:pPr>
-      <w:r>
-        <w:t xml:space="preserve">Для разработки мобильного приложения выбрана среда разработки </w:t>
-      </w:r>
-      <w:r>
-        <w:rPr>
-          <w:lang w:val="en-US"/>
-        </w:rPr>
-        <w:t>Android</w:t>
-      </w:r>
-      <w:r>
-        <w:t xml:space="preserve"> </w:t>
-      </w:r>
-      <w:r>
-        <w:rPr>
-          <w:lang w:val="en-US"/>
-        </w:rPr>
-        <w:t>Studio</w:t>
-      </w:r>
-      <w:r>
-        <w:t xml:space="preserve">, которая является официальной средой разработки приложений на </w:t>
-      </w:r>
-      <w:r>
-        <w:rPr>
-          <w:lang w:val="en-US"/>
-        </w:rPr>
-        <w:t>Android</w:t>
-      </w:r>
-      <w:r>
-        <w:t xml:space="preserve">. </w:t>
-      </w:r>
-    </w:p>
-    <w:p>
-      <w:pPr>
-        <w:pStyle w:val="a7"/>
-      </w:pPr>
-      <w:r>
-        <w:t>К клиенту оконного приложения представлены следующие а</w:t>
-      </w:r>
-      <w:r>
-        <w:t>ппаратные</w:t>
-      </w:r>
-      <w:r>
-        <w:t xml:space="preserve"> и программные</w:t>
-      </w:r>
-      <w:r>
-        <w:t xml:space="preserve"> требования </w:t>
-      </w:r>
-      <w:r>
-        <w:t>для запуска</w:t>
-      </w:r>
-      <w:r>
-        <w:t xml:space="preserve"> разработанного </w:t>
-      </w:r>
-      <w:r>
-        <w:t>приложения</w:t>
-      </w:r>
-      <w:r>
-        <w:t>:</w:t>
-      </w:r>
-    </w:p>
-    <w:p>
-      <w:pPr>
-        <w:pStyle w:val="a1"/>
-      </w:pPr>
-      <w:r>
-        <w:t xml:space="preserve">операционная система: </w:t>
-      </w:r>
-      <w:proofErr w:type="spellStart"/>
-      <w:r>
-        <w:rPr>
-          <w:highlight w:val="yellow"/>
-        </w:rPr>
-        <w:t>Windows</w:t>
-      </w:r>
-      <w:proofErr w:type="spellEnd"/>
-      <w:r>
-        <w:rPr>
-          <w:highlight w:val="yellow"/>
-        </w:rPr>
-        <w:t xml:space="preserve"> 10 и выше;</w:t>
-      </w:r>
-    </w:p>
-    <w:p>
-      <w:pPr>
-        <w:pStyle w:val="a1"/>
-      </w:pPr>
-      <w:r>
-        <w:t>процессор: 2-ядерный с тактовой частотой от 1 ГГц;</w:t>
-      </w:r>
-    </w:p>
-    <w:p>
-      <w:pPr>
-        <w:pStyle w:val="a1"/>
-      </w:pPr>
-      <w:r>
-        <w:t>оперативная память: от 2 ГБ для 32-битных систем или от 4 ГБ для 64-битных систем;</w:t>
-      </w:r>
-    </w:p>
-    <w:p>
-      <w:pPr>
-        <w:pStyle w:val="a1"/>
-      </w:pPr>
-      <w:r>
-        <w:t>свободное пространство диска</w:t>
-      </w:r>
-      <w:r>
-        <w:t xml:space="preserve">: </w:t>
-      </w:r>
-      <w:r>
-        <w:t>5 ГБ</w:t>
-      </w:r>
-      <w:r>
-        <w:t>;</w:t>
-      </w:r>
-      <w:bookmarkStart w:id="6" w:name="_GoBack"/>
-      <w:bookmarkEnd w:id="6"/>
-    </w:p>
-    <w:p>
-      <w:pPr>
-        <w:pStyle w:val="a1"/>
-      </w:pPr>
-      <w:r>
-        <w:t xml:space="preserve">видеокарта: встроенная графика </w:t>
-      </w:r>
-      <w:r>
-        <w:t xml:space="preserve">– </w:t>
-      </w:r>
-      <w:r>
-        <w:t>отдельная видеокарта не требуется</w:t>
-      </w:r>
-      <w:r>
-        <w:t>.</w:t>
-      </w:r>
-    </w:p>
-    <w:p>
-      <w:pPr>
-        <w:pStyle w:val="a7"/>
-      </w:pPr>
-      <w:r>
-        <w:t>К клиенту мобильного приложения представлены следующие аппаратные и программные требования</w:t>
-      </w:r>
-      <w:r>
-        <w:t xml:space="preserve"> для запуска разработанного приложения</w:t>
-      </w:r>
-      <w:r>
-        <w:t>:</w:t>
-      </w:r>
-    </w:p>
-    <w:p>
-      <w:pPr>
-        <w:pStyle w:val="a1"/>
-      </w:pPr>
-      <w:r>
-        <w:lastRenderedPageBreak/>
-        <w:t xml:space="preserve">операционная система: </w:t>
-      </w:r>
-      <w:r>
-        <w:rPr>
-          <w:highlight w:val="yellow"/>
-          <w:lang w:val="en-US"/>
-        </w:rPr>
-        <w:t>Android</w:t>
-      </w:r>
-      <w:r>
-        <w:rPr>
-          <w:highlight w:val="yellow"/>
-        </w:rPr>
-        <w:t xml:space="preserve"> 11 и выше</w:t>
-      </w:r>
-      <w:r>
-        <w:rPr>
-          <w:highlight w:val="yellow"/>
-        </w:rPr>
-        <w:t>;</w:t>
-      </w:r>
-    </w:p>
-    <w:p>
-      <w:pPr>
-        <w:pStyle w:val="a1"/>
-      </w:pPr>
-      <w:r>
-        <w:t xml:space="preserve">архитектура процессора: </w:t>
-      </w:r>
-      <w:r>
-        <w:t xml:space="preserve">архитектура </w:t>
-      </w:r>
-      <w:r>
-        <w:rPr>
-          <w:lang w:val="en-US"/>
-        </w:rPr>
-        <w:t>ARM</w:t>
-      </w:r>
-      <w:r>
-        <w:t xml:space="preserve">, </w:t>
-      </w:r>
-      <w:r>
-        <w:t>64-битная;</w:t>
-      </w:r>
-    </w:p>
-    <w:p>
-      <w:pPr>
-        <w:pStyle w:val="a1"/>
-      </w:pPr>
-      <w:r>
-        <w:t>оперативная память: от 2 до 4 ГБ;</w:t>
-      </w:r>
-    </w:p>
-    <w:p>
-      <w:pPr>
-        <w:pStyle w:val="a1"/>
-      </w:pPr>
-      <w:r>
-        <w:t>свободное пространство диска: 5 ГБ;</w:t>
-      </w:r>
-    </w:p>
-    <w:p>
-      <w:pPr>
-        <w:pStyle w:val="a7"/>
-      </w:pPr>
-      <w:r>
-        <w:t>Аппаратные и программные требования, представленные</w:t>
-      </w:r>
-      <w:r>
-        <w:t xml:space="preserve"> к серверу для корректной работы приложения</w:t>
-      </w:r>
-      <w:r>
-        <w:t>:</w:t>
-      </w:r>
-    </w:p>
-    <w:p>
-      <w:pPr>
-        <w:pStyle w:val="a1"/>
-      </w:pPr>
-      <w:r>
-        <w:t>о</w:t>
-      </w:r>
-      <w:r>
-        <w:t>перационная система</w:t>
-      </w:r>
-      <w:r>
-        <w:t xml:space="preserve">: </w:t>
-      </w:r>
-      <w:proofErr w:type="spellStart"/>
-      <w:r>
-        <w:t>Ubuntu</w:t>
-      </w:r>
-      <w:proofErr w:type="spellEnd"/>
-      <w:r>
-        <w:t xml:space="preserve"> </w:t>
-      </w:r>
-      <w:proofErr w:type="spellStart"/>
-      <w:r>
-        <w:t>Server</w:t>
-      </w:r>
-      <w:proofErr w:type="spellEnd"/>
-      <w:r>
-        <w:t xml:space="preserve"> 24.04 </w:t>
-      </w:r>
-      <w:r>
-        <w:t>LTS</w:t>
-      </w:r>
-      <w:r>
-        <w:t>;</w:t>
-      </w:r>
-    </w:p>
-    <w:p>
-      <w:pPr>
-        <w:pStyle w:val="a1"/>
-      </w:pPr>
-      <w:r>
-        <w:t xml:space="preserve">установленный </w:t>
-      </w:r>
-      <w:r>
-        <w:t xml:space="preserve">сервер БД </w:t>
-      </w:r>
-      <w:r>
-        <w:rPr>
-          <w:lang w:val="en-US"/>
-        </w:rPr>
-        <w:t>MySQL</w:t>
-      </w:r>
-      <w:r>
-        <w:t xml:space="preserve"> </w:t>
-      </w:r>
-      <w:r>
-        <w:rPr>
-          <w:lang w:val="en-US"/>
-        </w:rPr>
-        <w:t>Server</w:t>
-      </w:r>
-      <w:r>
-        <w:t xml:space="preserve"> 8.0</w:t>
-      </w:r>
-      <w:r>
-        <w:t>;</w:t>
-      </w:r>
-    </w:p>
-    <w:p>
-      <w:pPr>
-        <w:pStyle w:val="a1"/>
-      </w:pPr>
-      <w:r>
-        <w:t xml:space="preserve">установленная среда выполнения </w:t>
-      </w:r>
-      <w:r>
-        <w:rPr>
-          <w:highlight w:val="yellow"/>
-        </w:rPr>
-        <w:t>.</w:t>
-      </w:r>
-      <w:r>
-        <w:rPr>
-          <w:highlight w:val="yellow"/>
-          <w:lang w:val="en-US"/>
-        </w:rPr>
-        <w:t>NET</w:t>
-      </w:r>
-      <w:r>
-        <w:rPr>
-          <w:highlight w:val="yellow"/>
-        </w:rPr>
-        <w:t xml:space="preserve"> </w:t>
-      </w:r>
-      <w:r>
-        <w:rPr>
-          <w:highlight w:val="yellow"/>
-          <w:lang w:val="en-US"/>
-        </w:rPr>
-        <w:t>Runtime</w:t>
-      </w:r>
-      <w:r>
-        <w:rPr>
-          <w:highlight w:val="yellow"/>
-        </w:rPr>
-        <w:t>;</w:t>
-      </w:r>
-    </w:p>
-    <w:p>
-      <w:pPr>
-        <w:pStyle w:val="a1"/>
-      </w:pPr>
-      <w:r>
-        <w:t>п</w:t>
-      </w:r>
-      <w:r>
-        <w:t xml:space="preserve">роцессор: </w:t>
-      </w:r>
-      <w:r>
-        <w:t>64-</w:t>
-      </w:r>
-      <w:r>
-        <w:t>битный</w:t>
-      </w:r>
-      <w:r>
-        <w:t>,</w:t>
-      </w:r>
-      <w:r>
-        <w:t xml:space="preserve"> </w:t>
-      </w:r>
-      <w:r>
-        <w:t>2-</w:t>
-      </w:r>
-      <w:r>
-        <w:t>ядерный п</w:t>
-      </w:r>
-      <w:r>
-        <w:t>роцессор, с тактовой частой 2,5</w:t>
-      </w:r>
-      <w:r>
-        <w:rPr>
-          <w:lang w:val="en-US"/>
-        </w:rPr>
-        <w:t> </w:t>
-      </w:r>
-      <w:r>
-        <w:t>ГГЦ;</w:t>
-      </w:r>
-    </w:p>
-    <w:p>
-      <w:pPr>
-        <w:pStyle w:val="a1"/>
-      </w:pPr>
-      <w:r>
-        <w:t>о</w:t>
-      </w:r>
-      <w:r>
-        <w:t>перативная память</w:t>
-      </w:r>
-      <w:r>
-        <w:t xml:space="preserve">: </w:t>
-      </w:r>
-      <w:r>
-        <w:t>4</w:t>
-      </w:r>
-      <w:r>
-        <w:t xml:space="preserve"> ГБ</w:t>
-      </w:r>
-      <w:r>
-        <w:t xml:space="preserve"> для работы серверных служб</w:t>
-      </w:r>
-      <w:r>
-        <w:t>;</w:t>
-      </w:r>
-    </w:p>
-    <w:p>
-      <w:pPr>
-        <w:pStyle w:val="a1"/>
-      </w:pPr>
-      <w:r>
-        <w:t>хранилище: 25 ГБ для всего устанавливаемого ПО и хранения данных</w:t>
-      </w:r>
-      <w:r>
-        <w:t>.</w:t>
-      </w:r>
-    </w:p>
-    <w:p>
-      <w:pPr>
         <w:pStyle w:val="1"/>
       </w:pPr>
-      <w:bookmarkStart w:id="7" w:name="_Toc243597596"/>
+      <w:bookmarkStart w:id="6" w:name="_Toc243597596"/>
       <w:r>
         <w:lastRenderedPageBreak/>
         <w:t>Проектирование программного обеспечения</w:t>
       </w:r>
+      <w:bookmarkEnd w:id="6"/>
+    </w:p>
+    <w:p>
+      <w:pPr>
+        <w:pStyle w:val="2"/>
+      </w:pPr>
+      <w:bookmarkStart w:id="7" w:name="_Toc243597597"/>
+      <w:r>
+        <w:t xml:space="preserve">Проектирование </w:t>
+      </w:r>
+      <w:r>
+        <w:t>интерфейса</w:t>
+      </w:r>
+      <w:r>
+        <w:t xml:space="preserve"> пользователя</w:t>
+      </w:r>
       <w:bookmarkEnd w:id="7"/>
     </w:p>
     <w:p>
       <w:pPr>
+        <w:pStyle w:val="a7"/>
+      </w:pPr>
+    </w:p>
+    <w:p>
+      <w:pPr>
         <w:pStyle w:val="2"/>
       </w:pPr>
-      <w:bookmarkStart w:id="8" w:name="_Toc243597597"/>
+      <w:bookmarkStart w:id="8" w:name="_Toc243597598"/>
+      <w:r>
+        <w:t>Разработка архитектуры программного обеспечения</w:t>
+      </w:r>
+      <w:bookmarkEnd w:id="8"/>
+    </w:p>
+    <w:p>
+      <w:pPr>
+        <w:pStyle w:val="a7"/>
+      </w:pPr>
+    </w:p>
+    <w:p>
+      <w:pPr>
+        <w:pStyle w:val="2"/>
+      </w:pPr>
+      <w:bookmarkStart w:id="9" w:name="_Toc243597599"/>
       <w:r>
         <w:t xml:space="preserve">Проектирование </w:t>
       </w:r>
       <w:r>
-        <w:t>интерфейса</w:t>
-      </w:r>
-      <w:r>
-        <w:t xml:space="preserve"> пользователя</w:t>
-      </w:r>
-      <w:bookmarkEnd w:id="8"/>
+        <w:t>базы данных</w:t>
+      </w:r>
+      <w:bookmarkEnd w:id="9"/>
     </w:p>
     <w:p>
       <w:pPr>
@@ -4752,61 +4792,43 @@
     </w:p>
     <w:p>
       <w:pPr>
-        <w:pStyle w:val="2"/>
-      </w:pPr>
-      <w:bookmarkStart w:id="9" w:name="_Toc243597598"/>
-      <w:r>
-        <w:t>Разработка архитектуры программного обеспечения</w:t>
-      </w:r>
-      <w:bookmarkEnd w:id="9"/>
-    </w:p>
-    <w:p>
-      <w:pPr>
-        <w:pStyle w:val="a7"/>
-      </w:pPr>
-    </w:p>
-    <w:p>
-      <w:pPr>
-        <w:pStyle w:val="2"/>
-      </w:pPr>
-      <w:bookmarkStart w:id="10" w:name="_Toc243597599"/>
-      <w:r>
-        <w:t xml:space="preserve">Проектирование </w:t>
-      </w:r>
-      <w:r>
-        <w:t>базы данных</w:t>
-      </w:r>
-      <w:bookmarkEnd w:id="10"/>
-    </w:p>
-    <w:p>
-      <w:pPr>
-        <w:pStyle w:val="a7"/>
-      </w:pPr>
-    </w:p>
-    <w:p>
-      <w:pPr>
         <w:pStyle w:val="1"/>
       </w:pPr>
-      <w:bookmarkStart w:id="11" w:name="_Toc243597600"/>
+      <w:bookmarkStart w:id="10" w:name="_Toc243597600"/>
       <w:r>
         <w:lastRenderedPageBreak/>
         <w:t>Разработка модулей программного обеспечения</w:t>
       </w:r>
+      <w:bookmarkEnd w:id="10"/>
+    </w:p>
+    <w:p>
+      <w:pPr>
+        <w:pStyle w:val="2"/>
+      </w:pPr>
+      <w:bookmarkStart w:id="11" w:name="_Toc243597601"/>
+      <w:r>
+        <w:t xml:space="preserve">Разработка </w:t>
+      </w:r>
+      <w:r>
+        <w:t xml:space="preserve">программных </w:t>
+      </w:r>
+      <w:r>
+        <w:t>модулей</w:t>
+      </w:r>
       <w:bookmarkEnd w:id="11"/>
     </w:p>
     <w:p>
       <w:pPr>
+        <w:pStyle w:val="a7"/>
+      </w:pPr>
+    </w:p>
+    <w:p>
+      <w:pPr>
         <w:pStyle w:val="2"/>
       </w:pPr>
-      <w:bookmarkStart w:id="12" w:name="_Toc243597601"/>
-      <w:r>
-        <w:t xml:space="preserve">Разработка </w:t>
-      </w:r>
-      <w:r>
-        <w:t xml:space="preserve">программных </w:t>
-      </w:r>
-      <w:r>
-        <w:t>модулей</w:t>
+      <w:bookmarkStart w:id="12" w:name="_Toc243597602"/>
+      <w:r>
+        <w:t>Реализация интерфейса пользователя</w:t>
       </w:r>
       <w:bookmarkEnd w:id="12"/>
     </w:p>
@@ -4819,9 +4841,9 @@
       <w:pPr>
         <w:pStyle w:val="2"/>
       </w:pPr>
-      <w:bookmarkStart w:id="13" w:name="_Toc243597602"/>
-      <w:r>
-        <w:t>Реализация интерфейса пользователя</w:t>
+      <w:bookmarkStart w:id="13" w:name="_Toc243597603"/>
+      <w:r>
+        <w:t>Разграничение прав доступа пользователей</w:t>
       </w:r>
       <w:bookmarkEnd w:id="13"/>
     </w:p>
@@ -4834,9 +4856,9 @@
       <w:pPr>
         <w:pStyle w:val="2"/>
       </w:pPr>
-      <w:bookmarkStart w:id="14" w:name="_Toc243597603"/>
-      <w:r>
-        <w:t>Разграничение прав доступа пользователей</w:t>
+      <w:bookmarkStart w:id="14" w:name="_Toc243597604"/>
+      <w:r>
+        <w:t>Экспорт и импорт данных</w:t>
       </w:r>
       <w:bookmarkEnd w:id="14"/>
     </w:p>
@@ -4847,37 +4869,37 @@
     </w:p>
     <w:p>
       <w:pPr>
-        <w:pStyle w:val="2"/>
-      </w:pPr>
-      <w:bookmarkStart w:id="15" w:name="_Toc243597604"/>
-      <w:r>
-        <w:t>Экспорт и импорт данных</w:t>
-      </w:r>
-      <w:bookmarkEnd w:id="15"/>
-    </w:p>
-    <w:p>
-      <w:pPr>
-        <w:pStyle w:val="a7"/>
-      </w:pPr>
-    </w:p>
-    <w:p>
-      <w:pPr>
         <w:pStyle w:val="1"/>
       </w:pPr>
-      <w:bookmarkStart w:id="16" w:name="_Toc243597605"/>
+      <w:bookmarkStart w:id="15" w:name="_Toc243597605"/>
       <w:r>
         <w:lastRenderedPageBreak/>
         <w:t>Тестирование и отладка программного обеспечения</w:t>
       </w:r>
+      <w:bookmarkEnd w:id="15"/>
+    </w:p>
+    <w:p>
+      <w:pPr>
+        <w:pStyle w:val="2"/>
+      </w:pPr>
+      <w:bookmarkStart w:id="16" w:name="_Toc243597606"/>
+      <w:r>
+        <w:t>Структурное тестирование</w:t>
+      </w:r>
       <w:bookmarkEnd w:id="16"/>
     </w:p>
     <w:p>
       <w:pPr>
+        <w:pStyle w:val="a7"/>
+      </w:pPr>
+    </w:p>
+    <w:p>
+      <w:pPr>
         <w:pStyle w:val="2"/>
       </w:pPr>
-      <w:bookmarkStart w:id="17" w:name="_Toc243597606"/>
-      <w:r>
-        <w:t>Структурное тестирование</w:t>
+      <w:bookmarkStart w:id="17" w:name="_Toc243597607"/>
+      <w:r>
+        <w:t>Функциональное тестирование</w:t>
       </w:r>
       <w:bookmarkEnd w:id="17"/>
     </w:p>
@@ -4888,40 +4910,40 @@
     </w:p>
     <w:p>
       <w:pPr>
-        <w:pStyle w:val="2"/>
-      </w:pPr>
-      <w:bookmarkStart w:id="18" w:name="_Toc243597607"/>
-      <w:r>
-        <w:t>Функциональное тестирование</w:t>
-      </w:r>
-      <w:bookmarkEnd w:id="18"/>
-    </w:p>
-    <w:p>
-      <w:pPr>
-        <w:pStyle w:val="a7"/>
-      </w:pPr>
-    </w:p>
-    <w:p>
-      <w:pPr>
         <w:pStyle w:val="1"/>
       </w:pPr>
-      <w:bookmarkStart w:id="19" w:name="_Toc243597608"/>
+      <w:bookmarkStart w:id="18" w:name="_Toc243597608"/>
       <w:r>
         <w:lastRenderedPageBreak/>
         <w:t>Инструкция по эксплуатации программного обеспечения</w:t>
       </w:r>
+      <w:bookmarkEnd w:id="18"/>
+    </w:p>
+    <w:p>
+      <w:pPr>
+        <w:pStyle w:val="2"/>
+      </w:pPr>
+      <w:bookmarkStart w:id="19" w:name="_Toc243597609"/>
+      <w:r>
+        <w:t xml:space="preserve">Установка </w:t>
+      </w:r>
+      <w:r>
+        <w:t>программного обеспечения</w:t>
+      </w:r>
       <w:bookmarkEnd w:id="19"/>
     </w:p>
     <w:p>
       <w:pPr>
+        <w:pStyle w:val="a7"/>
+      </w:pPr>
+    </w:p>
+    <w:p>
+      <w:pPr>
         <w:pStyle w:val="2"/>
       </w:pPr>
-      <w:bookmarkStart w:id="20" w:name="_Toc243597609"/>
-      <w:r>
-        <w:t xml:space="preserve">Установка </w:t>
-      </w:r>
-      <w:r>
-        <w:t>программного обеспечения</w:t>
+      <w:bookmarkStart w:id="20" w:name="_Toc243597610"/>
+      <w:r>
+        <w:t>Инструкция по работе</w:t>
       </w:r>
       <w:bookmarkEnd w:id="20"/>
     </w:p>
@@ -4932,29 +4954,14 @@
     </w:p>
     <w:p>
       <w:pPr>
-        <w:pStyle w:val="2"/>
-      </w:pPr>
-      <w:bookmarkStart w:id="21" w:name="_Toc243597610"/>
-      <w:r>
-        <w:t>Инструкция по работе</w:t>
-      </w:r>
-      <w:bookmarkEnd w:id="21"/>
-    </w:p>
-    <w:p>
-      <w:pPr>
-        <w:pStyle w:val="a7"/>
-      </w:pPr>
-    </w:p>
-    <w:p>
-      <w:pPr>
         <w:pStyle w:val="a6"/>
       </w:pPr>
-      <w:bookmarkStart w:id="22" w:name="_Toc243597611"/>
+      <w:bookmarkStart w:id="21" w:name="_Toc243597611"/>
       <w:r>
         <w:lastRenderedPageBreak/>
         <w:t>Заключение</w:t>
       </w:r>
-      <w:bookmarkEnd w:id="22"/>
+      <w:bookmarkEnd w:id="21"/>
     </w:p>
     <w:p>
       <w:pPr>
@@ -4988,15 +4995,7 @@
         <w:t xml:space="preserve">позволяющего </w:t>
       </w:r>
       <w:r>
-        <w:t xml:space="preserve">систематизировать хранение, просмотр и редактирование записей пользователя с возможностью работы в </w:t>
-      </w:r>
-      <w:proofErr w:type="spellStart"/>
-      <w:r>
-        <w:t>оффлайн</w:t>
-      </w:r>
-      <w:proofErr w:type="spellEnd"/>
-      <w:r>
-        <w:t>-режиме и синхронизации записей между устройствами пользователя.</w:t>
+        <w:t>систематизировать хранение, просмотр и редактирование записей пользователя с возможностью работы в оффлайн-режиме и синхронизации записей между устройствами пользователя.</w:t>
       </w:r>
     </w:p>
     <w:p>
@@ -5329,12 +5328,12 @@
       <w:pPr>
         <w:pStyle w:val="a6"/>
       </w:pPr>
-      <w:bookmarkStart w:id="23" w:name="_Toc243597612"/>
+      <w:bookmarkStart w:id="22" w:name="_Toc243597612"/>
       <w:r>
         <w:lastRenderedPageBreak/>
         <w:t>Список использованных источников</w:t>
       </w:r>
-      <w:bookmarkEnd w:id="23"/>
+      <w:bookmarkEnd w:id="22"/>
     </w:p>
     <w:p>
       <w:pPr>
@@ -5349,34 +5348,66 @@
       </w:r>
       <w:proofErr w:type="spellEnd"/>
       <w:r>
-        <w:t xml:space="preserve"> А. </w:t>
+        <w:t xml:space="preserve"> А. MySQL. Практические рецепты: Пер. с англ. / А. </w:t>
       </w:r>
       <w:proofErr w:type="spellStart"/>
       <w:r>
-        <w:t>MySQL</w:t>
+        <w:t>Аспин</w:t>
       </w:r>
       <w:proofErr w:type="spellEnd"/>
       <w:r>
-        <w:t xml:space="preserve">. Практические рецепты: Пер. с англ. / А. </w:t>
+        <w:t xml:space="preserve"> – Санкт-Петербург : БХВ-Петербург, 2024. – 592 с. – URL: https://ibooks.ru/bookshelf/396439/reading (дата обращения: 05.05.2026). – Режим доступа: для </w:t>
       </w:r>
       <w:proofErr w:type="spellStart"/>
       <w:r>
-        <w:t>Аспин</w:t>
+        <w:t>зарегистрир</w:t>
       </w:r>
       <w:proofErr w:type="spellEnd"/>
       <w:r>
-        <w:t xml:space="preserve"> – Санкт-</w:t>
-      </w:r>
-      <w:proofErr w:type="gramStart"/>
-      <w:r>
-        <w:t>Петербург :</w:t>
-      </w:r>
-      <w:proofErr w:type="gramEnd"/>
-      <w:r>
-        <w:t xml:space="preserve"> БХВ-Петербург, 2024. – 592 с. – URL: https://ibooks.ru/bookshelf/396439/reading (дата обращения: 05.05.2026). – Режим доступа: для </w:t>
+        <w:t xml:space="preserve">. пользователей. – Текст: электронный. </w:t>
+      </w:r>
+    </w:p>
+    <w:p>
+      <w:pPr>
+        <w:pStyle w:val="a7"/>
+      </w:pPr>
+      <w:r>
+        <w:t xml:space="preserve">2. </w:t>
       </w:r>
       <w:proofErr w:type="spellStart"/>
       <w:r>
+        <w:t>Нацвин</w:t>
+      </w:r>
+      <w:proofErr w:type="spellEnd"/>
+      <w:r>
+        <w:t xml:space="preserve"> А. В., Юрьева Т. А. Разработка программного обеспечения с графическим интерфейсом на базе фреймворка </w:t>
+      </w:r>
+      <w:proofErr w:type="spellStart"/>
+      <w:r>
+        <w:t>Avalonia</w:t>
+      </w:r>
+      <w:proofErr w:type="spellEnd"/>
+      <w:r>
+        <w:t xml:space="preserve">: учебно-методическое пособие / А.В. </w:t>
+      </w:r>
+      <w:proofErr w:type="spellStart"/>
+      <w:r>
+        <w:t>Нацвин</w:t>
+      </w:r>
+      <w:proofErr w:type="spellEnd"/>
+      <w:r>
+        <w:t xml:space="preserve">, Т.А. Юрьева. – Благовещенск : </w:t>
+      </w:r>
+      <w:proofErr w:type="spellStart"/>
+      <w:r>
+        <w:t>АмГУ</w:t>
+      </w:r>
+      <w:proofErr w:type="spellEnd"/>
+      <w:r>
+        <w:t xml:space="preserve">, 2023. – 102 с. – URL: https://reader.lanbook.com/book/454511 (дата обращения: 16.05.2026). – Режим доступа: для </w:t>
+      </w:r>
+      <w:proofErr w:type="spellStart"/>
+      <w:r>
         <w:t>зарегистрир</w:t>
       </w:r>
       <w:proofErr w:type="spellEnd"/>
@@ -5389,188 +5420,71 @@
         <w:pStyle w:val="a7"/>
       </w:pPr>
       <w:r>
-        <w:t xml:space="preserve">2. </w:t>
+        <w:t xml:space="preserve">3. Проскуряков А. В. Качество и тестирование программного обеспечения. Метрология программного обеспечения. – Таганрог : Издательство Южного федерального университета, 2022. – 197 с. – URL: https://znanium.ru/read?id=429841 (дата обращения: 10.06.2026). – Режим доступа: для </w:t>
       </w:r>
       <w:proofErr w:type="spellStart"/>
       <w:r>
-        <w:t>Нацвин</w:t>
+        <w:t>зарегистрир</w:t>
       </w:r>
       <w:proofErr w:type="spellEnd"/>
       <w:r>
-        <w:t xml:space="preserve"> А. В., Юрьева Т. А. Разработка программного обеспечения с графическим интерфейсом на базе </w:t>
+        <w:t xml:space="preserve">. пользователей. – Текст: электронный. </w:t>
+      </w:r>
+    </w:p>
+    <w:p>
+      <w:pPr>
+        <w:pStyle w:val="a7"/>
+      </w:pPr>
+      <w:r>
+        <w:t xml:space="preserve">4. </w:t>
       </w:r>
       <w:proofErr w:type="spellStart"/>
       <w:r>
-        <w:t>фреймворка</w:t>
+        <w:t>Фленов</w:t>
       </w:r>
       <w:proofErr w:type="spellEnd"/>
       <w:r>
-        <w:t xml:space="preserve"> </w:t>
+        <w:t xml:space="preserve"> М. Е. Библия C#. – 6-е изд., </w:t>
       </w:r>
       <w:proofErr w:type="spellStart"/>
       <w:r>
-        <w:t>Avalonia</w:t>
+        <w:t>перераб</w:t>
       </w:r>
       <w:proofErr w:type="spellEnd"/>
       <w:r>
-        <w:t xml:space="preserve">: учебно-методическое пособие / А.В. </w:t>
+        <w:t xml:space="preserve">. и доп. / М.Е. </w:t>
       </w:r>
       <w:proofErr w:type="spellStart"/>
       <w:r>
-        <w:t>Нацвин</w:t>
+        <w:t>Фленов</w:t>
       </w:r>
       <w:proofErr w:type="spellEnd"/>
       <w:r>
-        <w:t xml:space="preserve">, Т.А. Юрьева. – </w:t>
-      </w:r>
-      <w:proofErr w:type="gramStart"/>
-      <w:r>
-        <w:t>Благовещенск :</w:t>
-      </w:r>
-      <w:proofErr w:type="gramEnd"/>
-      <w:r>
-        <w:t xml:space="preserve"> </w:t>
+        <w:t xml:space="preserve">. – Санкт-Петербург : БХВ-Петербург, 2024. – 512 с. – URL: https://ibooks.ru/bookshelf/396461/reading (дата обращения: 28.05.2026). – Режим доступа: для </w:t>
       </w:r>
       <w:proofErr w:type="spellStart"/>
       <w:r>
-        <w:t>АмГУ</w:t>
+        <w:t>зарегистрир</w:t>
       </w:r>
       <w:proofErr w:type="spellEnd"/>
       <w:r>
-        <w:t xml:space="preserve">, 2023. – 102 с. – URL: https://reader.lanbook.com/book/454511 (дата обращения: 16.05.2026). – Режим доступа: для </w:t>
+        <w:t xml:space="preserve">. пользователей. – Текст: электронный. </w:t>
+      </w:r>
+    </w:p>
+    <w:p>
+      <w:pPr>
+        <w:pStyle w:val="a7"/>
+      </w:pPr>
+      <w:r>
+        <w:t xml:space="preserve">5. Шалин П. Программирование на </w:t>
       </w:r>
       <w:proofErr w:type="spellStart"/>
       <w:r>
-        <w:t>зарегистрир</w:t>
+        <w:t>Kotlin</w:t>
       </w:r>
       <w:proofErr w:type="spellEnd"/>
       <w:r>
-        <w:t xml:space="preserve">. пользователей. – Текст: электронный. </w:t>
-      </w:r>
-    </w:p>
-    <w:p>
-      <w:pPr>
-        <w:pStyle w:val="a7"/>
-      </w:pPr>
-      <w:r>
-        <w:t xml:space="preserve">3. Проскуряков А. В. Качество и тестирование программного обеспечения. Метрология программного обеспечения. – </w:t>
-      </w:r>
-      <w:proofErr w:type="gramStart"/>
-      <w:r>
-        <w:t>Таганрог :</w:t>
-      </w:r>
-      <w:proofErr w:type="gramEnd"/>
-      <w:r>
-        <w:t xml:space="preserve"> Издательство Южного федерального университета, 2022. – 197 с. – URL: https://znanium.ru/read?id=429841 (дата обращения: 10.06.2026). – Режим доступа: для </w:t>
-      </w:r>
-      <w:proofErr w:type="spellStart"/>
-      <w:r>
-        <w:t>зарегистрир</w:t>
-      </w:r>
-      <w:proofErr w:type="spellEnd"/>
-      <w:r>
-        <w:t xml:space="preserve">. пользователей. – Текст: электронный. </w:t>
-      </w:r>
-    </w:p>
-    <w:p>
-      <w:pPr>
-        <w:pStyle w:val="a7"/>
-      </w:pPr>
-      <w:r>
-        <w:t xml:space="preserve">4. </w:t>
-      </w:r>
-      <w:proofErr w:type="spellStart"/>
-      <w:r>
-        <w:t>Фленов</w:t>
-      </w:r>
-      <w:proofErr w:type="spellEnd"/>
-      <w:r>
-        <w:t xml:space="preserve"> М. Е. Библия C#. – 6-е изд., </w:t>
-      </w:r>
-      <w:proofErr w:type="spellStart"/>
-      <w:r>
-        <w:t>перераб</w:t>
-      </w:r>
-      <w:proofErr w:type="spellEnd"/>
-      <w:proofErr w:type="gramStart"/>
-      <w:r>
-        <w:t>.</w:t>
-      </w:r>
-      <w:proofErr w:type="gramEnd"/>
-      <w:r>
-        <w:t xml:space="preserve"> и доп. / М.Е. </w:t>
-      </w:r>
-      <w:proofErr w:type="spellStart"/>
-      <w:r>
-        <w:t>Фленов</w:t>
-      </w:r>
-      <w:proofErr w:type="spellEnd"/>
-      <w:r>
-        <w:t>. – Санкт-</w:t>
-      </w:r>
-      <w:proofErr w:type="gramStart"/>
-      <w:r>
-        <w:t>Петербург :</w:t>
-      </w:r>
-      <w:proofErr w:type="gramEnd"/>
-      <w:r>
-        <w:t xml:space="preserve"> БХВ-Петербург, 2024. – 512 с. – URL: https://ibooks.ru/bookshelf/396461/reading (дата обращения: 28.05.2026). – Режим доступа: для </w:t>
-      </w:r>
-      <w:proofErr w:type="spellStart"/>
-      <w:r>
-        <w:t>зарегистрир</w:t>
-      </w:r>
-      <w:proofErr w:type="spellEnd"/>
-      <w:r>
-        <w:t xml:space="preserve">. пользователей. – Текст: электронный. </w:t>
-      </w:r>
-    </w:p>
-    <w:p>
-      <w:pPr>
-        <w:pStyle w:val="a7"/>
-      </w:pPr>
-      <w:r>
-        <w:t xml:space="preserve">5. </w:t>
-      </w:r>
-      <w:proofErr w:type="spellStart"/>
-      <w:r>
-        <w:t>Шалин</w:t>
-      </w:r>
-      <w:proofErr w:type="spellEnd"/>
-      <w:r>
-        <w:t xml:space="preserve"> П. Программирование на </w:t>
-      </w:r>
-      <w:proofErr w:type="spellStart"/>
-      <w:r>
-        <w:t>Kotlin</w:t>
-      </w:r>
-      <w:proofErr w:type="spellEnd"/>
-      <w:r>
-        <w:t xml:space="preserve"> для </w:t>
-      </w:r>
-      <w:proofErr w:type="spellStart"/>
-      <w:r>
-        <w:t>Android</w:t>
-      </w:r>
-      <w:proofErr w:type="spellEnd"/>
-      <w:r>
-        <w:t xml:space="preserve">: Пер. с англ. / П. </w:t>
-      </w:r>
-      <w:proofErr w:type="spellStart"/>
-      <w:r>
-        <w:t>Шалин</w:t>
-      </w:r>
-      <w:proofErr w:type="spellEnd"/>
-      <w:r>
-        <w:t>. – Санкт-</w:t>
-      </w:r>
-      <w:proofErr w:type="gramStart"/>
-      <w:r>
-        <w:t>Петербург :</w:t>
-      </w:r>
-      <w:proofErr w:type="gramEnd"/>
-      <w:r>
-        <w:t xml:space="preserve"> БХВ-Петербург, 2023. – 336 с. – URL: https://ibooks.ru/bookshelf/396448/reading (дата обращения: 03.06.2026). – Режим доступа: для </w:t>
+        <w:t xml:space="preserve"> для Android: Пер. с англ. / П. Шалин. – Санкт-Петербург : БХВ-Петербург, 2023. – 336 с. – URL: https://ibooks.ru/bookshelf/396448/reading (дата обращения: 03.06.2026). – Режим доступа: для </w:t>
       </w:r>
       <w:proofErr w:type="spellStart"/>
       <w:r>
@@ -5594,7 +5508,7 @@
 </file>
 
 <file path=word/endnotes.xml><?xml version="1.0" encoding="utf-8"?>
-<w:endnotes xmlns:wpc="http://schemas.microsoft.com/office/word/2010/wordprocessingCanvas" xmlns:cx="http://schemas.microsoft.com/office/drawing/2014/chartex" xmlns:mc="http://schemas.openxmlformats.org/markup-compatibility/2006" xmlns:o="urn:schemas-microsoft-com:office:office" xmlns:r="http://schemas.openxmlformats.org/officeDocument/2006/relationships" xmlns:m="http://schemas.openxmlformats.org/officeDocument/2006/math" xmlns:v="urn:schemas-microsoft-com:vml" xmlns:wp14="http://schemas.microsoft.com/office/word/2010/wordprocessingDrawing" xmlns:wp="http://schemas.openxmlformats.org/drawingml/2006/wordprocessingDrawing" xmlns:w10="urn:schemas-microsoft-com:office:word" xmlns:w="http://schemas.openxmlformats.org/wordprocessingml/2006/main" xmlns:w14="http://schemas.microsoft.com/office/word/2010/wordml" xmlns:w15="http://schemas.microsoft.com/office/word/2012/wordml" xmlns:w16se="http://schemas.microsoft.com/office/word/2015/wordml/symex" xmlns:wpg="http://schemas.microsoft.com/office/word/2010/wordprocessingGroup" xmlns:wpi="http://schemas.microsoft.com/office/word/2010/wordprocessingInk" xmlns:wne="http://schemas.microsoft.com/office/word/2006/wordml" xmlns:wps="http://schemas.microsoft.com/office/word/2010/wordprocessingShape" mc:Ignorable="w14 w15 w16se wp14">
+<w:endnotes xmlns:wpc="http://schemas.microsoft.com/office/word/2010/wordprocessingCanvas" xmlns:cx="http://schemas.microsoft.com/office/drawing/2014/chartex" xmlns:cx1="http://schemas.microsoft.com/office/drawing/2015/9/8/chartex" xmlns:cx2="http://schemas.microsoft.com/office/drawing/2015/10/21/chartex" xmlns:cx3="http://schemas.microsoft.com/office/drawing/2016/5/9/chartex" xmlns:cx4="http://schemas.microsoft.com/office/drawing/2016/5/10/chartex" xmlns:cx5="http://schemas.microsoft.com/office/drawing/2016/5/11/chartex" xmlns:cx6="http://schemas.microsoft.com/office/drawing/2016/5/12/chartex" xmlns:cx7="http://schemas.microsoft.com/office/drawing/2016/5/13/chartex" xmlns:cx8="http://schemas.microsoft.com/office/drawing/2016/5/14/chartex" xmlns:mc="http://schemas.openxmlformats.org/markup-compatibility/2006" xmlns:aink="http://schemas.microsoft.com/office/drawing/2016/ink" xmlns:am3d="http://schemas.microsoft.com/office/drawing/2017/model3d" xmlns:o="urn:schemas-microsoft-com:office:office" xmlns:oel="http://schemas.microsoft.com/office/2019/extlst" xmlns:r="http://schemas.openxmlformats.org/officeDocument/2006/relationships" xmlns:m="http://schemas.openxmlformats.org/officeDocument/2006/math" xmlns:v="urn:schemas-microsoft-com:vml" xmlns:wp14="http://schemas.microsoft.com/office/word/2010/wordprocessingDrawing" xmlns:wp="http://schemas.openxmlformats.org/drawingml/2006/wordprocessingDrawing" xmlns:w10="urn:schemas-microsoft-com:office:word" xmlns:w="http://schemas.openxmlformats.org/wordprocessingml/2006/main" xmlns:w14="http://schemas.microsoft.com/office/word/2010/wordml" xmlns:w15="http://schemas.microsoft.com/office/word/2012/wordml" xmlns:w16cex="http://schemas.microsoft.com/office/word/2018/wordml/cex" xmlns:w16cid="http://schemas.microsoft.com/office/word/2016/wordml/cid" xmlns:w16="http://schemas.microsoft.com/office/word/2018/wordml" xmlns:w16sdtdh="http://schemas.microsoft.com/office/word/2020/wordml/sdtdatahash" xmlns:w16se="http://schemas.microsoft.com/office/word/2015/wordml/symex" xmlns:wpg="http://schemas.microsoft.com/office/word/2010/wordprocessingGroup" xmlns:wpi="http://schemas.microsoft.com/office/word/2010/wordprocessingInk" xmlns:wne="http://schemas.microsoft.com/office/word/2006/wordml" xmlns:wps="http://schemas.microsoft.com/office/word/2010/wordprocessingShape" mc:Ignorable="w14 w15 w16se w16cid w16 w16cex w16sdtdh wp14">
   <w:endnote w:type="separator" w:id="-1">
     <w:p>
       <w:r>
@@ -5613,7 +5527,7 @@
 </file>
 
 <file path=word/footer1.xml><?xml version="1.0" encoding="utf-8"?>
-<w:ftr xmlns:wpc="http://schemas.microsoft.com/office/word/2010/wordprocessingCanvas" xmlns:cx="http://schemas.microsoft.com/office/drawing/2014/chartex" xmlns:mc="http://schemas.openxmlformats.org/markup-compatibility/2006" xmlns:o="urn:schemas-microsoft-com:office:office" xmlns:r="http://schemas.openxmlformats.org/officeDocument/2006/relationships" xmlns:m="http://schemas.openxmlformats.org/officeDocument/2006/math" xmlns:v="urn:schemas-microsoft-com:vml" xmlns:wp14="http://schemas.microsoft.com/office/word/2010/wordprocessingDrawing" xmlns:wp="http://schemas.openxmlformats.org/drawingml/2006/wordprocessingDrawing" xmlns:w10="urn:schemas-microsoft-com:office:word" xmlns:w="http://schemas.openxmlformats.org/wordprocessingml/2006/main" xmlns:w14="http://schemas.microsoft.com/office/word/2010/wordml" xmlns:w15="http://schemas.microsoft.com/office/word/2012/wordml" xmlns:w16se="http://schemas.microsoft.com/office/word/2015/wordml/symex" xmlns:wpg="http://schemas.microsoft.com/office/word/2010/wordprocessingGroup" xmlns:wpi="http://schemas.microsoft.com/office/word/2010/wordprocessingInk" xmlns:wne="http://schemas.microsoft.com/office/word/2006/wordml" xmlns:wps="http://schemas.microsoft.com/office/word/2010/wordprocessingShape" mc:Ignorable="w14 w15 w16se wp14">
+<w:ftr xmlns:wpc="http://schemas.microsoft.com/office/word/2010/wordprocessingCanvas" xmlns:cx="http://schemas.microsoft.com/office/drawing/2014/chartex" xmlns:cx1="http://schemas.microsoft.com/office/drawing/2015/9/8/chartex" xmlns:cx2="http://schemas.microsoft.com/office/drawing/2015/10/21/chartex" xmlns:cx3="http://schemas.microsoft.com/office/drawing/2016/5/9/chartex" xmlns:cx4="http://schemas.microsoft.com/office/drawing/2016/5/10/chartex" xmlns:cx5="http://schemas.microsoft.com/office/drawing/2016/5/11/chartex" xmlns:cx6="http://schemas.microsoft.com/office/drawing/2016/5/12/chartex" xmlns:cx7="http://schemas.microsoft.com/office/drawing/2016/5/13/chartex" xmlns:cx8="http://schemas.microsoft.com/office/drawing/2016/5/14/chartex" xmlns:mc="http://schemas.openxmlformats.org/markup-compatibility/2006" xmlns:aink="http://schemas.microsoft.com/office/drawing/2016/ink" xmlns:am3d="http://schemas.microsoft.com/office/drawing/2017/model3d" xmlns:o="urn:schemas-microsoft-com:office:office" xmlns:oel="http://schemas.microsoft.com/office/2019/extlst" xmlns:r="http://schemas.openxmlformats.org/officeDocument/2006/relationships" xmlns:m="http://schemas.openxmlformats.org/officeDocument/2006/math" xmlns:v="urn:schemas-microsoft-com:vml" xmlns:wp14="http://schemas.microsoft.com/office/word/2010/wordprocessingDrawing" xmlns:wp="http://schemas.openxmlformats.org/drawingml/2006/wordprocessingDrawing" xmlns:w10="urn:schemas-microsoft-com:office:word" xmlns:w="http://schemas.openxmlformats.org/wordprocessingml/2006/main" xmlns:w14="http://schemas.microsoft.com/office/word/2010/wordml" xmlns:w15="http://schemas.microsoft.com/office/word/2012/wordml" xmlns:w16cex="http://schemas.microsoft.com/office/word/2018/wordml/cex" xmlns:w16cid="http://schemas.microsoft.com/office/word/2016/wordml/cid" xmlns:w16="http://schemas.microsoft.com/office/word/2018/wordml" xmlns:w16sdtdh="http://schemas.microsoft.com/office/word/2020/wordml/sdtdatahash" xmlns:w16se="http://schemas.microsoft.com/office/word/2015/wordml/symex" xmlns:wpg="http://schemas.microsoft.com/office/word/2010/wordprocessingGroup" xmlns:wpi="http://schemas.microsoft.com/office/word/2010/wordprocessingInk" xmlns:wne="http://schemas.microsoft.com/office/word/2006/wordml" xmlns:wps="http://schemas.microsoft.com/office/word/2010/wordprocessingShape" mc:Ignorable="w14 w15 w16se w16cid w16 w16cex w16sdtdh wp14">
   <w:sdt>
     <w:sdtPr>
       <w:id w:val="-651911265"/>
@@ -5673,7 +5587,7 @@
 </file>
 
 <file path=word/footnotes.xml><?xml version="1.0" encoding="utf-8"?>
-<w:footnotes xmlns:wpc="http://schemas.microsoft.com/office/word/2010/wordprocessingCanvas" xmlns:cx="http://schemas.microsoft.com/office/drawing/2014/chartex" xmlns:mc="http://schemas.openxmlformats.org/markup-compatibility/2006" xmlns:o="urn:schemas-microsoft-com:office:office" xmlns:r="http://schemas.openxmlformats.org/officeDocument/2006/relationships" xmlns:m="http://schemas.openxmlformats.org/officeDocument/2006/math" xmlns:v="urn:schemas-microsoft-com:vml" xmlns:wp14="http://schemas.microsoft.com/office/word/2010/wordprocessingDrawing" xmlns:wp="http://schemas.openxmlformats.org/drawingml/2006/wordprocessingDrawing" xmlns:w10="urn:schemas-microsoft-com:office:word" xmlns:w="http://schemas.openxmlformats.org/wordprocessingml/2006/main" xmlns:w14="http://schemas.microsoft.com/office/word/2010/wordml" xmlns:w15="http://schemas.microsoft.com/office/word/2012/wordml" xmlns:w16se="http://schemas.microsoft.com/office/word/2015/wordml/symex" xmlns:wpg="http://schemas.microsoft.com/office/word/2010/wordprocessingGroup" xmlns:wpi="http://schemas.microsoft.com/office/word/2010/wordprocessingInk" xmlns:wne="http://schemas.microsoft.com/office/word/2006/wordml" xmlns:wps="http://schemas.microsoft.com/office/word/2010/wordprocessingShape" mc:Ignorable="w14 w15 w16se wp14">
+<w:footnotes xmlns:wpc="http://schemas.microsoft.com/office/word/2010/wordprocessingCanvas" xmlns:cx="http://schemas.microsoft.com/office/drawing/2014/chartex" xmlns:cx1="http://schemas.microsoft.com/office/drawing/2015/9/8/chartex" xmlns:cx2="http://schemas.microsoft.com/office/drawing/2015/10/21/chartex" xmlns:cx3="http://schemas.microsoft.com/office/drawing/2016/5/9/chartex" xmlns:cx4="http://schemas.microsoft.com/office/drawing/2016/5/10/chartex" xmlns:cx5="http://schemas.microsoft.com/office/drawing/2016/5/11/chartex" xmlns:cx6="http://schemas.microsoft.com/office/drawing/2016/5/12/chartex" xmlns:cx7="http://schemas.microsoft.com/office/drawing/2016/5/13/chartex" xmlns:cx8="http://schemas.microsoft.com/office/drawing/2016/5/14/chartex" xmlns:mc="http://schemas.openxmlformats.org/markup-compatibility/2006" xmlns:aink="http://schemas.microsoft.com/office/drawing/2016/ink" xmlns:am3d="http://schemas.microsoft.com/office/drawing/2017/model3d" xmlns:o="urn:schemas-microsoft-com:office:office" xmlns:oel="http://schemas.microsoft.com/office/2019/extlst" xmlns:r="http://schemas.openxmlformats.org/officeDocument/2006/relationships" xmlns:m="http://schemas.openxmlformats.org/officeDocument/2006/math" xmlns:v="urn:schemas-microsoft-com:vml" xmlns:wp14="http://schemas.microsoft.com/office/word/2010/wordprocessingDrawing" xmlns:wp="http://schemas.openxmlformats.org/drawingml/2006/wordprocessingDrawing" xmlns:w10="urn:schemas-microsoft-com:office:word" xmlns:w="http://schemas.openxmlformats.org/wordprocessingml/2006/main" xmlns:w14="http://schemas.microsoft.com/office/word/2010/wordml" xmlns:w15="http://schemas.microsoft.com/office/word/2012/wordml" xmlns:w16cex="http://schemas.microsoft.com/office/word/2018/wordml/cex" xmlns:w16cid="http://schemas.microsoft.com/office/word/2016/wordml/cid" xmlns:w16="http://schemas.microsoft.com/office/word/2018/wordml" xmlns:w16sdtdh="http://schemas.microsoft.com/office/word/2020/wordml/sdtdatahash" xmlns:w16se="http://schemas.microsoft.com/office/word/2015/wordml/symex" xmlns:wpg="http://schemas.microsoft.com/office/word/2010/wordprocessingGroup" xmlns:wpi="http://schemas.microsoft.com/office/word/2010/wordprocessingInk" xmlns:wne="http://schemas.microsoft.com/office/word/2006/wordml" xmlns:wps="http://schemas.microsoft.com/office/word/2010/wordprocessingShape" mc:Ignorable="w14 w15 w16se w16cid w16 w16cex w16sdtdh wp14">
   <w:footnote w:type="separator" w:id="-1">
     <w:p>
       <w:r>
@@ -5692,7 +5606,7 @@
 </file>
 
 <file path=word/numbering.xml><?xml version="1.0" encoding="utf-8"?>
-<w:numbering xmlns:wpc="http://schemas.microsoft.com/office/word/2010/wordprocessingCanvas" xmlns:cx="http://schemas.microsoft.com/office/drawing/2014/chartex" xmlns:mc="http://schemas.openxmlformats.org/markup-compatibility/2006" xmlns:o="urn:schemas-microsoft-com:office:office" xmlns:r="http://schemas.openxmlformats.org/officeDocument/2006/relationships" xmlns:m="http://schemas.openxmlformats.org/officeDocument/2006/math" xmlns:v="urn:schemas-microsoft-com:vml" xmlns:wp14="http://schemas.microsoft.com/office/word/2010/wordprocessingDrawing" xmlns:wp="http://schemas.openxmlformats.org/drawingml/2006/wordprocessingDrawing" xmlns:w10="urn:schemas-microsoft-com:office:word" xmlns:w="http://schemas.openxmlformats.org/wordprocessingml/2006/main" xmlns:w14="http://schemas.microsoft.com/office/word/2010/wordml" xmlns:w15="http://schemas.microsoft.com/office/word/2012/wordml" xmlns:w16se="http://schemas.microsoft.com/office/word/2015/wordml/symex" xmlns:wpg="http://schemas.microsoft.com/office/word/2010/wordprocessingGroup" xmlns:wpi="http://schemas.microsoft.com/office/word/2010/wordprocessingInk" xmlns:wne="http://schemas.microsoft.com/office/word/2006/wordml" xmlns:wps="http://schemas.microsoft.com/office/word/2010/wordprocessingShape" mc:Ignorable="w14 w15 w16se wp14">
+<w:numbering xmlns:wpc="http://schemas.microsoft.com/office/word/2010/wordprocessingCanvas" xmlns:cx="http://schemas.microsoft.com/office/drawing/2014/chartex" xmlns:cx1="http://schemas.microsoft.com/office/drawing/2015/9/8/chartex" xmlns:cx2="http://schemas.microsoft.com/office/drawing/2015/10/21/chartex" xmlns:cx3="http://schemas.microsoft.com/office/drawing/2016/5/9/chartex" xmlns:cx4="http://schemas.microsoft.com/office/drawing/2016/5/10/chartex" xmlns:cx5="http://schemas.microsoft.com/office/drawing/2016/5/11/chartex" xmlns:cx6="http://schemas.microsoft.com/office/drawing/2016/5/12/chartex" xmlns:cx7="http://schemas.microsoft.com/office/drawing/2016/5/13/chartex" xmlns:cx8="http://schemas.microsoft.com/office/drawing/2016/5/14/chartex" xmlns:mc="http://schemas.openxmlformats.org/markup-compatibility/2006" xmlns:aink="http://schemas.microsoft.com/office/drawing/2016/ink" xmlns:am3d="http://schemas.microsoft.com/office/drawing/2017/model3d" xmlns:o="urn:schemas-microsoft-com:office:office" xmlns:oel="http://schemas.microsoft.com/office/2019/extlst" xmlns:r="http://schemas.openxmlformats.org/officeDocument/2006/relationships" xmlns:m="http://schemas.openxmlformats.org/officeDocument/2006/math" xmlns:v="urn:schemas-microsoft-com:vml" xmlns:wp14="http://schemas.microsoft.com/office/word/2010/wordprocessingDrawing" xmlns:wp="http://schemas.openxmlformats.org/drawingml/2006/wordprocessingDrawing" xmlns:w10="urn:schemas-microsoft-com:office:word" xmlns:w="http://schemas.openxmlformats.org/wordprocessingml/2006/main" xmlns:w14="http://schemas.microsoft.com/office/word/2010/wordml" xmlns:w15="http://schemas.microsoft.com/office/word/2012/wordml" xmlns:w16cex="http://schemas.microsoft.com/office/word/2018/wordml/cex" xmlns:w16cid="http://schemas.microsoft.com/office/word/2016/wordml/cid" xmlns:w16="http://schemas.microsoft.com/office/word/2018/wordml" xmlns:w16sdtdh="http://schemas.microsoft.com/office/word/2020/wordml/sdtdatahash" xmlns:w16se="http://schemas.microsoft.com/office/word/2015/wordml/symex" xmlns:wpg="http://schemas.microsoft.com/office/word/2010/wordprocessingGroup" xmlns:wpi="http://schemas.microsoft.com/office/word/2010/wordprocessingInk" xmlns:wne="http://schemas.microsoft.com/office/word/2006/wordml" xmlns:wps="http://schemas.microsoft.com/office/word/2010/wordprocessingShape" mc:Ignorable="w14 w15 w16se w16cid w16 w16cex w16sdtdh wp14">
   <w:abstractNum w:abstractNumId="0" w15:restartNumberingAfterBreak="0">
     <w:nsid w:val="0428275C"/>
     <w:multiLevelType w:val="hybridMultilevel"/>
@@ -6839,59 +6753,59 @@
       </w:pPr>
     </w:lvl>
   </w:abstractNum>
-  <w:num w:numId="1">
+  <w:num w:numId="1" w16cid:durableId="175510821">
     <w:abstractNumId w:val="8"/>
   </w:num>
-  <w:num w:numId="2">
+  <w:num w:numId="2" w16cid:durableId="256521481">
     <w:abstractNumId w:val="3"/>
   </w:num>
-  <w:num w:numId="3">
+  <w:num w:numId="3" w16cid:durableId="1754473796">
     <w:abstractNumId w:val="2"/>
   </w:num>
-  <w:num w:numId="4">
+  <w:num w:numId="4" w16cid:durableId="1213733659">
     <w:abstractNumId w:val="2"/>
     <w:lvlOverride w:ilvl="0">
       <w:startOverride w:val="1"/>
     </w:lvlOverride>
   </w:num>
-  <w:num w:numId="5">
+  <w:num w:numId="5" w16cid:durableId="223686221">
     <w:abstractNumId w:val="2"/>
     <w:lvlOverride w:ilvl="0">
       <w:startOverride w:val="1"/>
     </w:lvlOverride>
   </w:num>
-  <w:num w:numId="6">
+  <w:num w:numId="6" w16cid:durableId="929318429">
     <w:abstractNumId w:val="5"/>
   </w:num>
-  <w:num w:numId="7">
+  <w:num w:numId="7" w16cid:durableId="913051371">
     <w:abstractNumId w:val="6"/>
   </w:num>
-  <w:num w:numId="8">
+  <w:num w:numId="8" w16cid:durableId="1868785048">
     <w:abstractNumId w:val="1"/>
   </w:num>
-  <w:num w:numId="9">
+  <w:num w:numId="9" w16cid:durableId="1387796464">
     <w:abstractNumId w:val="0"/>
   </w:num>
-  <w:num w:numId="10">
+  <w:num w:numId="10" w16cid:durableId="559948532">
     <w:abstractNumId w:val="9"/>
   </w:num>
-  <w:num w:numId="11">
+  <w:num w:numId="11" w16cid:durableId="1665438">
     <w:abstractNumId w:val="7"/>
   </w:num>
-  <w:num w:numId="12">
+  <w:num w:numId="12" w16cid:durableId="1504971793">
     <w:abstractNumId w:val="8"/>
   </w:num>
-  <w:num w:numId="13">
+  <w:num w:numId="13" w16cid:durableId="914320719">
     <w:abstractNumId w:val="8"/>
   </w:num>
-  <w:num w:numId="14">
+  <w:num w:numId="14" w16cid:durableId="121579731">
     <w:abstractNumId w:val="4"/>
   </w:num>
 </w:numbering>
 </file>
 
 <file path=word/styles.xml><?xml version="1.0" encoding="utf-8"?>
-<w:styles xmlns:mc="http://schemas.openxmlformats.org/markup-compatibility/2006" xmlns:r="http://schemas.openxmlformats.org/officeDocument/2006/relationships" xmlns:w="http://schemas.openxmlformats.org/wordprocessingml/2006/main" xmlns:w14="http://schemas.microsoft.com/office/word/2010/wordml" xmlns:w15="http://schemas.microsoft.com/office/word/2012/wordml" xmlns:w16se="http://schemas.microsoft.com/office/word/2015/wordml/symex" mc:Ignorable="w14 w15 w16se">
+<w:styles xmlns:mc="http://schemas.openxmlformats.org/markup-compatibility/2006" xmlns:r="http://schemas.openxmlformats.org/officeDocument/2006/relationships" xmlns:w="http://schemas.openxmlformats.org/wordprocessingml/2006/main" xmlns:w14="http://schemas.microsoft.com/office/word/2010/wordml" xmlns:w15="http://schemas.microsoft.com/office/word/2012/wordml" xmlns:w16cex="http://schemas.microsoft.com/office/word/2018/wordml/cex" xmlns:w16cid="http://schemas.microsoft.com/office/word/2016/wordml/cid" xmlns:w16="http://schemas.microsoft.com/office/word/2018/wordml" xmlns:w16sdtdh="http://schemas.microsoft.com/office/word/2020/wordml/sdtdatahash" xmlns:w16se="http://schemas.microsoft.com/office/word/2015/wordml/symex" mc:Ignorable="w14 w15 w16se w16cid w16 w16cex w16sdtdh">
   <w:docDefaults>
     <w:rPrDefault>
       <w:rPr>
@@ -6907,7 +6821,7 @@
       </w:pPr>
     </w:pPrDefault>
   </w:docDefaults>
-  <w:latentStyles w:defLockedState="0" w:defUIPriority="99" w:defSemiHidden="0" w:defUnhideWhenUsed="0" w:defQFormat="0" w:count="371">
+  <w:latentStyles w:defLockedState="0" w:defUIPriority="99" w:defSemiHidden="0" w:defUnhideWhenUsed="0" w:defQFormat="0" w:count="376">
     <w:lsdException w:name="Normal" w:uiPriority="0" w:qFormat="1"/>
     <w:lsdException w:name="heading 1" w:uiPriority="9" w:qFormat="1"/>
     <w:lsdException w:name="heading 2" w:semiHidden="1" w:uiPriority="9" w:unhideWhenUsed="1" w:qFormat="1"/>
@@ -7279,6 +7193,11 @@
     <w:lsdException w:name="List Table 5 Dark Accent 6" w:uiPriority="50"/>
     <w:lsdException w:name="List Table 6 Colorful Accent 6" w:uiPriority="51"/>
     <w:lsdException w:name="List Table 7 Colorful Accent 6" w:uiPriority="52"/>
+    <w:lsdException w:name="Mention" w:semiHidden="1" w:unhideWhenUsed="1"/>
+    <w:lsdException w:name="Smart Hyperlink" w:semiHidden="1" w:unhideWhenUsed="1"/>
+    <w:lsdException w:name="Hashtag" w:semiHidden="1" w:unhideWhenUsed="1"/>
+    <w:lsdException w:name="Unresolved Mention" w:semiHidden="1" w:unhideWhenUsed="1"/>
+    <w:lsdException w:name="Smart Link" w:semiHidden="1" w:unhideWhenUsed="1"/>
   </w:latentStyles>
   <w:style w:type="paragraph" w:default="1" w:styleId="a2">
     <w:name w:val="Normal"/>
@@ -7510,7 +7429,6 @@
   <w:style w:type="character" w:default="1" w:styleId="a3">
     <w:name w:val="Default Paragraph Font"/>
     <w:uiPriority w:val="1"/>
-    <w:semiHidden/>
     <w:unhideWhenUsed/>
   </w:style>
   <w:style w:type="table" w:default="1" w:styleId="a4">

</xml_diff>